<commit_message>
doc: add `SSD`, `SD` and `Logical Architecture Diagram` for hw4
</commit_message>
<xml_diff>
--- a/document/hw4.docx
+++ b/document/hw4.docx
@@ -1,6 +1,6 @@
 
 <file path=word/document.xml><?xml version="1.0" encoding="utf-8"?>
-<w:document xmlns:wpc="http://schemas.microsoft.com/office/word/2010/wordprocessingCanvas" xmlns:cx="http://schemas.microsoft.com/office/drawing/2014/chartex" xmlns:cx1="http://schemas.microsoft.com/office/drawing/2015/9/8/chartex" xmlns:cx2="http://schemas.microsoft.com/office/drawing/2015/10/21/chartex" xmlns:cx3="http://schemas.microsoft.com/office/drawing/2016/5/9/chartex" xmlns:cx4="http://schemas.microsoft.com/office/drawing/2016/5/10/chartex" xmlns:cx5="http://schemas.microsoft.com/office/drawing/2016/5/11/chartex" xmlns:cx6="http://schemas.microsoft.com/office/drawing/2016/5/12/chartex" xmlns:cx7="http://schemas.microsoft.com/office/drawing/2016/5/13/chartex" xmlns:cx8="http://schemas.microsoft.com/office/drawing/2016/5/14/chartex" xmlns:mc="http://schemas.openxmlformats.org/markup-compatibility/2006" xmlns:aink="http://schemas.microsoft.com/office/drawing/2016/ink" xmlns:am3d="http://schemas.microsoft.com/office/drawing/2017/model3d" xmlns:o="urn:schemas-microsoft-com:office:office" xmlns:oel="http://schemas.microsoft.com/office/2019/extlst" xmlns:r="http://schemas.openxmlformats.org/officeDocument/2006/relationships" xmlns:m="http://schemas.openxmlformats.org/officeDocument/2006/math" xmlns:v="urn:schemas-microsoft-com:vml" xmlns:wp14="http://schemas.microsoft.com/office/word/2010/wordprocessingDrawing" xmlns:wp="http://schemas.openxmlformats.org/drawingml/2006/wordprocessingDrawing" xmlns:w10="urn:schemas-microsoft-com:office:word" xmlns:w="http://schemas.openxmlformats.org/wordprocessingml/2006/main" xmlns:w14="http://schemas.microsoft.com/office/word/2010/wordml" xmlns:w15="http://schemas.microsoft.com/office/word/2012/wordml" xmlns:w16cex="http://schemas.microsoft.com/office/word/2018/wordml/cex" xmlns:w16cid="http://schemas.microsoft.com/office/word/2016/wordml/cid" xmlns:w16="http://schemas.microsoft.com/office/word/2018/wordml" xmlns:w16sdtdh="http://schemas.microsoft.com/office/word/2020/wordml/sdtdatahash" xmlns:w16se="http://schemas.microsoft.com/office/word/2015/wordml/symex" xmlns:wpg="http://schemas.microsoft.com/office/word/2010/wordprocessingGroup" xmlns:wpi="http://schemas.microsoft.com/office/word/2010/wordprocessingInk" xmlns:wne="http://schemas.microsoft.com/office/word/2006/wordml" xmlns:wps="http://schemas.microsoft.com/office/word/2010/wordprocessingShape" mc:Ignorable="w14 w15 w16se w16cid w16 w16cex w16sdtdh wp14">
+<w:document xmlns:wpc="http://schemas.microsoft.com/office/word/2010/wordprocessingCanvas" xmlns:cx="http://schemas.microsoft.com/office/drawing/2014/chartex" xmlns:cx1="http://schemas.microsoft.com/office/drawing/2015/9/8/chartex" xmlns:cx2="http://schemas.microsoft.com/office/drawing/2015/10/21/chartex" xmlns:cx3="http://schemas.microsoft.com/office/drawing/2016/5/9/chartex" xmlns:cx4="http://schemas.microsoft.com/office/drawing/2016/5/10/chartex" xmlns:cx5="http://schemas.microsoft.com/office/drawing/2016/5/11/chartex" xmlns:cx6="http://schemas.microsoft.com/office/drawing/2016/5/12/chartex" xmlns:cx7="http://schemas.microsoft.com/office/drawing/2016/5/13/chartex" xmlns:cx8="http://schemas.microsoft.com/office/drawing/2016/5/14/chartex" xmlns:mc="http://schemas.openxmlformats.org/markup-compatibility/2006" xmlns:aink="http://schemas.microsoft.com/office/drawing/2016/ink" xmlns:am3d="http://schemas.microsoft.com/office/drawing/2017/model3d" xmlns:o="urn:schemas-microsoft-com:office:office" xmlns:oel="http://schemas.microsoft.com/office/2019/extlst" xmlns:r="http://schemas.openxmlformats.org/officeDocument/2006/relationships" xmlns:m="http://schemas.openxmlformats.org/officeDocument/2006/math" xmlns:v="urn:schemas-microsoft-com:vml" xmlns:wp14="http://schemas.microsoft.com/office/word/2010/wordprocessingDrawing" xmlns:wp="http://schemas.openxmlformats.org/drawingml/2006/wordprocessingDrawing" xmlns:w10="urn:schemas-microsoft-com:office:word" xmlns:w="http://schemas.openxmlformats.org/wordprocessingml/2006/main" xmlns:w14="http://schemas.microsoft.com/office/word/2010/wordml" xmlns:w15="http://schemas.microsoft.com/office/word/2012/wordml" xmlns:w16cex="http://schemas.microsoft.com/office/word/2018/wordml/cex" xmlns:w16cid="http://schemas.microsoft.com/office/word/2016/wordml/cid" xmlns:w16="http://schemas.microsoft.com/office/word/2018/wordml" xmlns:w16du="http://schemas.microsoft.com/office/word/2023/wordml/word16du" xmlns:w16sdtdh="http://schemas.microsoft.com/office/word/2020/wordml/sdtdatahash" xmlns:w16sdtfl="http://schemas.microsoft.com/office/word/2024/wordml/sdtformatlock" xmlns:w16se="http://schemas.microsoft.com/office/word/2015/wordml/symex" xmlns:wpg="http://schemas.microsoft.com/office/word/2010/wordprocessingGroup" xmlns:wpi="http://schemas.microsoft.com/office/word/2010/wordprocessingInk" xmlns:wne="http://schemas.microsoft.com/office/word/2006/wordml" xmlns:wps="http://schemas.microsoft.com/office/word/2010/wordprocessingShape" mc:Ignorable="w14 w15 w16se w16cid w16 w16cex w16sdtdh w16sdtfl w16du wp14">
   <w:body>
     <w:p>
       <w:pPr>
@@ -165,7 +165,7 @@
           <w:sz w:val="40"/>
           <w:szCs w:val="40"/>
         </w:rPr>
-        <w:t>3</w:t>
+        <w:t>4</w:t>
       </w:r>
     </w:p>
     <w:p>
@@ -1217,6 +1217,44 @@
     </w:p>
     <w:p>
       <w:pPr>
+        <w:jc w:val="center"/>
+        <w:rPr>
+          <w:rFonts w:ascii="Times New Roman" w:hAnsi="Times New Roman" w:cs="Times New Roman" w:hint="eastAsia"/>
+          <w:b/>
+          <w:bCs/>
+          <w:i/>
+          <w:iCs/>
+          <w:sz w:val="22"/>
+          <w:szCs w:val="22"/>
+        </w:rPr>
+      </w:pPr>
+      <w:r>
+        <w:rPr>
+          <w:rFonts w:ascii="Times New Roman" w:hAnsi="Times New Roman" w:cs="Times New Roman"/>
+          <w:b/>
+          <w:bCs/>
+          <w:i/>
+          <w:iCs/>
+          <w:sz w:val="22"/>
+          <w:szCs w:val="22"/>
+        </w:rPr>
+        <w:t>Figure 1</w:t>
+      </w:r>
+      <w:r>
+        <w:rPr>
+          <w:rFonts w:ascii="Times New Roman" w:hAnsi="Times New Roman" w:cs="Times New Roman" w:hint="eastAsia"/>
+          <w:b/>
+          <w:bCs/>
+          <w:i/>
+          <w:iCs/>
+          <w:sz w:val="22"/>
+          <w:szCs w:val="22"/>
+        </w:rPr>
+        <w:t xml:space="preserve"> use case diagram of system</w:t>
+      </w:r>
+    </w:p>
+    <w:p>
+      <w:pPr>
         <w:pStyle w:val="2"/>
       </w:pPr>
       <w:r>
@@ -1469,7 +1507,14 @@
               <w:rPr>
                 <w:rFonts w:ascii="Times New Roman" w:eastAsia="標楷體" w:hAnsi="Times New Roman" w:cs="Times New Roman" w:hint="eastAsia"/>
               </w:rPr>
-              <w:t>書籍與編輯其資訊</w:t>
+              <w:t>書籍與</w:t>
+            </w:r>
+            <w:r>
+              <w:rPr>
+                <w:rFonts w:ascii="Times New Roman" w:eastAsia="標楷體" w:hAnsi="Times New Roman" w:cs="Times New Roman" w:hint="eastAsia"/>
+              </w:rPr>
+              <w:lastRenderedPageBreak/>
+              <w:t>編輯其資訊</w:t>
             </w:r>
             <w:r>
               <w:rPr>
@@ -1494,7 +1539,6 @@
               <w:rPr>
                 <w:rFonts w:ascii="Times New Roman" w:eastAsia="標楷體" w:hAnsi="Times New Roman" w:cs="Times New Roman" w:hint="eastAsia"/>
               </w:rPr>
-              <w:lastRenderedPageBreak/>
               <w:t>買家：希望看到最準確、即時的</w:t>
             </w:r>
             <w:r>
@@ -2388,7 +2432,6 @@
         <w:rPr>
           <w:rFonts w:hint="eastAsia"/>
         </w:rPr>
-        <w:lastRenderedPageBreak/>
         <w:t xml:space="preserve">1.5.2 </w:t>
       </w:r>
       <w:r>
@@ -3262,6 +3305,7 @@
               <w:rPr>
                 <w:rFonts w:ascii="Times New Roman" w:eastAsia="標楷體" w:hAnsi="Times New Roman" w:cs="Times New Roman" w:hint="eastAsia"/>
               </w:rPr>
+              <w:lastRenderedPageBreak/>
               <w:t>Scope</w:t>
             </w:r>
           </w:p>
@@ -3348,7 +3392,6 @@
               <w:rPr>
                 <w:rFonts w:ascii="Times New Roman" w:eastAsia="標楷體" w:hAnsi="Times New Roman" w:cs="Times New Roman" w:hint="eastAsia"/>
               </w:rPr>
-              <w:lastRenderedPageBreak/>
               <w:t>Primary Actor</w:t>
             </w:r>
           </w:p>
@@ -3948,6 +3991,7 @@
               <w:rPr>
                 <w:rFonts w:ascii="Times New Roman" w:eastAsia="標楷體" w:hAnsi="Times New Roman" w:cs="Times New Roman" w:hint="eastAsia"/>
               </w:rPr>
+              <w:lastRenderedPageBreak/>
               <w:t>Frequency of Occurrence</w:t>
             </w:r>
           </w:p>
@@ -4018,14 +4062,7 @@
               <w:rPr>
                 <w:rFonts w:ascii="Times New Roman" w:eastAsia="標楷體" w:hAnsi="Times New Roman" w:cs="Times New Roman"/>
               </w:rPr>
-              <w:t>例</w:t>
-            </w:r>
-            <w:r>
-              <w:rPr>
-                <w:rFonts w:ascii="Times New Roman" w:eastAsia="標楷體" w:hAnsi="Times New Roman" w:cs="Times New Roman"/>
-              </w:rPr>
-              <w:lastRenderedPageBreak/>
-              <w:t>如：訂單成立後</w:t>
+              <w:t>例如：訂單成立後</w:t>
             </w:r>
             <w:r>
               <w:rPr>
@@ -8309,20 +8346,16 @@
           <w:ilvl w:val="0"/>
           <w:numId w:val="11"/>
         </w:numPr>
-      </w:pPr>
-      <w:r>
         <w:rPr>
           <w:rFonts w:hint="eastAsia"/>
         </w:rPr>
+      </w:pPr>
+      <w:r>
+        <w:rPr>
+          <w:rFonts w:hint="eastAsia"/>
+        </w:rPr>
         <w:t>Domain model</w:t>
       </w:r>
-    </w:p>
-    <w:p>
-      <w:pPr>
-        <w:rPr>
-          <w:rFonts w:ascii="Times New Roman" w:eastAsia="標楷體" w:hAnsi="Times New Roman" w:cs="Times New Roman"/>
-        </w:rPr>
-      </w:pPr>
     </w:p>
     <w:p>
       <w:pPr>
@@ -9430,7 +9463,6 @@
         <w:rPr>
           <w:rFonts w:ascii="Times New Roman" w:eastAsia="標楷體" w:hAnsi="Times New Roman" w:cs="Times New Roman" w:hint="eastAsia"/>
         </w:rPr>
-        <w:lastRenderedPageBreak/>
         <w:t>類別名稱：應作為</w:t>
       </w:r>
       <w:r>
@@ -9461,6 +9493,7 @@
         <w:rPr>
           <w:rFonts w:ascii="Times New Roman" w:eastAsia="標楷體" w:hAnsi="Times New Roman" w:cs="Times New Roman" w:hint="eastAsia"/>
         </w:rPr>
+        <w:lastRenderedPageBreak/>
         <w:t>訂單資訊：這只是一堆</w:t>
       </w:r>
       <w:r>
@@ -10203,9 +10236,9 @@
           <w:noProof/>
         </w:rPr>
         <w:drawing>
-          <wp:inline distT="0" distB="0" distL="0" distR="0" wp14:anchorId="631A6759" wp14:editId="11639DC7">
-            <wp:extent cx="8194890" cy="3494619"/>
-            <wp:effectExtent l="0" t="0" r="3810" b="0"/>
+          <wp:inline distT="0" distB="0" distL="0" distR="0" wp14:anchorId="631A6759" wp14:editId="441E91AE">
+            <wp:extent cx="7725199" cy="3294324"/>
+            <wp:effectExtent l="0" t="0" r="0" b="0"/>
             <wp:docPr id="1" name="圖片 1"/>
             <wp:cNvGraphicFramePr>
               <a:graphicFrameLocks xmlns:a="http://schemas.openxmlformats.org/drawingml/2006/main" noChangeAspect="1"/>
@@ -10226,7 +10259,7 @@
                   <pic:spPr>
                     <a:xfrm rot="5400000">
                       <a:off x="0" y="0"/>
-                      <a:ext cx="8238967" cy="3513415"/>
+                      <a:ext cx="7777476" cy="3316617"/>
                     </a:xfrm>
                     <a:prstGeom prst="rect">
                       <a:avLst/>
@@ -10237,6 +10270,44 @@
             </a:graphic>
           </wp:inline>
         </w:drawing>
+      </w:r>
+    </w:p>
+    <w:p>
+      <w:pPr>
+        <w:jc w:val="center"/>
+        <w:rPr>
+          <w:rFonts w:ascii="Times New Roman" w:eastAsia="標楷體" w:hAnsi="Times New Roman" w:cs="Times New Roman" w:hint="eastAsia"/>
+          <w:b/>
+          <w:bCs/>
+          <w:i/>
+          <w:iCs/>
+          <w:sz w:val="22"/>
+          <w:szCs w:val="22"/>
+        </w:rPr>
+      </w:pPr>
+      <w:r>
+        <w:rPr>
+          <w:rFonts w:ascii="Times New Roman" w:eastAsia="標楷體" w:hAnsi="Times New Roman" w:cs="Times New Roman" w:hint="eastAsia"/>
+          <w:b/>
+          <w:bCs/>
+          <w:i/>
+          <w:iCs/>
+          <w:sz w:val="22"/>
+          <w:szCs w:val="22"/>
+        </w:rPr>
+        <w:t xml:space="preserve">Figure 2-1 </w:t>
+      </w:r>
+      <w:r>
+        <w:rPr>
+          <w:rFonts w:ascii="Times New Roman" w:eastAsia="標楷體" w:hAnsi="Times New Roman" w:cs="Times New Roman"/>
+          <w:b/>
+          <w:bCs/>
+          <w:i/>
+          <w:iCs/>
+          <w:sz w:val="22"/>
+          <w:szCs w:val="22"/>
+        </w:rPr>
+        <w:t>Domain Class Diagram with Associations</w:t>
       </w:r>
     </w:p>
     <w:p>
@@ -10298,18 +10369,68 @@
     </w:p>
     <w:p>
       <w:pPr>
-        <w:pStyle w:val="1"/>
-      </w:pPr>
-      <w:r>
-        <w:rPr>
-          <w:rFonts w:hint="eastAsia"/>
+        <w:jc w:val="center"/>
+        <w:rPr>
+          <w:rFonts w:ascii="Times New Roman" w:eastAsia="標楷體" w:hAnsi="Times New Roman" w:cs="Times New Roman" w:hint="eastAsia"/>
+          <w:b/>
+          <w:bCs/>
+          <w:i/>
+          <w:iCs/>
+          <w:sz w:val="22"/>
+          <w:szCs w:val="22"/>
+        </w:rPr>
+      </w:pPr>
+      <w:r>
+        <w:rPr>
+          <w:rFonts w:ascii="Times New Roman" w:eastAsia="標楷體" w:hAnsi="Times New Roman" w:cs="Times New Roman" w:hint="eastAsia"/>
+          <w:b/>
+          <w:bCs/>
+          <w:i/>
+          <w:iCs/>
+          <w:sz w:val="22"/>
+          <w:szCs w:val="22"/>
         </w:rPr>
         <w:lastRenderedPageBreak/>
-        <w:t>3. Design</w:t>
+        <w:t xml:space="preserve">Figure 2-1 </w:t>
+      </w:r>
+      <w:r>
+        <w:rPr>
+          <w:rFonts w:ascii="Times New Roman" w:eastAsia="標楷體" w:hAnsi="Times New Roman" w:cs="Times New Roman"/>
+          <w:b/>
+          <w:bCs/>
+          <w:i/>
+          <w:iCs/>
+          <w:sz w:val="22"/>
+          <w:szCs w:val="22"/>
+        </w:rPr>
+        <w:t>Domain Class Diagram with A</w:t>
+      </w:r>
+      <w:r>
+        <w:rPr>
+          <w:rFonts w:ascii="Times New Roman" w:eastAsia="標楷體" w:hAnsi="Times New Roman" w:cs="Times New Roman" w:hint="eastAsia"/>
+          <w:b/>
+          <w:bCs/>
+          <w:i/>
+          <w:iCs/>
+          <w:sz w:val="22"/>
+          <w:szCs w:val="22"/>
+        </w:rPr>
+        <w:t>ttributes</w:t>
       </w:r>
     </w:p>
     <w:p>
       <w:pPr>
+        <w:pStyle w:val="1"/>
+      </w:pPr>
+      <w:r>
+        <w:rPr>
+          <w:rFonts w:hint="eastAsia"/>
+        </w:rPr>
+        <w:t>3. Design</w:t>
+      </w:r>
+    </w:p>
+    <w:p>
+      <w:pPr>
         <w:pStyle w:val="2"/>
       </w:pPr>
       <w:r>
@@ -10317,39 +10438,1743 @@
           <w:rFonts w:hint="eastAsia"/>
         </w:rPr>
         <w:t>3.1 Logical Architecture</w:t>
+      </w:r>
+    </w:p>
+    <w:p>
+      <w:pPr>
+        <w:jc w:val="center"/>
+      </w:pPr>
+      <w:r>
+        <w:drawing>
+          <wp:inline distT="0" distB="0" distL="0" distR="0" wp14:anchorId="23B9AB71" wp14:editId="712F5C4E">
+            <wp:extent cx="2400842" cy="4021105"/>
+            <wp:effectExtent l="0" t="0" r="0" b="0"/>
+            <wp:docPr id="821945353" name="圖片 2"/>
+            <wp:cNvGraphicFramePr>
+              <a:graphicFrameLocks xmlns:a="http://schemas.openxmlformats.org/drawingml/2006/main" noChangeAspect="1"/>
+            </wp:cNvGraphicFramePr>
+            <a:graphic xmlns:a="http://schemas.openxmlformats.org/drawingml/2006/main">
+              <a:graphicData uri="http://schemas.openxmlformats.org/drawingml/2006/picture">
+                <pic:pic xmlns:pic="http://schemas.openxmlformats.org/drawingml/2006/picture">
+                  <pic:nvPicPr>
+                    <pic:cNvPr id="0" name="Picture 6"/>
+                    <pic:cNvPicPr>
+                      <a:picLocks noChangeAspect="1" noChangeArrowheads="1"/>
+                    </pic:cNvPicPr>
+                  </pic:nvPicPr>
+                  <pic:blipFill>
+                    <a:blip r:embed="rId11" cstate="print">
+                      <a:extLst>
+                        <a:ext uri="{28A0092B-C50C-407E-A947-70E740481C1C}">
+                          <a14:useLocalDpi xmlns:a14="http://schemas.microsoft.com/office/drawing/2010/main" val="0"/>
+                        </a:ext>
+                      </a:extLst>
+                    </a:blip>
+                    <a:srcRect/>
+                    <a:stretch>
+                      <a:fillRect/>
+                    </a:stretch>
+                  </pic:blipFill>
+                  <pic:spPr bwMode="auto">
+                    <a:xfrm>
+                      <a:off x="0" y="0"/>
+                      <a:ext cx="2415867" cy="4046271"/>
+                    </a:xfrm>
+                    <a:prstGeom prst="rect">
+                      <a:avLst/>
+                    </a:prstGeom>
+                    <a:noFill/>
+                    <a:ln>
+                      <a:noFill/>
+                    </a:ln>
+                  </pic:spPr>
+                </pic:pic>
+              </a:graphicData>
+            </a:graphic>
+          </wp:inline>
+        </w:drawing>
+      </w:r>
+    </w:p>
+    <w:p>
+      <w:pPr>
+        <w:jc w:val="center"/>
+        <w:rPr>
+          <w:rFonts w:ascii="Times New Roman" w:eastAsia="標楷體" w:hAnsi="Times New Roman" w:cs="Times New Roman" w:hint="eastAsia"/>
+          <w:b/>
+          <w:bCs/>
+          <w:i/>
+          <w:iCs/>
+          <w:sz w:val="22"/>
+          <w:szCs w:val="22"/>
+        </w:rPr>
+      </w:pPr>
+      <w:r>
+        <w:rPr>
+          <w:rFonts w:ascii="Times New Roman" w:eastAsia="標楷體" w:hAnsi="Times New Roman" w:cs="Times New Roman" w:hint="eastAsia"/>
+          <w:b/>
+          <w:bCs/>
+          <w:i/>
+          <w:iCs/>
+          <w:sz w:val="22"/>
+          <w:szCs w:val="22"/>
+        </w:rPr>
+        <w:t xml:space="preserve">Figure </w:t>
+      </w:r>
+      <w:r>
+        <w:rPr>
+          <w:rFonts w:ascii="Times New Roman" w:eastAsia="標楷體" w:hAnsi="Times New Roman" w:cs="Times New Roman" w:hint="eastAsia"/>
+          <w:b/>
+          <w:bCs/>
+          <w:i/>
+          <w:iCs/>
+          <w:sz w:val="22"/>
+          <w:szCs w:val="22"/>
+        </w:rPr>
+        <w:t>3</w:t>
+      </w:r>
+      <w:r>
+        <w:rPr>
+          <w:rFonts w:ascii="Times New Roman" w:eastAsia="標楷體" w:hAnsi="Times New Roman" w:cs="Times New Roman" w:hint="eastAsia"/>
+          <w:b/>
+          <w:bCs/>
+          <w:i/>
+          <w:iCs/>
+          <w:sz w:val="22"/>
+          <w:szCs w:val="22"/>
+        </w:rPr>
+        <w:t xml:space="preserve">-1 </w:t>
+      </w:r>
+      <w:r>
+        <w:rPr>
+          <w:rFonts w:ascii="Times New Roman" w:eastAsia="標楷體" w:hAnsi="Times New Roman" w:cs="Times New Roman"/>
+          <w:b/>
+          <w:bCs/>
+          <w:i/>
+          <w:iCs/>
+          <w:sz w:val="22"/>
+          <w:szCs w:val="22"/>
+        </w:rPr>
+        <w:t>Logical Architecture</w:t>
+      </w:r>
+      <w:r>
+        <w:rPr>
+          <w:rFonts w:ascii="Times New Roman" w:eastAsia="標楷體" w:hAnsi="Times New Roman" w:cs="Times New Roman"/>
+          <w:b/>
+          <w:bCs/>
+          <w:i/>
+          <w:iCs/>
+          <w:sz w:val="22"/>
+          <w:szCs w:val="22"/>
+        </w:rPr>
+        <w:t xml:space="preserve"> </w:t>
+      </w:r>
+      <w:r>
+        <w:rPr>
+          <w:rFonts w:ascii="Times New Roman" w:eastAsia="標楷體" w:hAnsi="Times New Roman" w:cs="Times New Roman"/>
+          <w:b/>
+          <w:bCs/>
+          <w:i/>
+          <w:iCs/>
+          <w:sz w:val="22"/>
+          <w:szCs w:val="22"/>
+        </w:rPr>
+        <w:t>Diagram</w:t>
+      </w:r>
+    </w:p>
+    <w:p>
+      <w:pPr>
+        <w:pStyle w:val="2"/>
+      </w:pPr>
+      <w:r>
+        <w:rPr>
+          <w:rFonts w:hint="eastAsia"/>
+        </w:rPr>
+        <w:t>3.2 Use-Case Realizations with GRASP Patterns</w:t>
+      </w:r>
+    </w:p>
+    <w:p>
+      <w:pPr>
+        <w:pStyle w:val="3"/>
+      </w:pPr>
+      <w:r>
+        <w:rPr>
+          <w:rFonts w:hint="eastAsia"/>
+        </w:rPr>
+        <w:t>3.2.1 System Sequence Diagram</w:t>
+      </w:r>
+    </w:p>
+    <w:p>
+      <w:pPr>
+        <w:jc w:val="center"/>
+      </w:pPr>
+      <w:r>
+        <w:drawing>
+          <wp:inline distT="0" distB="0" distL="0" distR="0" wp14:anchorId="3464DDB7" wp14:editId="577D62A5">
+            <wp:extent cx="3198233" cy="1357690"/>
+            <wp:effectExtent l="0" t="0" r="2540" b="0"/>
+            <wp:docPr id="2005860709" name="圖片 1"/>
+            <wp:cNvGraphicFramePr>
+              <a:graphicFrameLocks xmlns:a="http://schemas.openxmlformats.org/drawingml/2006/main" noChangeAspect="1"/>
+            </wp:cNvGraphicFramePr>
+            <a:graphic xmlns:a="http://schemas.openxmlformats.org/drawingml/2006/main">
+              <a:graphicData uri="http://schemas.openxmlformats.org/drawingml/2006/picture">
+                <pic:pic xmlns:pic="http://schemas.openxmlformats.org/drawingml/2006/picture">
+                  <pic:nvPicPr>
+                    <pic:cNvPr id="2005860709" name=""/>
+                    <pic:cNvPicPr/>
+                  </pic:nvPicPr>
+                  <pic:blipFill>
+                    <a:blip r:embed="rId12"/>
+                    <a:stretch>
+                      <a:fillRect/>
+                    </a:stretch>
+                  </pic:blipFill>
+                  <pic:spPr>
+                    <a:xfrm>
+                      <a:off x="0" y="0"/>
+                      <a:ext cx="3244505" cy="1377333"/>
+                    </a:xfrm>
+                    <a:prstGeom prst="rect">
+                      <a:avLst/>
+                    </a:prstGeom>
+                  </pic:spPr>
+                </pic:pic>
+              </a:graphicData>
+            </a:graphic>
+          </wp:inline>
+        </w:drawing>
+      </w:r>
+    </w:p>
+    <w:p>
+      <w:pPr>
+        <w:jc w:val="center"/>
+        <w:rPr>
+          <w:rFonts w:ascii="Times New Roman" w:eastAsia="標楷體" w:hAnsi="Times New Roman" w:cs="Times New Roman" w:hint="eastAsia"/>
+          <w:b/>
+          <w:bCs/>
+          <w:i/>
+          <w:iCs/>
+          <w:sz w:val="22"/>
+          <w:szCs w:val="22"/>
+        </w:rPr>
+      </w:pPr>
+      <w:r>
+        <w:rPr>
+          <w:rFonts w:ascii="Times New Roman" w:eastAsia="標楷體" w:hAnsi="Times New Roman" w:cs="Times New Roman" w:hint="eastAsia"/>
+          <w:b/>
+          <w:bCs/>
+          <w:i/>
+          <w:iCs/>
+          <w:sz w:val="22"/>
+          <w:szCs w:val="22"/>
+        </w:rPr>
+        <w:t xml:space="preserve">Figure </w:t>
+      </w:r>
+      <w:r>
+        <w:rPr>
+          <w:rFonts w:ascii="Times New Roman" w:eastAsia="標楷體" w:hAnsi="Times New Roman" w:cs="Times New Roman" w:hint="eastAsia"/>
+          <w:b/>
+          <w:bCs/>
+          <w:i/>
+          <w:iCs/>
+          <w:sz w:val="22"/>
+          <w:szCs w:val="22"/>
+        </w:rPr>
+        <w:t>3</w:t>
+      </w:r>
+      <w:r>
+        <w:rPr>
+          <w:rFonts w:ascii="Times New Roman" w:eastAsia="標楷體" w:hAnsi="Times New Roman" w:cs="Times New Roman" w:hint="eastAsia"/>
+          <w:b/>
+          <w:bCs/>
+          <w:i/>
+          <w:iCs/>
+          <w:sz w:val="22"/>
+          <w:szCs w:val="22"/>
+        </w:rPr>
+        <w:t>-</w:t>
+      </w:r>
+      <w:r>
+        <w:rPr>
+          <w:rFonts w:ascii="Times New Roman" w:eastAsia="標楷體" w:hAnsi="Times New Roman" w:cs="Times New Roman" w:hint="eastAsia"/>
+          <w:b/>
+          <w:bCs/>
+          <w:i/>
+          <w:iCs/>
+          <w:sz w:val="22"/>
+          <w:szCs w:val="22"/>
+        </w:rPr>
+        <w:t>2</w:t>
+      </w:r>
+      <w:r>
+        <w:rPr>
+          <w:rFonts w:ascii="Times New Roman" w:eastAsia="標楷體" w:hAnsi="Times New Roman" w:cs="Times New Roman" w:hint="eastAsia"/>
+          <w:b/>
+          <w:bCs/>
+          <w:i/>
+          <w:iCs/>
+          <w:sz w:val="22"/>
+          <w:szCs w:val="22"/>
+        </w:rPr>
+        <w:t xml:space="preserve"> </w:t>
+      </w:r>
+      <w:r>
+        <w:rPr>
+          <w:rFonts w:ascii="Times New Roman" w:eastAsia="標楷體" w:hAnsi="Times New Roman" w:cs="Times New Roman" w:hint="eastAsia"/>
+          <w:b/>
+          <w:bCs/>
+          <w:i/>
+          <w:iCs/>
+          <w:sz w:val="22"/>
+          <w:szCs w:val="22"/>
+        </w:rPr>
+        <w:t>System Sequence Diagram of FEA-03</w:t>
+      </w:r>
+    </w:p>
+    <w:p>
+      <w:pPr>
+        <w:jc w:val="center"/>
+        <w:rPr>
+          <w:rFonts w:hint="eastAsia"/>
+        </w:rPr>
+      </w:pPr>
+      <w:r>
+        <w:lastRenderedPageBreak/>
+        <w:drawing>
+          <wp:inline distT="0" distB="0" distL="0" distR="0" wp14:anchorId="2570E9FD" wp14:editId="5B2AE440">
+            <wp:extent cx="3354244" cy="1503069"/>
+            <wp:effectExtent l="0" t="0" r="0" b="1905"/>
+            <wp:docPr id="397868409" name="圖片 1"/>
+            <wp:cNvGraphicFramePr>
+              <a:graphicFrameLocks xmlns:a="http://schemas.openxmlformats.org/drawingml/2006/main" noChangeAspect="1"/>
+            </wp:cNvGraphicFramePr>
+            <a:graphic xmlns:a="http://schemas.openxmlformats.org/drawingml/2006/main">
+              <a:graphicData uri="http://schemas.openxmlformats.org/drawingml/2006/picture">
+                <pic:pic xmlns:pic="http://schemas.openxmlformats.org/drawingml/2006/picture">
+                  <pic:nvPicPr>
+                    <pic:cNvPr id="397868409" name=""/>
+                    <pic:cNvPicPr/>
+                  </pic:nvPicPr>
+                  <pic:blipFill>
+                    <a:blip r:embed="rId13"/>
+                    <a:stretch>
+                      <a:fillRect/>
+                    </a:stretch>
+                  </pic:blipFill>
+                  <pic:spPr>
+                    <a:xfrm>
+                      <a:off x="0" y="0"/>
+                      <a:ext cx="3408550" cy="1527404"/>
+                    </a:xfrm>
+                    <a:prstGeom prst="rect">
+                      <a:avLst/>
+                    </a:prstGeom>
+                  </pic:spPr>
+                </pic:pic>
+              </a:graphicData>
+            </a:graphic>
+          </wp:inline>
+        </w:drawing>
+      </w:r>
+    </w:p>
+    <w:p>
+      <w:pPr>
+        <w:jc w:val="center"/>
+        <w:rPr>
+          <w:rFonts w:ascii="Times New Roman" w:eastAsia="標楷體" w:hAnsi="Times New Roman" w:cs="Times New Roman" w:hint="eastAsia"/>
+          <w:b/>
+          <w:bCs/>
+          <w:i/>
+          <w:iCs/>
+          <w:sz w:val="22"/>
+          <w:szCs w:val="22"/>
+        </w:rPr>
+      </w:pPr>
+      <w:r>
+        <w:rPr>
+          <w:rFonts w:ascii="Times New Roman" w:eastAsia="標楷體" w:hAnsi="Times New Roman" w:cs="Times New Roman" w:hint="eastAsia"/>
+          <w:b/>
+          <w:bCs/>
+          <w:i/>
+          <w:iCs/>
+          <w:sz w:val="22"/>
+          <w:szCs w:val="22"/>
+        </w:rPr>
+        <w:t xml:space="preserve">Figure </w:t>
+      </w:r>
+      <w:r>
+        <w:rPr>
+          <w:rFonts w:ascii="Times New Roman" w:eastAsia="標楷體" w:hAnsi="Times New Roman" w:cs="Times New Roman" w:hint="eastAsia"/>
+          <w:b/>
+          <w:bCs/>
+          <w:i/>
+          <w:iCs/>
+          <w:sz w:val="22"/>
+          <w:szCs w:val="22"/>
+        </w:rPr>
+        <w:t>3</w:t>
+      </w:r>
+      <w:r>
+        <w:rPr>
+          <w:rFonts w:ascii="Times New Roman" w:eastAsia="標楷體" w:hAnsi="Times New Roman" w:cs="Times New Roman" w:hint="eastAsia"/>
+          <w:b/>
+          <w:bCs/>
+          <w:i/>
+          <w:iCs/>
+          <w:sz w:val="22"/>
+          <w:szCs w:val="22"/>
+        </w:rPr>
+        <w:t>-</w:t>
+      </w:r>
+      <w:r>
+        <w:rPr>
+          <w:rFonts w:ascii="Times New Roman" w:eastAsia="標楷體" w:hAnsi="Times New Roman" w:cs="Times New Roman" w:hint="eastAsia"/>
+          <w:b/>
+          <w:bCs/>
+          <w:i/>
+          <w:iCs/>
+          <w:sz w:val="22"/>
+          <w:szCs w:val="22"/>
+        </w:rPr>
+        <w:t>3</w:t>
+      </w:r>
+      <w:r>
+        <w:rPr>
+          <w:rFonts w:ascii="Times New Roman" w:eastAsia="標楷體" w:hAnsi="Times New Roman" w:cs="Times New Roman" w:hint="eastAsia"/>
+          <w:b/>
+          <w:bCs/>
+          <w:i/>
+          <w:iCs/>
+          <w:sz w:val="22"/>
+          <w:szCs w:val="22"/>
+        </w:rPr>
+        <w:t xml:space="preserve"> </w:t>
+      </w:r>
+      <w:r>
+        <w:rPr>
+          <w:rFonts w:ascii="Times New Roman" w:eastAsia="標楷體" w:hAnsi="Times New Roman" w:cs="Times New Roman" w:hint="eastAsia"/>
+          <w:b/>
+          <w:bCs/>
+          <w:i/>
+          <w:iCs/>
+          <w:sz w:val="22"/>
+          <w:szCs w:val="22"/>
+        </w:rPr>
+        <w:t>System Sequence Diagram of FEA-0</w:t>
+      </w:r>
+      <w:r>
+        <w:rPr>
+          <w:rFonts w:ascii="Times New Roman" w:eastAsia="標楷體" w:hAnsi="Times New Roman" w:cs="Times New Roman" w:hint="eastAsia"/>
+          <w:b/>
+          <w:bCs/>
+          <w:i/>
+          <w:iCs/>
+          <w:sz w:val="22"/>
+          <w:szCs w:val="22"/>
+        </w:rPr>
+        <w:t>1</w:t>
+      </w:r>
+      <w:r>
+        <w:rPr>
+          <w:rFonts w:ascii="Times New Roman" w:eastAsia="標楷體" w:hAnsi="Times New Roman" w:cs="Times New Roman" w:hint="eastAsia"/>
+          <w:b/>
+          <w:bCs/>
+          <w:i/>
+          <w:iCs/>
+          <w:sz w:val="22"/>
+          <w:szCs w:val="22"/>
+        </w:rPr>
+        <w:t>: add book</w:t>
+      </w:r>
+    </w:p>
+    <w:p>
+      <w:pPr>
+        <w:jc w:val="center"/>
+      </w:pPr>
+      <w:r>
+        <w:drawing>
+          <wp:inline distT="0" distB="0" distL="0" distR="0" wp14:anchorId="340815CF" wp14:editId="7E89E59B">
+            <wp:extent cx="3258905" cy="1460347"/>
+            <wp:effectExtent l="0" t="0" r="0" b="6985"/>
+            <wp:docPr id="1635343776" name="圖片 1"/>
+            <wp:cNvGraphicFramePr>
+              <a:graphicFrameLocks xmlns:a="http://schemas.openxmlformats.org/drawingml/2006/main" noChangeAspect="1"/>
+            </wp:cNvGraphicFramePr>
+            <a:graphic xmlns:a="http://schemas.openxmlformats.org/drawingml/2006/main">
+              <a:graphicData uri="http://schemas.openxmlformats.org/drawingml/2006/picture">
+                <pic:pic xmlns:pic="http://schemas.openxmlformats.org/drawingml/2006/picture">
+                  <pic:nvPicPr>
+                    <pic:cNvPr id="1635343776" name=""/>
+                    <pic:cNvPicPr/>
+                  </pic:nvPicPr>
+                  <pic:blipFill>
+                    <a:blip r:embed="rId14"/>
+                    <a:stretch>
+                      <a:fillRect/>
+                    </a:stretch>
+                  </pic:blipFill>
+                  <pic:spPr>
+                    <a:xfrm>
+                      <a:off x="0" y="0"/>
+                      <a:ext cx="3270591" cy="1465584"/>
+                    </a:xfrm>
+                    <a:prstGeom prst="rect">
+                      <a:avLst/>
+                    </a:prstGeom>
+                  </pic:spPr>
+                </pic:pic>
+              </a:graphicData>
+            </a:graphic>
+          </wp:inline>
+        </w:drawing>
+      </w:r>
+    </w:p>
+    <w:p>
+      <w:pPr>
+        <w:jc w:val="center"/>
+        <w:rPr>
+          <w:rFonts w:ascii="Times New Roman" w:eastAsia="標楷體" w:hAnsi="Times New Roman" w:cs="Times New Roman" w:hint="eastAsia"/>
+          <w:b/>
+          <w:bCs/>
+          <w:i/>
+          <w:iCs/>
+          <w:sz w:val="22"/>
+          <w:szCs w:val="22"/>
+        </w:rPr>
+      </w:pPr>
+      <w:r>
+        <w:rPr>
+          <w:rFonts w:ascii="Times New Roman" w:eastAsia="標楷體" w:hAnsi="Times New Roman" w:cs="Times New Roman" w:hint="eastAsia"/>
+          <w:b/>
+          <w:bCs/>
+          <w:i/>
+          <w:iCs/>
+          <w:sz w:val="22"/>
+          <w:szCs w:val="22"/>
+        </w:rPr>
+        <w:t xml:space="preserve">Figure </w:t>
+      </w:r>
+      <w:r>
+        <w:rPr>
+          <w:rFonts w:ascii="Times New Roman" w:eastAsia="標楷體" w:hAnsi="Times New Roman" w:cs="Times New Roman" w:hint="eastAsia"/>
+          <w:b/>
+          <w:bCs/>
+          <w:i/>
+          <w:iCs/>
+          <w:sz w:val="22"/>
+          <w:szCs w:val="22"/>
+        </w:rPr>
+        <w:t>3</w:t>
+      </w:r>
+      <w:r>
+        <w:rPr>
+          <w:rFonts w:ascii="Times New Roman" w:eastAsia="標楷體" w:hAnsi="Times New Roman" w:cs="Times New Roman" w:hint="eastAsia"/>
+          <w:b/>
+          <w:bCs/>
+          <w:i/>
+          <w:iCs/>
+          <w:sz w:val="22"/>
+          <w:szCs w:val="22"/>
+        </w:rPr>
+        <w:t>-</w:t>
+      </w:r>
+      <w:r>
+        <w:rPr>
+          <w:rFonts w:ascii="Times New Roman" w:eastAsia="標楷體" w:hAnsi="Times New Roman" w:cs="Times New Roman" w:hint="eastAsia"/>
+          <w:b/>
+          <w:bCs/>
+          <w:i/>
+          <w:iCs/>
+          <w:sz w:val="22"/>
+          <w:szCs w:val="22"/>
+        </w:rPr>
+        <w:t>4</w:t>
+      </w:r>
+      <w:r>
+        <w:rPr>
+          <w:rFonts w:ascii="Times New Roman" w:eastAsia="標楷體" w:hAnsi="Times New Roman" w:cs="Times New Roman" w:hint="eastAsia"/>
+          <w:b/>
+          <w:bCs/>
+          <w:i/>
+          <w:iCs/>
+          <w:sz w:val="22"/>
+          <w:szCs w:val="22"/>
+        </w:rPr>
+        <w:t xml:space="preserve"> </w:t>
+      </w:r>
+      <w:r>
+        <w:rPr>
+          <w:rFonts w:ascii="Times New Roman" w:eastAsia="標楷體" w:hAnsi="Times New Roman" w:cs="Times New Roman" w:hint="eastAsia"/>
+          <w:b/>
+          <w:bCs/>
+          <w:i/>
+          <w:iCs/>
+          <w:sz w:val="22"/>
+          <w:szCs w:val="22"/>
+        </w:rPr>
+        <w:t xml:space="preserve">System Sequence Diagram of FEA-01: </w:t>
+      </w:r>
+      <w:r>
+        <w:rPr>
+          <w:rFonts w:ascii="Times New Roman" w:eastAsia="標楷體" w:hAnsi="Times New Roman" w:cs="Times New Roman" w:hint="eastAsia"/>
+          <w:b/>
+          <w:bCs/>
+          <w:i/>
+          <w:iCs/>
+          <w:sz w:val="22"/>
+          <w:szCs w:val="22"/>
+        </w:rPr>
+        <w:t>view</w:t>
+      </w:r>
+      <w:r>
+        <w:rPr>
+          <w:rFonts w:ascii="Times New Roman" w:eastAsia="標楷體" w:hAnsi="Times New Roman" w:cs="Times New Roman" w:hint="eastAsia"/>
+          <w:b/>
+          <w:bCs/>
+          <w:i/>
+          <w:iCs/>
+          <w:sz w:val="22"/>
+          <w:szCs w:val="22"/>
+        </w:rPr>
+        <w:t xml:space="preserve"> book</w:t>
+      </w:r>
+      <w:r>
+        <w:rPr>
+          <w:rFonts w:ascii="Times New Roman" w:eastAsia="標楷體" w:hAnsi="Times New Roman" w:cs="Times New Roman" w:hint="eastAsia"/>
+          <w:b/>
+          <w:bCs/>
+          <w:i/>
+          <w:iCs/>
+          <w:sz w:val="22"/>
+          <w:szCs w:val="22"/>
+        </w:rPr>
+        <w:t xml:space="preserve"> list</w:t>
+      </w:r>
+    </w:p>
+    <w:p>
+      <w:pPr>
+        <w:jc w:val="center"/>
+      </w:pPr>
+      <w:r>
+        <w:drawing>
+          <wp:inline distT="0" distB="0" distL="0" distR="0" wp14:anchorId="0CBE34B2" wp14:editId="736C72CB">
+            <wp:extent cx="3129153" cy="1402204"/>
+            <wp:effectExtent l="0" t="0" r="0" b="7620"/>
+            <wp:docPr id="1586646722" name="圖片 1"/>
+            <wp:cNvGraphicFramePr>
+              <a:graphicFrameLocks xmlns:a="http://schemas.openxmlformats.org/drawingml/2006/main" noChangeAspect="1"/>
+            </wp:cNvGraphicFramePr>
+            <a:graphic xmlns:a="http://schemas.openxmlformats.org/drawingml/2006/main">
+              <a:graphicData uri="http://schemas.openxmlformats.org/drawingml/2006/picture">
+                <pic:pic xmlns:pic="http://schemas.openxmlformats.org/drawingml/2006/picture">
+                  <pic:nvPicPr>
+                    <pic:cNvPr id="1586646722" name=""/>
+                    <pic:cNvPicPr/>
+                  </pic:nvPicPr>
+                  <pic:blipFill>
+                    <a:blip r:embed="rId15"/>
+                    <a:stretch>
+                      <a:fillRect/>
+                    </a:stretch>
+                  </pic:blipFill>
+                  <pic:spPr>
+                    <a:xfrm>
+                      <a:off x="0" y="0"/>
+                      <a:ext cx="3172902" cy="1421808"/>
+                    </a:xfrm>
+                    <a:prstGeom prst="rect">
+                      <a:avLst/>
+                    </a:prstGeom>
+                  </pic:spPr>
+                </pic:pic>
+              </a:graphicData>
+            </a:graphic>
+          </wp:inline>
+        </w:drawing>
+      </w:r>
+    </w:p>
+    <w:p>
+      <w:pPr>
+        <w:jc w:val="center"/>
+        <w:rPr>
+          <w:rFonts w:ascii="Times New Roman" w:eastAsia="標楷體" w:hAnsi="Times New Roman" w:cs="Times New Roman" w:hint="eastAsia"/>
+          <w:b/>
+          <w:bCs/>
+          <w:i/>
+          <w:iCs/>
+          <w:sz w:val="22"/>
+          <w:szCs w:val="22"/>
+        </w:rPr>
+      </w:pPr>
+      <w:r>
+        <w:rPr>
+          <w:rFonts w:ascii="Times New Roman" w:eastAsia="標楷體" w:hAnsi="Times New Roman" w:cs="Times New Roman" w:hint="eastAsia"/>
+          <w:b/>
+          <w:bCs/>
+          <w:i/>
+          <w:iCs/>
+          <w:sz w:val="22"/>
+          <w:szCs w:val="22"/>
+        </w:rPr>
+        <w:t xml:space="preserve">Figure </w:t>
+      </w:r>
+      <w:r>
+        <w:rPr>
+          <w:rFonts w:ascii="Times New Roman" w:eastAsia="標楷體" w:hAnsi="Times New Roman" w:cs="Times New Roman" w:hint="eastAsia"/>
+          <w:b/>
+          <w:bCs/>
+          <w:i/>
+          <w:iCs/>
+          <w:sz w:val="22"/>
+          <w:szCs w:val="22"/>
+        </w:rPr>
+        <w:t>3</w:t>
+      </w:r>
+      <w:r>
+        <w:rPr>
+          <w:rFonts w:ascii="Times New Roman" w:eastAsia="標楷體" w:hAnsi="Times New Roman" w:cs="Times New Roman" w:hint="eastAsia"/>
+          <w:b/>
+          <w:bCs/>
+          <w:i/>
+          <w:iCs/>
+          <w:sz w:val="22"/>
+          <w:szCs w:val="22"/>
+        </w:rPr>
+        <w:t>-</w:t>
+      </w:r>
+      <w:r>
+        <w:rPr>
+          <w:rFonts w:ascii="Times New Roman" w:eastAsia="標楷體" w:hAnsi="Times New Roman" w:cs="Times New Roman" w:hint="eastAsia"/>
+          <w:b/>
+          <w:bCs/>
+          <w:i/>
+          <w:iCs/>
+          <w:sz w:val="22"/>
+          <w:szCs w:val="22"/>
+        </w:rPr>
+        <w:t>5</w:t>
+      </w:r>
+      <w:r>
+        <w:rPr>
+          <w:rFonts w:ascii="Times New Roman" w:eastAsia="標楷體" w:hAnsi="Times New Roman" w:cs="Times New Roman" w:hint="eastAsia"/>
+          <w:b/>
+          <w:bCs/>
+          <w:i/>
+          <w:iCs/>
+          <w:sz w:val="22"/>
+          <w:szCs w:val="22"/>
+        </w:rPr>
+        <w:t xml:space="preserve"> </w:t>
+      </w:r>
+      <w:r>
+        <w:rPr>
+          <w:rFonts w:ascii="Times New Roman" w:eastAsia="標楷體" w:hAnsi="Times New Roman" w:cs="Times New Roman" w:hint="eastAsia"/>
+          <w:b/>
+          <w:bCs/>
+          <w:i/>
+          <w:iCs/>
+          <w:sz w:val="22"/>
+          <w:szCs w:val="22"/>
+        </w:rPr>
+        <w:t xml:space="preserve">System Sequence Diagram of FEA-01: </w:t>
+      </w:r>
+      <w:r>
+        <w:rPr>
+          <w:rFonts w:ascii="Times New Roman" w:eastAsia="標楷體" w:hAnsi="Times New Roman" w:cs="Times New Roman" w:hint="eastAsia"/>
+          <w:b/>
+          <w:bCs/>
+          <w:i/>
+          <w:iCs/>
+          <w:sz w:val="22"/>
+          <w:szCs w:val="22"/>
+        </w:rPr>
+        <w:t>update</w:t>
+      </w:r>
+      <w:r>
+        <w:rPr>
+          <w:rFonts w:ascii="Times New Roman" w:eastAsia="標楷體" w:hAnsi="Times New Roman" w:cs="Times New Roman" w:hint="eastAsia"/>
+          <w:b/>
+          <w:bCs/>
+          <w:i/>
+          <w:iCs/>
+          <w:sz w:val="22"/>
+          <w:szCs w:val="22"/>
+        </w:rPr>
+        <w:t xml:space="preserve"> book</w:t>
+      </w:r>
+    </w:p>
+    <w:p>
+      <w:pPr>
+        <w:jc w:val="center"/>
+      </w:pPr>
+      <w:r>
+        <w:drawing>
+          <wp:inline distT="0" distB="0" distL="0" distR="0" wp14:anchorId="58C89F6E" wp14:editId="2BD3494C">
+            <wp:extent cx="3302499" cy="1479882"/>
+            <wp:effectExtent l="0" t="0" r="0" b="6350"/>
+            <wp:docPr id="353923455" name="圖片 1"/>
+            <wp:cNvGraphicFramePr>
+              <a:graphicFrameLocks xmlns:a="http://schemas.openxmlformats.org/drawingml/2006/main" noChangeAspect="1"/>
+            </wp:cNvGraphicFramePr>
+            <a:graphic xmlns:a="http://schemas.openxmlformats.org/drawingml/2006/main">
+              <a:graphicData uri="http://schemas.openxmlformats.org/drawingml/2006/picture">
+                <pic:pic xmlns:pic="http://schemas.openxmlformats.org/drawingml/2006/picture">
+                  <pic:nvPicPr>
+                    <pic:cNvPr id="353923455" name=""/>
+                    <pic:cNvPicPr/>
+                  </pic:nvPicPr>
+                  <pic:blipFill>
+                    <a:blip r:embed="rId16"/>
+                    <a:stretch>
+                      <a:fillRect/>
+                    </a:stretch>
+                  </pic:blipFill>
+                  <pic:spPr>
+                    <a:xfrm>
+                      <a:off x="0" y="0"/>
+                      <a:ext cx="3335583" cy="1494707"/>
+                    </a:xfrm>
+                    <a:prstGeom prst="rect">
+                      <a:avLst/>
+                    </a:prstGeom>
+                  </pic:spPr>
+                </pic:pic>
+              </a:graphicData>
+            </a:graphic>
+          </wp:inline>
+        </w:drawing>
+      </w:r>
+    </w:p>
+    <w:p>
+      <w:pPr>
+        <w:jc w:val="center"/>
+        <w:rPr>
+          <w:rFonts w:hint="eastAsia"/>
+        </w:rPr>
+      </w:pPr>
+      <w:r>
+        <w:rPr>
+          <w:rFonts w:ascii="Times New Roman" w:eastAsia="標楷體" w:hAnsi="Times New Roman" w:cs="Times New Roman" w:hint="eastAsia"/>
+          <w:b/>
+          <w:bCs/>
+          <w:i/>
+          <w:iCs/>
+          <w:sz w:val="22"/>
+          <w:szCs w:val="22"/>
+        </w:rPr>
+        <w:t xml:space="preserve">Figure </w:t>
+      </w:r>
+      <w:r>
+        <w:rPr>
+          <w:rFonts w:ascii="Times New Roman" w:eastAsia="標楷體" w:hAnsi="Times New Roman" w:cs="Times New Roman" w:hint="eastAsia"/>
+          <w:b/>
+          <w:bCs/>
+          <w:i/>
+          <w:iCs/>
+          <w:sz w:val="22"/>
+          <w:szCs w:val="22"/>
+        </w:rPr>
+        <w:t>3</w:t>
+      </w:r>
+      <w:r>
+        <w:rPr>
+          <w:rFonts w:ascii="Times New Roman" w:eastAsia="標楷體" w:hAnsi="Times New Roman" w:cs="Times New Roman" w:hint="eastAsia"/>
+          <w:b/>
+          <w:bCs/>
+          <w:i/>
+          <w:iCs/>
+          <w:sz w:val="22"/>
+          <w:szCs w:val="22"/>
+        </w:rPr>
+        <w:t>-</w:t>
+      </w:r>
+      <w:r>
+        <w:rPr>
+          <w:rFonts w:ascii="Times New Roman" w:eastAsia="標楷體" w:hAnsi="Times New Roman" w:cs="Times New Roman" w:hint="eastAsia"/>
+          <w:b/>
+          <w:bCs/>
+          <w:i/>
+          <w:iCs/>
+          <w:sz w:val="22"/>
+          <w:szCs w:val="22"/>
+        </w:rPr>
+        <w:t>6</w:t>
+      </w:r>
+      <w:r>
+        <w:rPr>
+          <w:rFonts w:ascii="Times New Roman" w:eastAsia="標楷體" w:hAnsi="Times New Roman" w:cs="Times New Roman" w:hint="eastAsia"/>
+          <w:b/>
+          <w:bCs/>
+          <w:i/>
+          <w:iCs/>
+          <w:sz w:val="22"/>
+          <w:szCs w:val="22"/>
+        </w:rPr>
+        <w:t xml:space="preserve"> </w:t>
+      </w:r>
+      <w:r>
+        <w:rPr>
+          <w:rFonts w:ascii="Times New Roman" w:eastAsia="標楷體" w:hAnsi="Times New Roman" w:cs="Times New Roman" w:hint="eastAsia"/>
+          <w:b/>
+          <w:bCs/>
+          <w:i/>
+          <w:iCs/>
+          <w:sz w:val="22"/>
+          <w:szCs w:val="22"/>
+        </w:rPr>
+        <w:t xml:space="preserve">System Sequence Diagram of FEA-01: </w:t>
+      </w:r>
+      <w:r>
+        <w:rPr>
+          <w:rFonts w:ascii="Times New Roman" w:eastAsia="標楷體" w:hAnsi="Times New Roman" w:cs="Times New Roman" w:hint="eastAsia"/>
+          <w:b/>
+          <w:bCs/>
+          <w:i/>
+          <w:iCs/>
+          <w:sz w:val="22"/>
+          <w:szCs w:val="22"/>
+        </w:rPr>
+        <w:t>delete</w:t>
+      </w:r>
+      <w:r>
+        <w:rPr>
+          <w:rFonts w:ascii="Times New Roman" w:eastAsia="標楷體" w:hAnsi="Times New Roman" w:cs="Times New Roman" w:hint="eastAsia"/>
+          <w:b/>
+          <w:bCs/>
+          <w:i/>
+          <w:iCs/>
+          <w:sz w:val="22"/>
+          <w:szCs w:val="22"/>
+        </w:rPr>
+        <w:t xml:space="preserve"> book</w:t>
+      </w:r>
+    </w:p>
+    <w:p>
+      <w:pPr>
+        <w:pStyle w:val="3"/>
+        <w:rPr>
+          <w:rFonts w:hint="eastAsia"/>
+        </w:rPr>
+      </w:pPr>
+      <w:r>
+        <w:rPr>
+          <w:rFonts w:hint="eastAsia"/>
+        </w:rPr>
+        <w:lastRenderedPageBreak/>
+        <w:t>3.2.2 Operation Sequence Diagram</w:t>
+      </w:r>
+    </w:p>
+    <w:p>
+      <w:r>
+        <w:drawing>
+          <wp:inline distT="0" distB="0" distL="0" distR="0" wp14:anchorId="35655F5A" wp14:editId="12FFA824">
+            <wp:extent cx="5274310" cy="1906905"/>
+            <wp:effectExtent l="0" t="0" r="2540" b="0"/>
+            <wp:docPr id="1593557882" name="圖片 1"/>
+            <wp:cNvGraphicFramePr>
+              <a:graphicFrameLocks xmlns:a="http://schemas.openxmlformats.org/drawingml/2006/main" noChangeAspect="1"/>
+            </wp:cNvGraphicFramePr>
+            <a:graphic xmlns:a="http://schemas.openxmlformats.org/drawingml/2006/main">
+              <a:graphicData uri="http://schemas.openxmlformats.org/drawingml/2006/picture">
+                <pic:pic xmlns:pic="http://schemas.openxmlformats.org/drawingml/2006/picture">
+                  <pic:nvPicPr>
+                    <pic:cNvPr id="1593557882" name=""/>
+                    <pic:cNvPicPr/>
+                  </pic:nvPicPr>
+                  <pic:blipFill>
+                    <a:blip r:embed="rId17"/>
+                    <a:stretch>
+                      <a:fillRect/>
+                    </a:stretch>
+                  </pic:blipFill>
+                  <pic:spPr>
+                    <a:xfrm>
+                      <a:off x="0" y="0"/>
+                      <a:ext cx="5274310" cy="1906905"/>
+                    </a:xfrm>
+                    <a:prstGeom prst="rect">
+                      <a:avLst/>
+                    </a:prstGeom>
+                  </pic:spPr>
+                </pic:pic>
+              </a:graphicData>
+            </a:graphic>
+          </wp:inline>
+        </w:drawing>
+      </w:r>
+    </w:p>
+    <w:p>
+      <w:pPr>
+        <w:jc w:val="center"/>
+        <w:rPr>
+          <w:rFonts w:hint="eastAsia"/>
+        </w:rPr>
+      </w:pPr>
+      <w:r>
+        <w:rPr>
+          <w:rFonts w:ascii="Times New Roman" w:eastAsia="標楷體" w:hAnsi="Times New Roman" w:cs="Times New Roman" w:hint="eastAsia"/>
+          <w:b/>
+          <w:bCs/>
+          <w:i/>
+          <w:iCs/>
+          <w:sz w:val="22"/>
+          <w:szCs w:val="22"/>
+        </w:rPr>
+        <w:t xml:space="preserve">Figure </w:t>
+      </w:r>
+      <w:r>
+        <w:rPr>
+          <w:rFonts w:ascii="Times New Roman" w:eastAsia="標楷體" w:hAnsi="Times New Roman" w:cs="Times New Roman" w:hint="eastAsia"/>
+          <w:b/>
+          <w:bCs/>
+          <w:i/>
+          <w:iCs/>
+          <w:sz w:val="22"/>
+          <w:szCs w:val="22"/>
+        </w:rPr>
+        <w:t>3</w:t>
+      </w:r>
+      <w:r>
+        <w:rPr>
+          <w:rFonts w:ascii="Times New Roman" w:eastAsia="標楷體" w:hAnsi="Times New Roman" w:cs="Times New Roman" w:hint="eastAsia"/>
+          <w:b/>
+          <w:bCs/>
+          <w:i/>
+          <w:iCs/>
+          <w:sz w:val="22"/>
+          <w:szCs w:val="22"/>
+        </w:rPr>
+        <w:t>-</w:t>
+      </w:r>
+      <w:r>
+        <w:rPr>
+          <w:rFonts w:ascii="Times New Roman" w:eastAsia="標楷體" w:hAnsi="Times New Roman" w:cs="Times New Roman" w:hint="eastAsia"/>
+          <w:b/>
+          <w:bCs/>
+          <w:i/>
+          <w:iCs/>
+          <w:sz w:val="22"/>
+          <w:szCs w:val="22"/>
+        </w:rPr>
+        <w:t>7</w:t>
+      </w:r>
+      <w:r>
+        <w:rPr>
+          <w:rFonts w:ascii="Times New Roman" w:eastAsia="標楷體" w:hAnsi="Times New Roman" w:cs="Times New Roman" w:hint="eastAsia"/>
+          <w:b/>
+          <w:bCs/>
+          <w:i/>
+          <w:iCs/>
+          <w:sz w:val="22"/>
+          <w:szCs w:val="22"/>
+        </w:rPr>
+        <w:t xml:space="preserve"> Sequence </w:t>
+      </w:r>
+      <w:proofErr w:type="gramStart"/>
+      <w:r>
+        <w:rPr>
+          <w:rFonts w:ascii="Times New Roman" w:eastAsia="標楷體" w:hAnsi="Times New Roman" w:cs="Times New Roman" w:hint="eastAsia"/>
+          <w:b/>
+          <w:bCs/>
+          <w:i/>
+          <w:iCs/>
+          <w:sz w:val="22"/>
+          <w:szCs w:val="22"/>
+        </w:rPr>
+        <w:t xml:space="preserve">Diagram </w:t>
+      </w:r>
+      <w:r>
+        <w:rPr>
+          <w:rFonts w:ascii="Times New Roman" w:eastAsia="標楷體" w:hAnsi="Times New Roman" w:cs="Times New Roman" w:hint="eastAsia"/>
+          <w:b/>
+          <w:bCs/>
+          <w:i/>
+          <w:iCs/>
+          <w:sz w:val="22"/>
+          <w:szCs w:val="22"/>
+        </w:rPr>
+        <w:t>:</w:t>
+      </w:r>
+      <w:proofErr w:type="gramEnd"/>
+      <w:r>
+        <w:rPr>
+          <w:rFonts w:ascii="Times New Roman" w:eastAsia="標楷體" w:hAnsi="Times New Roman" w:cs="Times New Roman" w:hint="eastAsia"/>
+          <w:b/>
+          <w:bCs/>
+          <w:i/>
+          <w:iCs/>
+          <w:sz w:val="22"/>
+          <w:szCs w:val="22"/>
+        </w:rPr>
+        <w:t xml:space="preserve"> </w:t>
+      </w:r>
+      <w:proofErr w:type="spellStart"/>
+      <w:r>
+        <w:rPr>
+          <w:rFonts w:ascii="Times New Roman" w:eastAsia="標楷體" w:hAnsi="Times New Roman" w:cs="Times New Roman" w:hint="eastAsia"/>
+          <w:b/>
+          <w:bCs/>
+          <w:i/>
+          <w:iCs/>
+          <w:sz w:val="22"/>
+          <w:szCs w:val="22"/>
+        </w:rPr>
+        <w:t>checkOut</w:t>
+      </w:r>
+      <w:proofErr w:type="spellEnd"/>
+    </w:p>
+    <w:p>
+      <w:r>
+        <w:drawing>
+          <wp:inline distT="0" distB="0" distL="0" distR="0" wp14:anchorId="102CBAFB" wp14:editId="024ECFE3">
+            <wp:extent cx="5274310" cy="1442085"/>
+            <wp:effectExtent l="0" t="0" r="2540" b="5715"/>
+            <wp:docPr id="795438240" name="圖片 1"/>
+            <wp:cNvGraphicFramePr>
+              <a:graphicFrameLocks xmlns:a="http://schemas.openxmlformats.org/drawingml/2006/main" noChangeAspect="1"/>
+            </wp:cNvGraphicFramePr>
+            <a:graphic xmlns:a="http://schemas.openxmlformats.org/drawingml/2006/main">
+              <a:graphicData uri="http://schemas.openxmlformats.org/drawingml/2006/picture">
+                <pic:pic xmlns:pic="http://schemas.openxmlformats.org/drawingml/2006/picture">
+                  <pic:nvPicPr>
+                    <pic:cNvPr id="795438240" name=""/>
+                    <pic:cNvPicPr/>
+                  </pic:nvPicPr>
+                  <pic:blipFill>
+                    <a:blip r:embed="rId18"/>
+                    <a:stretch>
+                      <a:fillRect/>
+                    </a:stretch>
+                  </pic:blipFill>
+                  <pic:spPr>
+                    <a:xfrm>
+                      <a:off x="0" y="0"/>
+                      <a:ext cx="5274310" cy="1442085"/>
+                    </a:xfrm>
+                    <a:prstGeom prst="rect">
+                      <a:avLst/>
+                    </a:prstGeom>
+                  </pic:spPr>
+                </pic:pic>
+              </a:graphicData>
+            </a:graphic>
+          </wp:inline>
+        </w:drawing>
+      </w:r>
+    </w:p>
+    <w:p>
+      <w:pPr>
+        <w:jc w:val="center"/>
+        <w:rPr>
+          <w:rFonts w:hint="eastAsia"/>
+        </w:rPr>
+      </w:pPr>
+      <w:r>
+        <w:rPr>
+          <w:rFonts w:ascii="Times New Roman" w:eastAsia="標楷體" w:hAnsi="Times New Roman" w:cs="Times New Roman" w:hint="eastAsia"/>
+          <w:b/>
+          <w:bCs/>
+          <w:i/>
+          <w:iCs/>
+          <w:sz w:val="22"/>
+          <w:szCs w:val="22"/>
+        </w:rPr>
+        <w:t xml:space="preserve">Figure </w:t>
+      </w:r>
+      <w:r>
+        <w:rPr>
+          <w:rFonts w:ascii="Times New Roman" w:eastAsia="標楷體" w:hAnsi="Times New Roman" w:cs="Times New Roman" w:hint="eastAsia"/>
+          <w:b/>
+          <w:bCs/>
+          <w:i/>
+          <w:iCs/>
+          <w:sz w:val="22"/>
+          <w:szCs w:val="22"/>
+        </w:rPr>
+        <w:t>3</w:t>
+      </w:r>
+      <w:r>
+        <w:rPr>
+          <w:rFonts w:ascii="Times New Roman" w:eastAsia="標楷體" w:hAnsi="Times New Roman" w:cs="Times New Roman" w:hint="eastAsia"/>
+          <w:b/>
+          <w:bCs/>
+          <w:i/>
+          <w:iCs/>
+          <w:sz w:val="22"/>
+          <w:szCs w:val="22"/>
+        </w:rPr>
+        <w:t>-</w:t>
+      </w:r>
+      <w:r>
+        <w:rPr>
+          <w:rFonts w:ascii="Times New Roman" w:eastAsia="標楷體" w:hAnsi="Times New Roman" w:cs="Times New Roman" w:hint="eastAsia"/>
+          <w:b/>
+          <w:bCs/>
+          <w:i/>
+          <w:iCs/>
+          <w:sz w:val="22"/>
+          <w:szCs w:val="22"/>
+        </w:rPr>
+        <w:t>8</w:t>
+      </w:r>
+      <w:r>
+        <w:rPr>
+          <w:rFonts w:ascii="Times New Roman" w:eastAsia="標楷體" w:hAnsi="Times New Roman" w:cs="Times New Roman" w:hint="eastAsia"/>
+          <w:b/>
+          <w:bCs/>
+          <w:i/>
+          <w:iCs/>
+          <w:sz w:val="22"/>
+          <w:szCs w:val="22"/>
+        </w:rPr>
+        <w:t xml:space="preserve"> Sequence </w:t>
+      </w:r>
+      <w:proofErr w:type="gramStart"/>
+      <w:r>
+        <w:rPr>
+          <w:rFonts w:ascii="Times New Roman" w:eastAsia="標楷體" w:hAnsi="Times New Roman" w:cs="Times New Roman" w:hint="eastAsia"/>
+          <w:b/>
+          <w:bCs/>
+          <w:i/>
+          <w:iCs/>
+          <w:sz w:val="22"/>
+          <w:szCs w:val="22"/>
+        </w:rPr>
+        <w:t>Diagram :</w:t>
+      </w:r>
+      <w:proofErr w:type="gramEnd"/>
+      <w:r>
+        <w:rPr>
+          <w:rFonts w:ascii="Times New Roman" w:eastAsia="標楷體" w:hAnsi="Times New Roman" w:cs="Times New Roman" w:hint="eastAsia"/>
+          <w:b/>
+          <w:bCs/>
+          <w:i/>
+          <w:iCs/>
+          <w:sz w:val="22"/>
+          <w:szCs w:val="22"/>
+        </w:rPr>
+        <w:t xml:space="preserve"> </w:t>
+      </w:r>
+      <w:proofErr w:type="spellStart"/>
+      <w:r>
+        <w:rPr>
+          <w:rFonts w:ascii="Times New Roman" w:eastAsia="標楷體" w:hAnsi="Times New Roman" w:cs="Times New Roman" w:hint="eastAsia"/>
+          <w:b/>
+          <w:bCs/>
+          <w:i/>
+          <w:iCs/>
+          <w:sz w:val="22"/>
+          <w:szCs w:val="22"/>
+        </w:rPr>
+        <w:t>add</w:t>
+      </w:r>
+      <w:r>
+        <w:rPr>
+          <w:rFonts w:ascii="Times New Roman" w:eastAsia="標楷體" w:hAnsi="Times New Roman" w:cs="Times New Roman" w:hint="eastAsia"/>
+          <w:b/>
+          <w:bCs/>
+          <w:i/>
+          <w:iCs/>
+          <w:sz w:val="22"/>
+          <w:szCs w:val="22"/>
+        </w:rPr>
+        <w:t>B</w:t>
+      </w:r>
+      <w:r>
+        <w:rPr>
+          <w:rFonts w:ascii="Times New Roman" w:eastAsia="標楷體" w:hAnsi="Times New Roman" w:cs="Times New Roman" w:hint="eastAsia"/>
+          <w:b/>
+          <w:bCs/>
+          <w:i/>
+          <w:iCs/>
+          <w:sz w:val="22"/>
+          <w:szCs w:val="22"/>
+        </w:rPr>
+        <w:t>ook</w:t>
+      </w:r>
+      <w:proofErr w:type="spellEnd"/>
+    </w:p>
+    <w:p>
+      <w:pPr>
+        <w:jc w:val="center"/>
+      </w:pPr>
+      <w:r>
+        <w:drawing>
+          <wp:inline distT="0" distB="0" distL="0" distR="0" wp14:anchorId="07462C8E" wp14:editId="5C637EB2">
+            <wp:extent cx="4307906" cy="1952717"/>
+            <wp:effectExtent l="0" t="0" r="0" b="9525"/>
+            <wp:docPr id="1025247087" name="圖片 1"/>
+            <wp:cNvGraphicFramePr>
+              <a:graphicFrameLocks xmlns:a="http://schemas.openxmlformats.org/drawingml/2006/main" noChangeAspect="1"/>
+            </wp:cNvGraphicFramePr>
+            <a:graphic xmlns:a="http://schemas.openxmlformats.org/drawingml/2006/main">
+              <a:graphicData uri="http://schemas.openxmlformats.org/drawingml/2006/picture">
+                <pic:pic xmlns:pic="http://schemas.openxmlformats.org/drawingml/2006/picture">
+                  <pic:nvPicPr>
+                    <pic:cNvPr id="1025247087" name=""/>
+                    <pic:cNvPicPr/>
+                  </pic:nvPicPr>
+                  <pic:blipFill>
+                    <a:blip r:embed="rId19"/>
+                    <a:stretch>
+                      <a:fillRect/>
+                    </a:stretch>
+                  </pic:blipFill>
+                  <pic:spPr>
+                    <a:xfrm>
+                      <a:off x="0" y="0"/>
+                      <a:ext cx="4335309" cy="1965139"/>
+                    </a:xfrm>
+                    <a:prstGeom prst="rect">
+                      <a:avLst/>
+                    </a:prstGeom>
+                  </pic:spPr>
+                </pic:pic>
+              </a:graphicData>
+            </a:graphic>
+          </wp:inline>
+        </w:drawing>
+      </w:r>
+    </w:p>
+    <w:p>
+      <w:pPr>
+        <w:jc w:val="center"/>
+        <w:rPr>
+          <w:rFonts w:hint="eastAsia"/>
+        </w:rPr>
+      </w:pPr>
+      <w:r>
+        <w:rPr>
+          <w:rFonts w:ascii="Times New Roman" w:eastAsia="標楷體" w:hAnsi="Times New Roman" w:cs="Times New Roman" w:hint="eastAsia"/>
+          <w:b/>
+          <w:bCs/>
+          <w:i/>
+          <w:iCs/>
+          <w:sz w:val="22"/>
+          <w:szCs w:val="22"/>
+        </w:rPr>
+        <w:t xml:space="preserve">Figure </w:t>
+      </w:r>
+      <w:r>
+        <w:rPr>
+          <w:rFonts w:ascii="Times New Roman" w:eastAsia="標楷體" w:hAnsi="Times New Roman" w:cs="Times New Roman" w:hint="eastAsia"/>
+          <w:b/>
+          <w:bCs/>
+          <w:i/>
+          <w:iCs/>
+          <w:sz w:val="22"/>
+          <w:szCs w:val="22"/>
+        </w:rPr>
+        <w:t>3</w:t>
+      </w:r>
+      <w:r>
+        <w:rPr>
+          <w:rFonts w:ascii="Times New Roman" w:eastAsia="標楷體" w:hAnsi="Times New Roman" w:cs="Times New Roman" w:hint="eastAsia"/>
+          <w:b/>
+          <w:bCs/>
+          <w:i/>
+          <w:iCs/>
+          <w:sz w:val="22"/>
+          <w:szCs w:val="22"/>
+        </w:rPr>
+        <w:t>-</w:t>
+      </w:r>
+      <w:r>
+        <w:rPr>
+          <w:rFonts w:ascii="Times New Roman" w:eastAsia="標楷體" w:hAnsi="Times New Roman" w:cs="Times New Roman" w:hint="eastAsia"/>
+          <w:b/>
+          <w:bCs/>
+          <w:i/>
+          <w:iCs/>
+          <w:sz w:val="22"/>
+          <w:szCs w:val="22"/>
+        </w:rPr>
+        <w:t>9</w:t>
+      </w:r>
+      <w:r>
+        <w:rPr>
+          <w:rFonts w:ascii="Times New Roman" w:eastAsia="標楷體" w:hAnsi="Times New Roman" w:cs="Times New Roman" w:hint="eastAsia"/>
+          <w:b/>
+          <w:bCs/>
+          <w:i/>
+          <w:iCs/>
+          <w:sz w:val="22"/>
+          <w:szCs w:val="22"/>
+        </w:rPr>
+        <w:t xml:space="preserve"> Sequence </w:t>
+      </w:r>
+      <w:proofErr w:type="gramStart"/>
+      <w:r>
+        <w:rPr>
+          <w:rFonts w:ascii="Times New Roman" w:eastAsia="標楷體" w:hAnsi="Times New Roman" w:cs="Times New Roman" w:hint="eastAsia"/>
+          <w:b/>
+          <w:bCs/>
+          <w:i/>
+          <w:iCs/>
+          <w:sz w:val="22"/>
+          <w:szCs w:val="22"/>
+        </w:rPr>
+        <w:t>Diagram :</w:t>
+      </w:r>
+      <w:proofErr w:type="gramEnd"/>
+      <w:r>
+        <w:rPr>
+          <w:rFonts w:ascii="Times New Roman" w:eastAsia="標楷體" w:hAnsi="Times New Roman" w:cs="Times New Roman" w:hint="eastAsia"/>
+          <w:b/>
+          <w:bCs/>
+          <w:i/>
+          <w:iCs/>
+          <w:sz w:val="22"/>
+          <w:szCs w:val="22"/>
+        </w:rPr>
+        <w:t xml:space="preserve"> </w:t>
+      </w:r>
+      <w:proofErr w:type="spellStart"/>
+      <w:r>
+        <w:rPr>
+          <w:rFonts w:ascii="Times New Roman" w:eastAsia="標楷體" w:hAnsi="Times New Roman" w:cs="Times New Roman" w:hint="eastAsia"/>
+          <w:b/>
+          <w:bCs/>
+          <w:i/>
+          <w:iCs/>
+          <w:sz w:val="22"/>
+          <w:szCs w:val="22"/>
+        </w:rPr>
+        <w:t>viewBookList</w:t>
+      </w:r>
+      <w:proofErr w:type="spellEnd"/>
+    </w:p>
+    <w:p>
+      <w:r>
+        <w:lastRenderedPageBreak/>
+        <w:drawing>
+          <wp:inline distT="0" distB="0" distL="0" distR="0" wp14:anchorId="0972C7BB" wp14:editId="6084EFF2">
+            <wp:extent cx="5840025" cy="1854802"/>
+            <wp:effectExtent l="0" t="0" r="0" b="0"/>
+            <wp:docPr id="1284505140" name="圖片 1"/>
+            <wp:cNvGraphicFramePr>
+              <a:graphicFrameLocks xmlns:a="http://schemas.openxmlformats.org/drawingml/2006/main" noChangeAspect="1"/>
+            </wp:cNvGraphicFramePr>
+            <a:graphic xmlns:a="http://schemas.openxmlformats.org/drawingml/2006/main">
+              <a:graphicData uri="http://schemas.openxmlformats.org/drawingml/2006/picture">
+                <pic:pic xmlns:pic="http://schemas.openxmlformats.org/drawingml/2006/picture">
+                  <pic:nvPicPr>
+                    <pic:cNvPr id="1284505140" name=""/>
+                    <pic:cNvPicPr/>
+                  </pic:nvPicPr>
+                  <pic:blipFill>
+                    <a:blip r:embed="rId20"/>
+                    <a:stretch>
+                      <a:fillRect/>
+                    </a:stretch>
+                  </pic:blipFill>
+                  <pic:spPr>
+                    <a:xfrm>
+                      <a:off x="0" y="0"/>
+                      <a:ext cx="5852948" cy="1858906"/>
+                    </a:xfrm>
+                    <a:prstGeom prst="rect">
+                      <a:avLst/>
+                    </a:prstGeom>
+                  </pic:spPr>
+                </pic:pic>
+              </a:graphicData>
+            </a:graphic>
+          </wp:inline>
+        </w:drawing>
+      </w:r>
+    </w:p>
+    <w:p>
+      <w:pPr>
+        <w:jc w:val="center"/>
+        <w:rPr>
+          <w:rFonts w:hint="eastAsia"/>
+        </w:rPr>
+      </w:pPr>
+      <w:r>
+        <w:rPr>
+          <w:rFonts w:ascii="Times New Roman" w:eastAsia="標楷體" w:hAnsi="Times New Roman" w:cs="Times New Roman" w:hint="eastAsia"/>
+          <w:b/>
+          <w:bCs/>
+          <w:i/>
+          <w:iCs/>
+          <w:sz w:val="22"/>
+          <w:szCs w:val="22"/>
+        </w:rPr>
+        <w:t xml:space="preserve">Figure </w:t>
+      </w:r>
+      <w:r>
+        <w:rPr>
+          <w:rFonts w:ascii="Times New Roman" w:eastAsia="標楷體" w:hAnsi="Times New Roman" w:cs="Times New Roman" w:hint="eastAsia"/>
+          <w:b/>
+          <w:bCs/>
+          <w:i/>
+          <w:iCs/>
+          <w:sz w:val="22"/>
+          <w:szCs w:val="22"/>
+        </w:rPr>
+        <w:t>3</w:t>
+      </w:r>
+      <w:r>
+        <w:rPr>
+          <w:rFonts w:ascii="Times New Roman" w:eastAsia="標楷體" w:hAnsi="Times New Roman" w:cs="Times New Roman" w:hint="eastAsia"/>
+          <w:b/>
+          <w:bCs/>
+          <w:i/>
+          <w:iCs/>
+          <w:sz w:val="22"/>
+          <w:szCs w:val="22"/>
+        </w:rPr>
+        <w:t>-</w:t>
+      </w:r>
+      <w:r>
+        <w:rPr>
+          <w:rFonts w:ascii="Times New Roman" w:eastAsia="標楷體" w:hAnsi="Times New Roman" w:cs="Times New Roman" w:hint="eastAsia"/>
+          <w:b/>
+          <w:bCs/>
+          <w:i/>
+          <w:iCs/>
+          <w:sz w:val="22"/>
+          <w:szCs w:val="22"/>
+        </w:rPr>
+        <w:t>10</w:t>
+      </w:r>
+      <w:r>
+        <w:rPr>
+          <w:rFonts w:ascii="Times New Roman" w:eastAsia="標楷體" w:hAnsi="Times New Roman" w:cs="Times New Roman" w:hint="eastAsia"/>
+          <w:b/>
+          <w:bCs/>
+          <w:i/>
+          <w:iCs/>
+          <w:sz w:val="22"/>
+          <w:szCs w:val="22"/>
+        </w:rPr>
+        <w:t xml:space="preserve"> Sequence </w:t>
+      </w:r>
+      <w:proofErr w:type="gramStart"/>
+      <w:r>
+        <w:rPr>
+          <w:rFonts w:ascii="Times New Roman" w:eastAsia="標楷體" w:hAnsi="Times New Roman" w:cs="Times New Roman" w:hint="eastAsia"/>
+          <w:b/>
+          <w:bCs/>
+          <w:i/>
+          <w:iCs/>
+          <w:sz w:val="22"/>
+          <w:szCs w:val="22"/>
+        </w:rPr>
+        <w:t>Diagram :</w:t>
+      </w:r>
+      <w:proofErr w:type="gramEnd"/>
+      <w:r>
+        <w:rPr>
+          <w:rFonts w:ascii="Times New Roman" w:eastAsia="標楷體" w:hAnsi="Times New Roman" w:cs="Times New Roman" w:hint="eastAsia"/>
+          <w:b/>
+          <w:bCs/>
+          <w:i/>
+          <w:iCs/>
+          <w:sz w:val="22"/>
+          <w:szCs w:val="22"/>
+        </w:rPr>
+        <w:t xml:space="preserve"> </w:t>
+      </w:r>
+      <w:proofErr w:type="spellStart"/>
+      <w:r>
+        <w:rPr>
+          <w:rFonts w:ascii="Times New Roman" w:eastAsia="標楷體" w:hAnsi="Times New Roman" w:cs="Times New Roman" w:hint="eastAsia"/>
+          <w:b/>
+          <w:bCs/>
+          <w:i/>
+          <w:iCs/>
+          <w:sz w:val="22"/>
+          <w:szCs w:val="22"/>
+        </w:rPr>
+        <w:t>updateBook</w:t>
+      </w:r>
+      <w:proofErr w:type="spellEnd"/>
+    </w:p>
+    <w:p>
+      <w:r>
+        <w:drawing>
+          <wp:inline distT="0" distB="0" distL="0" distR="0" wp14:anchorId="39AB2E37" wp14:editId="125EE8D8">
+            <wp:extent cx="5274310" cy="1831975"/>
+            <wp:effectExtent l="0" t="0" r="2540" b="0"/>
+            <wp:docPr id="462810598" name="圖片 1"/>
+            <wp:cNvGraphicFramePr>
+              <a:graphicFrameLocks xmlns:a="http://schemas.openxmlformats.org/drawingml/2006/main" noChangeAspect="1"/>
+            </wp:cNvGraphicFramePr>
+            <a:graphic xmlns:a="http://schemas.openxmlformats.org/drawingml/2006/main">
+              <a:graphicData uri="http://schemas.openxmlformats.org/drawingml/2006/picture">
+                <pic:pic xmlns:pic="http://schemas.openxmlformats.org/drawingml/2006/picture">
+                  <pic:nvPicPr>
+                    <pic:cNvPr id="462810598" name=""/>
+                    <pic:cNvPicPr/>
+                  </pic:nvPicPr>
+                  <pic:blipFill>
+                    <a:blip r:embed="rId21"/>
+                    <a:stretch>
+                      <a:fillRect/>
+                    </a:stretch>
+                  </pic:blipFill>
+                  <pic:spPr>
+                    <a:xfrm>
+                      <a:off x="0" y="0"/>
+                      <a:ext cx="5274310" cy="1831975"/>
+                    </a:xfrm>
+                    <a:prstGeom prst="rect">
+                      <a:avLst/>
+                    </a:prstGeom>
+                  </pic:spPr>
+                </pic:pic>
+              </a:graphicData>
+            </a:graphic>
+          </wp:inline>
+        </w:drawing>
+      </w:r>
+    </w:p>
+    <w:p>
+      <w:pPr>
+        <w:jc w:val="center"/>
+        <w:rPr>
+          <w:rFonts w:hint="eastAsia"/>
+        </w:rPr>
+      </w:pPr>
+      <w:r>
+        <w:rPr>
+          <w:rFonts w:ascii="Times New Roman" w:eastAsia="標楷體" w:hAnsi="Times New Roman" w:cs="Times New Roman" w:hint="eastAsia"/>
+          <w:b/>
+          <w:bCs/>
+          <w:i/>
+          <w:iCs/>
+          <w:sz w:val="22"/>
+          <w:szCs w:val="22"/>
+        </w:rPr>
+        <w:t xml:space="preserve">Figure </w:t>
+      </w:r>
+      <w:r>
+        <w:rPr>
+          <w:rFonts w:ascii="Times New Roman" w:eastAsia="標楷體" w:hAnsi="Times New Roman" w:cs="Times New Roman" w:hint="eastAsia"/>
+          <w:b/>
+          <w:bCs/>
+          <w:i/>
+          <w:iCs/>
+          <w:sz w:val="22"/>
+          <w:szCs w:val="22"/>
+        </w:rPr>
+        <w:t>3</w:t>
+      </w:r>
+      <w:r>
+        <w:rPr>
+          <w:rFonts w:ascii="Times New Roman" w:eastAsia="標楷體" w:hAnsi="Times New Roman" w:cs="Times New Roman" w:hint="eastAsia"/>
+          <w:b/>
+          <w:bCs/>
+          <w:i/>
+          <w:iCs/>
+          <w:sz w:val="22"/>
+          <w:szCs w:val="22"/>
+        </w:rPr>
+        <w:t>-</w:t>
+      </w:r>
+      <w:r>
+        <w:rPr>
+          <w:rFonts w:ascii="Times New Roman" w:eastAsia="標楷體" w:hAnsi="Times New Roman" w:cs="Times New Roman" w:hint="eastAsia"/>
+          <w:b/>
+          <w:bCs/>
+          <w:i/>
+          <w:iCs/>
+          <w:sz w:val="22"/>
+          <w:szCs w:val="22"/>
+        </w:rPr>
+        <w:t>1</w:t>
+      </w:r>
+      <w:r>
+        <w:rPr>
+          <w:rFonts w:ascii="Times New Roman" w:eastAsia="標楷體" w:hAnsi="Times New Roman" w:cs="Times New Roman" w:hint="eastAsia"/>
+          <w:b/>
+          <w:bCs/>
+          <w:i/>
+          <w:iCs/>
+          <w:sz w:val="22"/>
+          <w:szCs w:val="22"/>
+        </w:rPr>
+        <w:t>1</w:t>
+      </w:r>
+      <w:r>
+        <w:rPr>
+          <w:rFonts w:ascii="Times New Roman" w:eastAsia="標楷體" w:hAnsi="Times New Roman" w:cs="Times New Roman" w:hint="eastAsia"/>
+          <w:b/>
+          <w:bCs/>
+          <w:i/>
+          <w:iCs/>
+          <w:sz w:val="22"/>
+          <w:szCs w:val="22"/>
+        </w:rPr>
+        <w:t xml:space="preserve"> Sequence </w:t>
+      </w:r>
+      <w:proofErr w:type="gramStart"/>
+      <w:r>
+        <w:rPr>
+          <w:rFonts w:ascii="Times New Roman" w:eastAsia="標楷體" w:hAnsi="Times New Roman" w:cs="Times New Roman" w:hint="eastAsia"/>
+          <w:b/>
+          <w:bCs/>
+          <w:i/>
+          <w:iCs/>
+          <w:sz w:val="22"/>
+          <w:szCs w:val="22"/>
+        </w:rPr>
+        <w:t>Diagram :</w:t>
+      </w:r>
+      <w:proofErr w:type="gramEnd"/>
+      <w:r>
+        <w:rPr>
+          <w:rFonts w:ascii="Times New Roman" w:eastAsia="標楷體" w:hAnsi="Times New Roman" w:cs="Times New Roman" w:hint="eastAsia"/>
+          <w:b/>
+          <w:bCs/>
+          <w:i/>
+          <w:iCs/>
+          <w:sz w:val="22"/>
+          <w:szCs w:val="22"/>
+        </w:rPr>
+        <w:t xml:space="preserve"> </w:t>
+      </w:r>
+      <w:proofErr w:type="spellStart"/>
+      <w:r>
+        <w:rPr>
+          <w:rFonts w:ascii="Times New Roman" w:eastAsia="標楷體" w:hAnsi="Times New Roman" w:cs="Times New Roman" w:hint="eastAsia"/>
+          <w:b/>
+          <w:bCs/>
+          <w:i/>
+          <w:iCs/>
+          <w:sz w:val="22"/>
+          <w:szCs w:val="22"/>
+        </w:rPr>
+        <w:t>delet</w:t>
+      </w:r>
+      <w:r>
+        <w:rPr>
+          <w:rFonts w:ascii="Times New Roman" w:eastAsia="標楷體" w:hAnsi="Times New Roman" w:cs="Times New Roman" w:hint="eastAsia"/>
+          <w:b/>
+          <w:bCs/>
+          <w:i/>
+          <w:iCs/>
+          <w:sz w:val="22"/>
+          <w:szCs w:val="22"/>
+        </w:rPr>
+        <w:t>eBook</w:t>
+      </w:r>
+      <w:proofErr w:type="spellEnd"/>
+    </w:p>
+    <w:p>
+      <w:pPr>
+        <w:pStyle w:val="2"/>
+      </w:pPr>
+      <w:r>
+        <w:rPr>
+          <w:rFonts w:hint="eastAsia"/>
+        </w:rPr>
+        <w:t>3.3 Design Class Model</w:t>
       </w:r>
     </w:p>
     <w:p/>
-    <w:p>
-      <w:pPr>
-        <w:pStyle w:val="2"/>
-      </w:pPr>
-      <w:r>
-        <w:rPr>
-          <w:rFonts w:hint="eastAsia"/>
-        </w:rPr>
-        <w:t>3.2 Use-Case Realizations with GRASP Patterns</w:t>
-      </w:r>
-    </w:p>
-    <w:p/>
-    <w:p>
-      <w:pPr>
-        <w:pStyle w:val="2"/>
-      </w:pPr>
-      <w:r>
-        <w:rPr>
-          <w:rFonts w:hint="eastAsia"/>
-        </w:rPr>
-        <w:t>3.3 Design Class Model</w:t>
-      </w:r>
-    </w:p>
-    <w:p>
-      <w:pPr>
-        <w:rPr>
-          <w:rFonts w:hint="eastAsia"/>
-        </w:rPr>
-      </w:pPr>
-    </w:p>
     <w:p>
       <w:pPr>
         <w:pStyle w:val="1"/>
@@ -10371,13 +12196,18 @@
         <w:tblLook w:val="04A0" w:firstRow="1" w:lastRow="0" w:firstColumn="1" w:lastColumn="0" w:noHBand="0" w:noVBand="1"/>
       </w:tblPr>
       <w:tblGrid>
-        <w:gridCol w:w="4148"/>
-        <w:gridCol w:w="4148"/>
+        <w:gridCol w:w="1877"/>
+        <w:gridCol w:w="3829"/>
+        <w:gridCol w:w="1350"/>
+        <w:gridCol w:w="1189"/>
       </w:tblGrid>
       <w:tr>
-        <w:tc>
-          <w:tcPr>
-            <w:tcW w:w="4148" w:type="dxa"/>
+        <w:trPr>
+          <w:trHeight w:val="612"/>
+        </w:trPr>
+        <w:tc>
+          <w:tcPr>
+            <w:tcW w:w="1877" w:type="dxa"/>
           </w:tcPr>
           <w:p>
             <w:pPr>
@@ -10395,7 +12225,7 @@
         </w:tc>
         <w:tc>
           <w:tcPr>
-            <w:tcW w:w="4148" w:type="dxa"/>
+            <w:tcW w:w="3829" w:type="dxa"/>
           </w:tcPr>
           <w:p>
             <w:pPr>
@@ -10408,14 +12238,36 @@
                 <w:rFonts w:ascii="Times New Roman" w:eastAsia="標楷體" w:hAnsi="Times New Roman" w:cs="Times New Roman" w:hint="eastAsia"/>
               </w:rPr>
               <w:t>Time</w:t>
+            </w:r>
+          </w:p>
+        </w:tc>
+        <w:tc>
+          <w:tcPr>
+            <w:tcW w:w="2539" w:type="dxa"/>
+            <w:gridSpan w:val="2"/>
+          </w:tcPr>
+          <w:p>
+            <w:pPr>
+              <w:rPr>
+                <w:rFonts w:ascii="Times New Roman" w:eastAsia="標楷體" w:hAnsi="Times New Roman" w:cs="Times New Roman" w:hint="eastAsia"/>
+              </w:rPr>
+            </w:pPr>
+            <w:r>
+              <w:rPr>
+                <w:rFonts w:ascii="Times New Roman" w:eastAsia="標楷體" w:hAnsi="Times New Roman" w:cs="Times New Roman" w:hint="eastAsia"/>
+              </w:rPr>
+              <w:t>Total Hour</w:t>
             </w:r>
           </w:p>
         </w:tc>
       </w:tr>
       <w:tr>
-        <w:tc>
-          <w:tcPr>
-            <w:tcW w:w="4148" w:type="dxa"/>
+        <w:trPr>
+          <w:trHeight w:val="402"/>
+        </w:trPr>
+        <w:tc>
+          <w:tcPr>
+            <w:tcW w:w="1877" w:type="dxa"/>
             <w:vMerge w:val="restart"/>
           </w:tcPr>
           <w:p>
@@ -10434,7 +12286,7 @@
         </w:tc>
         <w:tc>
           <w:tcPr>
-            <w:tcW w:w="4148" w:type="dxa"/>
+            <w:tcW w:w="3829" w:type="dxa"/>
           </w:tcPr>
           <w:p>
             <w:pPr>
@@ -10448,13 +12300,48 @@
               </w:rPr>
               <w:t>26/02/28 20:17~22:07</w:t>
             </w:r>
+          </w:p>
+        </w:tc>
+        <w:tc>
+          <w:tcPr>
+            <w:tcW w:w="1350" w:type="dxa"/>
+            <w:vMerge w:val="restart"/>
+          </w:tcPr>
+          <w:p>
+            <w:pPr>
+              <w:rPr>
+                <w:rFonts w:ascii="Times New Roman" w:eastAsia="標楷體" w:hAnsi="Times New Roman" w:cs="Times New Roman" w:hint="eastAsia"/>
+              </w:rPr>
+            </w:pPr>
+            <w:r>
+              <w:rPr>
+                <w:rFonts w:ascii="Times New Roman" w:eastAsia="標楷體" w:hAnsi="Times New Roman" w:cs="Times New Roman" w:hint="eastAsia"/>
+              </w:rPr>
+              <w:t>2.77h</w:t>
+            </w:r>
+          </w:p>
+        </w:tc>
+        <w:tc>
+          <w:tcPr>
+            <w:tcW w:w="1189" w:type="dxa"/>
+            <w:vMerge w:val="restart"/>
+          </w:tcPr>
+          <w:p>
+            <w:pPr>
+              <w:rPr>
+                <w:rFonts w:ascii="Times New Roman" w:eastAsia="標楷體" w:hAnsi="Times New Roman" w:cs="Times New Roman" w:hint="eastAsia"/>
+              </w:rPr>
+            </w:pPr>
           </w:p>
         </w:tc>
       </w:tr>
       <w:tr>
-        <w:tc>
-          <w:tcPr>
-            <w:tcW w:w="4148" w:type="dxa"/>
+        <w:trPr>
+          <w:trHeight w:val="243"/>
+        </w:trPr>
+        <w:tc>
+          <w:tcPr>
+            <w:tcW w:w="1877" w:type="dxa"/>
             <w:vMerge/>
           </w:tcPr>
           <w:p>
@@ -10467,7 +12354,7 @@
         </w:tc>
         <w:tc>
           <w:tcPr>
-            <w:tcW w:w="4148" w:type="dxa"/>
+            <w:tcW w:w="3829" w:type="dxa"/>
           </w:tcPr>
           <w:p>
             <w:pPr>
@@ -10481,13 +12368,42 @@
               </w:rPr>
               <w:t>26/03/02 17:15~18:19</w:t>
             </w:r>
+          </w:p>
+        </w:tc>
+        <w:tc>
+          <w:tcPr>
+            <w:tcW w:w="1350" w:type="dxa"/>
+            <w:vMerge/>
+          </w:tcPr>
+          <w:p>
+            <w:pPr>
+              <w:rPr>
+                <w:rFonts w:ascii="Times New Roman" w:eastAsia="標楷體" w:hAnsi="Times New Roman" w:cs="Times New Roman" w:hint="eastAsia"/>
+              </w:rPr>
+            </w:pPr>
+          </w:p>
+        </w:tc>
+        <w:tc>
+          <w:tcPr>
+            <w:tcW w:w="1189" w:type="dxa"/>
+            <w:vMerge/>
+          </w:tcPr>
+          <w:p>
+            <w:pPr>
+              <w:rPr>
+                <w:rFonts w:ascii="Times New Roman" w:eastAsia="標楷體" w:hAnsi="Times New Roman" w:cs="Times New Roman" w:hint="eastAsia"/>
+              </w:rPr>
+            </w:pPr>
           </w:p>
         </w:tc>
       </w:tr>
       <w:tr>
-        <w:tc>
-          <w:tcPr>
-            <w:tcW w:w="4148" w:type="dxa"/>
+        <w:trPr>
+          <w:trHeight w:val="329"/>
+        </w:trPr>
+        <w:tc>
+          <w:tcPr>
+            <w:tcW w:w="1877" w:type="dxa"/>
             <w:vMerge w:val="restart"/>
           </w:tcPr>
           <w:p>
@@ -10506,7 +12422,7 @@
         </w:tc>
         <w:tc>
           <w:tcPr>
-            <w:tcW w:w="4148" w:type="dxa"/>
+            <w:tcW w:w="3829" w:type="dxa"/>
           </w:tcPr>
           <w:p>
             <w:pPr>
@@ -10520,13 +12436,48 @@
               </w:rPr>
               <w:t>26/03/09 14:30~16:00</w:t>
             </w:r>
+          </w:p>
+        </w:tc>
+        <w:tc>
+          <w:tcPr>
+            <w:tcW w:w="1350" w:type="dxa"/>
+            <w:vMerge w:val="restart"/>
+          </w:tcPr>
+          <w:p>
+            <w:pPr>
+              <w:rPr>
+                <w:rFonts w:ascii="Times New Roman" w:eastAsia="標楷體" w:hAnsi="Times New Roman" w:cs="Times New Roman" w:hint="eastAsia"/>
+              </w:rPr>
+            </w:pPr>
+            <w:r>
+              <w:rPr>
+                <w:rFonts w:ascii="Times New Roman" w:eastAsia="標楷體" w:hAnsi="Times New Roman" w:cs="Times New Roman" w:hint="eastAsia"/>
+              </w:rPr>
+              <w:t>4.5h</w:t>
+            </w:r>
+          </w:p>
+        </w:tc>
+        <w:tc>
+          <w:tcPr>
+            <w:tcW w:w="1189" w:type="dxa"/>
+            <w:vMerge/>
+          </w:tcPr>
+          <w:p>
+            <w:pPr>
+              <w:rPr>
+                <w:rFonts w:ascii="Times New Roman" w:eastAsia="標楷體" w:hAnsi="Times New Roman" w:cs="Times New Roman" w:hint="eastAsia"/>
+              </w:rPr>
+            </w:pPr>
           </w:p>
         </w:tc>
       </w:tr>
       <w:tr>
-        <w:tc>
-          <w:tcPr>
-            <w:tcW w:w="4148" w:type="dxa"/>
+        <w:trPr>
+          <w:trHeight w:val="243"/>
+        </w:trPr>
+        <w:tc>
+          <w:tcPr>
+            <w:tcW w:w="1877" w:type="dxa"/>
             <w:vMerge/>
           </w:tcPr>
           <w:p>
@@ -10539,7 +12490,7 @@
         </w:tc>
         <w:tc>
           <w:tcPr>
-            <w:tcW w:w="4148" w:type="dxa"/>
+            <w:tcW w:w="3829" w:type="dxa"/>
           </w:tcPr>
           <w:p>
             <w:pPr>
@@ -10553,13 +12504,42 @@
               </w:rPr>
               <w:t>26/03/13 13:00~16:00</w:t>
             </w:r>
+          </w:p>
+        </w:tc>
+        <w:tc>
+          <w:tcPr>
+            <w:tcW w:w="1350" w:type="dxa"/>
+            <w:vMerge/>
+          </w:tcPr>
+          <w:p>
+            <w:pPr>
+              <w:rPr>
+                <w:rFonts w:ascii="Times New Roman" w:eastAsia="標楷體" w:hAnsi="Times New Roman" w:cs="Times New Roman" w:hint="eastAsia"/>
+              </w:rPr>
+            </w:pPr>
+          </w:p>
+        </w:tc>
+        <w:tc>
+          <w:tcPr>
+            <w:tcW w:w="1189" w:type="dxa"/>
+            <w:vMerge/>
+          </w:tcPr>
+          <w:p>
+            <w:pPr>
+              <w:rPr>
+                <w:rFonts w:ascii="Times New Roman" w:eastAsia="標楷體" w:hAnsi="Times New Roman" w:cs="Times New Roman" w:hint="eastAsia"/>
+              </w:rPr>
+            </w:pPr>
           </w:p>
         </w:tc>
       </w:tr>
       <w:tr>
-        <w:tc>
-          <w:tcPr>
-            <w:tcW w:w="4148" w:type="dxa"/>
+        <w:trPr>
+          <w:trHeight w:val="297"/>
+        </w:trPr>
+        <w:tc>
+          <w:tcPr>
+            <w:tcW w:w="1877" w:type="dxa"/>
             <w:vMerge w:val="restart"/>
           </w:tcPr>
           <w:p>
@@ -10578,7 +12558,7 @@
         </w:tc>
         <w:tc>
           <w:tcPr>
-            <w:tcW w:w="4148" w:type="dxa"/>
+            <w:tcW w:w="3829" w:type="dxa"/>
           </w:tcPr>
           <w:p>
             <w:pPr>
@@ -10592,13 +12572,48 @@
               </w:rPr>
               <w:t>26/03/26 21:00~22:00</w:t>
             </w:r>
+          </w:p>
+        </w:tc>
+        <w:tc>
+          <w:tcPr>
+            <w:tcW w:w="1350" w:type="dxa"/>
+            <w:vMerge w:val="restart"/>
+          </w:tcPr>
+          <w:p>
+            <w:pPr>
+              <w:rPr>
+                <w:rFonts w:ascii="Times New Roman" w:eastAsia="標楷體" w:hAnsi="Times New Roman" w:cs="Times New Roman" w:hint="eastAsia"/>
+              </w:rPr>
+            </w:pPr>
+            <w:r>
+              <w:rPr>
+                <w:rFonts w:ascii="Times New Roman" w:eastAsia="標楷體" w:hAnsi="Times New Roman" w:cs="Times New Roman" w:hint="eastAsia"/>
+              </w:rPr>
+              <w:t>9.67h</w:t>
+            </w:r>
+          </w:p>
+        </w:tc>
+        <w:tc>
+          <w:tcPr>
+            <w:tcW w:w="1189" w:type="dxa"/>
+            <w:vMerge/>
+          </w:tcPr>
+          <w:p>
+            <w:pPr>
+              <w:rPr>
+                <w:rFonts w:ascii="Times New Roman" w:eastAsia="標楷體" w:hAnsi="Times New Roman" w:cs="Times New Roman" w:hint="eastAsia"/>
+              </w:rPr>
+            </w:pPr>
           </w:p>
         </w:tc>
       </w:tr>
       <w:tr>
-        <w:tc>
-          <w:tcPr>
-            <w:tcW w:w="4148" w:type="dxa"/>
+        <w:trPr>
+          <w:trHeight w:val="243"/>
+        </w:trPr>
+        <w:tc>
+          <w:tcPr>
+            <w:tcW w:w="1877" w:type="dxa"/>
             <w:vMerge/>
           </w:tcPr>
           <w:p>
@@ -10611,7 +12626,7 @@
         </w:tc>
         <w:tc>
           <w:tcPr>
-            <w:tcW w:w="4148" w:type="dxa"/>
+            <w:tcW w:w="3829" w:type="dxa"/>
           </w:tcPr>
           <w:p>
             <w:pPr>
@@ -10625,13 +12640,42 @@
               </w:rPr>
               <w:t>26/03/27 14:00~16:00</w:t>
             </w:r>
+          </w:p>
+        </w:tc>
+        <w:tc>
+          <w:tcPr>
+            <w:tcW w:w="1350" w:type="dxa"/>
+            <w:vMerge/>
+          </w:tcPr>
+          <w:p>
+            <w:pPr>
+              <w:rPr>
+                <w:rFonts w:ascii="Times New Roman" w:eastAsia="標楷體" w:hAnsi="Times New Roman" w:cs="Times New Roman" w:hint="eastAsia"/>
+              </w:rPr>
+            </w:pPr>
+          </w:p>
+        </w:tc>
+        <w:tc>
+          <w:tcPr>
+            <w:tcW w:w="1189" w:type="dxa"/>
+            <w:vMerge/>
+          </w:tcPr>
+          <w:p>
+            <w:pPr>
+              <w:rPr>
+                <w:rFonts w:ascii="Times New Roman" w:eastAsia="標楷體" w:hAnsi="Times New Roman" w:cs="Times New Roman" w:hint="eastAsia"/>
+              </w:rPr>
+            </w:pPr>
           </w:p>
         </w:tc>
       </w:tr>
       <w:tr>
-        <w:tc>
-          <w:tcPr>
-            <w:tcW w:w="4148" w:type="dxa"/>
+        <w:trPr>
+          <w:trHeight w:val="243"/>
+        </w:trPr>
+        <w:tc>
+          <w:tcPr>
+            <w:tcW w:w="1877" w:type="dxa"/>
             <w:vMerge/>
           </w:tcPr>
           <w:p>
@@ -10644,7 +12688,7 @@
         </w:tc>
         <w:tc>
           <w:tcPr>
-            <w:tcW w:w="4148" w:type="dxa"/>
+            <w:tcW w:w="3829" w:type="dxa"/>
           </w:tcPr>
           <w:p>
             <w:pPr>
@@ -10658,13 +12702,42 @@
               </w:rPr>
               <w:t>26/03/30 10:00~12:00</w:t>
             </w:r>
+          </w:p>
+        </w:tc>
+        <w:tc>
+          <w:tcPr>
+            <w:tcW w:w="1350" w:type="dxa"/>
+            <w:vMerge/>
+          </w:tcPr>
+          <w:p>
+            <w:pPr>
+              <w:rPr>
+                <w:rFonts w:ascii="Times New Roman" w:eastAsia="標楷體" w:hAnsi="Times New Roman" w:cs="Times New Roman" w:hint="eastAsia"/>
+              </w:rPr>
+            </w:pPr>
+          </w:p>
+        </w:tc>
+        <w:tc>
+          <w:tcPr>
+            <w:tcW w:w="1189" w:type="dxa"/>
+            <w:vMerge/>
+          </w:tcPr>
+          <w:p>
+            <w:pPr>
+              <w:rPr>
+                <w:rFonts w:ascii="Times New Roman" w:eastAsia="標楷體" w:hAnsi="Times New Roman" w:cs="Times New Roman" w:hint="eastAsia"/>
+              </w:rPr>
+            </w:pPr>
           </w:p>
         </w:tc>
       </w:tr>
       <w:tr>
-        <w:tc>
-          <w:tcPr>
-            <w:tcW w:w="4148" w:type="dxa"/>
+        <w:trPr>
+          <w:trHeight w:val="243"/>
+        </w:trPr>
+        <w:tc>
+          <w:tcPr>
+            <w:tcW w:w="1877" w:type="dxa"/>
             <w:vMerge/>
           </w:tcPr>
           <w:p>
@@ -10677,7 +12750,7 @@
         </w:tc>
         <w:tc>
           <w:tcPr>
-            <w:tcW w:w="4148" w:type="dxa"/>
+            <w:tcW w:w="3829" w:type="dxa"/>
           </w:tcPr>
           <w:p>
             <w:pPr>
@@ -10691,6 +12764,104 @@
               </w:rPr>
               <w:t>26/03/30 14:00~18:40</w:t>
             </w:r>
+          </w:p>
+        </w:tc>
+        <w:tc>
+          <w:tcPr>
+            <w:tcW w:w="1350" w:type="dxa"/>
+            <w:vMerge/>
+          </w:tcPr>
+          <w:p>
+            <w:pPr>
+              <w:rPr>
+                <w:rFonts w:ascii="Times New Roman" w:eastAsia="標楷體" w:hAnsi="Times New Roman" w:cs="Times New Roman" w:hint="eastAsia"/>
+              </w:rPr>
+            </w:pPr>
+          </w:p>
+        </w:tc>
+        <w:tc>
+          <w:tcPr>
+            <w:tcW w:w="1189" w:type="dxa"/>
+            <w:vMerge/>
+          </w:tcPr>
+          <w:p>
+            <w:pPr>
+              <w:rPr>
+                <w:rFonts w:ascii="Times New Roman" w:eastAsia="標楷體" w:hAnsi="Times New Roman" w:cs="Times New Roman" w:hint="eastAsia"/>
+              </w:rPr>
+            </w:pPr>
+          </w:p>
+        </w:tc>
+      </w:tr>
+      <w:tr>
+        <w:trPr>
+          <w:trHeight w:val="336"/>
+        </w:trPr>
+        <w:tc>
+          <w:tcPr>
+            <w:tcW w:w="1877" w:type="dxa"/>
+          </w:tcPr>
+          <w:p>
+            <w:pPr>
+              <w:rPr>
+                <w:rFonts w:ascii="Times New Roman" w:eastAsia="標楷體" w:hAnsi="Times New Roman" w:cs="Times New Roman"/>
+              </w:rPr>
+            </w:pPr>
+            <w:r>
+              <w:rPr>
+                <w:rFonts w:ascii="Times New Roman" w:eastAsia="標楷體" w:hAnsi="Times New Roman" w:cs="Times New Roman" w:hint="eastAsia"/>
+              </w:rPr>
+              <w:t>HW#</w:t>
+            </w:r>
+            <w:r>
+              <w:rPr>
+                <w:rFonts w:ascii="Times New Roman" w:eastAsia="標楷體" w:hAnsi="Times New Roman" w:cs="Times New Roman" w:hint="eastAsia"/>
+              </w:rPr>
+              <w:t>4</w:t>
+            </w:r>
+          </w:p>
+        </w:tc>
+        <w:tc>
+          <w:tcPr>
+            <w:tcW w:w="3829" w:type="dxa"/>
+          </w:tcPr>
+          <w:p>
+            <w:pPr>
+              <w:rPr>
+                <w:rFonts w:ascii="Times New Roman" w:eastAsia="標楷體" w:hAnsi="Times New Roman" w:cs="Times New Roman" w:hint="eastAsia"/>
+              </w:rPr>
+            </w:pPr>
+            <w:r>
+              <w:rPr>
+                <w:rFonts w:ascii="Times New Roman" w:eastAsia="標楷體" w:hAnsi="Times New Roman" w:cs="Times New Roman" w:hint="eastAsia"/>
+              </w:rPr>
+              <w:t>26/04/11 12:00~18:15</w:t>
+            </w:r>
+          </w:p>
+        </w:tc>
+        <w:tc>
+          <w:tcPr>
+            <w:tcW w:w="1350" w:type="dxa"/>
+          </w:tcPr>
+          <w:p>
+            <w:pPr>
+              <w:rPr>
+                <w:rFonts w:ascii="Times New Roman" w:eastAsia="標楷體" w:hAnsi="Times New Roman" w:cs="Times New Roman" w:hint="eastAsia"/>
+              </w:rPr>
+            </w:pPr>
+          </w:p>
+        </w:tc>
+        <w:tc>
+          <w:tcPr>
+            <w:tcW w:w="1189" w:type="dxa"/>
+            <w:vMerge/>
+          </w:tcPr>
+          <w:p>
+            <w:pPr>
+              <w:rPr>
+                <w:rFonts w:ascii="Times New Roman" w:eastAsia="標楷體" w:hAnsi="Times New Roman" w:cs="Times New Roman" w:hint="eastAsia"/>
+              </w:rPr>
+            </w:pPr>
           </w:p>
         </w:tc>
       </w:tr>
@@ -10720,7 +12891,7 @@
 </file>
 
 <file path=word/endnotes.xml><?xml version="1.0" encoding="utf-8"?>
-<w:endnotes xmlns:wpc="http://schemas.microsoft.com/office/word/2010/wordprocessingCanvas" xmlns:cx="http://schemas.microsoft.com/office/drawing/2014/chartex" xmlns:cx1="http://schemas.microsoft.com/office/drawing/2015/9/8/chartex" xmlns:cx2="http://schemas.microsoft.com/office/drawing/2015/10/21/chartex" xmlns:cx3="http://schemas.microsoft.com/office/drawing/2016/5/9/chartex" xmlns:cx4="http://schemas.microsoft.com/office/drawing/2016/5/10/chartex" xmlns:cx5="http://schemas.microsoft.com/office/drawing/2016/5/11/chartex" xmlns:cx6="http://schemas.microsoft.com/office/drawing/2016/5/12/chartex" xmlns:cx7="http://schemas.microsoft.com/office/drawing/2016/5/13/chartex" xmlns:cx8="http://schemas.microsoft.com/office/drawing/2016/5/14/chartex" xmlns:mc="http://schemas.openxmlformats.org/markup-compatibility/2006" xmlns:aink="http://schemas.microsoft.com/office/drawing/2016/ink" xmlns:am3d="http://schemas.microsoft.com/office/drawing/2017/model3d" xmlns:o="urn:schemas-microsoft-com:office:office" xmlns:oel="http://schemas.microsoft.com/office/2019/extlst" xmlns:r="http://schemas.openxmlformats.org/officeDocument/2006/relationships" xmlns:m="http://schemas.openxmlformats.org/officeDocument/2006/math" xmlns:v="urn:schemas-microsoft-com:vml" xmlns:wp14="http://schemas.microsoft.com/office/word/2010/wordprocessingDrawing" xmlns:wp="http://schemas.openxmlformats.org/drawingml/2006/wordprocessingDrawing" xmlns:w10="urn:schemas-microsoft-com:office:word" xmlns:w="http://schemas.openxmlformats.org/wordprocessingml/2006/main" xmlns:w14="http://schemas.microsoft.com/office/word/2010/wordml" xmlns:w15="http://schemas.microsoft.com/office/word/2012/wordml" xmlns:w16cex="http://schemas.microsoft.com/office/word/2018/wordml/cex" xmlns:w16cid="http://schemas.microsoft.com/office/word/2016/wordml/cid" xmlns:w16="http://schemas.microsoft.com/office/word/2018/wordml" xmlns:w16sdtdh="http://schemas.microsoft.com/office/word/2020/wordml/sdtdatahash" xmlns:w16se="http://schemas.microsoft.com/office/word/2015/wordml/symex" xmlns:wpg="http://schemas.microsoft.com/office/word/2010/wordprocessingGroup" xmlns:wpi="http://schemas.microsoft.com/office/word/2010/wordprocessingInk" xmlns:wne="http://schemas.microsoft.com/office/word/2006/wordml" xmlns:wps="http://schemas.microsoft.com/office/word/2010/wordprocessingShape" mc:Ignorable="w14 w15 w16se w16cid w16 w16cex w16sdtdh wp14">
+<w:endnotes xmlns:wpc="http://schemas.microsoft.com/office/word/2010/wordprocessingCanvas" xmlns:cx="http://schemas.microsoft.com/office/drawing/2014/chartex" xmlns:cx1="http://schemas.microsoft.com/office/drawing/2015/9/8/chartex" xmlns:cx2="http://schemas.microsoft.com/office/drawing/2015/10/21/chartex" xmlns:cx3="http://schemas.microsoft.com/office/drawing/2016/5/9/chartex" xmlns:cx4="http://schemas.microsoft.com/office/drawing/2016/5/10/chartex" xmlns:cx5="http://schemas.microsoft.com/office/drawing/2016/5/11/chartex" xmlns:cx6="http://schemas.microsoft.com/office/drawing/2016/5/12/chartex" xmlns:cx7="http://schemas.microsoft.com/office/drawing/2016/5/13/chartex" xmlns:cx8="http://schemas.microsoft.com/office/drawing/2016/5/14/chartex" xmlns:mc="http://schemas.openxmlformats.org/markup-compatibility/2006" xmlns:aink="http://schemas.microsoft.com/office/drawing/2016/ink" xmlns:am3d="http://schemas.microsoft.com/office/drawing/2017/model3d" xmlns:o="urn:schemas-microsoft-com:office:office" xmlns:oel="http://schemas.microsoft.com/office/2019/extlst" xmlns:r="http://schemas.openxmlformats.org/officeDocument/2006/relationships" xmlns:m="http://schemas.openxmlformats.org/officeDocument/2006/math" xmlns:v="urn:schemas-microsoft-com:vml" xmlns:wp14="http://schemas.microsoft.com/office/word/2010/wordprocessingDrawing" xmlns:wp="http://schemas.openxmlformats.org/drawingml/2006/wordprocessingDrawing" xmlns:w10="urn:schemas-microsoft-com:office:word" xmlns:w="http://schemas.openxmlformats.org/wordprocessingml/2006/main" xmlns:w14="http://schemas.microsoft.com/office/word/2010/wordml" xmlns:w15="http://schemas.microsoft.com/office/word/2012/wordml" xmlns:w16cex="http://schemas.microsoft.com/office/word/2018/wordml/cex" xmlns:w16cid="http://schemas.microsoft.com/office/word/2016/wordml/cid" xmlns:w16="http://schemas.microsoft.com/office/word/2018/wordml" xmlns:w16du="http://schemas.microsoft.com/office/word/2023/wordml/word16du" xmlns:w16sdtdh="http://schemas.microsoft.com/office/word/2020/wordml/sdtdatahash" xmlns:w16sdtfl="http://schemas.microsoft.com/office/word/2024/wordml/sdtformatlock" xmlns:w16se="http://schemas.microsoft.com/office/word/2015/wordml/symex" xmlns:wpg="http://schemas.microsoft.com/office/word/2010/wordprocessingGroup" xmlns:wpi="http://schemas.microsoft.com/office/word/2010/wordprocessingInk" xmlns:wne="http://schemas.microsoft.com/office/word/2006/wordml" xmlns:wps="http://schemas.microsoft.com/office/word/2010/wordprocessingShape" mc:Ignorable="w14 w15 w16se w16cid w16 w16cex w16sdtdh w16sdtfl w16du wp14">
   <w:endnote w:type="separator" w:id="-1">
     <w:p>
       <w:pPr>
@@ -10745,7 +12916,7 @@
 </file>
 
 <file path=word/footnotes.xml><?xml version="1.0" encoding="utf-8"?>
-<w:footnotes xmlns:wpc="http://schemas.microsoft.com/office/word/2010/wordprocessingCanvas" xmlns:cx="http://schemas.microsoft.com/office/drawing/2014/chartex" xmlns:cx1="http://schemas.microsoft.com/office/drawing/2015/9/8/chartex" xmlns:cx2="http://schemas.microsoft.com/office/drawing/2015/10/21/chartex" xmlns:cx3="http://schemas.microsoft.com/office/drawing/2016/5/9/chartex" xmlns:cx4="http://schemas.microsoft.com/office/drawing/2016/5/10/chartex" xmlns:cx5="http://schemas.microsoft.com/office/drawing/2016/5/11/chartex" xmlns:cx6="http://schemas.microsoft.com/office/drawing/2016/5/12/chartex" xmlns:cx7="http://schemas.microsoft.com/office/drawing/2016/5/13/chartex" xmlns:cx8="http://schemas.microsoft.com/office/drawing/2016/5/14/chartex" xmlns:mc="http://schemas.openxmlformats.org/markup-compatibility/2006" xmlns:aink="http://schemas.microsoft.com/office/drawing/2016/ink" xmlns:am3d="http://schemas.microsoft.com/office/drawing/2017/model3d" xmlns:o="urn:schemas-microsoft-com:office:office" xmlns:oel="http://schemas.microsoft.com/office/2019/extlst" xmlns:r="http://schemas.openxmlformats.org/officeDocument/2006/relationships" xmlns:m="http://schemas.openxmlformats.org/officeDocument/2006/math" xmlns:v="urn:schemas-microsoft-com:vml" xmlns:wp14="http://schemas.microsoft.com/office/word/2010/wordprocessingDrawing" xmlns:wp="http://schemas.openxmlformats.org/drawingml/2006/wordprocessingDrawing" xmlns:w10="urn:schemas-microsoft-com:office:word" xmlns:w="http://schemas.openxmlformats.org/wordprocessingml/2006/main" xmlns:w14="http://schemas.microsoft.com/office/word/2010/wordml" xmlns:w15="http://schemas.microsoft.com/office/word/2012/wordml" xmlns:w16cex="http://schemas.microsoft.com/office/word/2018/wordml/cex" xmlns:w16cid="http://schemas.microsoft.com/office/word/2016/wordml/cid" xmlns:w16="http://schemas.microsoft.com/office/word/2018/wordml" xmlns:w16sdtdh="http://schemas.microsoft.com/office/word/2020/wordml/sdtdatahash" xmlns:w16se="http://schemas.microsoft.com/office/word/2015/wordml/symex" xmlns:wpg="http://schemas.microsoft.com/office/word/2010/wordprocessingGroup" xmlns:wpi="http://schemas.microsoft.com/office/word/2010/wordprocessingInk" xmlns:wne="http://schemas.microsoft.com/office/word/2006/wordml" xmlns:wps="http://schemas.microsoft.com/office/word/2010/wordprocessingShape" mc:Ignorable="w14 w15 w16se w16cid w16 w16cex w16sdtdh wp14">
+<w:footnotes xmlns:wpc="http://schemas.microsoft.com/office/word/2010/wordprocessingCanvas" xmlns:cx="http://schemas.microsoft.com/office/drawing/2014/chartex" xmlns:cx1="http://schemas.microsoft.com/office/drawing/2015/9/8/chartex" xmlns:cx2="http://schemas.microsoft.com/office/drawing/2015/10/21/chartex" xmlns:cx3="http://schemas.microsoft.com/office/drawing/2016/5/9/chartex" xmlns:cx4="http://schemas.microsoft.com/office/drawing/2016/5/10/chartex" xmlns:cx5="http://schemas.microsoft.com/office/drawing/2016/5/11/chartex" xmlns:cx6="http://schemas.microsoft.com/office/drawing/2016/5/12/chartex" xmlns:cx7="http://schemas.microsoft.com/office/drawing/2016/5/13/chartex" xmlns:cx8="http://schemas.microsoft.com/office/drawing/2016/5/14/chartex" xmlns:mc="http://schemas.openxmlformats.org/markup-compatibility/2006" xmlns:aink="http://schemas.microsoft.com/office/drawing/2016/ink" xmlns:am3d="http://schemas.microsoft.com/office/drawing/2017/model3d" xmlns:o="urn:schemas-microsoft-com:office:office" xmlns:oel="http://schemas.microsoft.com/office/2019/extlst" xmlns:r="http://schemas.openxmlformats.org/officeDocument/2006/relationships" xmlns:m="http://schemas.openxmlformats.org/officeDocument/2006/math" xmlns:v="urn:schemas-microsoft-com:vml" xmlns:wp14="http://schemas.microsoft.com/office/word/2010/wordprocessingDrawing" xmlns:wp="http://schemas.openxmlformats.org/drawingml/2006/wordprocessingDrawing" xmlns:w10="urn:schemas-microsoft-com:office:word" xmlns:w="http://schemas.openxmlformats.org/wordprocessingml/2006/main" xmlns:w14="http://schemas.microsoft.com/office/word/2010/wordml" xmlns:w15="http://schemas.microsoft.com/office/word/2012/wordml" xmlns:w16cex="http://schemas.microsoft.com/office/word/2018/wordml/cex" xmlns:w16cid="http://schemas.microsoft.com/office/word/2016/wordml/cid" xmlns:w16="http://schemas.microsoft.com/office/word/2018/wordml" xmlns:w16du="http://schemas.microsoft.com/office/word/2023/wordml/word16du" xmlns:w16sdtdh="http://schemas.microsoft.com/office/word/2020/wordml/sdtdatahash" xmlns:w16sdtfl="http://schemas.microsoft.com/office/word/2024/wordml/sdtformatlock" xmlns:w16se="http://schemas.microsoft.com/office/word/2015/wordml/symex" xmlns:wpg="http://schemas.microsoft.com/office/word/2010/wordprocessingGroup" xmlns:wpi="http://schemas.microsoft.com/office/word/2010/wordprocessingInk" xmlns:wne="http://schemas.microsoft.com/office/word/2006/wordml" xmlns:wps="http://schemas.microsoft.com/office/word/2010/wordprocessingShape" mc:Ignorable="w14 w15 w16se w16cid w16 w16cex w16sdtdh w16sdtfl w16du wp14">
   <w:footnote w:type="separator" w:id="-1">
     <w:p>
       <w:pPr>
@@ -10770,7 +12941,7 @@
 </file>
 
 <file path=word/numbering.xml><?xml version="1.0" encoding="utf-8"?>
-<w:numbering xmlns:wpc="http://schemas.microsoft.com/office/word/2010/wordprocessingCanvas" xmlns:cx="http://schemas.microsoft.com/office/drawing/2014/chartex" xmlns:cx1="http://schemas.microsoft.com/office/drawing/2015/9/8/chartex" xmlns:cx2="http://schemas.microsoft.com/office/drawing/2015/10/21/chartex" xmlns:cx3="http://schemas.microsoft.com/office/drawing/2016/5/9/chartex" xmlns:cx4="http://schemas.microsoft.com/office/drawing/2016/5/10/chartex" xmlns:cx5="http://schemas.microsoft.com/office/drawing/2016/5/11/chartex" xmlns:cx6="http://schemas.microsoft.com/office/drawing/2016/5/12/chartex" xmlns:cx7="http://schemas.microsoft.com/office/drawing/2016/5/13/chartex" xmlns:cx8="http://schemas.microsoft.com/office/drawing/2016/5/14/chartex" xmlns:mc="http://schemas.openxmlformats.org/markup-compatibility/2006" xmlns:aink="http://schemas.microsoft.com/office/drawing/2016/ink" xmlns:am3d="http://schemas.microsoft.com/office/drawing/2017/model3d" xmlns:o="urn:schemas-microsoft-com:office:office" xmlns:oel="http://schemas.microsoft.com/office/2019/extlst" xmlns:r="http://schemas.openxmlformats.org/officeDocument/2006/relationships" xmlns:m="http://schemas.openxmlformats.org/officeDocument/2006/math" xmlns:v="urn:schemas-microsoft-com:vml" xmlns:wp14="http://schemas.microsoft.com/office/word/2010/wordprocessingDrawing" xmlns:wp="http://schemas.openxmlformats.org/drawingml/2006/wordprocessingDrawing" xmlns:w10="urn:schemas-microsoft-com:office:word" xmlns:w="http://schemas.openxmlformats.org/wordprocessingml/2006/main" xmlns:w14="http://schemas.microsoft.com/office/word/2010/wordml" xmlns:w15="http://schemas.microsoft.com/office/word/2012/wordml" xmlns:w16cex="http://schemas.microsoft.com/office/word/2018/wordml/cex" xmlns:w16cid="http://schemas.microsoft.com/office/word/2016/wordml/cid" xmlns:w16="http://schemas.microsoft.com/office/word/2018/wordml" xmlns:w16sdtdh="http://schemas.microsoft.com/office/word/2020/wordml/sdtdatahash" xmlns:w16se="http://schemas.microsoft.com/office/word/2015/wordml/symex" xmlns:wpg="http://schemas.microsoft.com/office/word/2010/wordprocessingGroup" xmlns:wpi="http://schemas.microsoft.com/office/word/2010/wordprocessingInk" xmlns:wne="http://schemas.microsoft.com/office/word/2006/wordml" xmlns:wps="http://schemas.microsoft.com/office/word/2010/wordprocessingShape" mc:Ignorable="w14 w15 w16se w16cid w16 w16cex w16sdtdh wp14">
+<w:numbering xmlns:wpc="http://schemas.microsoft.com/office/word/2010/wordprocessingCanvas" xmlns:cx="http://schemas.microsoft.com/office/drawing/2014/chartex" xmlns:cx1="http://schemas.microsoft.com/office/drawing/2015/9/8/chartex" xmlns:cx2="http://schemas.microsoft.com/office/drawing/2015/10/21/chartex" xmlns:cx3="http://schemas.microsoft.com/office/drawing/2016/5/9/chartex" xmlns:cx4="http://schemas.microsoft.com/office/drawing/2016/5/10/chartex" xmlns:cx5="http://schemas.microsoft.com/office/drawing/2016/5/11/chartex" xmlns:cx6="http://schemas.microsoft.com/office/drawing/2016/5/12/chartex" xmlns:cx7="http://schemas.microsoft.com/office/drawing/2016/5/13/chartex" xmlns:cx8="http://schemas.microsoft.com/office/drawing/2016/5/14/chartex" xmlns:mc="http://schemas.openxmlformats.org/markup-compatibility/2006" xmlns:aink="http://schemas.microsoft.com/office/drawing/2016/ink" xmlns:am3d="http://schemas.microsoft.com/office/drawing/2017/model3d" xmlns:o="urn:schemas-microsoft-com:office:office" xmlns:oel="http://schemas.microsoft.com/office/2019/extlst" xmlns:r="http://schemas.openxmlformats.org/officeDocument/2006/relationships" xmlns:m="http://schemas.openxmlformats.org/officeDocument/2006/math" xmlns:v="urn:schemas-microsoft-com:vml" xmlns:wp14="http://schemas.microsoft.com/office/word/2010/wordprocessingDrawing" xmlns:wp="http://schemas.openxmlformats.org/drawingml/2006/wordprocessingDrawing" xmlns:w10="urn:schemas-microsoft-com:office:word" xmlns:w="http://schemas.openxmlformats.org/wordprocessingml/2006/main" xmlns:w14="http://schemas.microsoft.com/office/word/2010/wordml" xmlns:w15="http://schemas.microsoft.com/office/word/2012/wordml" xmlns:w16cex="http://schemas.microsoft.com/office/word/2018/wordml/cex" xmlns:w16cid="http://schemas.microsoft.com/office/word/2016/wordml/cid" xmlns:w16="http://schemas.microsoft.com/office/word/2018/wordml" xmlns:w16du="http://schemas.microsoft.com/office/word/2023/wordml/word16du" xmlns:w16sdtdh="http://schemas.microsoft.com/office/word/2020/wordml/sdtdatahash" xmlns:w16sdtfl="http://schemas.microsoft.com/office/word/2024/wordml/sdtformatlock" xmlns:w16se="http://schemas.microsoft.com/office/word/2015/wordml/symex" xmlns:wpg="http://schemas.microsoft.com/office/word/2010/wordprocessingGroup" xmlns:wpi="http://schemas.microsoft.com/office/word/2010/wordprocessingInk" xmlns:wne="http://schemas.microsoft.com/office/word/2006/wordml" xmlns:wps="http://schemas.microsoft.com/office/word/2010/wordprocessingShape" mc:Ignorable="w14 w15 w16se w16cid w16 w16cex w16sdtdh w16sdtfl w16du wp14">
   <w:abstractNum w:abstractNumId="0" w15:restartNumberingAfterBreak="0">
     <w:nsid w:val="0BA862C0"/>
     <w:multiLevelType w:val="hybridMultilevel"/>
@@ -12225,7 +14396,7 @@
 </file>
 
 <file path=word/styles.xml><?xml version="1.0" encoding="utf-8"?>
-<w:styles xmlns:mc="http://schemas.openxmlformats.org/markup-compatibility/2006" xmlns:r="http://schemas.openxmlformats.org/officeDocument/2006/relationships" xmlns:w="http://schemas.openxmlformats.org/wordprocessingml/2006/main" xmlns:w14="http://schemas.microsoft.com/office/word/2010/wordml" xmlns:w15="http://schemas.microsoft.com/office/word/2012/wordml" xmlns:w16cex="http://schemas.microsoft.com/office/word/2018/wordml/cex" xmlns:w16cid="http://schemas.microsoft.com/office/word/2016/wordml/cid" xmlns:w16="http://schemas.microsoft.com/office/word/2018/wordml" xmlns:w16sdtdh="http://schemas.microsoft.com/office/word/2020/wordml/sdtdatahash" xmlns:w16se="http://schemas.microsoft.com/office/word/2015/wordml/symex" mc:Ignorable="w14 w15 w16se w16cid w16 w16cex w16sdtdh">
+<w:styles xmlns:mc="http://schemas.openxmlformats.org/markup-compatibility/2006" xmlns:r="http://schemas.openxmlformats.org/officeDocument/2006/relationships" xmlns:w="http://schemas.openxmlformats.org/wordprocessingml/2006/main" xmlns:w14="http://schemas.microsoft.com/office/word/2010/wordml" xmlns:w15="http://schemas.microsoft.com/office/word/2012/wordml" xmlns:w16cex="http://schemas.microsoft.com/office/word/2018/wordml/cex" xmlns:w16cid="http://schemas.microsoft.com/office/word/2016/wordml/cid" xmlns:w16="http://schemas.microsoft.com/office/word/2018/wordml" xmlns:w16du="http://schemas.microsoft.com/office/word/2023/wordml/word16du" xmlns:w16sdtdh="http://schemas.microsoft.com/office/word/2020/wordml/sdtdatahash" xmlns:w16sdtfl="http://schemas.microsoft.com/office/word/2024/wordml/sdtformatlock" xmlns:w16se="http://schemas.microsoft.com/office/word/2015/wordml/symex" mc:Ignorable="w14 w15 w16se w16cid w16 w16cex w16sdtdh w16sdtfl w16du">
   <w:docDefaults>
     <w:rPrDefault>
       <w:rPr>
@@ -12624,7 +14795,7 @@
   <w:style w:type="paragraph" w:default="1" w:styleId="a">
     <w:name w:val="Normal"/>
     <w:qFormat/>
-    <w:rsid w:val="00C1102D"/>
+    <w:rsid w:val="005C4F1C"/>
     <w:pPr>
       <w:widowControl w:val="0"/>
     </w:pPr>
@@ -12700,10 +14871,9 @@
     <w:next w:val="a"/>
     <w:link w:val="40"/>
     <w:uiPriority w:val="9"/>
-    <w:semiHidden/>
     <w:unhideWhenUsed/>
     <w:qFormat/>
-    <w:rsid w:val="00A42C4D"/>
+    <w:rsid w:val="006D25AC"/>
     <w:pPr>
       <w:keepNext/>
       <w:keepLines/>
@@ -12711,8 +14881,8 @@
       <w:outlineLvl w:val="3"/>
     </w:pPr>
     <w:rPr>
-      <w:rFonts w:eastAsiaTheme="majorEastAsia" w:cstheme="majorBidi"/>
-      <w:color w:val="0F4761" w:themeColor="accent1" w:themeShade="BF"/>
+      <w:rFonts w:ascii="Times New Roman" w:eastAsia="標楷體" w:hAnsi="Times New Roman" w:cstheme="majorBidi"/>
+      <w:b/>
       <w:sz w:val="28"/>
       <w:szCs w:val="28"/>
     </w:rPr>
@@ -12828,7 +14998,6 @@
   <w:style w:type="character" w:default="1" w:styleId="a0">
     <w:name w:val="Default Paragraph Font"/>
     <w:uiPriority w:val="1"/>
-    <w:semiHidden/>
     <w:unhideWhenUsed/>
   </w:style>
   <w:style w:type="table" w:default="1" w:styleId="a1">
@@ -12896,11 +15065,10 @@
     <w:basedOn w:val="a0"/>
     <w:link w:val="4"/>
     <w:uiPriority w:val="9"/>
-    <w:semiHidden/>
-    <w:rsid w:val="00A42C4D"/>
+    <w:rsid w:val="006D25AC"/>
     <w:rPr>
-      <w:rFonts w:eastAsiaTheme="majorEastAsia" w:cstheme="majorBidi"/>
-      <w:color w:val="0F4761" w:themeColor="accent1" w:themeShade="BF"/>
+      <w:rFonts w:ascii="Times New Roman" w:eastAsia="標楷體" w:hAnsi="Times New Roman" w:cstheme="majorBidi"/>
+      <w:b/>
       <w:sz w:val="28"/>
       <w:szCs w:val="28"/>
     </w:rPr>

</xml_diff>

<commit_message>
doc: revise domain model
</commit_message>
<xml_diff>
--- a/document/hw4.docx
+++ b/document/hw4.docx
@@ -1,6 +1,6 @@
 
 <file path=word/document.xml><?xml version="1.0" encoding="utf-8"?>
-<w:document xmlns:wpc="http://schemas.microsoft.com/office/word/2010/wordprocessingCanvas" xmlns:cx="http://schemas.microsoft.com/office/drawing/2014/chartex" xmlns:cx1="http://schemas.microsoft.com/office/drawing/2015/9/8/chartex" xmlns:cx2="http://schemas.microsoft.com/office/drawing/2015/10/21/chartex" xmlns:cx3="http://schemas.microsoft.com/office/drawing/2016/5/9/chartex" xmlns:cx4="http://schemas.microsoft.com/office/drawing/2016/5/10/chartex" xmlns:cx5="http://schemas.microsoft.com/office/drawing/2016/5/11/chartex" xmlns:cx6="http://schemas.microsoft.com/office/drawing/2016/5/12/chartex" xmlns:cx7="http://schemas.microsoft.com/office/drawing/2016/5/13/chartex" xmlns:cx8="http://schemas.microsoft.com/office/drawing/2016/5/14/chartex" xmlns:mc="http://schemas.openxmlformats.org/markup-compatibility/2006" xmlns:aink="http://schemas.microsoft.com/office/drawing/2016/ink" xmlns:am3d="http://schemas.microsoft.com/office/drawing/2017/model3d" xmlns:o="urn:schemas-microsoft-com:office:office" xmlns:oel="http://schemas.microsoft.com/office/2019/extlst" xmlns:r="http://schemas.openxmlformats.org/officeDocument/2006/relationships" xmlns:m="http://schemas.openxmlformats.org/officeDocument/2006/math" xmlns:v="urn:schemas-microsoft-com:vml" xmlns:wp14="http://schemas.microsoft.com/office/word/2010/wordprocessingDrawing" xmlns:wp="http://schemas.openxmlformats.org/drawingml/2006/wordprocessingDrawing" xmlns:w10="urn:schemas-microsoft-com:office:word" xmlns:w="http://schemas.openxmlformats.org/wordprocessingml/2006/main" xmlns:w14="http://schemas.microsoft.com/office/word/2010/wordml" xmlns:w15="http://schemas.microsoft.com/office/word/2012/wordml" xmlns:w16cex="http://schemas.microsoft.com/office/word/2018/wordml/cex" xmlns:w16cid="http://schemas.microsoft.com/office/word/2016/wordml/cid" xmlns:w16="http://schemas.microsoft.com/office/word/2018/wordml" xmlns:w16du="http://schemas.microsoft.com/office/word/2023/wordml/word16du" xmlns:w16sdtdh="http://schemas.microsoft.com/office/word/2020/wordml/sdtdatahash" xmlns:w16sdtfl="http://schemas.microsoft.com/office/word/2024/wordml/sdtformatlock" xmlns:w16se="http://schemas.microsoft.com/office/word/2015/wordml/symex" xmlns:wpg="http://schemas.microsoft.com/office/word/2010/wordprocessingGroup" xmlns:wpi="http://schemas.microsoft.com/office/word/2010/wordprocessingInk" xmlns:wne="http://schemas.microsoft.com/office/word/2006/wordml" xmlns:wps="http://schemas.microsoft.com/office/word/2010/wordprocessingShape" mc:Ignorable="w14 w15 w16se w16cid w16 w16cex w16sdtdh w16sdtfl w16du wp14">
+<w:document xmlns:wpc="http://schemas.microsoft.com/office/word/2010/wordprocessingCanvas" xmlns:cx="http://schemas.microsoft.com/office/drawing/2014/chartex" xmlns:cx1="http://schemas.microsoft.com/office/drawing/2015/9/8/chartex" xmlns:cx2="http://schemas.microsoft.com/office/drawing/2015/10/21/chartex" xmlns:cx3="http://schemas.microsoft.com/office/drawing/2016/5/9/chartex" xmlns:cx4="http://schemas.microsoft.com/office/drawing/2016/5/10/chartex" xmlns:cx5="http://schemas.microsoft.com/office/drawing/2016/5/11/chartex" xmlns:cx6="http://schemas.microsoft.com/office/drawing/2016/5/12/chartex" xmlns:cx7="http://schemas.microsoft.com/office/drawing/2016/5/13/chartex" xmlns:cx8="http://schemas.microsoft.com/office/drawing/2016/5/14/chartex" xmlns:mc="http://schemas.openxmlformats.org/markup-compatibility/2006" xmlns:aink="http://schemas.microsoft.com/office/drawing/2016/ink" xmlns:am3d="http://schemas.microsoft.com/office/drawing/2017/model3d" xmlns:o="urn:schemas-microsoft-com:office:office" xmlns:oel="http://schemas.microsoft.com/office/2019/extlst" xmlns:r="http://schemas.openxmlformats.org/officeDocument/2006/relationships" xmlns:m="http://schemas.openxmlformats.org/officeDocument/2006/math" xmlns:v="urn:schemas-microsoft-com:vml" xmlns:wp14="http://schemas.microsoft.com/office/word/2010/wordprocessingDrawing" xmlns:wp="http://schemas.openxmlformats.org/drawingml/2006/wordprocessingDrawing" xmlns:w10="urn:schemas-microsoft-com:office:word" xmlns:w="http://schemas.openxmlformats.org/wordprocessingml/2006/main" xmlns:w14="http://schemas.microsoft.com/office/word/2010/wordml" xmlns:w15="http://schemas.microsoft.com/office/word/2012/wordml" xmlns:w16cex="http://schemas.microsoft.com/office/word/2018/wordml/cex" xmlns:w16cid="http://schemas.microsoft.com/office/word/2016/wordml/cid" xmlns:w16="http://schemas.microsoft.com/office/word/2018/wordml" xmlns:w16sdtdh="http://schemas.microsoft.com/office/word/2020/wordml/sdtdatahash" xmlns:w16se="http://schemas.microsoft.com/office/word/2015/wordml/symex" xmlns:wpg="http://schemas.microsoft.com/office/word/2010/wordprocessingGroup" xmlns:wpi="http://schemas.microsoft.com/office/word/2010/wordprocessingInk" xmlns:wne="http://schemas.microsoft.com/office/word/2006/wordml" xmlns:wps="http://schemas.microsoft.com/office/word/2010/wordprocessingShape" mc:Ignorable="w14 w15 w16se w16cid w16 w16cex w16sdtdh wp14">
   <w:body>
     <w:p>
       <w:pPr>
@@ -1219,7 +1219,7 @@
       <w:pPr>
         <w:jc w:val="center"/>
         <w:rPr>
-          <w:rFonts w:ascii="Times New Roman" w:hAnsi="Times New Roman" w:cs="Times New Roman" w:hint="eastAsia"/>
+          <w:rFonts w:ascii="Times New Roman" w:hAnsi="Times New Roman" w:cs="Times New Roman"/>
           <w:b/>
           <w:bCs/>
           <w:i/>
@@ -8346,9 +8346,6 @@
           <w:ilvl w:val="0"/>
           <w:numId w:val="11"/>
         </w:numPr>
-        <w:rPr>
-          <w:rFonts w:hint="eastAsia"/>
-        </w:rPr>
       </w:pPr>
       <w:r>
         <w:rPr>
@@ -10227,19 +10224,18 @@
       <w:pPr>
         <w:jc w:val="center"/>
         <w:rPr>
+          <w:rFonts w:ascii="Times New Roman" w:eastAsia="標楷體" w:hAnsi="Times New Roman" w:cs="Times New Roman" w:hint="eastAsia"/>
+        </w:rPr>
+      </w:pPr>
+      <w:r>
+        <w:rPr>
           <w:rFonts w:ascii="Times New Roman" w:eastAsia="標楷體" w:hAnsi="Times New Roman" w:cs="Times New Roman"/>
         </w:rPr>
-      </w:pPr>
-      <w:r>
-        <w:rPr>
-          <w:rFonts w:ascii="Times New Roman" w:eastAsia="標楷體" w:hAnsi="Times New Roman" w:cs="Times New Roman"/>
-          <w:noProof/>
-        </w:rPr>
         <w:drawing>
-          <wp:inline distT="0" distB="0" distL="0" distR="0" wp14:anchorId="631A6759" wp14:editId="441E91AE">
-            <wp:extent cx="7725199" cy="3294324"/>
-            <wp:effectExtent l="0" t="0" r="0" b="0"/>
-            <wp:docPr id="1" name="圖片 1"/>
+          <wp:inline distT="0" distB="0" distL="0" distR="0" wp14:anchorId="1B8C9355" wp14:editId="73FA1D1F">
+            <wp:extent cx="4549731" cy="5162550"/>
+            <wp:effectExtent l="0" t="0" r="3810" b="0"/>
+            <wp:docPr id="4" name="圖片 4"/>
             <wp:cNvGraphicFramePr>
               <a:graphicFrameLocks xmlns:a="http://schemas.openxmlformats.org/drawingml/2006/main" noChangeAspect="1"/>
             </wp:cNvGraphicFramePr>
@@ -10247,23 +10243,36 @@
               <a:graphicData uri="http://schemas.openxmlformats.org/drawingml/2006/picture">
                 <pic:pic xmlns:pic="http://schemas.openxmlformats.org/drawingml/2006/picture">
                   <pic:nvPicPr>
-                    <pic:cNvPr id="1" name=""/>
-                    <pic:cNvPicPr/>
+                    <pic:cNvPr id="0" name="Picture 6"/>
+                    <pic:cNvPicPr>
+                      <a:picLocks noChangeAspect="1" noChangeArrowheads="1"/>
+                    </pic:cNvPicPr>
                   </pic:nvPicPr>
                   <pic:blipFill>
-                    <a:blip r:embed="rId9"/>
+                    <a:blip r:embed="rId9" cstate="print">
+                      <a:extLst>
+                        <a:ext uri="{28A0092B-C50C-407E-A947-70E740481C1C}">
+                          <a14:useLocalDpi xmlns:a14="http://schemas.microsoft.com/office/drawing/2010/main" val="0"/>
+                        </a:ext>
+                      </a:extLst>
+                    </a:blip>
+                    <a:srcRect/>
                     <a:stretch>
                       <a:fillRect/>
                     </a:stretch>
                   </pic:blipFill>
-                  <pic:spPr>
-                    <a:xfrm rot="5400000">
+                  <pic:spPr bwMode="auto">
+                    <a:xfrm>
                       <a:off x="0" y="0"/>
-                      <a:ext cx="7777476" cy="3316617"/>
+                      <a:ext cx="4589066" cy="5207183"/>
                     </a:xfrm>
                     <a:prstGeom prst="rect">
                       <a:avLst/>
                     </a:prstGeom>
+                    <a:noFill/>
+                    <a:ln>
+                      <a:noFill/>
+                    </a:ln>
                   </pic:spPr>
                 </pic:pic>
               </a:graphicData>
@@ -10275,29 +10284,6 @@
     <w:p>
       <w:pPr>
         <w:jc w:val="center"/>
-        <w:rPr>
-          <w:rFonts w:ascii="Times New Roman" w:eastAsia="標楷體" w:hAnsi="Times New Roman" w:cs="Times New Roman" w:hint="eastAsia"/>
-          <w:b/>
-          <w:bCs/>
-          <w:i/>
-          <w:iCs/>
-          <w:sz w:val="22"/>
-          <w:szCs w:val="22"/>
-        </w:rPr>
-      </w:pPr>
-      <w:r>
-        <w:rPr>
-          <w:rFonts w:ascii="Times New Roman" w:eastAsia="標楷體" w:hAnsi="Times New Roman" w:cs="Times New Roman" w:hint="eastAsia"/>
-          <w:b/>
-          <w:bCs/>
-          <w:i/>
-          <w:iCs/>
-          <w:sz w:val="22"/>
-          <w:szCs w:val="22"/>
-        </w:rPr>
-        <w:t xml:space="preserve">Figure 2-1 </w:t>
-      </w:r>
-      <w:r>
         <w:rPr>
           <w:rFonts w:ascii="Times New Roman" w:eastAsia="標楷體" w:hAnsi="Times New Roman" w:cs="Times New Roman"/>
           <w:b/>
@@ -10307,6 +10293,29 @@
           <w:sz w:val="22"/>
           <w:szCs w:val="22"/>
         </w:rPr>
+      </w:pPr>
+      <w:r>
+        <w:rPr>
+          <w:rFonts w:ascii="Times New Roman" w:eastAsia="標楷體" w:hAnsi="Times New Roman" w:cs="Times New Roman" w:hint="eastAsia"/>
+          <w:b/>
+          <w:bCs/>
+          <w:i/>
+          <w:iCs/>
+          <w:sz w:val="22"/>
+          <w:szCs w:val="22"/>
+        </w:rPr>
+        <w:t xml:space="preserve">Figure 2-1 </w:t>
+      </w:r>
+      <w:r>
+        <w:rPr>
+          <w:rFonts w:ascii="Times New Roman" w:eastAsia="標楷體" w:hAnsi="Times New Roman" w:cs="Times New Roman"/>
+          <w:b/>
+          <w:bCs/>
+          <w:i/>
+          <w:iCs/>
+          <w:sz w:val="22"/>
+          <w:szCs w:val="22"/>
+        </w:rPr>
         <w:t>Domain Class Diagram with Associations</w:t>
       </w:r>
     </w:p>
@@ -10325,16 +10334,16 @@
     <w:p>
       <w:pPr>
         <w:jc w:val="center"/>
-      </w:pPr>
-      <w:r>
-        <w:rPr>
-          <w:noProof/>
-        </w:rPr>
+        <w:rPr>
+          <w:rFonts w:hint="eastAsia"/>
+        </w:rPr>
+      </w:pPr>
+      <w:r>
         <w:drawing>
-          <wp:inline distT="0" distB="0" distL="0" distR="0" wp14:anchorId="5CF64CB4" wp14:editId="19382F8F">
-            <wp:extent cx="8174258" cy="3767284"/>
-            <wp:effectExtent l="0" t="0" r="0" b="0"/>
-            <wp:docPr id="2" name="圖片 2"/>
+          <wp:inline distT="0" distB="0" distL="0" distR="0" wp14:anchorId="13AEE99A" wp14:editId="355AB5B8">
+            <wp:extent cx="4775200" cy="5554822"/>
+            <wp:effectExtent l="0" t="0" r="6350" b="0"/>
+            <wp:docPr id="8" name="圖片 8"/>
             <wp:cNvGraphicFramePr>
               <a:graphicFrameLocks xmlns:a="http://schemas.openxmlformats.org/drawingml/2006/main" noChangeAspect="1"/>
             </wp:cNvGraphicFramePr>
@@ -10342,23 +10351,36 @@
               <a:graphicData uri="http://schemas.openxmlformats.org/drawingml/2006/picture">
                 <pic:pic xmlns:pic="http://schemas.openxmlformats.org/drawingml/2006/picture">
                   <pic:nvPicPr>
-                    <pic:cNvPr id="1" name=""/>
-                    <pic:cNvPicPr/>
+                    <pic:cNvPr id="0" name="Picture 23"/>
+                    <pic:cNvPicPr>
+                      <a:picLocks noChangeAspect="1" noChangeArrowheads="1"/>
+                    </pic:cNvPicPr>
                   </pic:nvPicPr>
                   <pic:blipFill>
-                    <a:blip r:embed="rId10"/>
+                    <a:blip r:embed="rId10" cstate="print">
+                      <a:extLst>
+                        <a:ext uri="{28A0092B-C50C-407E-A947-70E740481C1C}">
+                          <a14:useLocalDpi xmlns:a14="http://schemas.microsoft.com/office/drawing/2010/main" val="0"/>
+                        </a:ext>
+                      </a:extLst>
+                    </a:blip>
+                    <a:srcRect/>
                     <a:stretch>
                       <a:fillRect/>
                     </a:stretch>
                   </pic:blipFill>
-                  <pic:spPr>
-                    <a:xfrm rot="5400000">
+                  <pic:spPr bwMode="auto">
+                    <a:xfrm>
                       <a:off x="0" y="0"/>
-                      <a:ext cx="8216689" cy="3786839"/>
+                      <a:ext cx="4820055" cy="5607000"/>
                     </a:xfrm>
                     <a:prstGeom prst="rect">
                       <a:avLst/>
                     </a:prstGeom>
+                    <a:noFill/>
+                    <a:ln>
+                      <a:noFill/>
+                    </a:ln>
                   </pic:spPr>
                 </pic:pic>
               </a:graphicData>
@@ -10370,30 +10392,6 @@
     <w:p>
       <w:pPr>
         <w:jc w:val="center"/>
-        <w:rPr>
-          <w:rFonts w:ascii="Times New Roman" w:eastAsia="標楷體" w:hAnsi="Times New Roman" w:cs="Times New Roman" w:hint="eastAsia"/>
-          <w:b/>
-          <w:bCs/>
-          <w:i/>
-          <w:iCs/>
-          <w:sz w:val="22"/>
-          <w:szCs w:val="22"/>
-        </w:rPr>
-      </w:pPr>
-      <w:r>
-        <w:rPr>
-          <w:rFonts w:ascii="Times New Roman" w:eastAsia="標楷體" w:hAnsi="Times New Roman" w:cs="Times New Roman" w:hint="eastAsia"/>
-          <w:b/>
-          <w:bCs/>
-          <w:i/>
-          <w:iCs/>
-          <w:sz w:val="22"/>
-          <w:szCs w:val="22"/>
-        </w:rPr>
-        <w:lastRenderedPageBreak/>
-        <w:t xml:space="preserve">Figure 2-1 </w:t>
-      </w:r>
-      <w:r>
         <w:rPr>
           <w:rFonts w:ascii="Times New Roman" w:eastAsia="標楷體" w:hAnsi="Times New Roman" w:cs="Times New Roman"/>
           <w:b/>
@@ -10403,8 +10401,7 @@
           <w:sz w:val="22"/>
           <w:szCs w:val="22"/>
         </w:rPr>
-        <w:t>Domain Class Diagram with A</w:t>
-      </w:r>
+      </w:pPr>
       <w:r>
         <w:rPr>
           <w:rFonts w:ascii="Times New Roman" w:eastAsia="標楷體" w:hAnsi="Times New Roman" w:cs="Times New Roman" w:hint="eastAsia"/>
@@ -10415,6 +10412,30 @@
           <w:sz w:val="22"/>
           <w:szCs w:val="22"/>
         </w:rPr>
+        <w:t xml:space="preserve">Figure 2-1 </w:t>
+      </w:r>
+      <w:r>
+        <w:rPr>
+          <w:rFonts w:ascii="Times New Roman" w:eastAsia="標楷體" w:hAnsi="Times New Roman" w:cs="Times New Roman"/>
+          <w:b/>
+          <w:bCs/>
+          <w:i/>
+          <w:iCs/>
+          <w:sz w:val="22"/>
+          <w:szCs w:val="22"/>
+        </w:rPr>
+        <w:t>Domain Class Diagram with A</w:t>
+      </w:r>
+      <w:r>
+        <w:rPr>
+          <w:rFonts w:ascii="Times New Roman" w:eastAsia="標楷體" w:hAnsi="Times New Roman" w:cs="Times New Roman" w:hint="eastAsia"/>
+          <w:b/>
+          <w:bCs/>
+          <w:i/>
+          <w:iCs/>
+          <w:sz w:val="22"/>
+          <w:szCs w:val="22"/>
+        </w:rPr>
         <w:t>ttributes</w:t>
       </w:r>
     </w:p>
@@ -10426,6 +10447,7 @@
         <w:rPr>
           <w:rFonts w:hint="eastAsia"/>
         </w:rPr>
+        <w:lastRenderedPageBreak/>
         <w:t>3. Design</w:t>
       </w:r>
     </w:p>
@@ -10445,6 +10467,9 @@
         <w:jc w:val="center"/>
       </w:pPr>
       <w:r>
+        <w:rPr>
+          <w:noProof/>
+        </w:rPr>
         <w:drawing>
           <wp:inline distT="0" distB="0" distL="0" distR="0" wp14:anchorId="23B9AB71" wp14:editId="712F5C4E">
             <wp:extent cx="2400842" cy="4021105"/>
@@ -10499,53 +10524,6 @@
       <w:pPr>
         <w:jc w:val="center"/>
         <w:rPr>
-          <w:rFonts w:ascii="Times New Roman" w:eastAsia="標楷體" w:hAnsi="Times New Roman" w:cs="Times New Roman" w:hint="eastAsia"/>
-          <w:b/>
-          <w:bCs/>
-          <w:i/>
-          <w:iCs/>
-          <w:sz w:val="22"/>
-          <w:szCs w:val="22"/>
-        </w:rPr>
-      </w:pPr>
-      <w:r>
-        <w:rPr>
-          <w:rFonts w:ascii="Times New Roman" w:eastAsia="標楷體" w:hAnsi="Times New Roman" w:cs="Times New Roman" w:hint="eastAsia"/>
-          <w:b/>
-          <w:bCs/>
-          <w:i/>
-          <w:iCs/>
-          <w:sz w:val="22"/>
-          <w:szCs w:val="22"/>
-        </w:rPr>
-        <w:t xml:space="preserve">Figure </w:t>
-      </w:r>
-      <w:r>
-        <w:rPr>
-          <w:rFonts w:ascii="Times New Roman" w:eastAsia="標楷體" w:hAnsi="Times New Roman" w:cs="Times New Roman" w:hint="eastAsia"/>
-          <w:b/>
-          <w:bCs/>
-          <w:i/>
-          <w:iCs/>
-          <w:sz w:val="22"/>
-          <w:szCs w:val="22"/>
-        </w:rPr>
-        <w:t>3</w:t>
-      </w:r>
-      <w:r>
-        <w:rPr>
-          <w:rFonts w:ascii="Times New Roman" w:eastAsia="標楷體" w:hAnsi="Times New Roman" w:cs="Times New Roman" w:hint="eastAsia"/>
-          <w:b/>
-          <w:bCs/>
-          <w:i/>
-          <w:iCs/>
-          <w:sz w:val="22"/>
-          <w:szCs w:val="22"/>
-        </w:rPr>
-        <w:t xml:space="preserve">-1 </w:t>
-      </w:r>
-      <w:r>
-        <w:rPr>
           <w:rFonts w:ascii="Times New Roman" w:eastAsia="標楷體" w:hAnsi="Times New Roman" w:cs="Times New Roman"/>
           <w:b/>
           <w:bCs/>
@@ -10554,7 +10532,42 @@
           <w:sz w:val="22"/>
           <w:szCs w:val="22"/>
         </w:rPr>
-        <w:t>Logical Architecture</w:t>
+      </w:pPr>
+      <w:r>
+        <w:rPr>
+          <w:rFonts w:ascii="Times New Roman" w:eastAsia="標楷體" w:hAnsi="Times New Roman" w:cs="Times New Roman" w:hint="eastAsia"/>
+          <w:b/>
+          <w:bCs/>
+          <w:i/>
+          <w:iCs/>
+          <w:sz w:val="22"/>
+          <w:szCs w:val="22"/>
+        </w:rPr>
+        <w:t xml:space="preserve">Figure </w:t>
+      </w:r>
+      <w:r>
+        <w:rPr>
+          <w:rFonts w:ascii="Times New Roman" w:eastAsia="標楷體" w:hAnsi="Times New Roman" w:cs="Times New Roman" w:hint="eastAsia"/>
+          <w:b/>
+          <w:bCs/>
+          <w:i/>
+          <w:iCs/>
+          <w:sz w:val="22"/>
+          <w:szCs w:val="22"/>
+        </w:rPr>
+        <w:t>3</w:t>
+      </w:r>
+      <w:r>
+        <w:rPr>
+          <w:rFonts w:ascii="Times New Roman" w:eastAsia="標楷體" w:hAnsi="Times New Roman" w:cs="Times New Roman" w:hint="eastAsia"/>
+          <w:b/>
+          <w:bCs/>
+          <w:i/>
+          <w:iCs/>
+          <w:sz w:val="22"/>
+          <w:szCs w:val="22"/>
+        </w:rPr>
+        <w:t xml:space="preserve">-1 </w:t>
       </w:r>
       <w:r>
         <w:rPr>
@@ -10566,7 +10579,7 @@
           <w:sz w:val="22"/>
           <w:szCs w:val="22"/>
         </w:rPr>
-        <w:t xml:space="preserve"> </w:t>
+        <w:t xml:space="preserve">Logical Architecture </w:t>
       </w:r>
       <w:r>
         <w:rPr>
@@ -10608,6 +10621,9 @@
         <w:jc w:val="center"/>
       </w:pPr>
       <w:r>
+        <w:rPr>
+          <w:noProof/>
+        </w:rPr>
         <w:drawing>
           <wp:inline distT="0" distB="0" distL="0" distR="0" wp14:anchorId="3464DDB7" wp14:editId="577D62A5">
             <wp:extent cx="3198233" cy="1357690"/>
@@ -10649,7 +10665,7 @@
       <w:pPr>
         <w:jc w:val="center"/>
         <w:rPr>
-          <w:rFonts w:ascii="Times New Roman" w:eastAsia="標楷體" w:hAnsi="Times New Roman" w:cs="Times New Roman" w:hint="eastAsia"/>
+          <w:rFonts w:ascii="Times New Roman" w:eastAsia="標楷體" w:hAnsi="Times New Roman" w:cs="Times New Roman"/>
           <w:b/>
           <w:bCs/>
           <w:i/>
@@ -10734,11 +10750,11 @@
     <w:p>
       <w:pPr>
         <w:jc w:val="center"/>
-        <w:rPr>
-          <w:rFonts w:hint="eastAsia"/>
-        </w:rPr>
-      </w:pPr>
-      <w:r>
+      </w:pPr>
+      <w:r>
+        <w:rPr>
+          <w:noProof/>
+        </w:rPr>
         <w:lastRenderedPageBreak/>
         <w:drawing>
           <wp:inline distT="0" distB="0" distL="0" distR="0" wp14:anchorId="2570E9FD" wp14:editId="5B2AE440">
@@ -10781,7 +10797,7 @@
       <w:pPr>
         <w:jc w:val="center"/>
         <w:rPr>
-          <w:rFonts w:ascii="Times New Roman" w:eastAsia="標楷體" w:hAnsi="Times New Roman" w:cs="Times New Roman" w:hint="eastAsia"/>
+          <w:rFonts w:ascii="Times New Roman" w:eastAsia="標楷體" w:hAnsi="Times New Roman" w:cs="Times New Roman"/>
           <w:b/>
           <w:bCs/>
           <w:i/>
@@ -10892,6 +10908,9 @@
         <w:jc w:val="center"/>
       </w:pPr>
       <w:r>
+        <w:rPr>
+          <w:noProof/>
+        </w:rPr>
         <w:drawing>
           <wp:inline distT="0" distB="0" distL="0" distR="0" wp14:anchorId="340815CF" wp14:editId="7E89E59B">
             <wp:extent cx="3258905" cy="1460347"/>
@@ -10933,7 +10952,7 @@
       <w:pPr>
         <w:jc w:val="center"/>
         <w:rPr>
-          <w:rFonts w:ascii="Times New Roman" w:eastAsia="標楷體" w:hAnsi="Times New Roman" w:cs="Times New Roman" w:hint="eastAsia"/>
+          <w:rFonts w:ascii="Times New Roman" w:eastAsia="標楷體" w:hAnsi="Times New Roman" w:cs="Times New Roman"/>
           <w:b/>
           <w:bCs/>
           <w:i/>
@@ -11012,43 +11031,7 @@
           <w:sz w:val="22"/>
           <w:szCs w:val="22"/>
         </w:rPr>
-        <w:t xml:space="preserve">System Sequence Diagram of FEA-01: </w:t>
-      </w:r>
-      <w:r>
-        <w:rPr>
-          <w:rFonts w:ascii="Times New Roman" w:eastAsia="標楷體" w:hAnsi="Times New Roman" w:cs="Times New Roman" w:hint="eastAsia"/>
-          <w:b/>
-          <w:bCs/>
-          <w:i/>
-          <w:iCs/>
-          <w:sz w:val="22"/>
-          <w:szCs w:val="22"/>
-        </w:rPr>
-        <w:t>view</w:t>
-      </w:r>
-      <w:r>
-        <w:rPr>
-          <w:rFonts w:ascii="Times New Roman" w:eastAsia="標楷體" w:hAnsi="Times New Roman" w:cs="Times New Roman" w:hint="eastAsia"/>
-          <w:b/>
-          <w:bCs/>
-          <w:i/>
-          <w:iCs/>
-          <w:sz w:val="22"/>
-          <w:szCs w:val="22"/>
-        </w:rPr>
-        <w:t xml:space="preserve"> book</w:t>
-      </w:r>
-      <w:r>
-        <w:rPr>
-          <w:rFonts w:ascii="Times New Roman" w:eastAsia="標楷體" w:hAnsi="Times New Roman" w:cs="Times New Roman" w:hint="eastAsia"/>
-          <w:b/>
-          <w:bCs/>
-          <w:i/>
-          <w:iCs/>
-          <w:sz w:val="22"/>
-          <w:szCs w:val="22"/>
-        </w:rPr>
-        <w:t xml:space="preserve"> list</w:t>
+        <w:t>System Sequence Diagram of FEA-01: view book list</w:t>
       </w:r>
     </w:p>
     <w:p>
@@ -11056,6 +11039,9 @@
         <w:jc w:val="center"/>
       </w:pPr>
       <w:r>
+        <w:rPr>
+          <w:noProof/>
+        </w:rPr>
         <w:drawing>
           <wp:inline distT="0" distB="0" distL="0" distR="0" wp14:anchorId="0CBE34B2" wp14:editId="736C72CB">
             <wp:extent cx="3129153" cy="1402204"/>
@@ -11097,7 +11083,7 @@
       <w:pPr>
         <w:jc w:val="center"/>
         <w:rPr>
-          <w:rFonts w:ascii="Times New Roman" w:eastAsia="標楷體" w:hAnsi="Times New Roman" w:cs="Times New Roman" w:hint="eastAsia"/>
+          <w:rFonts w:ascii="Times New Roman" w:eastAsia="標楷體" w:hAnsi="Times New Roman" w:cs="Times New Roman"/>
           <w:b/>
           <w:bCs/>
           <w:i/>
@@ -11176,31 +11162,7 @@
           <w:sz w:val="22"/>
           <w:szCs w:val="22"/>
         </w:rPr>
-        <w:t xml:space="preserve">System Sequence Diagram of FEA-01: </w:t>
-      </w:r>
-      <w:r>
-        <w:rPr>
-          <w:rFonts w:ascii="Times New Roman" w:eastAsia="標楷體" w:hAnsi="Times New Roman" w:cs="Times New Roman" w:hint="eastAsia"/>
-          <w:b/>
-          <w:bCs/>
-          <w:i/>
-          <w:iCs/>
-          <w:sz w:val="22"/>
-          <w:szCs w:val="22"/>
-        </w:rPr>
-        <w:t>update</w:t>
-      </w:r>
-      <w:r>
-        <w:rPr>
-          <w:rFonts w:ascii="Times New Roman" w:eastAsia="標楷體" w:hAnsi="Times New Roman" w:cs="Times New Roman" w:hint="eastAsia"/>
-          <w:b/>
-          <w:bCs/>
-          <w:i/>
-          <w:iCs/>
-          <w:sz w:val="22"/>
-          <w:szCs w:val="22"/>
-        </w:rPr>
-        <w:t xml:space="preserve"> book</w:t>
+        <w:t>System Sequence Diagram of FEA-01: update book</w:t>
       </w:r>
     </w:p>
     <w:p>
@@ -11208,6 +11170,9 @@
         <w:jc w:val="center"/>
       </w:pPr>
       <w:r>
+        <w:rPr>
+          <w:noProof/>
+        </w:rPr>
         <w:drawing>
           <wp:inline distT="0" distB="0" distL="0" distR="0" wp14:anchorId="58C89F6E" wp14:editId="2BD3494C">
             <wp:extent cx="3302499" cy="1479882"/>
@@ -11248,9 +11213,6 @@
     <w:p>
       <w:pPr>
         <w:jc w:val="center"/>
-        <w:rPr>
-          <w:rFonts w:hint="eastAsia"/>
-        </w:rPr>
       </w:pPr>
       <w:r>
         <w:rPr>
@@ -11322,39 +11284,12 @@
           <w:sz w:val="22"/>
           <w:szCs w:val="22"/>
         </w:rPr>
-        <w:t xml:space="preserve">System Sequence Diagram of FEA-01: </w:t>
-      </w:r>
-      <w:r>
-        <w:rPr>
-          <w:rFonts w:ascii="Times New Roman" w:eastAsia="標楷體" w:hAnsi="Times New Roman" w:cs="Times New Roman" w:hint="eastAsia"/>
-          <w:b/>
-          <w:bCs/>
-          <w:i/>
-          <w:iCs/>
-          <w:sz w:val="22"/>
-          <w:szCs w:val="22"/>
-        </w:rPr>
-        <w:t>delete</w:t>
-      </w:r>
-      <w:r>
-        <w:rPr>
-          <w:rFonts w:ascii="Times New Roman" w:eastAsia="標楷體" w:hAnsi="Times New Roman" w:cs="Times New Roman" w:hint="eastAsia"/>
-          <w:b/>
-          <w:bCs/>
-          <w:i/>
-          <w:iCs/>
-          <w:sz w:val="22"/>
-          <w:szCs w:val="22"/>
-        </w:rPr>
-        <w:t xml:space="preserve"> book</w:t>
+        <w:t>System Sequence Diagram of FEA-01: delete book</w:t>
       </w:r>
     </w:p>
     <w:p>
       <w:pPr>
         <w:pStyle w:val="3"/>
-        <w:rPr>
-          <w:rFonts w:hint="eastAsia"/>
-        </w:rPr>
       </w:pPr>
       <w:r>
         <w:rPr>
@@ -11366,6 +11301,9 @@
     </w:p>
     <w:p>
       <w:r>
+        <w:rPr>
+          <w:noProof/>
+        </w:rPr>
         <w:drawing>
           <wp:inline distT="0" distB="0" distL="0" distR="0" wp14:anchorId="35655F5A" wp14:editId="12FFA824">
             <wp:extent cx="5274310" cy="1906905"/>
@@ -11406,9 +11344,6 @@
     <w:p>
       <w:pPr>
         <w:jc w:val="center"/>
-        <w:rPr>
-          <w:rFonts w:hint="eastAsia"/>
-        </w:rPr>
       </w:pPr>
       <w:r>
         <w:rPr>
@@ -11456,8 +11391,9 @@
           <w:sz w:val="22"/>
           <w:szCs w:val="22"/>
         </w:rPr>
-        <w:t>7</w:t>
-      </w:r>
+        <w:t xml:space="preserve">7 Sequence </w:t>
+      </w:r>
+      <w:proofErr w:type="gramStart"/>
       <w:r>
         <w:rPr>
           <w:rFonts w:ascii="Times New Roman" w:eastAsia="標楷體" w:hAnsi="Times New Roman" w:cs="Times New Roman" w:hint="eastAsia"/>
@@ -11468,9 +11404,9 @@
           <w:sz w:val="22"/>
           <w:szCs w:val="22"/>
         </w:rPr>
-        <w:t xml:space="preserve"> Sequence </w:t>
-      </w:r>
-      <w:proofErr w:type="gramStart"/>
+        <w:t>Diagram :</w:t>
+      </w:r>
+      <w:proofErr w:type="gramEnd"/>
       <w:r>
         <w:rPr>
           <w:rFonts w:ascii="Times New Roman" w:eastAsia="標楷體" w:hAnsi="Times New Roman" w:cs="Times New Roman" w:hint="eastAsia"/>
@@ -11481,8 +11417,9 @@
           <w:sz w:val="22"/>
           <w:szCs w:val="22"/>
         </w:rPr>
-        <w:t xml:space="preserve">Diagram </w:t>
-      </w:r>
+        <w:t xml:space="preserve"> </w:t>
+      </w:r>
+      <w:proofErr w:type="spellStart"/>
       <w:r>
         <w:rPr>
           <w:rFonts w:ascii="Times New Roman" w:eastAsia="標楷體" w:hAnsi="Times New Roman" w:cs="Times New Roman" w:hint="eastAsia"/>
@@ -11493,38 +11430,15 @@
           <w:sz w:val="22"/>
           <w:szCs w:val="22"/>
         </w:rPr>
-        <w:t>:</w:t>
-      </w:r>
-      <w:proofErr w:type="gramEnd"/>
-      <w:r>
-        <w:rPr>
-          <w:rFonts w:ascii="Times New Roman" w:eastAsia="標楷體" w:hAnsi="Times New Roman" w:cs="Times New Roman" w:hint="eastAsia"/>
-          <w:b/>
-          <w:bCs/>
-          <w:i/>
-          <w:iCs/>
-          <w:sz w:val="22"/>
-          <w:szCs w:val="22"/>
-        </w:rPr>
-        <w:t xml:space="preserve"> </w:t>
-      </w:r>
-      <w:proofErr w:type="spellStart"/>
-      <w:r>
-        <w:rPr>
-          <w:rFonts w:ascii="Times New Roman" w:eastAsia="標楷體" w:hAnsi="Times New Roman" w:cs="Times New Roman" w:hint="eastAsia"/>
-          <w:b/>
-          <w:bCs/>
-          <w:i/>
-          <w:iCs/>
-          <w:sz w:val="22"/>
-          <w:szCs w:val="22"/>
-        </w:rPr>
         <w:t>checkOut</w:t>
       </w:r>
       <w:proofErr w:type="spellEnd"/>
     </w:p>
     <w:p>
       <w:r>
+        <w:rPr>
+          <w:noProof/>
+        </w:rPr>
         <w:drawing>
           <wp:inline distT="0" distB="0" distL="0" distR="0" wp14:anchorId="102CBAFB" wp14:editId="024ECFE3">
             <wp:extent cx="5274310" cy="1442085"/>
@@ -11565,9 +11479,6 @@
     <w:p>
       <w:pPr>
         <w:jc w:val="center"/>
-        <w:rPr>
-          <w:rFonts w:hint="eastAsia"/>
-        </w:rPr>
       </w:pPr>
       <w:r>
         <w:rPr>
@@ -11615,8 +11526,9 @@
           <w:sz w:val="22"/>
           <w:szCs w:val="22"/>
         </w:rPr>
-        <w:t>8</w:t>
-      </w:r>
+        <w:t xml:space="preserve">8 Sequence </w:t>
+      </w:r>
+      <w:proofErr w:type="gramStart"/>
       <w:r>
         <w:rPr>
           <w:rFonts w:ascii="Times New Roman" w:eastAsia="標楷體" w:hAnsi="Times New Roman" w:cs="Times New Roman" w:hint="eastAsia"/>
@@ -11627,9 +11539,9 @@
           <w:sz w:val="22"/>
           <w:szCs w:val="22"/>
         </w:rPr>
-        <w:t xml:space="preserve"> Sequence </w:t>
-      </w:r>
-      <w:proofErr w:type="gramStart"/>
+        <w:t>Diagram :</w:t>
+      </w:r>
+      <w:proofErr w:type="gramEnd"/>
       <w:r>
         <w:rPr>
           <w:rFonts w:ascii="Times New Roman" w:eastAsia="標楷體" w:hAnsi="Times New Roman" w:cs="Times New Roman" w:hint="eastAsia"/>
@@ -11640,9 +11552,9 @@
           <w:sz w:val="22"/>
           <w:szCs w:val="22"/>
         </w:rPr>
-        <w:t>Diagram :</w:t>
-      </w:r>
-      <w:proofErr w:type="gramEnd"/>
+        <w:t xml:space="preserve"> </w:t>
+      </w:r>
+      <w:proofErr w:type="spellStart"/>
       <w:r>
         <w:rPr>
           <w:rFonts w:ascii="Times New Roman" w:eastAsia="標楷體" w:hAnsi="Times New Roman" w:cs="Times New Roman" w:hint="eastAsia"/>
@@ -11653,44 +11565,7 @@
           <w:sz w:val="22"/>
           <w:szCs w:val="22"/>
         </w:rPr>
-        <w:t xml:space="preserve"> </w:t>
-      </w:r>
-      <w:proofErr w:type="spellStart"/>
-      <w:r>
-        <w:rPr>
-          <w:rFonts w:ascii="Times New Roman" w:eastAsia="標楷體" w:hAnsi="Times New Roman" w:cs="Times New Roman" w:hint="eastAsia"/>
-          <w:b/>
-          <w:bCs/>
-          <w:i/>
-          <w:iCs/>
-          <w:sz w:val="22"/>
-          <w:szCs w:val="22"/>
-        </w:rPr>
-        <w:t>add</w:t>
-      </w:r>
-      <w:r>
-        <w:rPr>
-          <w:rFonts w:ascii="Times New Roman" w:eastAsia="標楷體" w:hAnsi="Times New Roman" w:cs="Times New Roman" w:hint="eastAsia"/>
-          <w:b/>
-          <w:bCs/>
-          <w:i/>
-          <w:iCs/>
-          <w:sz w:val="22"/>
-          <w:szCs w:val="22"/>
-        </w:rPr>
-        <w:t>B</w:t>
-      </w:r>
-      <w:r>
-        <w:rPr>
-          <w:rFonts w:ascii="Times New Roman" w:eastAsia="標楷體" w:hAnsi="Times New Roman" w:cs="Times New Roman" w:hint="eastAsia"/>
-          <w:b/>
-          <w:bCs/>
-          <w:i/>
-          <w:iCs/>
-          <w:sz w:val="22"/>
-          <w:szCs w:val="22"/>
-        </w:rPr>
-        <w:t>ook</w:t>
+        <w:t>addBook</w:t>
       </w:r>
       <w:proofErr w:type="spellEnd"/>
     </w:p>
@@ -11699,6 +11574,9 @@
         <w:jc w:val="center"/>
       </w:pPr>
       <w:r>
+        <w:rPr>
+          <w:noProof/>
+        </w:rPr>
         <w:drawing>
           <wp:inline distT="0" distB="0" distL="0" distR="0" wp14:anchorId="07462C8E" wp14:editId="5C637EB2">
             <wp:extent cx="4307906" cy="1952717"/>
@@ -11739,9 +11617,6 @@
     <w:p>
       <w:pPr>
         <w:jc w:val="center"/>
-        <w:rPr>
-          <w:rFonts w:hint="eastAsia"/>
-        </w:rPr>
       </w:pPr>
       <w:r>
         <w:rPr>
@@ -11789,8 +11664,9 @@
           <w:sz w:val="22"/>
           <w:szCs w:val="22"/>
         </w:rPr>
-        <w:t>9</w:t>
-      </w:r>
+        <w:t xml:space="preserve">9 Sequence </w:t>
+      </w:r>
+      <w:proofErr w:type="gramStart"/>
       <w:r>
         <w:rPr>
           <w:rFonts w:ascii="Times New Roman" w:eastAsia="標楷體" w:hAnsi="Times New Roman" w:cs="Times New Roman" w:hint="eastAsia"/>
@@ -11801,9 +11677,9 @@
           <w:sz w:val="22"/>
           <w:szCs w:val="22"/>
         </w:rPr>
-        <w:t xml:space="preserve"> Sequence </w:t>
-      </w:r>
-      <w:proofErr w:type="gramStart"/>
+        <w:t>Diagram :</w:t>
+      </w:r>
+      <w:proofErr w:type="gramEnd"/>
       <w:r>
         <w:rPr>
           <w:rFonts w:ascii="Times New Roman" w:eastAsia="標楷體" w:hAnsi="Times New Roman" w:cs="Times New Roman" w:hint="eastAsia"/>
@@ -11814,9 +11690,9 @@
           <w:sz w:val="22"/>
           <w:szCs w:val="22"/>
         </w:rPr>
-        <w:t>Diagram :</w:t>
-      </w:r>
-      <w:proofErr w:type="gramEnd"/>
+        <w:t xml:space="preserve"> </w:t>
+      </w:r>
+      <w:proofErr w:type="spellStart"/>
       <w:r>
         <w:rPr>
           <w:rFonts w:ascii="Times New Roman" w:eastAsia="標楷體" w:hAnsi="Times New Roman" w:cs="Times New Roman" w:hint="eastAsia"/>
@@ -11827,25 +11703,15 @@
           <w:sz w:val="22"/>
           <w:szCs w:val="22"/>
         </w:rPr>
-        <w:t xml:space="preserve"> </w:t>
-      </w:r>
-      <w:proofErr w:type="spellStart"/>
-      <w:r>
-        <w:rPr>
-          <w:rFonts w:ascii="Times New Roman" w:eastAsia="標楷體" w:hAnsi="Times New Roman" w:cs="Times New Roman" w:hint="eastAsia"/>
-          <w:b/>
-          <w:bCs/>
-          <w:i/>
-          <w:iCs/>
-          <w:sz w:val="22"/>
-          <w:szCs w:val="22"/>
-        </w:rPr>
         <w:t>viewBookList</w:t>
       </w:r>
       <w:proofErr w:type="spellEnd"/>
     </w:p>
     <w:p>
       <w:r>
+        <w:rPr>
+          <w:noProof/>
+        </w:rPr>
         <w:lastRenderedPageBreak/>
         <w:drawing>
           <wp:inline distT="0" distB="0" distL="0" distR="0" wp14:anchorId="0972C7BB" wp14:editId="6084EFF2">
@@ -11887,9 +11753,6 @@
     <w:p>
       <w:pPr>
         <w:jc w:val="center"/>
-        <w:rPr>
-          <w:rFonts w:hint="eastAsia"/>
-        </w:rPr>
       </w:pPr>
       <w:r>
         <w:rPr>
@@ -11937,8 +11800,9 @@
           <w:sz w:val="22"/>
           <w:szCs w:val="22"/>
         </w:rPr>
-        <w:t>10</w:t>
-      </w:r>
+        <w:t xml:space="preserve">10 Sequence </w:t>
+      </w:r>
+      <w:proofErr w:type="gramStart"/>
       <w:r>
         <w:rPr>
           <w:rFonts w:ascii="Times New Roman" w:eastAsia="標楷體" w:hAnsi="Times New Roman" w:cs="Times New Roman" w:hint="eastAsia"/>
@@ -11949,9 +11813,9 @@
           <w:sz w:val="22"/>
           <w:szCs w:val="22"/>
         </w:rPr>
-        <w:t xml:space="preserve"> Sequence </w:t>
-      </w:r>
-      <w:proofErr w:type="gramStart"/>
+        <w:t>Diagram :</w:t>
+      </w:r>
+      <w:proofErr w:type="gramEnd"/>
       <w:r>
         <w:rPr>
           <w:rFonts w:ascii="Times New Roman" w:eastAsia="標楷體" w:hAnsi="Times New Roman" w:cs="Times New Roman" w:hint="eastAsia"/>
@@ -11962,9 +11826,9 @@
           <w:sz w:val="22"/>
           <w:szCs w:val="22"/>
         </w:rPr>
-        <w:t>Diagram :</w:t>
-      </w:r>
-      <w:proofErr w:type="gramEnd"/>
+        <w:t xml:space="preserve"> </w:t>
+      </w:r>
+      <w:proofErr w:type="spellStart"/>
       <w:r>
         <w:rPr>
           <w:rFonts w:ascii="Times New Roman" w:eastAsia="標楷體" w:hAnsi="Times New Roman" w:cs="Times New Roman" w:hint="eastAsia"/>
@@ -11975,25 +11839,15 @@
           <w:sz w:val="22"/>
           <w:szCs w:val="22"/>
         </w:rPr>
-        <w:t xml:space="preserve"> </w:t>
-      </w:r>
-      <w:proofErr w:type="spellStart"/>
-      <w:r>
-        <w:rPr>
-          <w:rFonts w:ascii="Times New Roman" w:eastAsia="標楷體" w:hAnsi="Times New Roman" w:cs="Times New Roman" w:hint="eastAsia"/>
-          <w:b/>
-          <w:bCs/>
-          <w:i/>
-          <w:iCs/>
-          <w:sz w:val="22"/>
-          <w:szCs w:val="22"/>
-        </w:rPr>
         <w:t>updateBook</w:t>
       </w:r>
       <w:proofErr w:type="spellEnd"/>
     </w:p>
     <w:p>
       <w:r>
+        <w:rPr>
+          <w:noProof/>
+        </w:rPr>
         <w:drawing>
           <wp:inline distT="0" distB="0" distL="0" distR="0" wp14:anchorId="39AB2E37" wp14:editId="125EE8D8">
             <wp:extent cx="5274310" cy="1831975"/>
@@ -12034,9 +11888,6 @@
     <w:p>
       <w:pPr>
         <w:jc w:val="center"/>
-        <w:rPr>
-          <w:rFonts w:hint="eastAsia"/>
-        </w:rPr>
       </w:pPr>
       <w:r>
         <w:rPr>
@@ -12084,8 +11935,9 @@
           <w:sz w:val="22"/>
           <w:szCs w:val="22"/>
         </w:rPr>
-        <w:t>1</w:t>
-      </w:r>
+        <w:t xml:space="preserve">11 Sequence </w:t>
+      </w:r>
+      <w:proofErr w:type="gramStart"/>
       <w:r>
         <w:rPr>
           <w:rFonts w:ascii="Times New Roman" w:eastAsia="標楷體" w:hAnsi="Times New Roman" w:cs="Times New Roman" w:hint="eastAsia"/>
@@ -12096,8 +11948,9 @@
           <w:sz w:val="22"/>
           <w:szCs w:val="22"/>
         </w:rPr>
-        <w:t>1</w:t>
-      </w:r>
+        <w:t>Diagram :</w:t>
+      </w:r>
+      <w:proofErr w:type="gramEnd"/>
       <w:r>
         <w:rPr>
           <w:rFonts w:ascii="Times New Roman" w:eastAsia="標楷體" w:hAnsi="Times New Roman" w:cs="Times New Roman" w:hint="eastAsia"/>
@@ -12108,9 +11961,9 @@
           <w:sz w:val="22"/>
           <w:szCs w:val="22"/>
         </w:rPr>
-        <w:t xml:space="preserve"> Sequence </w:t>
-      </w:r>
-      <w:proofErr w:type="gramStart"/>
+        <w:t xml:space="preserve"> </w:t>
+      </w:r>
+      <w:proofErr w:type="spellStart"/>
       <w:r>
         <w:rPr>
           <w:rFonts w:ascii="Times New Roman" w:eastAsia="標楷體" w:hAnsi="Times New Roman" w:cs="Times New Roman" w:hint="eastAsia"/>
@@ -12121,45 +11974,7 @@
           <w:sz w:val="22"/>
           <w:szCs w:val="22"/>
         </w:rPr>
-        <w:t>Diagram :</w:t>
-      </w:r>
-      <w:proofErr w:type="gramEnd"/>
-      <w:r>
-        <w:rPr>
-          <w:rFonts w:ascii="Times New Roman" w:eastAsia="標楷體" w:hAnsi="Times New Roman" w:cs="Times New Roman" w:hint="eastAsia"/>
-          <w:b/>
-          <w:bCs/>
-          <w:i/>
-          <w:iCs/>
-          <w:sz w:val="22"/>
-          <w:szCs w:val="22"/>
-        </w:rPr>
-        <w:t xml:space="preserve"> </w:t>
-      </w:r>
-      <w:proofErr w:type="spellStart"/>
-      <w:r>
-        <w:rPr>
-          <w:rFonts w:ascii="Times New Roman" w:eastAsia="標楷體" w:hAnsi="Times New Roman" w:cs="Times New Roman" w:hint="eastAsia"/>
-          <w:b/>
-          <w:bCs/>
-          <w:i/>
-          <w:iCs/>
-          <w:sz w:val="22"/>
-          <w:szCs w:val="22"/>
-        </w:rPr>
-        <w:t>delet</w:t>
-      </w:r>
-      <w:r>
-        <w:rPr>
-          <w:rFonts w:ascii="Times New Roman" w:eastAsia="標楷體" w:hAnsi="Times New Roman" w:cs="Times New Roman" w:hint="eastAsia"/>
-          <w:b/>
-          <w:bCs/>
-          <w:i/>
-          <w:iCs/>
-          <w:sz w:val="22"/>
-          <w:szCs w:val="22"/>
-        </w:rPr>
-        <w:t>eBook</w:t>
+        <w:t>deleteBook</w:t>
       </w:r>
       <w:proofErr w:type="spellEnd"/>
     </w:p>
@@ -12249,7 +12064,7 @@
           <w:p>
             <w:pPr>
               <w:rPr>
-                <w:rFonts w:ascii="Times New Roman" w:eastAsia="標楷體" w:hAnsi="Times New Roman" w:cs="Times New Roman" w:hint="eastAsia"/>
+                <w:rFonts w:ascii="Times New Roman" w:eastAsia="標楷體" w:hAnsi="Times New Roman" w:cs="Times New Roman"/>
               </w:rPr>
             </w:pPr>
             <w:r>
@@ -12310,7 +12125,7 @@
           <w:p>
             <w:pPr>
               <w:rPr>
-                <w:rFonts w:ascii="Times New Roman" w:eastAsia="標楷體" w:hAnsi="Times New Roman" w:cs="Times New Roman" w:hint="eastAsia"/>
+                <w:rFonts w:ascii="Times New Roman" w:eastAsia="標楷體" w:hAnsi="Times New Roman" w:cs="Times New Roman"/>
               </w:rPr>
             </w:pPr>
             <w:r>
@@ -12329,7 +12144,7 @@
           <w:p>
             <w:pPr>
               <w:rPr>
-                <w:rFonts w:ascii="Times New Roman" w:eastAsia="標楷體" w:hAnsi="Times New Roman" w:cs="Times New Roman" w:hint="eastAsia"/>
+                <w:rFonts w:ascii="Times New Roman" w:eastAsia="標楷體" w:hAnsi="Times New Roman" w:cs="Times New Roman"/>
               </w:rPr>
             </w:pPr>
           </w:p>
@@ -12378,7 +12193,7 @@
           <w:p>
             <w:pPr>
               <w:rPr>
-                <w:rFonts w:ascii="Times New Roman" w:eastAsia="標楷體" w:hAnsi="Times New Roman" w:cs="Times New Roman" w:hint="eastAsia"/>
+                <w:rFonts w:ascii="Times New Roman" w:eastAsia="標楷體" w:hAnsi="Times New Roman" w:cs="Times New Roman"/>
               </w:rPr>
             </w:pPr>
           </w:p>
@@ -12391,7 +12206,7 @@
           <w:p>
             <w:pPr>
               <w:rPr>
-                <w:rFonts w:ascii="Times New Roman" w:eastAsia="標楷體" w:hAnsi="Times New Roman" w:cs="Times New Roman" w:hint="eastAsia"/>
+                <w:rFonts w:ascii="Times New Roman" w:eastAsia="標楷體" w:hAnsi="Times New Roman" w:cs="Times New Roman"/>
               </w:rPr>
             </w:pPr>
           </w:p>
@@ -12446,7 +12261,7 @@
           <w:p>
             <w:pPr>
               <w:rPr>
-                <w:rFonts w:ascii="Times New Roman" w:eastAsia="標楷體" w:hAnsi="Times New Roman" w:cs="Times New Roman" w:hint="eastAsia"/>
+                <w:rFonts w:ascii="Times New Roman" w:eastAsia="標楷體" w:hAnsi="Times New Roman" w:cs="Times New Roman"/>
               </w:rPr>
             </w:pPr>
             <w:r>
@@ -12465,7 +12280,7 @@
           <w:p>
             <w:pPr>
               <w:rPr>
-                <w:rFonts w:ascii="Times New Roman" w:eastAsia="標楷體" w:hAnsi="Times New Roman" w:cs="Times New Roman" w:hint="eastAsia"/>
+                <w:rFonts w:ascii="Times New Roman" w:eastAsia="標楷體" w:hAnsi="Times New Roman" w:cs="Times New Roman"/>
               </w:rPr>
             </w:pPr>
           </w:p>
@@ -12514,7 +12329,7 @@
           <w:p>
             <w:pPr>
               <w:rPr>
-                <w:rFonts w:ascii="Times New Roman" w:eastAsia="標楷體" w:hAnsi="Times New Roman" w:cs="Times New Roman" w:hint="eastAsia"/>
+                <w:rFonts w:ascii="Times New Roman" w:eastAsia="標楷體" w:hAnsi="Times New Roman" w:cs="Times New Roman"/>
               </w:rPr>
             </w:pPr>
           </w:p>
@@ -12527,7 +12342,7 @@
           <w:p>
             <w:pPr>
               <w:rPr>
-                <w:rFonts w:ascii="Times New Roman" w:eastAsia="標楷體" w:hAnsi="Times New Roman" w:cs="Times New Roman" w:hint="eastAsia"/>
+                <w:rFonts w:ascii="Times New Roman" w:eastAsia="標楷體" w:hAnsi="Times New Roman" w:cs="Times New Roman"/>
               </w:rPr>
             </w:pPr>
           </w:p>
@@ -12582,7 +12397,7 @@
           <w:p>
             <w:pPr>
               <w:rPr>
-                <w:rFonts w:ascii="Times New Roman" w:eastAsia="標楷體" w:hAnsi="Times New Roman" w:cs="Times New Roman" w:hint="eastAsia"/>
+                <w:rFonts w:ascii="Times New Roman" w:eastAsia="標楷體" w:hAnsi="Times New Roman" w:cs="Times New Roman"/>
               </w:rPr>
             </w:pPr>
             <w:r>
@@ -12601,7 +12416,7 @@
           <w:p>
             <w:pPr>
               <w:rPr>
-                <w:rFonts w:ascii="Times New Roman" w:eastAsia="標楷體" w:hAnsi="Times New Roman" w:cs="Times New Roman" w:hint="eastAsia"/>
+                <w:rFonts w:ascii="Times New Roman" w:eastAsia="標楷體" w:hAnsi="Times New Roman" w:cs="Times New Roman"/>
               </w:rPr>
             </w:pPr>
           </w:p>
@@ -12650,7 +12465,7 @@
           <w:p>
             <w:pPr>
               <w:rPr>
-                <w:rFonts w:ascii="Times New Roman" w:eastAsia="標楷體" w:hAnsi="Times New Roman" w:cs="Times New Roman" w:hint="eastAsia"/>
+                <w:rFonts w:ascii="Times New Roman" w:eastAsia="標楷體" w:hAnsi="Times New Roman" w:cs="Times New Roman"/>
               </w:rPr>
             </w:pPr>
           </w:p>
@@ -12663,7 +12478,7 @@
           <w:p>
             <w:pPr>
               <w:rPr>
-                <w:rFonts w:ascii="Times New Roman" w:eastAsia="標楷體" w:hAnsi="Times New Roman" w:cs="Times New Roman" w:hint="eastAsia"/>
+                <w:rFonts w:ascii="Times New Roman" w:eastAsia="標楷體" w:hAnsi="Times New Roman" w:cs="Times New Roman"/>
               </w:rPr>
             </w:pPr>
           </w:p>
@@ -12712,7 +12527,7 @@
           <w:p>
             <w:pPr>
               <w:rPr>
-                <w:rFonts w:ascii="Times New Roman" w:eastAsia="標楷體" w:hAnsi="Times New Roman" w:cs="Times New Roman" w:hint="eastAsia"/>
+                <w:rFonts w:ascii="Times New Roman" w:eastAsia="標楷體" w:hAnsi="Times New Roman" w:cs="Times New Roman"/>
               </w:rPr>
             </w:pPr>
           </w:p>
@@ -12725,7 +12540,7 @@
           <w:p>
             <w:pPr>
               <w:rPr>
-                <w:rFonts w:ascii="Times New Roman" w:eastAsia="標楷體" w:hAnsi="Times New Roman" w:cs="Times New Roman" w:hint="eastAsia"/>
+                <w:rFonts w:ascii="Times New Roman" w:eastAsia="標楷體" w:hAnsi="Times New Roman" w:cs="Times New Roman"/>
               </w:rPr>
             </w:pPr>
           </w:p>
@@ -12774,7 +12589,7 @@
           <w:p>
             <w:pPr>
               <w:rPr>
-                <w:rFonts w:ascii="Times New Roman" w:eastAsia="標楷體" w:hAnsi="Times New Roman" w:cs="Times New Roman" w:hint="eastAsia"/>
+                <w:rFonts w:ascii="Times New Roman" w:eastAsia="標楷體" w:hAnsi="Times New Roman" w:cs="Times New Roman"/>
               </w:rPr>
             </w:pPr>
           </w:p>
@@ -12787,7 +12602,7 @@
           <w:p>
             <w:pPr>
               <w:rPr>
-                <w:rFonts w:ascii="Times New Roman" w:eastAsia="標楷體" w:hAnsi="Times New Roman" w:cs="Times New Roman" w:hint="eastAsia"/>
+                <w:rFonts w:ascii="Times New Roman" w:eastAsia="標楷體" w:hAnsi="Times New Roman" w:cs="Times New Roman"/>
               </w:rPr>
             </w:pPr>
           </w:p>
@@ -12800,24 +12615,19 @@
         <w:tc>
           <w:tcPr>
             <w:tcW w:w="1877" w:type="dxa"/>
-          </w:tcPr>
-          <w:p>
-            <w:pPr>
-              <w:rPr>
-                <w:rFonts w:ascii="Times New Roman" w:eastAsia="標楷體" w:hAnsi="Times New Roman" w:cs="Times New Roman"/>
-              </w:rPr>
-            </w:pPr>
-            <w:r>
-              <w:rPr>
-                <w:rFonts w:ascii="Times New Roman" w:eastAsia="標楷體" w:hAnsi="Times New Roman" w:cs="Times New Roman" w:hint="eastAsia"/>
-              </w:rPr>
-              <w:t>HW#</w:t>
-            </w:r>
-            <w:r>
-              <w:rPr>
-                <w:rFonts w:ascii="Times New Roman" w:eastAsia="標楷體" w:hAnsi="Times New Roman" w:cs="Times New Roman" w:hint="eastAsia"/>
-              </w:rPr>
-              <w:t>4</w:t>
+            <w:vMerge w:val="restart"/>
+          </w:tcPr>
+          <w:p>
+            <w:pPr>
+              <w:rPr>
+                <w:rFonts w:ascii="Times New Roman" w:eastAsia="標楷體" w:hAnsi="Times New Roman" w:cs="Times New Roman"/>
+              </w:rPr>
+            </w:pPr>
+            <w:r>
+              <w:rPr>
+                <w:rFonts w:ascii="Times New Roman" w:eastAsia="標楷體" w:hAnsi="Times New Roman" w:cs="Times New Roman" w:hint="eastAsia"/>
+              </w:rPr>
+              <w:t>HW#4</w:t>
             </w:r>
           </w:p>
         </w:tc>
@@ -12828,7 +12638,7 @@
           <w:p>
             <w:pPr>
               <w:rPr>
-                <w:rFonts w:ascii="Times New Roman" w:eastAsia="標楷體" w:hAnsi="Times New Roman" w:cs="Times New Roman" w:hint="eastAsia"/>
+                <w:rFonts w:ascii="Times New Roman" w:eastAsia="標楷體" w:hAnsi="Times New Roman" w:cs="Times New Roman"/>
               </w:rPr>
             </w:pPr>
             <w:r>
@@ -12846,7 +12656,7 @@
           <w:p>
             <w:pPr>
               <w:rPr>
-                <w:rFonts w:ascii="Times New Roman" w:eastAsia="標楷體" w:hAnsi="Times New Roman" w:cs="Times New Roman" w:hint="eastAsia"/>
+                <w:rFonts w:ascii="Times New Roman" w:eastAsia="標楷體" w:hAnsi="Times New Roman" w:cs="Times New Roman"/>
               </w:rPr>
             </w:pPr>
           </w:p>
@@ -12859,7 +12669,67 @@
           <w:p>
             <w:pPr>
               <w:rPr>
-                <w:rFonts w:ascii="Times New Roman" w:eastAsia="標楷體" w:hAnsi="Times New Roman" w:cs="Times New Roman" w:hint="eastAsia"/>
+                <w:rFonts w:ascii="Times New Roman" w:eastAsia="標楷體" w:hAnsi="Times New Roman" w:cs="Times New Roman"/>
+              </w:rPr>
+            </w:pPr>
+          </w:p>
+        </w:tc>
+      </w:tr>
+      <w:tr>
+        <w:trPr>
+          <w:trHeight w:val="336"/>
+        </w:trPr>
+        <w:tc>
+          <w:tcPr>
+            <w:tcW w:w="1877" w:type="dxa"/>
+            <w:vMerge/>
+          </w:tcPr>
+          <w:p>
+            <w:pPr>
+              <w:rPr>
+                <w:rFonts w:ascii="Times New Roman" w:eastAsia="標楷體" w:hAnsi="Times New Roman" w:cs="Times New Roman" w:hint="eastAsia"/>
+              </w:rPr>
+            </w:pPr>
+          </w:p>
+        </w:tc>
+        <w:tc>
+          <w:tcPr>
+            <w:tcW w:w="3829" w:type="dxa"/>
+          </w:tcPr>
+          <w:p>
+            <w:pPr>
+              <w:rPr>
+                <w:rFonts w:ascii="Times New Roman" w:eastAsia="標楷體" w:hAnsi="Times New Roman" w:cs="Times New Roman" w:hint="eastAsia"/>
+              </w:rPr>
+            </w:pPr>
+            <w:r>
+              <w:rPr>
+                <w:rFonts w:ascii="Times New Roman" w:eastAsia="標楷體" w:hAnsi="Times New Roman" w:cs="Times New Roman" w:hint="eastAsia"/>
+              </w:rPr>
+              <w:t>26/04/12 15:00~16:30</w:t>
+            </w:r>
+          </w:p>
+        </w:tc>
+        <w:tc>
+          <w:tcPr>
+            <w:tcW w:w="1350" w:type="dxa"/>
+          </w:tcPr>
+          <w:p>
+            <w:pPr>
+              <w:rPr>
+                <w:rFonts w:ascii="Times New Roman" w:eastAsia="標楷體" w:hAnsi="Times New Roman" w:cs="Times New Roman"/>
+              </w:rPr>
+            </w:pPr>
+          </w:p>
+        </w:tc>
+        <w:tc>
+          <w:tcPr>
+            <w:tcW w:w="1189" w:type="dxa"/>
+          </w:tcPr>
+          <w:p>
+            <w:pPr>
+              <w:rPr>
+                <w:rFonts w:ascii="Times New Roman" w:eastAsia="標楷體" w:hAnsi="Times New Roman" w:cs="Times New Roman"/>
               </w:rPr>
             </w:pPr>
           </w:p>
@@ -12891,7 +12761,7 @@
 </file>
 
 <file path=word/endnotes.xml><?xml version="1.0" encoding="utf-8"?>
-<w:endnotes xmlns:wpc="http://schemas.microsoft.com/office/word/2010/wordprocessingCanvas" xmlns:cx="http://schemas.microsoft.com/office/drawing/2014/chartex" xmlns:cx1="http://schemas.microsoft.com/office/drawing/2015/9/8/chartex" xmlns:cx2="http://schemas.microsoft.com/office/drawing/2015/10/21/chartex" xmlns:cx3="http://schemas.microsoft.com/office/drawing/2016/5/9/chartex" xmlns:cx4="http://schemas.microsoft.com/office/drawing/2016/5/10/chartex" xmlns:cx5="http://schemas.microsoft.com/office/drawing/2016/5/11/chartex" xmlns:cx6="http://schemas.microsoft.com/office/drawing/2016/5/12/chartex" xmlns:cx7="http://schemas.microsoft.com/office/drawing/2016/5/13/chartex" xmlns:cx8="http://schemas.microsoft.com/office/drawing/2016/5/14/chartex" xmlns:mc="http://schemas.openxmlformats.org/markup-compatibility/2006" xmlns:aink="http://schemas.microsoft.com/office/drawing/2016/ink" xmlns:am3d="http://schemas.microsoft.com/office/drawing/2017/model3d" xmlns:o="urn:schemas-microsoft-com:office:office" xmlns:oel="http://schemas.microsoft.com/office/2019/extlst" xmlns:r="http://schemas.openxmlformats.org/officeDocument/2006/relationships" xmlns:m="http://schemas.openxmlformats.org/officeDocument/2006/math" xmlns:v="urn:schemas-microsoft-com:vml" xmlns:wp14="http://schemas.microsoft.com/office/word/2010/wordprocessingDrawing" xmlns:wp="http://schemas.openxmlformats.org/drawingml/2006/wordprocessingDrawing" xmlns:w10="urn:schemas-microsoft-com:office:word" xmlns:w="http://schemas.openxmlformats.org/wordprocessingml/2006/main" xmlns:w14="http://schemas.microsoft.com/office/word/2010/wordml" xmlns:w15="http://schemas.microsoft.com/office/word/2012/wordml" xmlns:w16cex="http://schemas.microsoft.com/office/word/2018/wordml/cex" xmlns:w16cid="http://schemas.microsoft.com/office/word/2016/wordml/cid" xmlns:w16="http://schemas.microsoft.com/office/word/2018/wordml" xmlns:w16du="http://schemas.microsoft.com/office/word/2023/wordml/word16du" xmlns:w16sdtdh="http://schemas.microsoft.com/office/word/2020/wordml/sdtdatahash" xmlns:w16sdtfl="http://schemas.microsoft.com/office/word/2024/wordml/sdtformatlock" xmlns:w16se="http://schemas.microsoft.com/office/word/2015/wordml/symex" xmlns:wpg="http://schemas.microsoft.com/office/word/2010/wordprocessingGroup" xmlns:wpi="http://schemas.microsoft.com/office/word/2010/wordprocessingInk" xmlns:wne="http://schemas.microsoft.com/office/word/2006/wordml" xmlns:wps="http://schemas.microsoft.com/office/word/2010/wordprocessingShape" mc:Ignorable="w14 w15 w16se w16cid w16 w16cex w16sdtdh w16sdtfl w16du wp14">
+<w:endnotes xmlns:wpc="http://schemas.microsoft.com/office/word/2010/wordprocessingCanvas" xmlns:cx="http://schemas.microsoft.com/office/drawing/2014/chartex" xmlns:cx1="http://schemas.microsoft.com/office/drawing/2015/9/8/chartex" xmlns:cx2="http://schemas.microsoft.com/office/drawing/2015/10/21/chartex" xmlns:cx3="http://schemas.microsoft.com/office/drawing/2016/5/9/chartex" xmlns:cx4="http://schemas.microsoft.com/office/drawing/2016/5/10/chartex" xmlns:cx5="http://schemas.microsoft.com/office/drawing/2016/5/11/chartex" xmlns:cx6="http://schemas.microsoft.com/office/drawing/2016/5/12/chartex" xmlns:cx7="http://schemas.microsoft.com/office/drawing/2016/5/13/chartex" xmlns:cx8="http://schemas.microsoft.com/office/drawing/2016/5/14/chartex" xmlns:mc="http://schemas.openxmlformats.org/markup-compatibility/2006" xmlns:aink="http://schemas.microsoft.com/office/drawing/2016/ink" xmlns:am3d="http://schemas.microsoft.com/office/drawing/2017/model3d" xmlns:o="urn:schemas-microsoft-com:office:office" xmlns:oel="http://schemas.microsoft.com/office/2019/extlst" xmlns:r="http://schemas.openxmlformats.org/officeDocument/2006/relationships" xmlns:m="http://schemas.openxmlformats.org/officeDocument/2006/math" xmlns:v="urn:schemas-microsoft-com:vml" xmlns:wp14="http://schemas.microsoft.com/office/word/2010/wordprocessingDrawing" xmlns:wp="http://schemas.openxmlformats.org/drawingml/2006/wordprocessingDrawing" xmlns:w10="urn:schemas-microsoft-com:office:word" xmlns:w="http://schemas.openxmlformats.org/wordprocessingml/2006/main" xmlns:w14="http://schemas.microsoft.com/office/word/2010/wordml" xmlns:w15="http://schemas.microsoft.com/office/word/2012/wordml" xmlns:w16cex="http://schemas.microsoft.com/office/word/2018/wordml/cex" xmlns:w16cid="http://schemas.microsoft.com/office/word/2016/wordml/cid" xmlns:w16="http://schemas.microsoft.com/office/word/2018/wordml" xmlns:w16sdtdh="http://schemas.microsoft.com/office/word/2020/wordml/sdtdatahash" xmlns:w16se="http://schemas.microsoft.com/office/word/2015/wordml/symex" xmlns:wpg="http://schemas.microsoft.com/office/word/2010/wordprocessingGroup" xmlns:wpi="http://schemas.microsoft.com/office/word/2010/wordprocessingInk" xmlns:wne="http://schemas.microsoft.com/office/word/2006/wordml" xmlns:wps="http://schemas.microsoft.com/office/word/2010/wordprocessingShape" mc:Ignorable="w14 w15 w16se w16cid w16 w16cex w16sdtdh wp14">
   <w:endnote w:type="separator" w:id="-1">
     <w:p>
       <w:pPr>
@@ -12916,7 +12786,7 @@
 </file>
 
 <file path=word/footnotes.xml><?xml version="1.0" encoding="utf-8"?>
-<w:footnotes xmlns:wpc="http://schemas.microsoft.com/office/word/2010/wordprocessingCanvas" xmlns:cx="http://schemas.microsoft.com/office/drawing/2014/chartex" xmlns:cx1="http://schemas.microsoft.com/office/drawing/2015/9/8/chartex" xmlns:cx2="http://schemas.microsoft.com/office/drawing/2015/10/21/chartex" xmlns:cx3="http://schemas.microsoft.com/office/drawing/2016/5/9/chartex" xmlns:cx4="http://schemas.microsoft.com/office/drawing/2016/5/10/chartex" xmlns:cx5="http://schemas.microsoft.com/office/drawing/2016/5/11/chartex" xmlns:cx6="http://schemas.microsoft.com/office/drawing/2016/5/12/chartex" xmlns:cx7="http://schemas.microsoft.com/office/drawing/2016/5/13/chartex" xmlns:cx8="http://schemas.microsoft.com/office/drawing/2016/5/14/chartex" xmlns:mc="http://schemas.openxmlformats.org/markup-compatibility/2006" xmlns:aink="http://schemas.microsoft.com/office/drawing/2016/ink" xmlns:am3d="http://schemas.microsoft.com/office/drawing/2017/model3d" xmlns:o="urn:schemas-microsoft-com:office:office" xmlns:oel="http://schemas.microsoft.com/office/2019/extlst" xmlns:r="http://schemas.openxmlformats.org/officeDocument/2006/relationships" xmlns:m="http://schemas.openxmlformats.org/officeDocument/2006/math" xmlns:v="urn:schemas-microsoft-com:vml" xmlns:wp14="http://schemas.microsoft.com/office/word/2010/wordprocessingDrawing" xmlns:wp="http://schemas.openxmlformats.org/drawingml/2006/wordprocessingDrawing" xmlns:w10="urn:schemas-microsoft-com:office:word" xmlns:w="http://schemas.openxmlformats.org/wordprocessingml/2006/main" xmlns:w14="http://schemas.microsoft.com/office/word/2010/wordml" xmlns:w15="http://schemas.microsoft.com/office/word/2012/wordml" xmlns:w16cex="http://schemas.microsoft.com/office/word/2018/wordml/cex" xmlns:w16cid="http://schemas.microsoft.com/office/word/2016/wordml/cid" xmlns:w16="http://schemas.microsoft.com/office/word/2018/wordml" xmlns:w16du="http://schemas.microsoft.com/office/word/2023/wordml/word16du" xmlns:w16sdtdh="http://schemas.microsoft.com/office/word/2020/wordml/sdtdatahash" xmlns:w16sdtfl="http://schemas.microsoft.com/office/word/2024/wordml/sdtformatlock" xmlns:w16se="http://schemas.microsoft.com/office/word/2015/wordml/symex" xmlns:wpg="http://schemas.microsoft.com/office/word/2010/wordprocessingGroup" xmlns:wpi="http://schemas.microsoft.com/office/word/2010/wordprocessingInk" xmlns:wne="http://schemas.microsoft.com/office/word/2006/wordml" xmlns:wps="http://schemas.microsoft.com/office/word/2010/wordprocessingShape" mc:Ignorable="w14 w15 w16se w16cid w16 w16cex w16sdtdh w16sdtfl w16du wp14">
+<w:footnotes xmlns:wpc="http://schemas.microsoft.com/office/word/2010/wordprocessingCanvas" xmlns:cx="http://schemas.microsoft.com/office/drawing/2014/chartex" xmlns:cx1="http://schemas.microsoft.com/office/drawing/2015/9/8/chartex" xmlns:cx2="http://schemas.microsoft.com/office/drawing/2015/10/21/chartex" xmlns:cx3="http://schemas.microsoft.com/office/drawing/2016/5/9/chartex" xmlns:cx4="http://schemas.microsoft.com/office/drawing/2016/5/10/chartex" xmlns:cx5="http://schemas.microsoft.com/office/drawing/2016/5/11/chartex" xmlns:cx6="http://schemas.microsoft.com/office/drawing/2016/5/12/chartex" xmlns:cx7="http://schemas.microsoft.com/office/drawing/2016/5/13/chartex" xmlns:cx8="http://schemas.microsoft.com/office/drawing/2016/5/14/chartex" xmlns:mc="http://schemas.openxmlformats.org/markup-compatibility/2006" xmlns:aink="http://schemas.microsoft.com/office/drawing/2016/ink" xmlns:am3d="http://schemas.microsoft.com/office/drawing/2017/model3d" xmlns:o="urn:schemas-microsoft-com:office:office" xmlns:oel="http://schemas.microsoft.com/office/2019/extlst" xmlns:r="http://schemas.openxmlformats.org/officeDocument/2006/relationships" xmlns:m="http://schemas.openxmlformats.org/officeDocument/2006/math" xmlns:v="urn:schemas-microsoft-com:vml" xmlns:wp14="http://schemas.microsoft.com/office/word/2010/wordprocessingDrawing" xmlns:wp="http://schemas.openxmlformats.org/drawingml/2006/wordprocessingDrawing" xmlns:w10="urn:schemas-microsoft-com:office:word" xmlns:w="http://schemas.openxmlformats.org/wordprocessingml/2006/main" xmlns:w14="http://schemas.microsoft.com/office/word/2010/wordml" xmlns:w15="http://schemas.microsoft.com/office/word/2012/wordml" xmlns:w16cex="http://schemas.microsoft.com/office/word/2018/wordml/cex" xmlns:w16cid="http://schemas.microsoft.com/office/word/2016/wordml/cid" xmlns:w16="http://schemas.microsoft.com/office/word/2018/wordml" xmlns:w16sdtdh="http://schemas.microsoft.com/office/word/2020/wordml/sdtdatahash" xmlns:w16se="http://schemas.microsoft.com/office/word/2015/wordml/symex" xmlns:wpg="http://schemas.microsoft.com/office/word/2010/wordprocessingGroup" xmlns:wpi="http://schemas.microsoft.com/office/word/2010/wordprocessingInk" xmlns:wne="http://schemas.microsoft.com/office/word/2006/wordml" xmlns:wps="http://schemas.microsoft.com/office/word/2010/wordprocessingShape" mc:Ignorable="w14 w15 w16se w16cid w16 w16cex w16sdtdh wp14">
   <w:footnote w:type="separator" w:id="-1">
     <w:p>
       <w:pPr>
@@ -12941,7 +12811,7 @@
 </file>
 
 <file path=word/numbering.xml><?xml version="1.0" encoding="utf-8"?>
-<w:numbering xmlns:wpc="http://schemas.microsoft.com/office/word/2010/wordprocessingCanvas" xmlns:cx="http://schemas.microsoft.com/office/drawing/2014/chartex" xmlns:cx1="http://schemas.microsoft.com/office/drawing/2015/9/8/chartex" xmlns:cx2="http://schemas.microsoft.com/office/drawing/2015/10/21/chartex" xmlns:cx3="http://schemas.microsoft.com/office/drawing/2016/5/9/chartex" xmlns:cx4="http://schemas.microsoft.com/office/drawing/2016/5/10/chartex" xmlns:cx5="http://schemas.microsoft.com/office/drawing/2016/5/11/chartex" xmlns:cx6="http://schemas.microsoft.com/office/drawing/2016/5/12/chartex" xmlns:cx7="http://schemas.microsoft.com/office/drawing/2016/5/13/chartex" xmlns:cx8="http://schemas.microsoft.com/office/drawing/2016/5/14/chartex" xmlns:mc="http://schemas.openxmlformats.org/markup-compatibility/2006" xmlns:aink="http://schemas.microsoft.com/office/drawing/2016/ink" xmlns:am3d="http://schemas.microsoft.com/office/drawing/2017/model3d" xmlns:o="urn:schemas-microsoft-com:office:office" xmlns:oel="http://schemas.microsoft.com/office/2019/extlst" xmlns:r="http://schemas.openxmlformats.org/officeDocument/2006/relationships" xmlns:m="http://schemas.openxmlformats.org/officeDocument/2006/math" xmlns:v="urn:schemas-microsoft-com:vml" xmlns:wp14="http://schemas.microsoft.com/office/word/2010/wordprocessingDrawing" xmlns:wp="http://schemas.openxmlformats.org/drawingml/2006/wordprocessingDrawing" xmlns:w10="urn:schemas-microsoft-com:office:word" xmlns:w="http://schemas.openxmlformats.org/wordprocessingml/2006/main" xmlns:w14="http://schemas.microsoft.com/office/word/2010/wordml" xmlns:w15="http://schemas.microsoft.com/office/word/2012/wordml" xmlns:w16cex="http://schemas.microsoft.com/office/word/2018/wordml/cex" xmlns:w16cid="http://schemas.microsoft.com/office/word/2016/wordml/cid" xmlns:w16="http://schemas.microsoft.com/office/word/2018/wordml" xmlns:w16du="http://schemas.microsoft.com/office/word/2023/wordml/word16du" xmlns:w16sdtdh="http://schemas.microsoft.com/office/word/2020/wordml/sdtdatahash" xmlns:w16sdtfl="http://schemas.microsoft.com/office/word/2024/wordml/sdtformatlock" xmlns:w16se="http://schemas.microsoft.com/office/word/2015/wordml/symex" xmlns:wpg="http://schemas.microsoft.com/office/word/2010/wordprocessingGroup" xmlns:wpi="http://schemas.microsoft.com/office/word/2010/wordprocessingInk" xmlns:wne="http://schemas.microsoft.com/office/word/2006/wordml" xmlns:wps="http://schemas.microsoft.com/office/word/2010/wordprocessingShape" mc:Ignorable="w14 w15 w16se w16cid w16 w16cex w16sdtdh w16sdtfl w16du wp14">
+<w:numbering xmlns:wpc="http://schemas.microsoft.com/office/word/2010/wordprocessingCanvas" xmlns:cx="http://schemas.microsoft.com/office/drawing/2014/chartex" xmlns:cx1="http://schemas.microsoft.com/office/drawing/2015/9/8/chartex" xmlns:cx2="http://schemas.microsoft.com/office/drawing/2015/10/21/chartex" xmlns:cx3="http://schemas.microsoft.com/office/drawing/2016/5/9/chartex" xmlns:cx4="http://schemas.microsoft.com/office/drawing/2016/5/10/chartex" xmlns:cx5="http://schemas.microsoft.com/office/drawing/2016/5/11/chartex" xmlns:cx6="http://schemas.microsoft.com/office/drawing/2016/5/12/chartex" xmlns:cx7="http://schemas.microsoft.com/office/drawing/2016/5/13/chartex" xmlns:cx8="http://schemas.microsoft.com/office/drawing/2016/5/14/chartex" xmlns:mc="http://schemas.openxmlformats.org/markup-compatibility/2006" xmlns:aink="http://schemas.microsoft.com/office/drawing/2016/ink" xmlns:am3d="http://schemas.microsoft.com/office/drawing/2017/model3d" xmlns:o="urn:schemas-microsoft-com:office:office" xmlns:oel="http://schemas.microsoft.com/office/2019/extlst" xmlns:r="http://schemas.openxmlformats.org/officeDocument/2006/relationships" xmlns:m="http://schemas.openxmlformats.org/officeDocument/2006/math" xmlns:v="urn:schemas-microsoft-com:vml" xmlns:wp14="http://schemas.microsoft.com/office/word/2010/wordprocessingDrawing" xmlns:wp="http://schemas.openxmlformats.org/drawingml/2006/wordprocessingDrawing" xmlns:w10="urn:schemas-microsoft-com:office:word" xmlns:w="http://schemas.openxmlformats.org/wordprocessingml/2006/main" xmlns:w14="http://schemas.microsoft.com/office/word/2010/wordml" xmlns:w15="http://schemas.microsoft.com/office/word/2012/wordml" xmlns:w16cex="http://schemas.microsoft.com/office/word/2018/wordml/cex" xmlns:w16cid="http://schemas.microsoft.com/office/word/2016/wordml/cid" xmlns:w16="http://schemas.microsoft.com/office/word/2018/wordml" xmlns:w16sdtdh="http://schemas.microsoft.com/office/word/2020/wordml/sdtdatahash" xmlns:w16se="http://schemas.microsoft.com/office/word/2015/wordml/symex" xmlns:wpg="http://schemas.microsoft.com/office/word/2010/wordprocessingGroup" xmlns:wpi="http://schemas.microsoft.com/office/word/2010/wordprocessingInk" xmlns:wne="http://schemas.microsoft.com/office/word/2006/wordml" xmlns:wps="http://schemas.microsoft.com/office/word/2010/wordprocessingShape" mc:Ignorable="w14 w15 w16se w16cid w16 w16cex w16sdtdh wp14">
   <w:abstractNum w:abstractNumId="0" w15:restartNumberingAfterBreak="0">
     <w:nsid w:val="0BA862C0"/>
     <w:multiLevelType w:val="hybridMultilevel"/>
@@ -14396,7 +14266,7 @@
 </file>
 
 <file path=word/styles.xml><?xml version="1.0" encoding="utf-8"?>
-<w:styles xmlns:mc="http://schemas.openxmlformats.org/markup-compatibility/2006" xmlns:r="http://schemas.openxmlformats.org/officeDocument/2006/relationships" xmlns:w="http://schemas.openxmlformats.org/wordprocessingml/2006/main" xmlns:w14="http://schemas.microsoft.com/office/word/2010/wordml" xmlns:w15="http://schemas.microsoft.com/office/word/2012/wordml" xmlns:w16cex="http://schemas.microsoft.com/office/word/2018/wordml/cex" xmlns:w16cid="http://schemas.microsoft.com/office/word/2016/wordml/cid" xmlns:w16="http://schemas.microsoft.com/office/word/2018/wordml" xmlns:w16du="http://schemas.microsoft.com/office/word/2023/wordml/word16du" xmlns:w16sdtdh="http://schemas.microsoft.com/office/word/2020/wordml/sdtdatahash" xmlns:w16sdtfl="http://schemas.microsoft.com/office/word/2024/wordml/sdtformatlock" xmlns:w16se="http://schemas.microsoft.com/office/word/2015/wordml/symex" mc:Ignorable="w14 w15 w16se w16cid w16 w16cex w16sdtdh w16sdtfl w16du">
+<w:styles xmlns:mc="http://schemas.openxmlformats.org/markup-compatibility/2006" xmlns:r="http://schemas.openxmlformats.org/officeDocument/2006/relationships" xmlns:w="http://schemas.openxmlformats.org/wordprocessingml/2006/main" xmlns:w14="http://schemas.microsoft.com/office/word/2010/wordml" xmlns:w15="http://schemas.microsoft.com/office/word/2012/wordml" xmlns:w16cex="http://schemas.microsoft.com/office/word/2018/wordml/cex" xmlns:w16cid="http://schemas.microsoft.com/office/word/2016/wordml/cid" xmlns:w16="http://schemas.microsoft.com/office/word/2018/wordml" xmlns:w16sdtdh="http://schemas.microsoft.com/office/word/2020/wordml/sdtdatahash" xmlns:w16se="http://schemas.microsoft.com/office/word/2015/wordml/symex" mc:Ignorable="w14 w15 w16se w16cid w16 w16cex w16sdtdh">
   <w:docDefaults>
     <w:rPrDefault>
       <w:rPr>

</xml_diff>

<commit_message>
doc: revise Fig 3-7 and 3-8 in hw4
</commit_message>
<xml_diff>
--- a/document/hw4.docx
+++ b/document/hw4.docx
@@ -1,6 +1,6 @@
 
 <file path=word/document.xml><?xml version="1.0" encoding="utf-8"?>
-<w:document xmlns:wpc="http://schemas.microsoft.com/office/word/2010/wordprocessingCanvas" xmlns:cx="http://schemas.microsoft.com/office/drawing/2014/chartex" xmlns:cx1="http://schemas.microsoft.com/office/drawing/2015/9/8/chartex" xmlns:cx2="http://schemas.microsoft.com/office/drawing/2015/10/21/chartex" xmlns:cx3="http://schemas.microsoft.com/office/drawing/2016/5/9/chartex" xmlns:cx4="http://schemas.microsoft.com/office/drawing/2016/5/10/chartex" xmlns:cx5="http://schemas.microsoft.com/office/drawing/2016/5/11/chartex" xmlns:cx6="http://schemas.microsoft.com/office/drawing/2016/5/12/chartex" xmlns:cx7="http://schemas.microsoft.com/office/drawing/2016/5/13/chartex" xmlns:cx8="http://schemas.microsoft.com/office/drawing/2016/5/14/chartex" xmlns:mc="http://schemas.openxmlformats.org/markup-compatibility/2006" xmlns:aink="http://schemas.microsoft.com/office/drawing/2016/ink" xmlns:am3d="http://schemas.microsoft.com/office/drawing/2017/model3d" xmlns:o="urn:schemas-microsoft-com:office:office" xmlns:oel="http://schemas.microsoft.com/office/2019/extlst" xmlns:r="http://schemas.openxmlformats.org/officeDocument/2006/relationships" xmlns:m="http://schemas.openxmlformats.org/officeDocument/2006/math" xmlns:v="urn:schemas-microsoft-com:vml" xmlns:wp14="http://schemas.microsoft.com/office/word/2010/wordprocessingDrawing" xmlns:wp="http://schemas.openxmlformats.org/drawingml/2006/wordprocessingDrawing" xmlns:w10="urn:schemas-microsoft-com:office:word" xmlns:w="http://schemas.openxmlformats.org/wordprocessingml/2006/main" xmlns:w14="http://schemas.microsoft.com/office/word/2010/wordml" xmlns:w15="http://schemas.microsoft.com/office/word/2012/wordml" xmlns:w16cex="http://schemas.microsoft.com/office/word/2018/wordml/cex" xmlns:w16cid="http://schemas.microsoft.com/office/word/2016/wordml/cid" xmlns:w16="http://schemas.microsoft.com/office/word/2018/wordml" xmlns:w16sdtdh="http://schemas.microsoft.com/office/word/2020/wordml/sdtdatahash" xmlns:w16se="http://schemas.microsoft.com/office/word/2015/wordml/symex" xmlns:wpg="http://schemas.microsoft.com/office/word/2010/wordprocessingGroup" xmlns:wpi="http://schemas.microsoft.com/office/word/2010/wordprocessingInk" xmlns:wne="http://schemas.microsoft.com/office/word/2006/wordml" xmlns:wps="http://schemas.microsoft.com/office/word/2010/wordprocessingShape" mc:Ignorable="w14 w15 w16se w16cid w16 w16cex w16sdtdh wp14">
+<w:document xmlns:wpc="http://schemas.microsoft.com/office/word/2010/wordprocessingCanvas" xmlns:cx="http://schemas.microsoft.com/office/drawing/2014/chartex" xmlns:cx1="http://schemas.microsoft.com/office/drawing/2015/9/8/chartex" xmlns:cx2="http://schemas.microsoft.com/office/drawing/2015/10/21/chartex" xmlns:cx3="http://schemas.microsoft.com/office/drawing/2016/5/9/chartex" xmlns:cx4="http://schemas.microsoft.com/office/drawing/2016/5/10/chartex" xmlns:cx5="http://schemas.microsoft.com/office/drawing/2016/5/11/chartex" xmlns:cx6="http://schemas.microsoft.com/office/drawing/2016/5/12/chartex" xmlns:cx7="http://schemas.microsoft.com/office/drawing/2016/5/13/chartex" xmlns:cx8="http://schemas.microsoft.com/office/drawing/2016/5/14/chartex" xmlns:mc="http://schemas.openxmlformats.org/markup-compatibility/2006" xmlns:aink="http://schemas.microsoft.com/office/drawing/2016/ink" xmlns:am3d="http://schemas.microsoft.com/office/drawing/2017/model3d" xmlns:o="urn:schemas-microsoft-com:office:office" xmlns:oel="http://schemas.microsoft.com/office/2019/extlst" xmlns:r="http://schemas.openxmlformats.org/officeDocument/2006/relationships" xmlns:m="http://schemas.openxmlformats.org/officeDocument/2006/math" xmlns:v="urn:schemas-microsoft-com:vml" xmlns:wp14="http://schemas.microsoft.com/office/word/2010/wordprocessingDrawing" xmlns:wp="http://schemas.openxmlformats.org/drawingml/2006/wordprocessingDrawing" xmlns:w10="urn:schemas-microsoft-com:office:word" xmlns:w="http://schemas.openxmlformats.org/wordprocessingml/2006/main" xmlns:w14="http://schemas.microsoft.com/office/word/2010/wordml" xmlns:w15="http://schemas.microsoft.com/office/word/2012/wordml" xmlns:w16cex="http://schemas.microsoft.com/office/word/2018/wordml/cex" xmlns:w16cid="http://schemas.microsoft.com/office/word/2016/wordml/cid" xmlns:w16="http://schemas.microsoft.com/office/word/2018/wordml" xmlns:w16du="http://schemas.microsoft.com/office/word/2023/wordml/word16du" xmlns:w16sdtdh="http://schemas.microsoft.com/office/word/2020/wordml/sdtdatahash" xmlns:w16sdtfl="http://schemas.microsoft.com/office/word/2024/wordml/sdtformatlock" xmlns:w16se="http://schemas.microsoft.com/office/word/2015/wordml/symex" xmlns:wpg="http://schemas.microsoft.com/office/word/2010/wordprocessingGroup" xmlns:wpi="http://schemas.microsoft.com/office/word/2010/wordprocessingInk" xmlns:wne="http://schemas.microsoft.com/office/word/2006/wordml" xmlns:wps="http://schemas.microsoft.com/office/word/2010/wordprocessingShape" mc:Ignorable="w14 w15 w16se w16cid w16 w16cex w16sdtdh w16sdtfl w16du wp14">
   <w:body>
     <w:p>
       <w:pPr>
@@ -10224,12 +10224,13 @@
       <w:pPr>
         <w:jc w:val="center"/>
         <w:rPr>
-          <w:rFonts w:ascii="Times New Roman" w:eastAsia="標楷體" w:hAnsi="Times New Roman" w:cs="Times New Roman" w:hint="eastAsia"/>
-        </w:rPr>
-      </w:pPr>
-      <w:r>
-        <w:rPr>
           <w:rFonts w:ascii="Times New Roman" w:eastAsia="標楷體" w:hAnsi="Times New Roman" w:cs="Times New Roman"/>
+        </w:rPr>
+      </w:pPr>
+      <w:r>
+        <w:rPr>
+          <w:rFonts w:ascii="Times New Roman" w:eastAsia="標楷體" w:hAnsi="Times New Roman" w:cs="Times New Roman"/>
+          <w:noProof/>
         </w:rPr>
         <w:drawing>
           <wp:inline distT="0" distB="0" distL="0" distR="0" wp14:anchorId="1B8C9355" wp14:editId="73FA1D1F">
@@ -10334,11 +10335,11 @@
     <w:p>
       <w:pPr>
         <w:jc w:val="center"/>
-        <w:rPr>
-          <w:rFonts w:hint="eastAsia"/>
-        </w:rPr>
-      </w:pPr>
-      <w:r>
+      </w:pPr>
+      <w:r>
+        <w:rPr>
+          <w:noProof/>
+        </w:rPr>
         <w:drawing>
           <wp:inline distT="0" distB="0" distL="0" distR="0" wp14:anchorId="13AEE99A" wp14:editId="355AB5B8">
             <wp:extent cx="4775200" cy="5554822"/>
@@ -11301,14 +11302,11 @@
     </w:p>
     <w:p>
       <w:r>
-        <w:rPr>
-          <w:noProof/>
-        </w:rPr>
         <w:drawing>
-          <wp:inline distT="0" distB="0" distL="0" distR="0" wp14:anchorId="35655F5A" wp14:editId="12FFA824">
-            <wp:extent cx="5274310" cy="1906905"/>
-            <wp:effectExtent l="0" t="0" r="2540" b="0"/>
-            <wp:docPr id="1593557882" name="圖片 1"/>
+          <wp:inline distT="0" distB="0" distL="0" distR="0" wp14:anchorId="479BAD3F" wp14:editId="193ABA0B">
+            <wp:extent cx="5274310" cy="1555750"/>
+            <wp:effectExtent l="0" t="0" r="2540" b="6350"/>
+            <wp:docPr id="274066439" name="圖片 1"/>
             <wp:cNvGraphicFramePr>
               <a:graphicFrameLocks xmlns:a="http://schemas.openxmlformats.org/drawingml/2006/main" noChangeAspect="1"/>
             </wp:cNvGraphicFramePr>
@@ -11316,7 +11314,7 @@
               <a:graphicData uri="http://schemas.openxmlformats.org/drawingml/2006/picture">
                 <pic:pic xmlns:pic="http://schemas.openxmlformats.org/drawingml/2006/picture">
                   <pic:nvPicPr>
-                    <pic:cNvPr id="1593557882" name=""/>
+                    <pic:cNvPr id="274066439" name=""/>
                     <pic:cNvPicPr/>
                   </pic:nvPicPr>
                   <pic:blipFill>
@@ -11328,7 +11326,7 @@
                   <pic:spPr>
                     <a:xfrm>
                       <a:off x="0" y="0"/>
-                      <a:ext cx="5274310" cy="1906905"/>
+                      <a:ext cx="5274310" cy="1555750"/>
                     </a:xfrm>
                     <a:prstGeom prst="rect">
                       <a:avLst/>
@@ -11436,14 +11434,11 @@
     </w:p>
     <w:p>
       <w:r>
-        <w:rPr>
-          <w:noProof/>
-        </w:rPr>
         <w:drawing>
-          <wp:inline distT="0" distB="0" distL="0" distR="0" wp14:anchorId="102CBAFB" wp14:editId="024ECFE3">
-            <wp:extent cx="5274310" cy="1442085"/>
-            <wp:effectExtent l="0" t="0" r="2540" b="5715"/>
-            <wp:docPr id="795438240" name="圖片 1"/>
+          <wp:inline distT="0" distB="0" distL="0" distR="0" wp14:anchorId="0205499D" wp14:editId="62C17CA0">
+            <wp:extent cx="5930162" cy="1673525"/>
+            <wp:effectExtent l="0" t="0" r="0" b="3175"/>
+            <wp:docPr id="308084301" name="圖片 1"/>
             <wp:cNvGraphicFramePr>
               <a:graphicFrameLocks xmlns:a="http://schemas.openxmlformats.org/drawingml/2006/main" noChangeAspect="1"/>
             </wp:cNvGraphicFramePr>
@@ -11451,7 +11446,7 @@
               <a:graphicData uri="http://schemas.openxmlformats.org/drawingml/2006/picture">
                 <pic:pic xmlns:pic="http://schemas.openxmlformats.org/drawingml/2006/picture">
                   <pic:nvPicPr>
-                    <pic:cNvPr id="795438240" name=""/>
+                    <pic:cNvPr id="308084301" name=""/>
                     <pic:cNvPicPr/>
                   </pic:nvPicPr>
                   <pic:blipFill>
@@ -11463,7 +11458,7 @@
                   <pic:spPr>
                     <a:xfrm>
                       <a:off x="0" y="0"/>
-                      <a:ext cx="5274310" cy="1442085"/>
+                      <a:ext cx="5930162" cy="1673525"/>
                     </a:xfrm>
                     <a:prstGeom prst="rect">
                       <a:avLst/>
@@ -12687,7 +12682,7 @@
           <w:p>
             <w:pPr>
               <w:rPr>
-                <w:rFonts w:ascii="Times New Roman" w:eastAsia="標楷體" w:hAnsi="Times New Roman" w:cs="Times New Roman" w:hint="eastAsia"/>
+                <w:rFonts w:ascii="Times New Roman" w:eastAsia="標楷體" w:hAnsi="Times New Roman" w:cs="Times New Roman"/>
               </w:rPr>
             </w:pPr>
           </w:p>
@@ -12699,7 +12694,7 @@
           <w:p>
             <w:pPr>
               <w:rPr>
-                <w:rFonts w:ascii="Times New Roman" w:eastAsia="標楷體" w:hAnsi="Times New Roman" w:cs="Times New Roman" w:hint="eastAsia"/>
+                <w:rFonts w:ascii="Times New Roman" w:eastAsia="標楷體" w:hAnsi="Times New Roman" w:cs="Times New Roman"/>
               </w:rPr>
             </w:pPr>
             <w:r>
@@ -12761,7 +12756,7 @@
 </file>
 
 <file path=word/endnotes.xml><?xml version="1.0" encoding="utf-8"?>
-<w:endnotes xmlns:wpc="http://schemas.microsoft.com/office/word/2010/wordprocessingCanvas" xmlns:cx="http://schemas.microsoft.com/office/drawing/2014/chartex" xmlns:cx1="http://schemas.microsoft.com/office/drawing/2015/9/8/chartex" xmlns:cx2="http://schemas.microsoft.com/office/drawing/2015/10/21/chartex" xmlns:cx3="http://schemas.microsoft.com/office/drawing/2016/5/9/chartex" xmlns:cx4="http://schemas.microsoft.com/office/drawing/2016/5/10/chartex" xmlns:cx5="http://schemas.microsoft.com/office/drawing/2016/5/11/chartex" xmlns:cx6="http://schemas.microsoft.com/office/drawing/2016/5/12/chartex" xmlns:cx7="http://schemas.microsoft.com/office/drawing/2016/5/13/chartex" xmlns:cx8="http://schemas.microsoft.com/office/drawing/2016/5/14/chartex" xmlns:mc="http://schemas.openxmlformats.org/markup-compatibility/2006" xmlns:aink="http://schemas.microsoft.com/office/drawing/2016/ink" xmlns:am3d="http://schemas.microsoft.com/office/drawing/2017/model3d" xmlns:o="urn:schemas-microsoft-com:office:office" xmlns:oel="http://schemas.microsoft.com/office/2019/extlst" xmlns:r="http://schemas.openxmlformats.org/officeDocument/2006/relationships" xmlns:m="http://schemas.openxmlformats.org/officeDocument/2006/math" xmlns:v="urn:schemas-microsoft-com:vml" xmlns:wp14="http://schemas.microsoft.com/office/word/2010/wordprocessingDrawing" xmlns:wp="http://schemas.openxmlformats.org/drawingml/2006/wordprocessingDrawing" xmlns:w10="urn:schemas-microsoft-com:office:word" xmlns:w="http://schemas.openxmlformats.org/wordprocessingml/2006/main" xmlns:w14="http://schemas.microsoft.com/office/word/2010/wordml" xmlns:w15="http://schemas.microsoft.com/office/word/2012/wordml" xmlns:w16cex="http://schemas.microsoft.com/office/word/2018/wordml/cex" xmlns:w16cid="http://schemas.microsoft.com/office/word/2016/wordml/cid" xmlns:w16="http://schemas.microsoft.com/office/word/2018/wordml" xmlns:w16sdtdh="http://schemas.microsoft.com/office/word/2020/wordml/sdtdatahash" xmlns:w16se="http://schemas.microsoft.com/office/word/2015/wordml/symex" xmlns:wpg="http://schemas.microsoft.com/office/word/2010/wordprocessingGroup" xmlns:wpi="http://schemas.microsoft.com/office/word/2010/wordprocessingInk" xmlns:wne="http://schemas.microsoft.com/office/word/2006/wordml" xmlns:wps="http://schemas.microsoft.com/office/word/2010/wordprocessingShape" mc:Ignorable="w14 w15 w16se w16cid w16 w16cex w16sdtdh wp14">
+<w:endnotes xmlns:wpc="http://schemas.microsoft.com/office/word/2010/wordprocessingCanvas" xmlns:cx="http://schemas.microsoft.com/office/drawing/2014/chartex" xmlns:cx1="http://schemas.microsoft.com/office/drawing/2015/9/8/chartex" xmlns:cx2="http://schemas.microsoft.com/office/drawing/2015/10/21/chartex" xmlns:cx3="http://schemas.microsoft.com/office/drawing/2016/5/9/chartex" xmlns:cx4="http://schemas.microsoft.com/office/drawing/2016/5/10/chartex" xmlns:cx5="http://schemas.microsoft.com/office/drawing/2016/5/11/chartex" xmlns:cx6="http://schemas.microsoft.com/office/drawing/2016/5/12/chartex" xmlns:cx7="http://schemas.microsoft.com/office/drawing/2016/5/13/chartex" xmlns:cx8="http://schemas.microsoft.com/office/drawing/2016/5/14/chartex" xmlns:mc="http://schemas.openxmlformats.org/markup-compatibility/2006" xmlns:aink="http://schemas.microsoft.com/office/drawing/2016/ink" xmlns:am3d="http://schemas.microsoft.com/office/drawing/2017/model3d" xmlns:o="urn:schemas-microsoft-com:office:office" xmlns:oel="http://schemas.microsoft.com/office/2019/extlst" xmlns:r="http://schemas.openxmlformats.org/officeDocument/2006/relationships" xmlns:m="http://schemas.openxmlformats.org/officeDocument/2006/math" xmlns:v="urn:schemas-microsoft-com:vml" xmlns:wp14="http://schemas.microsoft.com/office/word/2010/wordprocessingDrawing" xmlns:wp="http://schemas.openxmlformats.org/drawingml/2006/wordprocessingDrawing" xmlns:w10="urn:schemas-microsoft-com:office:word" xmlns:w="http://schemas.openxmlformats.org/wordprocessingml/2006/main" xmlns:w14="http://schemas.microsoft.com/office/word/2010/wordml" xmlns:w15="http://schemas.microsoft.com/office/word/2012/wordml" xmlns:w16cex="http://schemas.microsoft.com/office/word/2018/wordml/cex" xmlns:w16cid="http://schemas.microsoft.com/office/word/2016/wordml/cid" xmlns:w16="http://schemas.microsoft.com/office/word/2018/wordml" xmlns:w16du="http://schemas.microsoft.com/office/word/2023/wordml/word16du" xmlns:w16sdtdh="http://schemas.microsoft.com/office/word/2020/wordml/sdtdatahash" xmlns:w16sdtfl="http://schemas.microsoft.com/office/word/2024/wordml/sdtformatlock" xmlns:w16se="http://schemas.microsoft.com/office/word/2015/wordml/symex" xmlns:wpg="http://schemas.microsoft.com/office/word/2010/wordprocessingGroup" xmlns:wpi="http://schemas.microsoft.com/office/word/2010/wordprocessingInk" xmlns:wne="http://schemas.microsoft.com/office/word/2006/wordml" xmlns:wps="http://schemas.microsoft.com/office/word/2010/wordprocessingShape" mc:Ignorable="w14 w15 w16se w16cid w16 w16cex w16sdtdh w16sdtfl w16du wp14">
   <w:endnote w:type="separator" w:id="-1">
     <w:p>
       <w:pPr>
@@ -12786,7 +12781,7 @@
 </file>
 
 <file path=word/footnotes.xml><?xml version="1.0" encoding="utf-8"?>
-<w:footnotes xmlns:wpc="http://schemas.microsoft.com/office/word/2010/wordprocessingCanvas" xmlns:cx="http://schemas.microsoft.com/office/drawing/2014/chartex" xmlns:cx1="http://schemas.microsoft.com/office/drawing/2015/9/8/chartex" xmlns:cx2="http://schemas.microsoft.com/office/drawing/2015/10/21/chartex" xmlns:cx3="http://schemas.microsoft.com/office/drawing/2016/5/9/chartex" xmlns:cx4="http://schemas.microsoft.com/office/drawing/2016/5/10/chartex" xmlns:cx5="http://schemas.microsoft.com/office/drawing/2016/5/11/chartex" xmlns:cx6="http://schemas.microsoft.com/office/drawing/2016/5/12/chartex" xmlns:cx7="http://schemas.microsoft.com/office/drawing/2016/5/13/chartex" xmlns:cx8="http://schemas.microsoft.com/office/drawing/2016/5/14/chartex" xmlns:mc="http://schemas.openxmlformats.org/markup-compatibility/2006" xmlns:aink="http://schemas.microsoft.com/office/drawing/2016/ink" xmlns:am3d="http://schemas.microsoft.com/office/drawing/2017/model3d" xmlns:o="urn:schemas-microsoft-com:office:office" xmlns:oel="http://schemas.microsoft.com/office/2019/extlst" xmlns:r="http://schemas.openxmlformats.org/officeDocument/2006/relationships" xmlns:m="http://schemas.openxmlformats.org/officeDocument/2006/math" xmlns:v="urn:schemas-microsoft-com:vml" xmlns:wp14="http://schemas.microsoft.com/office/word/2010/wordprocessingDrawing" xmlns:wp="http://schemas.openxmlformats.org/drawingml/2006/wordprocessingDrawing" xmlns:w10="urn:schemas-microsoft-com:office:word" xmlns:w="http://schemas.openxmlformats.org/wordprocessingml/2006/main" xmlns:w14="http://schemas.microsoft.com/office/word/2010/wordml" xmlns:w15="http://schemas.microsoft.com/office/word/2012/wordml" xmlns:w16cex="http://schemas.microsoft.com/office/word/2018/wordml/cex" xmlns:w16cid="http://schemas.microsoft.com/office/word/2016/wordml/cid" xmlns:w16="http://schemas.microsoft.com/office/word/2018/wordml" xmlns:w16sdtdh="http://schemas.microsoft.com/office/word/2020/wordml/sdtdatahash" xmlns:w16se="http://schemas.microsoft.com/office/word/2015/wordml/symex" xmlns:wpg="http://schemas.microsoft.com/office/word/2010/wordprocessingGroup" xmlns:wpi="http://schemas.microsoft.com/office/word/2010/wordprocessingInk" xmlns:wne="http://schemas.microsoft.com/office/word/2006/wordml" xmlns:wps="http://schemas.microsoft.com/office/word/2010/wordprocessingShape" mc:Ignorable="w14 w15 w16se w16cid w16 w16cex w16sdtdh wp14">
+<w:footnotes xmlns:wpc="http://schemas.microsoft.com/office/word/2010/wordprocessingCanvas" xmlns:cx="http://schemas.microsoft.com/office/drawing/2014/chartex" xmlns:cx1="http://schemas.microsoft.com/office/drawing/2015/9/8/chartex" xmlns:cx2="http://schemas.microsoft.com/office/drawing/2015/10/21/chartex" xmlns:cx3="http://schemas.microsoft.com/office/drawing/2016/5/9/chartex" xmlns:cx4="http://schemas.microsoft.com/office/drawing/2016/5/10/chartex" xmlns:cx5="http://schemas.microsoft.com/office/drawing/2016/5/11/chartex" xmlns:cx6="http://schemas.microsoft.com/office/drawing/2016/5/12/chartex" xmlns:cx7="http://schemas.microsoft.com/office/drawing/2016/5/13/chartex" xmlns:cx8="http://schemas.microsoft.com/office/drawing/2016/5/14/chartex" xmlns:mc="http://schemas.openxmlformats.org/markup-compatibility/2006" xmlns:aink="http://schemas.microsoft.com/office/drawing/2016/ink" xmlns:am3d="http://schemas.microsoft.com/office/drawing/2017/model3d" xmlns:o="urn:schemas-microsoft-com:office:office" xmlns:oel="http://schemas.microsoft.com/office/2019/extlst" xmlns:r="http://schemas.openxmlformats.org/officeDocument/2006/relationships" xmlns:m="http://schemas.openxmlformats.org/officeDocument/2006/math" xmlns:v="urn:schemas-microsoft-com:vml" xmlns:wp14="http://schemas.microsoft.com/office/word/2010/wordprocessingDrawing" xmlns:wp="http://schemas.openxmlformats.org/drawingml/2006/wordprocessingDrawing" xmlns:w10="urn:schemas-microsoft-com:office:word" xmlns:w="http://schemas.openxmlformats.org/wordprocessingml/2006/main" xmlns:w14="http://schemas.microsoft.com/office/word/2010/wordml" xmlns:w15="http://schemas.microsoft.com/office/word/2012/wordml" xmlns:w16cex="http://schemas.microsoft.com/office/word/2018/wordml/cex" xmlns:w16cid="http://schemas.microsoft.com/office/word/2016/wordml/cid" xmlns:w16="http://schemas.microsoft.com/office/word/2018/wordml" xmlns:w16du="http://schemas.microsoft.com/office/word/2023/wordml/word16du" xmlns:w16sdtdh="http://schemas.microsoft.com/office/word/2020/wordml/sdtdatahash" xmlns:w16sdtfl="http://schemas.microsoft.com/office/word/2024/wordml/sdtformatlock" xmlns:w16se="http://schemas.microsoft.com/office/word/2015/wordml/symex" xmlns:wpg="http://schemas.microsoft.com/office/word/2010/wordprocessingGroup" xmlns:wpi="http://schemas.microsoft.com/office/word/2010/wordprocessingInk" xmlns:wne="http://schemas.microsoft.com/office/word/2006/wordml" xmlns:wps="http://schemas.microsoft.com/office/word/2010/wordprocessingShape" mc:Ignorable="w14 w15 w16se w16cid w16 w16cex w16sdtdh w16sdtfl w16du wp14">
   <w:footnote w:type="separator" w:id="-1">
     <w:p>
       <w:pPr>
@@ -12811,7 +12806,7 @@
 </file>
 
 <file path=word/numbering.xml><?xml version="1.0" encoding="utf-8"?>
-<w:numbering xmlns:wpc="http://schemas.microsoft.com/office/word/2010/wordprocessingCanvas" xmlns:cx="http://schemas.microsoft.com/office/drawing/2014/chartex" xmlns:cx1="http://schemas.microsoft.com/office/drawing/2015/9/8/chartex" xmlns:cx2="http://schemas.microsoft.com/office/drawing/2015/10/21/chartex" xmlns:cx3="http://schemas.microsoft.com/office/drawing/2016/5/9/chartex" xmlns:cx4="http://schemas.microsoft.com/office/drawing/2016/5/10/chartex" xmlns:cx5="http://schemas.microsoft.com/office/drawing/2016/5/11/chartex" xmlns:cx6="http://schemas.microsoft.com/office/drawing/2016/5/12/chartex" xmlns:cx7="http://schemas.microsoft.com/office/drawing/2016/5/13/chartex" xmlns:cx8="http://schemas.microsoft.com/office/drawing/2016/5/14/chartex" xmlns:mc="http://schemas.openxmlformats.org/markup-compatibility/2006" xmlns:aink="http://schemas.microsoft.com/office/drawing/2016/ink" xmlns:am3d="http://schemas.microsoft.com/office/drawing/2017/model3d" xmlns:o="urn:schemas-microsoft-com:office:office" xmlns:oel="http://schemas.microsoft.com/office/2019/extlst" xmlns:r="http://schemas.openxmlformats.org/officeDocument/2006/relationships" xmlns:m="http://schemas.openxmlformats.org/officeDocument/2006/math" xmlns:v="urn:schemas-microsoft-com:vml" xmlns:wp14="http://schemas.microsoft.com/office/word/2010/wordprocessingDrawing" xmlns:wp="http://schemas.openxmlformats.org/drawingml/2006/wordprocessingDrawing" xmlns:w10="urn:schemas-microsoft-com:office:word" xmlns:w="http://schemas.openxmlformats.org/wordprocessingml/2006/main" xmlns:w14="http://schemas.microsoft.com/office/word/2010/wordml" xmlns:w15="http://schemas.microsoft.com/office/word/2012/wordml" xmlns:w16cex="http://schemas.microsoft.com/office/word/2018/wordml/cex" xmlns:w16cid="http://schemas.microsoft.com/office/word/2016/wordml/cid" xmlns:w16="http://schemas.microsoft.com/office/word/2018/wordml" xmlns:w16sdtdh="http://schemas.microsoft.com/office/word/2020/wordml/sdtdatahash" xmlns:w16se="http://schemas.microsoft.com/office/word/2015/wordml/symex" xmlns:wpg="http://schemas.microsoft.com/office/word/2010/wordprocessingGroup" xmlns:wpi="http://schemas.microsoft.com/office/word/2010/wordprocessingInk" xmlns:wne="http://schemas.microsoft.com/office/word/2006/wordml" xmlns:wps="http://schemas.microsoft.com/office/word/2010/wordprocessingShape" mc:Ignorable="w14 w15 w16se w16cid w16 w16cex w16sdtdh wp14">
+<w:numbering xmlns:wpc="http://schemas.microsoft.com/office/word/2010/wordprocessingCanvas" xmlns:cx="http://schemas.microsoft.com/office/drawing/2014/chartex" xmlns:cx1="http://schemas.microsoft.com/office/drawing/2015/9/8/chartex" xmlns:cx2="http://schemas.microsoft.com/office/drawing/2015/10/21/chartex" xmlns:cx3="http://schemas.microsoft.com/office/drawing/2016/5/9/chartex" xmlns:cx4="http://schemas.microsoft.com/office/drawing/2016/5/10/chartex" xmlns:cx5="http://schemas.microsoft.com/office/drawing/2016/5/11/chartex" xmlns:cx6="http://schemas.microsoft.com/office/drawing/2016/5/12/chartex" xmlns:cx7="http://schemas.microsoft.com/office/drawing/2016/5/13/chartex" xmlns:cx8="http://schemas.microsoft.com/office/drawing/2016/5/14/chartex" xmlns:mc="http://schemas.openxmlformats.org/markup-compatibility/2006" xmlns:aink="http://schemas.microsoft.com/office/drawing/2016/ink" xmlns:am3d="http://schemas.microsoft.com/office/drawing/2017/model3d" xmlns:o="urn:schemas-microsoft-com:office:office" xmlns:oel="http://schemas.microsoft.com/office/2019/extlst" xmlns:r="http://schemas.openxmlformats.org/officeDocument/2006/relationships" xmlns:m="http://schemas.openxmlformats.org/officeDocument/2006/math" xmlns:v="urn:schemas-microsoft-com:vml" xmlns:wp14="http://schemas.microsoft.com/office/word/2010/wordprocessingDrawing" xmlns:wp="http://schemas.openxmlformats.org/drawingml/2006/wordprocessingDrawing" xmlns:w10="urn:schemas-microsoft-com:office:word" xmlns:w="http://schemas.openxmlformats.org/wordprocessingml/2006/main" xmlns:w14="http://schemas.microsoft.com/office/word/2010/wordml" xmlns:w15="http://schemas.microsoft.com/office/word/2012/wordml" xmlns:w16cex="http://schemas.microsoft.com/office/word/2018/wordml/cex" xmlns:w16cid="http://schemas.microsoft.com/office/word/2016/wordml/cid" xmlns:w16="http://schemas.microsoft.com/office/word/2018/wordml" xmlns:w16du="http://schemas.microsoft.com/office/word/2023/wordml/word16du" xmlns:w16sdtdh="http://schemas.microsoft.com/office/word/2020/wordml/sdtdatahash" xmlns:w16sdtfl="http://schemas.microsoft.com/office/word/2024/wordml/sdtformatlock" xmlns:w16se="http://schemas.microsoft.com/office/word/2015/wordml/symex" xmlns:wpg="http://schemas.microsoft.com/office/word/2010/wordprocessingGroup" xmlns:wpi="http://schemas.microsoft.com/office/word/2010/wordprocessingInk" xmlns:wne="http://schemas.microsoft.com/office/word/2006/wordml" xmlns:wps="http://schemas.microsoft.com/office/word/2010/wordprocessingShape" mc:Ignorable="w14 w15 w16se w16cid w16 w16cex w16sdtdh w16sdtfl w16du wp14">
   <w:abstractNum w:abstractNumId="0" w15:restartNumberingAfterBreak="0">
     <w:nsid w:val="0BA862C0"/>
     <w:multiLevelType w:val="hybridMultilevel"/>
@@ -14266,7 +14261,7 @@
 </file>
 
 <file path=word/styles.xml><?xml version="1.0" encoding="utf-8"?>
-<w:styles xmlns:mc="http://schemas.openxmlformats.org/markup-compatibility/2006" xmlns:r="http://schemas.openxmlformats.org/officeDocument/2006/relationships" xmlns:w="http://schemas.openxmlformats.org/wordprocessingml/2006/main" xmlns:w14="http://schemas.microsoft.com/office/word/2010/wordml" xmlns:w15="http://schemas.microsoft.com/office/word/2012/wordml" xmlns:w16cex="http://schemas.microsoft.com/office/word/2018/wordml/cex" xmlns:w16cid="http://schemas.microsoft.com/office/word/2016/wordml/cid" xmlns:w16="http://schemas.microsoft.com/office/word/2018/wordml" xmlns:w16sdtdh="http://schemas.microsoft.com/office/word/2020/wordml/sdtdatahash" xmlns:w16se="http://schemas.microsoft.com/office/word/2015/wordml/symex" mc:Ignorable="w14 w15 w16se w16cid w16 w16cex w16sdtdh">
+<w:styles xmlns:mc="http://schemas.openxmlformats.org/markup-compatibility/2006" xmlns:r="http://schemas.openxmlformats.org/officeDocument/2006/relationships" xmlns:w="http://schemas.openxmlformats.org/wordprocessingml/2006/main" xmlns:w14="http://schemas.microsoft.com/office/word/2010/wordml" xmlns:w15="http://schemas.microsoft.com/office/word/2012/wordml" xmlns:w16cex="http://schemas.microsoft.com/office/word/2018/wordml/cex" xmlns:w16cid="http://schemas.microsoft.com/office/word/2016/wordml/cid" xmlns:w16="http://schemas.microsoft.com/office/word/2018/wordml" xmlns:w16du="http://schemas.microsoft.com/office/word/2023/wordml/word16du" xmlns:w16sdtdh="http://schemas.microsoft.com/office/word/2020/wordml/sdtdatahash" xmlns:w16sdtfl="http://schemas.microsoft.com/office/word/2024/wordml/sdtformatlock" xmlns:w16se="http://schemas.microsoft.com/office/word/2015/wordml/symex" mc:Ignorable="w14 w15 w16se w16cid w16 w16cex w16sdtdh w16sdtfl w16du">
   <w:docDefaults>
     <w:rPrDefault>
       <w:rPr>
@@ -14868,6 +14863,7 @@
   <w:style w:type="character" w:default="1" w:styleId="a0">
     <w:name w:val="Default Paragraph Font"/>
     <w:uiPriority w:val="1"/>
+    <w:semiHidden/>
     <w:unhideWhenUsed/>
   </w:style>
   <w:style w:type="table" w:default="1" w:styleId="a1">

</xml_diff>

<commit_message>
doc: add Class in Design Class Diagram and revise SD in hw4
</commit_message>
<xml_diff>
--- a/document/hw4.docx
+++ b/document/hw4.docx
@@ -233,18 +233,8 @@
           <w:sz w:val="40"/>
           <w:szCs w:val="40"/>
         </w:rPr>
-        <w:t>陳</w:t>
-      </w:r>
-      <w:proofErr w:type="gramStart"/>
-      <w:r>
-        <w:rPr>
-          <w:rFonts w:ascii="Times New Roman" w:eastAsia="標楷體" w:hAnsi="Times New Roman" w:cs="Times New Roman"/>
-          <w:sz w:val="40"/>
-          <w:szCs w:val="40"/>
-        </w:rPr>
-        <w:t>宥錡</w:t>
-      </w:r>
-      <w:proofErr w:type="gramEnd"/>
+        <w:t>陳宥錡</w:t>
+      </w:r>
     </w:p>
     <w:p>
       <w:pPr>
@@ -4645,21 +4635,7 @@
               <w:rPr>
                 <w:rFonts w:ascii="Times New Roman" w:eastAsia="標楷體" w:hAnsi="Times New Roman" w:cs="Times New Roman" w:hint="eastAsia"/>
               </w:rPr>
-              <w:t>、議價或約定地點</w:t>
-            </w:r>
-            <w:proofErr w:type="gramStart"/>
-            <w:r>
-              <w:rPr>
-                <w:rFonts w:ascii="Times New Roman" w:eastAsia="標楷體" w:hAnsi="Times New Roman" w:cs="Times New Roman" w:hint="eastAsia"/>
-              </w:rPr>
-              <w:t>）</w:t>
-            </w:r>
-            <w:proofErr w:type="gramEnd"/>
-            <w:r>
-              <w:rPr>
-                <w:rFonts w:ascii="Times New Roman" w:eastAsia="標楷體" w:hAnsi="Times New Roman" w:cs="Times New Roman" w:hint="eastAsia"/>
-              </w:rPr>
-              <w:t>。</w:t>
+              <w:t>、議價或約定地點）。</w:t>
             </w:r>
           </w:p>
           <w:p>
@@ -11303,10 +11279,10 @@
     <w:p>
       <w:r>
         <w:drawing>
-          <wp:inline distT="0" distB="0" distL="0" distR="0" wp14:anchorId="479BAD3F" wp14:editId="193ABA0B">
+          <wp:inline distT="0" distB="0" distL="0" distR="0" wp14:anchorId="75C29FE9" wp14:editId="4EF1219A">
             <wp:extent cx="5274310" cy="1555750"/>
             <wp:effectExtent l="0" t="0" r="2540" b="6350"/>
-            <wp:docPr id="274066439" name="圖片 1"/>
+            <wp:docPr id="711182635" name="圖片 1"/>
             <wp:cNvGraphicFramePr>
               <a:graphicFrameLocks xmlns:a="http://schemas.openxmlformats.org/drawingml/2006/main" noChangeAspect="1"/>
             </wp:cNvGraphicFramePr>
@@ -11314,7 +11290,7 @@
               <a:graphicData uri="http://schemas.openxmlformats.org/drawingml/2006/picture">
                 <pic:pic xmlns:pic="http://schemas.openxmlformats.org/drawingml/2006/picture">
                   <pic:nvPicPr>
-                    <pic:cNvPr id="274066439" name=""/>
+                    <pic:cNvPr id="711182635" name=""/>
                     <pic:cNvPicPr/>
                   </pic:nvPicPr>
                   <pic:blipFill>
@@ -11434,6 +11410,9 @@
     </w:p>
     <w:p>
       <w:r>
+        <w:rPr>
+          <w:noProof/>
+        </w:rPr>
         <w:drawing>
           <wp:inline distT="0" distB="0" distL="0" distR="0" wp14:anchorId="0205499D" wp14:editId="62C17CA0">
             <wp:extent cx="5930162" cy="1673525"/>
@@ -11704,15 +11683,12 @@
     </w:p>
     <w:p>
       <w:r>
-        <w:rPr>
-          <w:noProof/>
-        </w:rPr>
         <w:lastRenderedPageBreak/>
         <w:drawing>
-          <wp:inline distT="0" distB="0" distL="0" distR="0" wp14:anchorId="0972C7BB" wp14:editId="6084EFF2">
-            <wp:extent cx="5840025" cy="1854802"/>
-            <wp:effectExtent l="0" t="0" r="0" b="0"/>
-            <wp:docPr id="1284505140" name="圖片 1"/>
+          <wp:inline distT="0" distB="0" distL="0" distR="0" wp14:anchorId="76D75AC4" wp14:editId="4E40C2F1">
+            <wp:extent cx="5274310" cy="1675130"/>
+            <wp:effectExtent l="0" t="0" r="2540" b="1270"/>
+            <wp:docPr id="871329710" name="圖片 1"/>
             <wp:cNvGraphicFramePr>
               <a:graphicFrameLocks xmlns:a="http://schemas.openxmlformats.org/drawingml/2006/main" noChangeAspect="1"/>
             </wp:cNvGraphicFramePr>
@@ -11720,7 +11696,7 @@
               <a:graphicData uri="http://schemas.openxmlformats.org/drawingml/2006/picture">
                 <pic:pic xmlns:pic="http://schemas.openxmlformats.org/drawingml/2006/picture">
                   <pic:nvPicPr>
-                    <pic:cNvPr id="1284505140" name=""/>
+                    <pic:cNvPr id="871329710" name=""/>
                     <pic:cNvPicPr/>
                   </pic:nvPicPr>
                   <pic:blipFill>
@@ -11732,7 +11708,7 @@
                   <pic:spPr>
                     <a:xfrm>
                       <a:off x="0" y="0"/>
-                      <a:ext cx="5852948" cy="1858906"/>
+                      <a:ext cx="5274310" cy="1675130"/>
                     </a:xfrm>
                     <a:prstGeom prst="rect">
                       <a:avLst/>
@@ -11840,14 +11816,11 @@
     </w:p>
     <w:p>
       <w:r>
-        <w:rPr>
-          <w:noProof/>
-        </w:rPr>
         <w:drawing>
-          <wp:inline distT="0" distB="0" distL="0" distR="0" wp14:anchorId="39AB2E37" wp14:editId="125EE8D8">
+          <wp:inline distT="0" distB="0" distL="0" distR="0" wp14:anchorId="2067D91E" wp14:editId="3D02AC45">
             <wp:extent cx="5274310" cy="1831975"/>
             <wp:effectExtent l="0" t="0" r="2540" b="0"/>
-            <wp:docPr id="462810598" name="圖片 1"/>
+            <wp:docPr id="119063444" name="圖片 1"/>
             <wp:cNvGraphicFramePr>
               <a:graphicFrameLocks xmlns:a="http://schemas.openxmlformats.org/drawingml/2006/main" noChangeAspect="1"/>
             </wp:cNvGraphicFramePr>
@@ -11855,7 +11828,7 @@
               <a:graphicData uri="http://schemas.openxmlformats.org/drawingml/2006/picture">
                 <pic:pic xmlns:pic="http://schemas.openxmlformats.org/drawingml/2006/picture">
                   <pic:nvPicPr>
-                    <pic:cNvPr id="462810598" name=""/>
+                    <pic:cNvPr id="119063444" name=""/>
                     <pic:cNvPicPr/>
                   </pic:nvPicPr>
                   <pic:blipFill>
@@ -12622,6 +12595,7 @@
               <w:rPr>
                 <w:rFonts w:ascii="Times New Roman" w:eastAsia="標楷體" w:hAnsi="Times New Roman" w:cs="Times New Roman" w:hint="eastAsia"/>
               </w:rPr>
+              <w:lastRenderedPageBreak/>
               <w:t>HW#4</w:t>
             </w:r>
           </w:p>

</xml_diff>

<commit_message>
doc: change class name into English in `Domain Model`
</commit_message>
<xml_diff>
--- a/document/hw4.docx
+++ b/document/hw4.docx
@@ -1,6 +1,6 @@
 
 <file path=word/document.xml><?xml version="1.0" encoding="utf-8"?>
-<w:document xmlns:wpc="http://schemas.microsoft.com/office/word/2010/wordprocessingCanvas" xmlns:cx="http://schemas.microsoft.com/office/drawing/2014/chartex" xmlns:cx1="http://schemas.microsoft.com/office/drawing/2015/9/8/chartex" xmlns:cx2="http://schemas.microsoft.com/office/drawing/2015/10/21/chartex" xmlns:cx3="http://schemas.microsoft.com/office/drawing/2016/5/9/chartex" xmlns:cx4="http://schemas.microsoft.com/office/drawing/2016/5/10/chartex" xmlns:cx5="http://schemas.microsoft.com/office/drawing/2016/5/11/chartex" xmlns:cx6="http://schemas.microsoft.com/office/drawing/2016/5/12/chartex" xmlns:cx7="http://schemas.microsoft.com/office/drawing/2016/5/13/chartex" xmlns:cx8="http://schemas.microsoft.com/office/drawing/2016/5/14/chartex" xmlns:mc="http://schemas.openxmlformats.org/markup-compatibility/2006" xmlns:aink="http://schemas.microsoft.com/office/drawing/2016/ink" xmlns:am3d="http://schemas.microsoft.com/office/drawing/2017/model3d" xmlns:o="urn:schemas-microsoft-com:office:office" xmlns:oel="http://schemas.microsoft.com/office/2019/extlst" xmlns:r="http://schemas.openxmlformats.org/officeDocument/2006/relationships" xmlns:m="http://schemas.openxmlformats.org/officeDocument/2006/math" xmlns:v="urn:schemas-microsoft-com:vml" xmlns:wp14="http://schemas.microsoft.com/office/word/2010/wordprocessingDrawing" xmlns:wp="http://schemas.openxmlformats.org/drawingml/2006/wordprocessingDrawing" xmlns:w10="urn:schemas-microsoft-com:office:word" xmlns:w="http://schemas.openxmlformats.org/wordprocessingml/2006/main" xmlns:w14="http://schemas.microsoft.com/office/word/2010/wordml" xmlns:w15="http://schemas.microsoft.com/office/word/2012/wordml" xmlns:w16cex="http://schemas.microsoft.com/office/word/2018/wordml/cex" xmlns:w16cid="http://schemas.microsoft.com/office/word/2016/wordml/cid" xmlns:w16="http://schemas.microsoft.com/office/word/2018/wordml" xmlns:w16du="http://schemas.microsoft.com/office/word/2023/wordml/word16du" xmlns:w16sdtdh="http://schemas.microsoft.com/office/word/2020/wordml/sdtdatahash" xmlns:w16sdtfl="http://schemas.microsoft.com/office/word/2024/wordml/sdtformatlock" xmlns:w16se="http://schemas.microsoft.com/office/word/2015/wordml/symex" xmlns:wpg="http://schemas.microsoft.com/office/word/2010/wordprocessingGroup" xmlns:wpi="http://schemas.microsoft.com/office/word/2010/wordprocessingInk" xmlns:wne="http://schemas.microsoft.com/office/word/2006/wordml" xmlns:wps="http://schemas.microsoft.com/office/word/2010/wordprocessingShape" mc:Ignorable="w14 w15 w16se w16cid w16 w16cex w16sdtdh w16sdtfl w16du wp14">
+<w:document xmlns:wpc="http://schemas.microsoft.com/office/word/2010/wordprocessingCanvas" xmlns:cx="http://schemas.microsoft.com/office/drawing/2014/chartex" xmlns:cx1="http://schemas.microsoft.com/office/drawing/2015/9/8/chartex" xmlns:cx2="http://schemas.microsoft.com/office/drawing/2015/10/21/chartex" xmlns:cx3="http://schemas.microsoft.com/office/drawing/2016/5/9/chartex" xmlns:cx4="http://schemas.microsoft.com/office/drawing/2016/5/10/chartex" xmlns:cx5="http://schemas.microsoft.com/office/drawing/2016/5/11/chartex" xmlns:cx6="http://schemas.microsoft.com/office/drawing/2016/5/12/chartex" xmlns:cx7="http://schemas.microsoft.com/office/drawing/2016/5/13/chartex" xmlns:cx8="http://schemas.microsoft.com/office/drawing/2016/5/14/chartex" xmlns:mc="http://schemas.openxmlformats.org/markup-compatibility/2006" xmlns:aink="http://schemas.microsoft.com/office/drawing/2016/ink" xmlns:am3d="http://schemas.microsoft.com/office/drawing/2017/model3d" xmlns:o="urn:schemas-microsoft-com:office:office" xmlns:oel="http://schemas.microsoft.com/office/2019/extlst" xmlns:r="http://schemas.openxmlformats.org/officeDocument/2006/relationships" xmlns:m="http://schemas.openxmlformats.org/officeDocument/2006/math" xmlns:v="urn:schemas-microsoft-com:vml" xmlns:wp14="http://schemas.microsoft.com/office/word/2010/wordprocessingDrawing" xmlns:wp="http://schemas.openxmlformats.org/drawingml/2006/wordprocessingDrawing" xmlns:w10="urn:schemas-microsoft-com:office:word" xmlns:w="http://schemas.openxmlformats.org/wordprocessingml/2006/main" xmlns:w14="http://schemas.microsoft.com/office/word/2010/wordml" xmlns:w15="http://schemas.microsoft.com/office/word/2012/wordml" xmlns:w16cex="http://schemas.microsoft.com/office/word/2018/wordml/cex" xmlns:w16cid="http://schemas.microsoft.com/office/word/2016/wordml/cid" xmlns:w16="http://schemas.microsoft.com/office/word/2018/wordml" xmlns:w16sdtdh="http://schemas.microsoft.com/office/word/2020/wordml/sdtdatahash" xmlns:w16se="http://schemas.microsoft.com/office/word/2015/wordml/symex" xmlns:wpg="http://schemas.microsoft.com/office/word/2010/wordprocessingGroup" xmlns:wpi="http://schemas.microsoft.com/office/word/2010/wordprocessingInk" xmlns:wne="http://schemas.microsoft.com/office/word/2006/wordml" xmlns:wps="http://schemas.microsoft.com/office/word/2010/wordprocessingShape" mc:Ignorable="w14 w15 w16se w16cid w16 w16cex w16sdtdh wp14">
   <w:body>
     <w:p>
       <w:pPr>
@@ -233,8 +233,18 @@
           <w:sz w:val="40"/>
           <w:szCs w:val="40"/>
         </w:rPr>
-        <w:t>陳宥錡</w:t>
-      </w:r>
+        <w:t>陳</w:t>
+      </w:r>
+      <w:proofErr w:type="gramStart"/>
+      <w:r>
+        <w:rPr>
+          <w:rFonts w:ascii="Times New Roman" w:eastAsia="標楷體" w:hAnsi="Times New Roman" w:cs="Times New Roman"/>
+          <w:sz w:val="40"/>
+          <w:szCs w:val="40"/>
+        </w:rPr>
+        <w:t>宥錡</w:t>
+      </w:r>
+      <w:proofErr w:type="gramEnd"/>
     </w:p>
     <w:p>
       <w:pPr>
@@ -4635,7 +4645,21 @@
               <w:rPr>
                 <w:rFonts w:ascii="Times New Roman" w:eastAsia="標楷體" w:hAnsi="Times New Roman" w:cs="Times New Roman" w:hint="eastAsia"/>
               </w:rPr>
-              <w:t>、議價或約定地點）。</w:t>
+              <w:t>、議價或約定地點</w:t>
+            </w:r>
+            <w:proofErr w:type="gramStart"/>
+            <w:r>
+              <w:rPr>
+                <w:rFonts w:ascii="Times New Roman" w:eastAsia="標楷體" w:hAnsi="Times New Roman" w:cs="Times New Roman" w:hint="eastAsia"/>
+              </w:rPr>
+              <w:t>）</w:t>
+            </w:r>
+            <w:proofErr w:type="gramEnd"/>
+            <w:r>
+              <w:rPr>
+                <w:rFonts w:ascii="Times New Roman" w:eastAsia="標楷體" w:hAnsi="Times New Roman" w:cs="Times New Roman" w:hint="eastAsia"/>
+              </w:rPr>
+              <w:t>。</w:t>
             </w:r>
           </w:p>
           <w:p>
@@ -10023,6 +10047,12 @@
               </w:rPr>
               <w:t>買家</w:t>
             </w:r>
+            <w:r>
+              <w:rPr>
+                <w:rFonts w:ascii="Times New Roman" w:eastAsia="標楷體" w:hAnsi="Times New Roman" w:cs="Times New Roman" w:hint="eastAsia"/>
+              </w:rPr>
+              <w:t xml:space="preserve"> (Buyer)</w:t>
+            </w:r>
           </w:p>
         </w:tc>
         <w:tc>
@@ -10041,6 +10071,12 @@
               </w:rPr>
               <w:t>賣家</w:t>
             </w:r>
+            <w:r>
+              <w:rPr>
+                <w:rFonts w:ascii="Times New Roman" w:eastAsia="標楷體" w:hAnsi="Times New Roman" w:cs="Times New Roman" w:hint="eastAsia"/>
+              </w:rPr>
+              <w:t xml:space="preserve"> (Seller)</w:t>
+            </w:r>
           </w:p>
         </w:tc>
         <w:tc>
@@ -10058,6 +10094,12 @@
                 <w:rFonts w:ascii="Times New Roman" w:eastAsia="標楷體" w:hAnsi="Times New Roman" w:cs="Times New Roman" w:hint="eastAsia"/>
               </w:rPr>
               <w:t>書籍</w:t>
+            </w:r>
+            <w:r>
+              <w:rPr>
+                <w:rFonts w:ascii="Times New Roman" w:eastAsia="標楷體" w:hAnsi="Times New Roman" w:cs="Times New Roman" w:hint="eastAsia"/>
+              </w:rPr>
+              <w:t xml:space="preserve"> (Book)</w:t>
             </w:r>
           </w:p>
         </w:tc>
@@ -10079,6 +10121,26 @@
               </w:rPr>
               <w:t>書籍資訊</w:t>
             </w:r>
+            <w:r>
+              <w:rPr>
+                <w:rFonts w:ascii="Times New Roman" w:eastAsia="標楷體" w:hAnsi="Times New Roman" w:cs="Times New Roman" w:hint="eastAsia"/>
+              </w:rPr>
+              <w:t xml:space="preserve"> (</w:t>
+            </w:r>
+            <w:proofErr w:type="spellStart"/>
+            <w:r>
+              <w:rPr>
+                <w:rFonts w:ascii="Times New Roman" w:eastAsia="標楷體" w:hAnsi="Times New Roman" w:cs="Times New Roman" w:hint="eastAsia"/>
+              </w:rPr>
+              <w:t>BookInfo</w:t>
+            </w:r>
+            <w:proofErr w:type="spellEnd"/>
+            <w:r>
+              <w:rPr>
+                <w:rFonts w:ascii="Times New Roman" w:eastAsia="標楷體" w:hAnsi="Times New Roman" w:cs="Times New Roman" w:hint="eastAsia"/>
+              </w:rPr>
+              <w:t>)</w:t>
+            </w:r>
           </w:p>
         </w:tc>
         <w:tc>
@@ -10097,6 +10159,12 @@
               </w:rPr>
               <w:t>訂單</w:t>
             </w:r>
+            <w:r>
+              <w:rPr>
+                <w:rFonts w:ascii="Times New Roman" w:eastAsia="標楷體" w:hAnsi="Times New Roman" w:cs="Times New Roman" w:hint="eastAsia"/>
+              </w:rPr>
+              <w:t xml:space="preserve"> (Order)</w:t>
+            </w:r>
           </w:p>
         </w:tc>
         <w:tc>
@@ -10117,6 +10185,12 @@
               <w:t>私訊</w:t>
             </w:r>
             <w:proofErr w:type="gramEnd"/>
+            <w:r>
+              <w:rPr>
+                <w:rFonts w:ascii="Times New Roman" w:eastAsia="標楷體" w:hAnsi="Times New Roman" w:cs="Times New Roman" w:hint="eastAsia"/>
+              </w:rPr>
+              <w:t xml:space="preserve"> (Message)</w:t>
+            </w:r>
           </w:p>
         </w:tc>
       </w:tr>
@@ -10137,6 +10211,12 @@
               </w:rPr>
               <w:t>類別</w:t>
             </w:r>
+            <w:r>
+              <w:rPr>
+                <w:rFonts w:ascii="Times New Roman" w:eastAsia="標楷體" w:hAnsi="Times New Roman" w:cs="Times New Roman" w:hint="eastAsia"/>
+              </w:rPr>
+              <w:t xml:space="preserve"> (Category)</w:t>
+            </w:r>
           </w:p>
         </w:tc>
         <w:tc>
@@ -10146,7 +10226,7 @@
           <w:p>
             <w:pPr>
               <w:rPr>
-                <w:rFonts w:ascii="Times New Roman" w:eastAsia="標楷體" w:hAnsi="Times New Roman" w:cs="Times New Roman"/>
+                <w:rFonts w:ascii="Times New Roman" w:eastAsia="標楷體" w:hAnsi="Times New Roman" w:cs="Times New Roman" w:hint="eastAsia"/>
               </w:rPr>
             </w:pPr>
             <w:r>
@@ -10155,6 +10235,12 @@
               </w:rPr>
               <w:t>購物車</w:t>
             </w:r>
+            <w:r>
+              <w:rPr>
+                <w:rFonts w:ascii="Times New Roman" w:eastAsia="標楷體" w:hAnsi="Times New Roman" w:cs="Times New Roman" w:hint="eastAsia"/>
+              </w:rPr>
+              <w:t xml:space="preserve"> (Cart)</w:t>
+            </w:r>
           </w:p>
         </w:tc>
         <w:tc>
@@ -10164,7 +10250,7 @@
           <w:p>
             <w:pPr>
               <w:rPr>
-                <w:rFonts w:ascii="Times New Roman" w:eastAsia="標楷體" w:hAnsi="Times New Roman" w:cs="Times New Roman"/>
+                <w:rFonts w:ascii="Times New Roman" w:eastAsia="標楷體" w:hAnsi="Times New Roman" w:cs="Times New Roman" w:hint="eastAsia"/>
               </w:rPr>
             </w:pPr>
             <w:r>
@@ -10172,6 +10258,12 @@
                 <w:rFonts w:ascii="Times New Roman" w:eastAsia="標楷體" w:hAnsi="Times New Roman" w:cs="Times New Roman" w:hint="eastAsia"/>
               </w:rPr>
               <w:t>賣場</w:t>
+            </w:r>
+            <w:r>
+              <w:rPr>
+                <w:rFonts w:ascii="Times New Roman" w:eastAsia="標楷體" w:hAnsi="Times New Roman" w:cs="Times New Roman" w:hint="eastAsia"/>
+              </w:rPr>
+              <w:t xml:space="preserve"> (Shop)</w:t>
             </w:r>
           </w:p>
         </w:tc>
@@ -10200,19 +10292,18 @@
       <w:pPr>
         <w:jc w:val="center"/>
         <w:rPr>
+          <w:rFonts w:ascii="Times New Roman" w:eastAsia="標楷體" w:hAnsi="Times New Roman" w:cs="Times New Roman" w:hint="eastAsia"/>
+        </w:rPr>
+      </w:pPr>
+      <w:r>
+        <w:rPr>
           <w:rFonts w:ascii="Times New Roman" w:eastAsia="標楷體" w:hAnsi="Times New Roman" w:cs="Times New Roman"/>
         </w:rPr>
-      </w:pPr>
-      <w:r>
-        <w:rPr>
-          <w:rFonts w:ascii="Times New Roman" w:eastAsia="標楷體" w:hAnsi="Times New Roman" w:cs="Times New Roman"/>
-          <w:noProof/>
-        </w:rPr>
         <w:drawing>
-          <wp:inline distT="0" distB="0" distL="0" distR="0" wp14:anchorId="1B8C9355" wp14:editId="73FA1D1F">
-            <wp:extent cx="4549731" cy="5162550"/>
-            <wp:effectExtent l="0" t="0" r="3810" b="0"/>
-            <wp:docPr id="4" name="圖片 4"/>
+          <wp:inline distT="0" distB="0" distL="0" distR="0" wp14:anchorId="5AA8504B" wp14:editId="60E92F39">
+            <wp:extent cx="4514502" cy="5067300"/>
+            <wp:effectExtent l="0" t="0" r="635" b="0"/>
+            <wp:docPr id="2" name="圖片 2"/>
             <wp:cNvGraphicFramePr>
               <a:graphicFrameLocks xmlns:a="http://schemas.openxmlformats.org/drawingml/2006/main" noChangeAspect="1"/>
             </wp:cNvGraphicFramePr>
@@ -10241,7 +10332,7 @@
                   <pic:spPr bwMode="auto">
                     <a:xfrm>
                       <a:off x="0" y="0"/>
-                      <a:ext cx="4589066" cy="5207183"/>
+                      <a:ext cx="4532616" cy="5087632"/>
                     </a:xfrm>
                     <a:prstGeom prst="rect">
                       <a:avLst/>
@@ -10311,16 +10402,16 @@
     <w:p>
       <w:pPr>
         <w:jc w:val="center"/>
-      </w:pPr>
-      <w:r>
-        <w:rPr>
-          <w:noProof/>
-        </w:rPr>
+        <w:rPr>
+          <w:rFonts w:hint="eastAsia"/>
+        </w:rPr>
+      </w:pPr>
+      <w:r>
         <w:drawing>
-          <wp:inline distT="0" distB="0" distL="0" distR="0" wp14:anchorId="13AEE99A" wp14:editId="355AB5B8">
-            <wp:extent cx="4775200" cy="5554822"/>
-            <wp:effectExtent l="0" t="0" r="6350" b="0"/>
-            <wp:docPr id="8" name="圖片 8"/>
+          <wp:inline distT="0" distB="0" distL="0" distR="0" wp14:anchorId="49A9932D" wp14:editId="16980449">
+            <wp:extent cx="4519864" cy="5257800"/>
+            <wp:effectExtent l="0" t="0" r="0" b="0"/>
+            <wp:docPr id="5" name="圖片 5"/>
             <wp:cNvGraphicFramePr>
               <a:graphicFrameLocks xmlns:a="http://schemas.openxmlformats.org/drawingml/2006/main" noChangeAspect="1"/>
             </wp:cNvGraphicFramePr>
@@ -10328,7 +10419,7 @@
               <a:graphicData uri="http://schemas.openxmlformats.org/drawingml/2006/picture">
                 <pic:pic xmlns:pic="http://schemas.openxmlformats.org/drawingml/2006/picture">
                   <pic:nvPicPr>
-                    <pic:cNvPr id="0" name="Picture 23"/>
+                    <pic:cNvPr id="0" name="Picture 13"/>
                     <pic:cNvPicPr>
                       <a:picLocks noChangeAspect="1" noChangeArrowheads="1"/>
                     </pic:cNvPicPr>
@@ -10349,7 +10440,7 @@
                   <pic:spPr bwMode="auto">
                     <a:xfrm>
                       <a:off x="0" y="0"/>
-                      <a:ext cx="4820055" cy="5607000"/>
+                      <a:ext cx="4533757" cy="5273961"/>
                     </a:xfrm>
                     <a:prstGeom prst="rect">
                       <a:avLst/>
@@ -10389,7 +10480,31 @@
           <w:sz w:val="22"/>
           <w:szCs w:val="22"/>
         </w:rPr>
-        <w:t xml:space="preserve">Figure 2-1 </w:t>
+        <w:t>Figure 2-</w:t>
+      </w:r>
+      <w:r>
+        <w:rPr>
+          <w:rFonts w:ascii="Times New Roman" w:eastAsia="標楷體" w:hAnsi="Times New Roman" w:cs="Times New Roman" w:hint="eastAsia"/>
+          <w:b/>
+          <w:bCs/>
+          <w:i/>
+          <w:iCs/>
+          <w:sz w:val="22"/>
+          <w:szCs w:val="22"/>
+        </w:rPr>
+        <w:t>2</w:t>
+      </w:r>
+      <w:r>
+        <w:rPr>
+          <w:rFonts w:ascii="Times New Roman" w:eastAsia="標楷體" w:hAnsi="Times New Roman" w:cs="Times New Roman" w:hint="eastAsia"/>
+          <w:b/>
+          <w:bCs/>
+          <w:i/>
+          <w:iCs/>
+          <w:sz w:val="22"/>
+          <w:szCs w:val="22"/>
+        </w:rPr>
+        <w:t xml:space="preserve"> </w:t>
       </w:r>
       <w:r>
         <w:rPr>
@@ -11278,6 +11393,9 @@
     </w:p>
     <w:p>
       <w:r>
+        <w:rPr>
+          <w:noProof/>
+        </w:rPr>
         <w:drawing>
           <wp:inline distT="0" distB="0" distL="0" distR="0" wp14:anchorId="75C29FE9" wp14:editId="4EF1219A">
             <wp:extent cx="5274310" cy="1555750"/>
@@ -11683,6 +11801,9 @@
     </w:p>
     <w:p>
       <w:r>
+        <w:rPr>
+          <w:noProof/>
+        </w:rPr>
         <w:lastRenderedPageBreak/>
         <w:drawing>
           <wp:inline distT="0" distB="0" distL="0" distR="0" wp14:anchorId="76D75AC4" wp14:editId="4E40C2F1">
@@ -11816,6 +11937,9 @@
     </w:p>
     <w:p>
       <w:r>
+        <w:rPr>
+          <w:noProof/>
+        </w:rPr>
         <w:drawing>
           <wp:inline distT="0" distB="0" distL="0" distR="0" wp14:anchorId="2067D91E" wp14:editId="3D02AC45">
             <wp:extent cx="5274310" cy="1831975"/>
@@ -12730,7 +12854,7 @@
 </file>
 
 <file path=word/endnotes.xml><?xml version="1.0" encoding="utf-8"?>
-<w:endnotes xmlns:wpc="http://schemas.microsoft.com/office/word/2010/wordprocessingCanvas" xmlns:cx="http://schemas.microsoft.com/office/drawing/2014/chartex" xmlns:cx1="http://schemas.microsoft.com/office/drawing/2015/9/8/chartex" xmlns:cx2="http://schemas.microsoft.com/office/drawing/2015/10/21/chartex" xmlns:cx3="http://schemas.microsoft.com/office/drawing/2016/5/9/chartex" xmlns:cx4="http://schemas.microsoft.com/office/drawing/2016/5/10/chartex" xmlns:cx5="http://schemas.microsoft.com/office/drawing/2016/5/11/chartex" xmlns:cx6="http://schemas.microsoft.com/office/drawing/2016/5/12/chartex" xmlns:cx7="http://schemas.microsoft.com/office/drawing/2016/5/13/chartex" xmlns:cx8="http://schemas.microsoft.com/office/drawing/2016/5/14/chartex" xmlns:mc="http://schemas.openxmlformats.org/markup-compatibility/2006" xmlns:aink="http://schemas.microsoft.com/office/drawing/2016/ink" xmlns:am3d="http://schemas.microsoft.com/office/drawing/2017/model3d" xmlns:o="urn:schemas-microsoft-com:office:office" xmlns:oel="http://schemas.microsoft.com/office/2019/extlst" xmlns:r="http://schemas.openxmlformats.org/officeDocument/2006/relationships" xmlns:m="http://schemas.openxmlformats.org/officeDocument/2006/math" xmlns:v="urn:schemas-microsoft-com:vml" xmlns:wp14="http://schemas.microsoft.com/office/word/2010/wordprocessingDrawing" xmlns:wp="http://schemas.openxmlformats.org/drawingml/2006/wordprocessingDrawing" xmlns:w10="urn:schemas-microsoft-com:office:word" xmlns:w="http://schemas.openxmlformats.org/wordprocessingml/2006/main" xmlns:w14="http://schemas.microsoft.com/office/word/2010/wordml" xmlns:w15="http://schemas.microsoft.com/office/word/2012/wordml" xmlns:w16cex="http://schemas.microsoft.com/office/word/2018/wordml/cex" xmlns:w16cid="http://schemas.microsoft.com/office/word/2016/wordml/cid" xmlns:w16="http://schemas.microsoft.com/office/word/2018/wordml" xmlns:w16du="http://schemas.microsoft.com/office/word/2023/wordml/word16du" xmlns:w16sdtdh="http://schemas.microsoft.com/office/word/2020/wordml/sdtdatahash" xmlns:w16sdtfl="http://schemas.microsoft.com/office/word/2024/wordml/sdtformatlock" xmlns:w16se="http://schemas.microsoft.com/office/word/2015/wordml/symex" xmlns:wpg="http://schemas.microsoft.com/office/word/2010/wordprocessingGroup" xmlns:wpi="http://schemas.microsoft.com/office/word/2010/wordprocessingInk" xmlns:wne="http://schemas.microsoft.com/office/word/2006/wordml" xmlns:wps="http://schemas.microsoft.com/office/word/2010/wordprocessingShape" mc:Ignorable="w14 w15 w16se w16cid w16 w16cex w16sdtdh w16sdtfl w16du wp14">
+<w:endnotes xmlns:wpc="http://schemas.microsoft.com/office/word/2010/wordprocessingCanvas" xmlns:cx="http://schemas.microsoft.com/office/drawing/2014/chartex" xmlns:cx1="http://schemas.microsoft.com/office/drawing/2015/9/8/chartex" xmlns:cx2="http://schemas.microsoft.com/office/drawing/2015/10/21/chartex" xmlns:cx3="http://schemas.microsoft.com/office/drawing/2016/5/9/chartex" xmlns:cx4="http://schemas.microsoft.com/office/drawing/2016/5/10/chartex" xmlns:cx5="http://schemas.microsoft.com/office/drawing/2016/5/11/chartex" xmlns:cx6="http://schemas.microsoft.com/office/drawing/2016/5/12/chartex" xmlns:cx7="http://schemas.microsoft.com/office/drawing/2016/5/13/chartex" xmlns:cx8="http://schemas.microsoft.com/office/drawing/2016/5/14/chartex" xmlns:mc="http://schemas.openxmlformats.org/markup-compatibility/2006" xmlns:aink="http://schemas.microsoft.com/office/drawing/2016/ink" xmlns:am3d="http://schemas.microsoft.com/office/drawing/2017/model3d" xmlns:o="urn:schemas-microsoft-com:office:office" xmlns:oel="http://schemas.microsoft.com/office/2019/extlst" xmlns:r="http://schemas.openxmlformats.org/officeDocument/2006/relationships" xmlns:m="http://schemas.openxmlformats.org/officeDocument/2006/math" xmlns:v="urn:schemas-microsoft-com:vml" xmlns:wp14="http://schemas.microsoft.com/office/word/2010/wordprocessingDrawing" xmlns:wp="http://schemas.openxmlformats.org/drawingml/2006/wordprocessingDrawing" xmlns:w10="urn:schemas-microsoft-com:office:word" xmlns:w="http://schemas.openxmlformats.org/wordprocessingml/2006/main" xmlns:w14="http://schemas.microsoft.com/office/word/2010/wordml" xmlns:w15="http://schemas.microsoft.com/office/word/2012/wordml" xmlns:w16cex="http://schemas.microsoft.com/office/word/2018/wordml/cex" xmlns:w16cid="http://schemas.microsoft.com/office/word/2016/wordml/cid" xmlns:w16="http://schemas.microsoft.com/office/word/2018/wordml" xmlns:w16sdtdh="http://schemas.microsoft.com/office/word/2020/wordml/sdtdatahash" xmlns:w16se="http://schemas.microsoft.com/office/word/2015/wordml/symex" xmlns:wpg="http://schemas.microsoft.com/office/word/2010/wordprocessingGroup" xmlns:wpi="http://schemas.microsoft.com/office/word/2010/wordprocessingInk" xmlns:wne="http://schemas.microsoft.com/office/word/2006/wordml" xmlns:wps="http://schemas.microsoft.com/office/word/2010/wordprocessingShape" mc:Ignorable="w14 w15 w16se w16cid w16 w16cex w16sdtdh wp14">
   <w:endnote w:type="separator" w:id="-1">
     <w:p>
       <w:pPr>
@@ -12755,7 +12879,7 @@
 </file>
 
 <file path=word/footnotes.xml><?xml version="1.0" encoding="utf-8"?>
-<w:footnotes xmlns:wpc="http://schemas.microsoft.com/office/word/2010/wordprocessingCanvas" xmlns:cx="http://schemas.microsoft.com/office/drawing/2014/chartex" xmlns:cx1="http://schemas.microsoft.com/office/drawing/2015/9/8/chartex" xmlns:cx2="http://schemas.microsoft.com/office/drawing/2015/10/21/chartex" xmlns:cx3="http://schemas.microsoft.com/office/drawing/2016/5/9/chartex" xmlns:cx4="http://schemas.microsoft.com/office/drawing/2016/5/10/chartex" xmlns:cx5="http://schemas.microsoft.com/office/drawing/2016/5/11/chartex" xmlns:cx6="http://schemas.microsoft.com/office/drawing/2016/5/12/chartex" xmlns:cx7="http://schemas.microsoft.com/office/drawing/2016/5/13/chartex" xmlns:cx8="http://schemas.microsoft.com/office/drawing/2016/5/14/chartex" xmlns:mc="http://schemas.openxmlformats.org/markup-compatibility/2006" xmlns:aink="http://schemas.microsoft.com/office/drawing/2016/ink" xmlns:am3d="http://schemas.microsoft.com/office/drawing/2017/model3d" xmlns:o="urn:schemas-microsoft-com:office:office" xmlns:oel="http://schemas.microsoft.com/office/2019/extlst" xmlns:r="http://schemas.openxmlformats.org/officeDocument/2006/relationships" xmlns:m="http://schemas.openxmlformats.org/officeDocument/2006/math" xmlns:v="urn:schemas-microsoft-com:vml" xmlns:wp14="http://schemas.microsoft.com/office/word/2010/wordprocessingDrawing" xmlns:wp="http://schemas.openxmlformats.org/drawingml/2006/wordprocessingDrawing" xmlns:w10="urn:schemas-microsoft-com:office:word" xmlns:w="http://schemas.openxmlformats.org/wordprocessingml/2006/main" xmlns:w14="http://schemas.microsoft.com/office/word/2010/wordml" xmlns:w15="http://schemas.microsoft.com/office/word/2012/wordml" xmlns:w16cex="http://schemas.microsoft.com/office/word/2018/wordml/cex" xmlns:w16cid="http://schemas.microsoft.com/office/word/2016/wordml/cid" xmlns:w16="http://schemas.microsoft.com/office/word/2018/wordml" xmlns:w16du="http://schemas.microsoft.com/office/word/2023/wordml/word16du" xmlns:w16sdtdh="http://schemas.microsoft.com/office/word/2020/wordml/sdtdatahash" xmlns:w16sdtfl="http://schemas.microsoft.com/office/word/2024/wordml/sdtformatlock" xmlns:w16se="http://schemas.microsoft.com/office/word/2015/wordml/symex" xmlns:wpg="http://schemas.microsoft.com/office/word/2010/wordprocessingGroup" xmlns:wpi="http://schemas.microsoft.com/office/word/2010/wordprocessingInk" xmlns:wne="http://schemas.microsoft.com/office/word/2006/wordml" xmlns:wps="http://schemas.microsoft.com/office/word/2010/wordprocessingShape" mc:Ignorable="w14 w15 w16se w16cid w16 w16cex w16sdtdh w16sdtfl w16du wp14">
+<w:footnotes xmlns:wpc="http://schemas.microsoft.com/office/word/2010/wordprocessingCanvas" xmlns:cx="http://schemas.microsoft.com/office/drawing/2014/chartex" xmlns:cx1="http://schemas.microsoft.com/office/drawing/2015/9/8/chartex" xmlns:cx2="http://schemas.microsoft.com/office/drawing/2015/10/21/chartex" xmlns:cx3="http://schemas.microsoft.com/office/drawing/2016/5/9/chartex" xmlns:cx4="http://schemas.microsoft.com/office/drawing/2016/5/10/chartex" xmlns:cx5="http://schemas.microsoft.com/office/drawing/2016/5/11/chartex" xmlns:cx6="http://schemas.microsoft.com/office/drawing/2016/5/12/chartex" xmlns:cx7="http://schemas.microsoft.com/office/drawing/2016/5/13/chartex" xmlns:cx8="http://schemas.microsoft.com/office/drawing/2016/5/14/chartex" xmlns:mc="http://schemas.openxmlformats.org/markup-compatibility/2006" xmlns:aink="http://schemas.microsoft.com/office/drawing/2016/ink" xmlns:am3d="http://schemas.microsoft.com/office/drawing/2017/model3d" xmlns:o="urn:schemas-microsoft-com:office:office" xmlns:oel="http://schemas.microsoft.com/office/2019/extlst" xmlns:r="http://schemas.openxmlformats.org/officeDocument/2006/relationships" xmlns:m="http://schemas.openxmlformats.org/officeDocument/2006/math" xmlns:v="urn:schemas-microsoft-com:vml" xmlns:wp14="http://schemas.microsoft.com/office/word/2010/wordprocessingDrawing" xmlns:wp="http://schemas.openxmlformats.org/drawingml/2006/wordprocessingDrawing" xmlns:w10="urn:schemas-microsoft-com:office:word" xmlns:w="http://schemas.openxmlformats.org/wordprocessingml/2006/main" xmlns:w14="http://schemas.microsoft.com/office/word/2010/wordml" xmlns:w15="http://schemas.microsoft.com/office/word/2012/wordml" xmlns:w16cex="http://schemas.microsoft.com/office/word/2018/wordml/cex" xmlns:w16cid="http://schemas.microsoft.com/office/word/2016/wordml/cid" xmlns:w16="http://schemas.microsoft.com/office/word/2018/wordml" xmlns:w16sdtdh="http://schemas.microsoft.com/office/word/2020/wordml/sdtdatahash" xmlns:w16se="http://schemas.microsoft.com/office/word/2015/wordml/symex" xmlns:wpg="http://schemas.microsoft.com/office/word/2010/wordprocessingGroup" xmlns:wpi="http://schemas.microsoft.com/office/word/2010/wordprocessingInk" xmlns:wne="http://schemas.microsoft.com/office/word/2006/wordml" xmlns:wps="http://schemas.microsoft.com/office/word/2010/wordprocessingShape" mc:Ignorable="w14 w15 w16se w16cid w16 w16cex w16sdtdh wp14">
   <w:footnote w:type="separator" w:id="-1">
     <w:p>
       <w:pPr>
@@ -12780,7 +12904,7 @@
 </file>
 
 <file path=word/numbering.xml><?xml version="1.0" encoding="utf-8"?>
-<w:numbering xmlns:wpc="http://schemas.microsoft.com/office/word/2010/wordprocessingCanvas" xmlns:cx="http://schemas.microsoft.com/office/drawing/2014/chartex" xmlns:cx1="http://schemas.microsoft.com/office/drawing/2015/9/8/chartex" xmlns:cx2="http://schemas.microsoft.com/office/drawing/2015/10/21/chartex" xmlns:cx3="http://schemas.microsoft.com/office/drawing/2016/5/9/chartex" xmlns:cx4="http://schemas.microsoft.com/office/drawing/2016/5/10/chartex" xmlns:cx5="http://schemas.microsoft.com/office/drawing/2016/5/11/chartex" xmlns:cx6="http://schemas.microsoft.com/office/drawing/2016/5/12/chartex" xmlns:cx7="http://schemas.microsoft.com/office/drawing/2016/5/13/chartex" xmlns:cx8="http://schemas.microsoft.com/office/drawing/2016/5/14/chartex" xmlns:mc="http://schemas.openxmlformats.org/markup-compatibility/2006" xmlns:aink="http://schemas.microsoft.com/office/drawing/2016/ink" xmlns:am3d="http://schemas.microsoft.com/office/drawing/2017/model3d" xmlns:o="urn:schemas-microsoft-com:office:office" xmlns:oel="http://schemas.microsoft.com/office/2019/extlst" xmlns:r="http://schemas.openxmlformats.org/officeDocument/2006/relationships" xmlns:m="http://schemas.openxmlformats.org/officeDocument/2006/math" xmlns:v="urn:schemas-microsoft-com:vml" xmlns:wp14="http://schemas.microsoft.com/office/word/2010/wordprocessingDrawing" xmlns:wp="http://schemas.openxmlformats.org/drawingml/2006/wordprocessingDrawing" xmlns:w10="urn:schemas-microsoft-com:office:word" xmlns:w="http://schemas.openxmlformats.org/wordprocessingml/2006/main" xmlns:w14="http://schemas.microsoft.com/office/word/2010/wordml" xmlns:w15="http://schemas.microsoft.com/office/word/2012/wordml" xmlns:w16cex="http://schemas.microsoft.com/office/word/2018/wordml/cex" xmlns:w16cid="http://schemas.microsoft.com/office/word/2016/wordml/cid" xmlns:w16="http://schemas.microsoft.com/office/word/2018/wordml" xmlns:w16du="http://schemas.microsoft.com/office/word/2023/wordml/word16du" xmlns:w16sdtdh="http://schemas.microsoft.com/office/word/2020/wordml/sdtdatahash" xmlns:w16sdtfl="http://schemas.microsoft.com/office/word/2024/wordml/sdtformatlock" xmlns:w16se="http://schemas.microsoft.com/office/word/2015/wordml/symex" xmlns:wpg="http://schemas.microsoft.com/office/word/2010/wordprocessingGroup" xmlns:wpi="http://schemas.microsoft.com/office/word/2010/wordprocessingInk" xmlns:wne="http://schemas.microsoft.com/office/word/2006/wordml" xmlns:wps="http://schemas.microsoft.com/office/word/2010/wordprocessingShape" mc:Ignorable="w14 w15 w16se w16cid w16 w16cex w16sdtdh w16sdtfl w16du wp14">
+<w:numbering xmlns:wpc="http://schemas.microsoft.com/office/word/2010/wordprocessingCanvas" xmlns:cx="http://schemas.microsoft.com/office/drawing/2014/chartex" xmlns:cx1="http://schemas.microsoft.com/office/drawing/2015/9/8/chartex" xmlns:cx2="http://schemas.microsoft.com/office/drawing/2015/10/21/chartex" xmlns:cx3="http://schemas.microsoft.com/office/drawing/2016/5/9/chartex" xmlns:cx4="http://schemas.microsoft.com/office/drawing/2016/5/10/chartex" xmlns:cx5="http://schemas.microsoft.com/office/drawing/2016/5/11/chartex" xmlns:cx6="http://schemas.microsoft.com/office/drawing/2016/5/12/chartex" xmlns:cx7="http://schemas.microsoft.com/office/drawing/2016/5/13/chartex" xmlns:cx8="http://schemas.microsoft.com/office/drawing/2016/5/14/chartex" xmlns:mc="http://schemas.openxmlformats.org/markup-compatibility/2006" xmlns:aink="http://schemas.microsoft.com/office/drawing/2016/ink" xmlns:am3d="http://schemas.microsoft.com/office/drawing/2017/model3d" xmlns:o="urn:schemas-microsoft-com:office:office" xmlns:oel="http://schemas.microsoft.com/office/2019/extlst" xmlns:r="http://schemas.openxmlformats.org/officeDocument/2006/relationships" xmlns:m="http://schemas.openxmlformats.org/officeDocument/2006/math" xmlns:v="urn:schemas-microsoft-com:vml" xmlns:wp14="http://schemas.microsoft.com/office/word/2010/wordprocessingDrawing" xmlns:wp="http://schemas.openxmlformats.org/drawingml/2006/wordprocessingDrawing" xmlns:w10="urn:schemas-microsoft-com:office:word" xmlns:w="http://schemas.openxmlformats.org/wordprocessingml/2006/main" xmlns:w14="http://schemas.microsoft.com/office/word/2010/wordml" xmlns:w15="http://schemas.microsoft.com/office/word/2012/wordml" xmlns:w16cex="http://schemas.microsoft.com/office/word/2018/wordml/cex" xmlns:w16cid="http://schemas.microsoft.com/office/word/2016/wordml/cid" xmlns:w16="http://schemas.microsoft.com/office/word/2018/wordml" xmlns:w16sdtdh="http://schemas.microsoft.com/office/word/2020/wordml/sdtdatahash" xmlns:w16se="http://schemas.microsoft.com/office/word/2015/wordml/symex" xmlns:wpg="http://schemas.microsoft.com/office/word/2010/wordprocessingGroup" xmlns:wpi="http://schemas.microsoft.com/office/word/2010/wordprocessingInk" xmlns:wne="http://schemas.microsoft.com/office/word/2006/wordml" xmlns:wps="http://schemas.microsoft.com/office/word/2010/wordprocessingShape" mc:Ignorable="w14 w15 w16se w16cid w16 w16cex w16sdtdh wp14">
   <w:abstractNum w:abstractNumId="0" w15:restartNumberingAfterBreak="0">
     <w:nsid w:val="0BA862C0"/>
     <w:multiLevelType w:val="hybridMultilevel"/>
@@ -14235,7 +14359,7 @@
 </file>
 
 <file path=word/styles.xml><?xml version="1.0" encoding="utf-8"?>
-<w:styles xmlns:mc="http://schemas.openxmlformats.org/markup-compatibility/2006" xmlns:r="http://schemas.openxmlformats.org/officeDocument/2006/relationships" xmlns:w="http://schemas.openxmlformats.org/wordprocessingml/2006/main" xmlns:w14="http://schemas.microsoft.com/office/word/2010/wordml" xmlns:w15="http://schemas.microsoft.com/office/word/2012/wordml" xmlns:w16cex="http://schemas.microsoft.com/office/word/2018/wordml/cex" xmlns:w16cid="http://schemas.microsoft.com/office/word/2016/wordml/cid" xmlns:w16="http://schemas.microsoft.com/office/word/2018/wordml" xmlns:w16du="http://schemas.microsoft.com/office/word/2023/wordml/word16du" xmlns:w16sdtdh="http://schemas.microsoft.com/office/word/2020/wordml/sdtdatahash" xmlns:w16sdtfl="http://schemas.microsoft.com/office/word/2024/wordml/sdtformatlock" xmlns:w16se="http://schemas.microsoft.com/office/word/2015/wordml/symex" mc:Ignorable="w14 w15 w16se w16cid w16 w16cex w16sdtdh w16sdtfl w16du">
+<w:styles xmlns:mc="http://schemas.openxmlformats.org/markup-compatibility/2006" xmlns:r="http://schemas.openxmlformats.org/officeDocument/2006/relationships" xmlns:w="http://schemas.openxmlformats.org/wordprocessingml/2006/main" xmlns:w14="http://schemas.microsoft.com/office/word/2010/wordml" xmlns:w15="http://schemas.microsoft.com/office/word/2012/wordml" xmlns:w16cex="http://schemas.microsoft.com/office/word/2018/wordml/cex" xmlns:w16cid="http://schemas.microsoft.com/office/word/2016/wordml/cid" xmlns:w16="http://schemas.microsoft.com/office/word/2018/wordml" xmlns:w16sdtdh="http://schemas.microsoft.com/office/word/2020/wordml/sdtdatahash" xmlns:w16se="http://schemas.microsoft.com/office/word/2015/wordml/symex" mc:Ignorable="w14 w15 w16se w16cid w16 w16cex w16sdtdh">
   <w:docDefaults>
     <w:rPrDefault>
       <w:rPr>
@@ -14837,7 +14961,6 @@
   <w:style w:type="character" w:default="1" w:styleId="a0">
     <w:name w:val="Default Paragraph Font"/>
     <w:uiPriority w:val="1"/>
-    <w:semiHidden/>
     <w:unhideWhenUsed/>
   </w:style>
   <w:style w:type="table" w:default="1" w:styleId="a1">

</xml_diff>

<commit_message>
doc: add `Design Class Model`
</commit_message>
<xml_diff>
--- a/document/hw4.docx
+++ b/document/hw4.docx
@@ -10226,7 +10226,7 @@
           <w:p>
             <w:pPr>
               <w:rPr>
-                <w:rFonts w:ascii="Times New Roman" w:eastAsia="標楷體" w:hAnsi="Times New Roman" w:cs="Times New Roman" w:hint="eastAsia"/>
+                <w:rFonts w:ascii="Times New Roman" w:eastAsia="標楷體" w:hAnsi="Times New Roman" w:cs="Times New Roman"/>
               </w:rPr>
             </w:pPr>
             <w:r>
@@ -10250,7 +10250,7 @@
           <w:p>
             <w:pPr>
               <w:rPr>
-                <w:rFonts w:ascii="Times New Roman" w:eastAsia="標楷體" w:hAnsi="Times New Roman" w:cs="Times New Roman" w:hint="eastAsia"/>
+                <w:rFonts w:ascii="Times New Roman" w:eastAsia="標楷體" w:hAnsi="Times New Roman" w:cs="Times New Roman"/>
               </w:rPr>
             </w:pPr>
             <w:r>
@@ -10292,12 +10292,13 @@
       <w:pPr>
         <w:jc w:val="center"/>
         <w:rPr>
-          <w:rFonts w:ascii="Times New Roman" w:eastAsia="標楷體" w:hAnsi="Times New Roman" w:cs="Times New Roman" w:hint="eastAsia"/>
-        </w:rPr>
-      </w:pPr>
-      <w:r>
-        <w:rPr>
           <w:rFonts w:ascii="Times New Roman" w:eastAsia="標楷體" w:hAnsi="Times New Roman" w:cs="Times New Roman"/>
+        </w:rPr>
+      </w:pPr>
+      <w:r>
+        <w:rPr>
+          <w:rFonts w:ascii="Times New Roman" w:eastAsia="標楷體" w:hAnsi="Times New Roman" w:cs="Times New Roman"/>
+          <w:noProof/>
         </w:rPr>
         <w:drawing>
           <wp:inline distT="0" distB="0" distL="0" distR="0" wp14:anchorId="5AA8504B" wp14:editId="60E92F39">
@@ -10402,11 +10403,11 @@
     <w:p>
       <w:pPr>
         <w:jc w:val="center"/>
-        <w:rPr>
-          <w:rFonts w:hint="eastAsia"/>
-        </w:rPr>
-      </w:pPr>
-      <w:r>
+      </w:pPr>
+      <w:r>
+        <w:rPr>
+          <w:noProof/>
+        </w:rPr>
         <w:drawing>
           <wp:inline distT="0" distB="0" distL="0" distR="0" wp14:anchorId="49A9932D" wp14:editId="16980449">
             <wp:extent cx="4519864" cy="5257800"/>
@@ -12078,10 +12079,150 @@
         <w:rPr>
           <w:rFonts w:hint="eastAsia"/>
         </w:rPr>
+        <w:lastRenderedPageBreak/>
         <w:t>3.3 Design Class Model</w:t>
+      </w:r>
+    </w:p>
+    <w:p>
+      <w:r>
+        <w:drawing>
+          <wp:inline distT="0" distB="0" distL="0" distR="0" wp14:anchorId="6D6A638D" wp14:editId="46B25F1E">
+            <wp:extent cx="4724400" cy="5048250"/>
+            <wp:effectExtent l="0" t="0" r="0" b="0"/>
+            <wp:docPr id="6" name="圖片 6"/>
+            <wp:cNvGraphicFramePr>
+              <a:graphicFrameLocks xmlns:a="http://schemas.openxmlformats.org/drawingml/2006/main" noChangeAspect="1"/>
+            </wp:cNvGraphicFramePr>
+            <a:graphic xmlns:a="http://schemas.openxmlformats.org/drawingml/2006/main">
+              <a:graphicData uri="http://schemas.openxmlformats.org/drawingml/2006/picture">
+                <pic:pic xmlns:pic="http://schemas.openxmlformats.org/drawingml/2006/picture">
+                  <pic:nvPicPr>
+                    <pic:cNvPr id="0" name="Picture 13"/>
+                    <pic:cNvPicPr>
+                      <a:picLocks noChangeAspect="1" noChangeArrowheads="1"/>
+                    </pic:cNvPicPr>
+                  </pic:nvPicPr>
+                  <pic:blipFill>
+                    <a:blip r:embed="rId22" cstate="print">
+                      <a:extLst>
+                        <a:ext uri="{28A0092B-C50C-407E-A947-70E740481C1C}">
+                          <a14:useLocalDpi xmlns:a14="http://schemas.microsoft.com/office/drawing/2010/main" val="0"/>
+                        </a:ext>
+                      </a:extLst>
+                    </a:blip>
+                    <a:srcRect/>
+                    <a:stretch>
+                      <a:fillRect/>
+                    </a:stretch>
+                  </pic:blipFill>
+                  <pic:spPr bwMode="auto">
+                    <a:xfrm>
+                      <a:off x="0" y="0"/>
+                      <a:ext cx="4724400" cy="5048250"/>
+                    </a:xfrm>
+                    <a:prstGeom prst="rect">
+                      <a:avLst/>
+                    </a:prstGeom>
+                    <a:noFill/>
+                    <a:ln>
+                      <a:noFill/>
+                    </a:ln>
+                  </pic:spPr>
+                </pic:pic>
+              </a:graphicData>
+            </a:graphic>
+          </wp:inline>
+        </w:drawing>
       </w:r>
     </w:p>
     <w:p/>
+    <w:p>
+      <w:pPr>
+        <w:jc w:val="center"/>
+        <w:rPr>
+          <w:rFonts w:hint="eastAsia"/>
+        </w:rPr>
+      </w:pPr>
+      <w:r>
+        <w:rPr>
+          <w:rFonts w:ascii="Times New Roman" w:eastAsia="標楷體" w:hAnsi="Times New Roman" w:cs="Times New Roman" w:hint="eastAsia"/>
+          <w:b/>
+          <w:bCs/>
+          <w:i/>
+          <w:iCs/>
+          <w:sz w:val="22"/>
+          <w:szCs w:val="22"/>
+        </w:rPr>
+        <w:t xml:space="preserve">Figure </w:t>
+      </w:r>
+      <w:r>
+        <w:rPr>
+          <w:rFonts w:ascii="Times New Roman" w:eastAsia="標楷體" w:hAnsi="Times New Roman" w:cs="Times New Roman" w:hint="eastAsia"/>
+          <w:b/>
+          <w:bCs/>
+          <w:i/>
+          <w:iCs/>
+          <w:sz w:val="22"/>
+          <w:szCs w:val="22"/>
+        </w:rPr>
+        <w:t>3</w:t>
+      </w:r>
+      <w:r>
+        <w:rPr>
+          <w:rFonts w:ascii="Times New Roman" w:eastAsia="標楷體" w:hAnsi="Times New Roman" w:cs="Times New Roman" w:hint="eastAsia"/>
+          <w:b/>
+          <w:bCs/>
+          <w:i/>
+          <w:iCs/>
+          <w:sz w:val="22"/>
+          <w:szCs w:val="22"/>
+        </w:rPr>
+        <w:t>-</w:t>
+      </w:r>
+      <w:r>
+        <w:rPr>
+          <w:rFonts w:ascii="Times New Roman" w:eastAsia="標楷體" w:hAnsi="Times New Roman" w:cs="Times New Roman" w:hint="eastAsia"/>
+          <w:b/>
+          <w:bCs/>
+          <w:i/>
+          <w:iCs/>
+          <w:sz w:val="22"/>
+          <w:szCs w:val="22"/>
+        </w:rPr>
+        <w:t>12</w:t>
+      </w:r>
+      <w:r>
+        <w:rPr>
+          <w:rFonts w:ascii="Times New Roman" w:eastAsia="標楷體" w:hAnsi="Times New Roman" w:cs="Times New Roman" w:hint="eastAsia"/>
+          <w:b/>
+          <w:bCs/>
+          <w:i/>
+          <w:iCs/>
+          <w:sz w:val="22"/>
+          <w:szCs w:val="22"/>
+        </w:rPr>
+        <w:t xml:space="preserve"> </w:t>
+      </w:r>
+      <w:r>
+        <w:rPr>
+          <w:rFonts w:ascii="Times New Roman" w:eastAsia="標楷體" w:hAnsi="Times New Roman" w:cs="Times New Roman" w:hint="eastAsia"/>
+          <w:b/>
+          <w:bCs/>
+          <w:i/>
+          <w:iCs/>
+          <w:sz w:val="22"/>
+          <w:szCs w:val="22"/>
+        </w:rPr>
+        <w:t>Design Class Model</w:t>
+      </w:r>
+    </w:p>
+    <w:p>
+      <w:pPr>
+        <w:rPr>
+          <w:rFonts w:hint="eastAsia"/>
+        </w:rPr>
+      </w:pPr>
+    </w:p>
     <w:p>
       <w:pPr>
         <w:pStyle w:val="1"/>
@@ -12165,6 +12306,12 @@
               </w:rPr>
               <w:t>Total Hour</w:t>
             </w:r>
+            <w:r>
+              <w:rPr>
+                <w:rFonts w:ascii="Times New Roman" w:eastAsia="標楷體" w:hAnsi="Times New Roman" w:cs="Times New Roman" w:hint="eastAsia"/>
+              </w:rPr>
+              <w:t>s</w:t>
+            </w:r>
           </w:p>
         </w:tc>
       </w:tr>
@@ -12236,9 +12383,15 @@
           <w:p>
             <w:pPr>
               <w:rPr>
-                <w:rFonts w:ascii="Times New Roman" w:eastAsia="標楷體" w:hAnsi="Times New Roman" w:cs="Times New Roman"/>
-              </w:rPr>
-            </w:pPr>
+                <w:rFonts w:ascii="Times New Roman" w:eastAsia="標楷體" w:hAnsi="Times New Roman" w:cs="Times New Roman" w:hint="eastAsia"/>
+              </w:rPr>
+            </w:pPr>
+            <w:r>
+              <w:rPr>
+                <w:rFonts w:ascii="Times New Roman" w:eastAsia="標楷體" w:hAnsi="Times New Roman" w:cs="Times New Roman" w:hint="eastAsia"/>
+              </w:rPr>
+              <w:t>27.44h</w:t>
+            </w:r>
           </w:p>
         </w:tc>
       </w:tr>
@@ -12719,7 +12872,6 @@
               <w:rPr>
                 <w:rFonts w:ascii="Times New Roman" w:eastAsia="標楷體" w:hAnsi="Times New Roman" w:cs="Times New Roman" w:hint="eastAsia"/>
               </w:rPr>
-              <w:lastRenderedPageBreak/>
               <w:t>HW#4</w:t>
             </w:r>
           </w:p>
@@ -12745,13 +12897,20 @@
         <w:tc>
           <w:tcPr>
             <w:tcW w:w="1350" w:type="dxa"/>
-          </w:tcPr>
-          <w:p>
-            <w:pPr>
-              <w:rPr>
-                <w:rFonts w:ascii="Times New Roman" w:eastAsia="標楷體" w:hAnsi="Times New Roman" w:cs="Times New Roman"/>
-              </w:rPr>
-            </w:pPr>
+            <w:vMerge w:val="restart"/>
+          </w:tcPr>
+          <w:p>
+            <w:pPr>
+              <w:rPr>
+                <w:rFonts w:ascii="Times New Roman" w:eastAsia="標楷體" w:hAnsi="Times New Roman" w:cs="Times New Roman" w:hint="eastAsia"/>
+              </w:rPr>
+            </w:pPr>
+            <w:r>
+              <w:rPr>
+                <w:rFonts w:ascii="Times New Roman" w:eastAsia="標楷體" w:hAnsi="Times New Roman" w:cs="Times New Roman" w:hint="eastAsia"/>
+              </w:rPr>
+              <w:t>10.5h</w:t>
+            </w:r>
           </w:p>
         </w:tc>
         <w:tc>
@@ -12806,6 +12965,7 @@
         <w:tc>
           <w:tcPr>
             <w:tcW w:w="1350" w:type="dxa"/>
+            <w:vMerge/>
           </w:tcPr>
           <w:p>
             <w:pPr>
@@ -12818,6 +12978,131 @@
         <w:tc>
           <w:tcPr>
             <w:tcW w:w="1189" w:type="dxa"/>
+            <w:vMerge/>
+          </w:tcPr>
+          <w:p>
+            <w:pPr>
+              <w:rPr>
+                <w:rFonts w:ascii="Times New Roman" w:eastAsia="標楷體" w:hAnsi="Times New Roman" w:cs="Times New Roman"/>
+              </w:rPr>
+            </w:pPr>
+          </w:p>
+        </w:tc>
+      </w:tr>
+      <w:tr>
+        <w:trPr>
+          <w:trHeight w:val="336"/>
+        </w:trPr>
+        <w:tc>
+          <w:tcPr>
+            <w:tcW w:w="1877" w:type="dxa"/>
+            <w:vMerge/>
+          </w:tcPr>
+          <w:p>
+            <w:pPr>
+              <w:rPr>
+                <w:rFonts w:ascii="Times New Roman" w:eastAsia="標楷體" w:hAnsi="Times New Roman" w:cs="Times New Roman"/>
+              </w:rPr>
+            </w:pPr>
+          </w:p>
+        </w:tc>
+        <w:tc>
+          <w:tcPr>
+            <w:tcW w:w="3829" w:type="dxa"/>
+          </w:tcPr>
+          <w:p>
+            <w:pPr>
+              <w:rPr>
+                <w:rFonts w:ascii="Times New Roman" w:eastAsia="標楷體" w:hAnsi="Times New Roman" w:cs="Times New Roman" w:hint="eastAsia"/>
+              </w:rPr>
+            </w:pPr>
+            <w:r>
+              <w:rPr>
+                <w:rFonts w:ascii="Times New Roman" w:eastAsia="標楷體" w:hAnsi="Times New Roman" w:cs="Times New Roman" w:hint="eastAsia"/>
+              </w:rPr>
+              <w:t>26/04/20 22:00~22:30</w:t>
+            </w:r>
+          </w:p>
+        </w:tc>
+        <w:tc>
+          <w:tcPr>
+            <w:tcW w:w="1350" w:type="dxa"/>
+            <w:vMerge/>
+          </w:tcPr>
+          <w:p>
+            <w:pPr>
+              <w:rPr>
+                <w:rFonts w:ascii="Times New Roman" w:eastAsia="標楷體" w:hAnsi="Times New Roman" w:cs="Times New Roman"/>
+              </w:rPr>
+            </w:pPr>
+          </w:p>
+        </w:tc>
+        <w:tc>
+          <w:tcPr>
+            <w:tcW w:w="1189" w:type="dxa"/>
+            <w:vMerge/>
+          </w:tcPr>
+          <w:p>
+            <w:pPr>
+              <w:rPr>
+                <w:rFonts w:ascii="Times New Roman" w:eastAsia="標楷體" w:hAnsi="Times New Roman" w:cs="Times New Roman"/>
+              </w:rPr>
+            </w:pPr>
+          </w:p>
+        </w:tc>
+      </w:tr>
+      <w:tr>
+        <w:trPr>
+          <w:trHeight w:val="336"/>
+        </w:trPr>
+        <w:tc>
+          <w:tcPr>
+            <w:tcW w:w="1877" w:type="dxa"/>
+            <w:vMerge/>
+          </w:tcPr>
+          <w:p>
+            <w:pPr>
+              <w:rPr>
+                <w:rFonts w:ascii="Times New Roman" w:eastAsia="標楷體" w:hAnsi="Times New Roman" w:cs="Times New Roman"/>
+              </w:rPr>
+            </w:pPr>
+          </w:p>
+        </w:tc>
+        <w:tc>
+          <w:tcPr>
+            <w:tcW w:w="3829" w:type="dxa"/>
+          </w:tcPr>
+          <w:p>
+            <w:pPr>
+              <w:rPr>
+                <w:rFonts w:ascii="Times New Roman" w:eastAsia="標楷體" w:hAnsi="Times New Roman" w:cs="Times New Roman" w:hint="eastAsia"/>
+              </w:rPr>
+            </w:pPr>
+            <w:r>
+              <w:rPr>
+                <w:rFonts w:ascii="Times New Roman" w:eastAsia="標楷體" w:hAnsi="Times New Roman" w:cs="Times New Roman" w:hint="eastAsia"/>
+              </w:rPr>
+              <w:t>26/04/22 16:00~18:15</w:t>
+            </w:r>
+          </w:p>
+        </w:tc>
+        <w:tc>
+          <w:tcPr>
+            <w:tcW w:w="1350" w:type="dxa"/>
+            <w:vMerge/>
+          </w:tcPr>
+          <w:p>
+            <w:pPr>
+              <w:rPr>
+                <w:rFonts w:ascii="Times New Roman" w:eastAsia="標楷體" w:hAnsi="Times New Roman" w:cs="Times New Roman"/>
+              </w:rPr>
+            </w:pPr>
+          </w:p>
+        </w:tc>
+        <w:tc>
+          <w:tcPr>
+            <w:tcW w:w="1189" w:type="dxa"/>
+            <w:vMerge/>
           </w:tcPr>
           <w:p>
             <w:pPr>
@@ -14758,7 +15043,7 @@
   <w:style w:type="paragraph" w:default="1" w:styleId="a">
     <w:name w:val="Normal"/>
     <w:qFormat/>
-    <w:rsid w:val="005C4F1C"/>
+    <w:rsid w:val="0048387E"/>
     <w:pPr>
       <w:widowControl w:val="0"/>
     </w:pPr>

</xml_diff>

<commit_message>
doc: add hw4 `Change History` and hw5 document
</commit_message>
<xml_diff>
--- a/document/hw4.docx
+++ b/document/hw4.docx
@@ -689,6 +689,92 @@
           </w:p>
         </w:tc>
       </w:tr>
+      <w:tr>
+        <w:tc>
+          <w:tcPr>
+            <w:tcW w:w="990" w:type="dxa"/>
+          </w:tcPr>
+          <w:p>
+            <w:pPr>
+              <w:rPr>
+                <w:rFonts w:ascii="Times New Roman" w:hAnsi="Times New Roman" w:cs="Times New Roman" w:hint="eastAsia"/>
+              </w:rPr>
+            </w:pPr>
+            <w:r>
+              <w:rPr>
+                <w:rFonts w:ascii="Times New Roman" w:hAnsi="Times New Roman" w:cs="Times New Roman" w:hint="eastAsia"/>
+              </w:rPr>
+              <w:t>5</w:t>
+            </w:r>
+          </w:p>
+        </w:tc>
+        <w:tc>
+          <w:tcPr>
+            <w:tcW w:w="5384" w:type="dxa"/>
+          </w:tcPr>
+          <w:p>
+            <w:pPr>
+              <w:rPr>
+                <w:rFonts w:ascii="Times New Roman" w:hAnsi="Times New Roman" w:cs="Times New Roman" w:hint="eastAsia"/>
+              </w:rPr>
+            </w:pPr>
+            <w:r>
+              <w:rPr>
+                <w:rFonts w:ascii="Times New Roman" w:hAnsi="Times New Roman" w:cs="Times New Roman"/>
+              </w:rPr>
+              <w:t>Logical Architecture</w:t>
+            </w:r>
+            <w:r>
+              <w:rPr>
+                <w:rFonts w:ascii="Times New Roman" w:hAnsi="Times New Roman" w:cs="Times New Roman" w:hint="eastAsia"/>
+              </w:rPr>
+              <w:t xml:space="preserve">, </w:t>
+            </w:r>
+            <w:r>
+              <w:rPr>
+                <w:rFonts w:ascii="Times New Roman" w:hAnsi="Times New Roman" w:cs="Times New Roman"/>
+              </w:rPr>
+              <w:t>Sequence Diagram</w:t>
+            </w:r>
+            <w:r>
+              <w:rPr>
+                <w:rFonts w:ascii="Times New Roman" w:hAnsi="Times New Roman" w:cs="Times New Roman" w:hint="eastAsia"/>
+              </w:rPr>
+              <w:t xml:space="preserve">, </w:t>
+            </w:r>
+            <w:r>
+              <w:rPr>
+                <w:rFonts w:ascii="Times New Roman" w:hAnsi="Times New Roman" w:cs="Times New Roman"/>
+              </w:rPr>
+              <w:t>Design Class Model</w:t>
+            </w:r>
+          </w:p>
+        </w:tc>
+        <w:tc>
+          <w:tcPr>
+            <w:tcW w:w="1922" w:type="dxa"/>
+          </w:tcPr>
+          <w:p>
+            <w:pPr>
+              <w:rPr>
+                <w:rFonts w:ascii="Times New Roman" w:hAnsi="Times New Roman" w:cs="Times New Roman" w:hint="eastAsia"/>
+              </w:rPr>
+            </w:pPr>
+            <w:r>
+              <w:rPr>
+                <w:rFonts w:ascii="Times New Roman" w:eastAsia="標楷體" w:hAnsi="Times New Roman" w:cs="Times New Roman" w:hint="eastAsia"/>
+              </w:rPr>
+              <w:t>20</w:t>
+            </w:r>
+            <w:r>
+              <w:rPr>
+                <w:rFonts w:ascii="Times New Roman" w:eastAsia="標楷體" w:hAnsi="Times New Roman" w:cs="Times New Roman" w:hint="eastAsia"/>
+              </w:rPr>
+              <w:t>26/04/22</w:t>
+            </w:r>
+          </w:p>
+        </w:tc>
+      </w:tr>
     </w:tbl>
     <w:p/>
     <w:p>
@@ -957,6 +1043,7 @@
               <w:rPr>
                 <w:rFonts w:ascii="Times New Roman" w:eastAsia="標楷體" w:hAnsi="Times New Roman" w:cs="Times New Roman" w:hint="eastAsia"/>
               </w:rPr>
+              <w:lastRenderedPageBreak/>
               <w:t>FEA-02</w:t>
             </w:r>
           </w:p>
@@ -1033,7 +1120,6 @@
               <w:rPr>
                 <w:rFonts w:ascii="Times New Roman" w:eastAsia="標楷體" w:hAnsi="Times New Roman" w:cs="Times New Roman" w:hint="eastAsia"/>
               </w:rPr>
-              <w:lastRenderedPageBreak/>
               <w:t>FEA-04</w:t>
             </w:r>
           </w:p>
@@ -1433,6 +1519,7 @@
               <w:rPr>
                 <w:rFonts w:ascii="Times New Roman" w:eastAsia="標楷體" w:hAnsi="Times New Roman" w:cs="Times New Roman" w:hint="eastAsia"/>
               </w:rPr>
+              <w:lastRenderedPageBreak/>
               <w:t>Primary Actor</w:t>
             </w:r>
           </w:p>
@@ -1507,14 +1594,7 @@
               <w:rPr>
                 <w:rFonts w:ascii="Times New Roman" w:eastAsia="標楷體" w:hAnsi="Times New Roman" w:cs="Times New Roman" w:hint="eastAsia"/>
               </w:rPr>
-              <w:t>書籍與</w:t>
-            </w:r>
-            <w:r>
-              <w:rPr>
-                <w:rFonts w:ascii="Times New Roman" w:eastAsia="標楷體" w:hAnsi="Times New Roman" w:cs="Times New Roman" w:hint="eastAsia"/>
-              </w:rPr>
-              <w:lastRenderedPageBreak/>
-              <w:t>編輯其資訊</w:t>
+              <w:t>書籍與編輯其資訊</w:t>
             </w:r>
             <w:r>
               <w:rPr>
@@ -1571,7 +1651,6 @@
               <w:rPr>
                 <w:rFonts w:ascii="Times New Roman" w:eastAsia="標楷體" w:hAnsi="Times New Roman" w:cs="Times New Roman" w:hint="eastAsia"/>
               </w:rPr>
-              <w:lastRenderedPageBreak/>
               <w:t>Preconditions</w:t>
             </w:r>
           </w:p>
@@ -2393,6 +2472,7 @@
               <w:rPr>
                 <w:rFonts w:ascii="Times New Roman" w:eastAsia="標楷體" w:hAnsi="Times New Roman" w:cs="Times New Roman" w:hint="eastAsia"/>
               </w:rPr>
+              <w:lastRenderedPageBreak/>
               <w:t>Miscellaneous</w:t>
             </w:r>
           </w:p>
@@ -3233,6 +3313,7 @@
         <w:rPr>
           <w:rFonts w:hint="eastAsia"/>
         </w:rPr>
+        <w:lastRenderedPageBreak/>
         <w:t xml:space="preserve">1.5.3 </w:t>
       </w:r>
       <w:r>
@@ -3305,7 +3386,6 @@
               <w:rPr>
                 <w:rFonts w:ascii="Times New Roman" w:eastAsia="標楷體" w:hAnsi="Times New Roman" w:cs="Times New Roman" w:hint="eastAsia"/>
               </w:rPr>
-              <w:lastRenderedPageBreak/>
               <w:t>Scope</w:t>
             </w:r>
           </w:p>
@@ -3921,7 +4001,14 @@
               <w:rPr>
                 <w:rFonts w:ascii="Times New Roman" w:eastAsia="標楷體" w:hAnsi="Times New Roman" w:cs="Times New Roman"/>
               </w:rPr>
-              <w:t>訂單生成與書籍狀態切換必須具備資料庫的原子性（</w:t>
+              <w:t>訂單生成與書籍狀態切換必須具備資</w:t>
+            </w:r>
+            <w:r>
+              <w:rPr>
+                <w:rFonts w:ascii="Times New Roman" w:eastAsia="標楷體" w:hAnsi="Times New Roman" w:cs="Times New Roman"/>
+              </w:rPr>
+              <w:lastRenderedPageBreak/>
+              <w:t>料庫的原子性（</w:t>
             </w:r>
             <w:r>
               <w:rPr>
@@ -3953,6 +4040,7 @@
               <w:rPr>
                 <w:rFonts w:ascii="Times New Roman" w:eastAsia="標楷體" w:hAnsi="Times New Roman" w:cs="Times New Roman" w:hint="eastAsia"/>
               </w:rPr>
+              <w:lastRenderedPageBreak/>
               <w:t>Technology and Data Variations List</w:t>
             </w:r>
           </w:p>
@@ -3991,7 +4079,6 @@
               <w:rPr>
                 <w:rFonts w:ascii="Times New Roman" w:eastAsia="標楷體" w:hAnsi="Times New Roman" w:cs="Times New Roman" w:hint="eastAsia"/>
               </w:rPr>
-              <w:lastRenderedPageBreak/>
               <w:t>Frequency of Occurrence</w:t>
             </w:r>
           </w:p>
@@ -4918,6 +5005,7 @@
               <w:rPr>
                 <w:rFonts w:ascii="Times New Roman" w:eastAsia="標楷體" w:hAnsi="Times New Roman" w:cs="Times New Roman" w:hint="eastAsia"/>
               </w:rPr>
+              <w:lastRenderedPageBreak/>
               <w:t>Frequency of Occurrence</w:t>
             </w:r>
           </w:p>
@@ -5001,7 +5089,6 @@
         <w:rPr>
           <w:rFonts w:hint="eastAsia"/>
         </w:rPr>
-        <w:lastRenderedPageBreak/>
         <w:t>1.5.</w:t>
       </w:r>
       <w:r>
@@ -5953,7 +6040,14 @@
               <w:rPr>
                 <w:rFonts w:ascii="Times New Roman" w:eastAsia="標楷體" w:hAnsi="Times New Roman" w:cs="Times New Roman" w:hint="eastAsia"/>
               </w:rPr>
-              <w:t>批次移動失敗：若系統在處理大量</w:t>
+              <w:t>批次移動失敗：若系統在處理大</w:t>
+            </w:r>
+            <w:r>
+              <w:rPr>
+                <w:rFonts w:ascii="Times New Roman" w:eastAsia="標楷體" w:hAnsi="Times New Roman" w:cs="Times New Roman" w:hint="eastAsia"/>
+              </w:rPr>
+              <w:lastRenderedPageBreak/>
+              <w:t>量</w:t>
             </w:r>
             <w:r>
               <w:rPr>
@@ -5985,6 +6079,7 @@
               <w:rPr>
                 <w:rFonts w:ascii="Times New Roman" w:eastAsia="標楷體" w:hAnsi="Times New Roman" w:cs="Times New Roman" w:hint="eastAsia"/>
               </w:rPr>
+              <w:lastRenderedPageBreak/>
               <w:t>Special Requirements</w:t>
             </w:r>
           </w:p>
@@ -6041,14 +6136,7 @@
               <w:rPr>
                 <w:rFonts w:ascii="Times New Roman" w:eastAsia="標楷體" w:hAnsi="Times New Roman" w:cs="Times New Roman" w:hint="eastAsia"/>
               </w:rPr>
-              <w:t>允許賣家自定義標籤進行彈性的管</w:t>
-            </w:r>
-            <w:r>
-              <w:rPr>
-                <w:rFonts w:ascii="Times New Roman" w:eastAsia="標楷體" w:hAnsi="Times New Roman" w:cs="Times New Roman" w:hint="eastAsia"/>
-              </w:rPr>
-              <w:lastRenderedPageBreak/>
-              <w:t>理。</w:t>
+              <w:t>允許賣家自定義標籤進行彈性的管理。</w:t>
             </w:r>
           </w:p>
         </w:tc>
@@ -6068,7 +6156,6 @@
               <w:rPr>
                 <w:rFonts w:ascii="Times New Roman" w:eastAsia="標楷體" w:hAnsi="Times New Roman" w:cs="Times New Roman" w:hint="eastAsia"/>
               </w:rPr>
-              <w:lastRenderedPageBreak/>
               <w:t>Frequency of Occurrence</w:t>
             </w:r>
           </w:p>
@@ -7152,7 +7239,6 @@
         <w:rPr>
           <w:rFonts w:hint="eastAsia"/>
         </w:rPr>
-        <w:lastRenderedPageBreak/>
         <w:t xml:space="preserve">1.6 </w:t>
       </w:r>
       <w:r>
@@ -8290,6 +8376,7 @@
         <w:rPr>
           <w:rFonts w:hint="eastAsia"/>
         </w:rPr>
+        <w:lastRenderedPageBreak/>
         <w:t xml:space="preserve">1.8 </w:t>
       </w:r>
       <w:r>
@@ -9370,6 +9457,7 @@
         <w:rPr>
           <w:rFonts w:ascii="Times New Roman" w:eastAsia="標楷體" w:hAnsi="Times New Roman" w:cs="Times New Roman" w:hint="eastAsia"/>
         </w:rPr>
+        <w:lastRenderedPageBreak/>
         <w:t xml:space="preserve">ISBN </w:t>
       </w:r>
       <w:r>
@@ -9490,7 +9578,6 @@
         <w:rPr>
           <w:rFonts w:ascii="Times New Roman" w:eastAsia="標楷體" w:hAnsi="Times New Roman" w:cs="Times New Roman" w:hint="eastAsia"/>
         </w:rPr>
-        <w:lastRenderedPageBreak/>
         <w:t>訂單資訊：這只是一堆</w:t>
       </w:r>
       <w:r>
@@ -12085,6 +12172,9 @@
     </w:p>
     <w:p>
       <w:r>
+        <w:rPr>
+          <w:noProof/>
+        </w:rPr>
         <w:drawing>
           <wp:inline distT="0" distB="0" distL="0" distR="0" wp14:anchorId="6D6A638D" wp14:editId="46B25F1E">
             <wp:extent cx="4724400" cy="5048250"/>
@@ -12140,12 +12230,7 @@
       <w:pPr>
         <w:jc w:val="center"/>
         <w:rPr>
-          <w:rFonts w:hint="eastAsia"/>
-        </w:rPr>
-      </w:pPr>
-      <w:r>
-        <w:rPr>
-          <w:rFonts w:ascii="Times New Roman" w:eastAsia="標楷體" w:hAnsi="Times New Roman" w:cs="Times New Roman" w:hint="eastAsia"/>
+          <w:rFonts w:ascii="Times New Roman" w:eastAsia="標楷體" w:hAnsi="Times New Roman" w:cs="Times New Roman"/>
           <w:b/>
           <w:bCs/>
           <w:i/>
@@ -12153,8 +12238,7 @@
           <w:sz w:val="22"/>
           <w:szCs w:val="22"/>
         </w:rPr>
-        <w:t xml:space="preserve">Figure </w:t>
-      </w:r>
+      </w:pPr>
       <w:r>
         <w:rPr>
           <w:rFonts w:ascii="Times New Roman" w:eastAsia="標楷體" w:hAnsi="Times New Roman" w:cs="Times New Roman" w:hint="eastAsia"/>
@@ -12165,7 +12249,7 @@
           <w:sz w:val="22"/>
           <w:szCs w:val="22"/>
         </w:rPr>
-        <w:t>3</w:t>
+        <w:t xml:space="preserve">Figure </w:t>
       </w:r>
       <w:r>
         <w:rPr>
@@ -12177,7 +12261,7 @@
           <w:sz w:val="22"/>
           <w:szCs w:val="22"/>
         </w:rPr>
-        <w:t>-</w:t>
+        <w:t>3</w:t>
       </w:r>
       <w:r>
         <w:rPr>
@@ -12189,7 +12273,7 @@
           <w:sz w:val="22"/>
           <w:szCs w:val="22"/>
         </w:rPr>
-        <w:t>12</w:t>
+        <w:t>-</w:t>
       </w:r>
       <w:r>
         <w:rPr>
@@ -12201,37 +12285,25 @@
           <w:sz w:val="22"/>
           <w:szCs w:val="22"/>
         </w:rPr>
-        <w:t xml:space="preserve"> </w:t>
-      </w:r>
-      <w:r>
-        <w:rPr>
-          <w:rFonts w:ascii="Times New Roman" w:eastAsia="標楷體" w:hAnsi="Times New Roman" w:cs="Times New Roman" w:hint="eastAsia"/>
-          <w:b/>
-          <w:bCs/>
-          <w:i/>
-          <w:iCs/>
-          <w:sz w:val="22"/>
-          <w:szCs w:val="22"/>
-        </w:rPr>
-        <w:t>Design Class Model</w:t>
+        <w:t>12 Design Class Model</w:t>
       </w:r>
     </w:p>
+    <w:p/>
     <w:p>
       <w:pPr>
+        <w:pStyle w:val="1"/>
+      </w:pPr>
+      <w:r>
         <w:rPr>
           <w:rFonts w:hint="eastAsia"/>
         </w:rPr>
-      </w:pPr>
-    </w:p>
-    <w:p>
-      <w:pPr>
-        <w:pStyle w:val="1"/>
-      </w:pPr>
+        <w:t>4</w:t>
+      </w:r>
       <w:r>
         <w:rPr>
           <w:rFonts w:hint="eastAsia"/>
         </w:rPr>
-        <w:t xml:space="preserve">4. </w:t>
+        <w:t xml:space="preserve">. </w:t>
       </w:r>
       <w:r>
         <w:t>Measurement</w:t>
@@ -12383,7 +12455,7 @@
           <w:p>
             <w:pPr>
               <w:rPr>
-                <w:rFonts w:ascii="Times New Roman" w:eastAsia="標楷體" w:hAnsi="Times New Roman" w:cs="Times New Roman" w:hint="eastAsia"/>
+                <w:rFonts w:ascii="Times New Roman" w:eastAsia="標楷體" w:hAnsi="Times New Roman" w:cs="Times New Roman"/>
               </w:rPr>
             </w:pPr>
             <w:r>
@@ -12902,7 +12974,7 @@
           <w:p>
             <w:pPr>
               <w:rPr>
-                <w:rFonts w:ascii="Times New Roman" w:eastAsia="標楷體" w:hAnsi="Times New Roman" w:cs="Times New Roman" w:hint="eastAsia"/>
+                <w:rFonts w:ascii="Times New Roman" w:eastAsia="標楷體" w:hAnsi="Times New Roman" w:cs="Times New Roman"/>
               </w:rPr>
             </w:pPr>
             <w:r>
@@ -13013,7 +13085,7 @@
           <w:p>
             <w:pPr>
               <w:rPr>
-                <w:rFonts w:ascii="Times New Roman" w:eastAsia="標楷體" w:hAnsi="Times New Roman" w:cs="Times New Roman" w:hint="eastAsia"/>
+                <w:rFonts w:ascii="Times New Roman" w:eastAsia="標楷體" w:hAnsi="Times New Roman" w:cs="Times New Roman"/>
               </w:rPr>
             </w:pPr>
             <w:r>
@@ -13075,7 +13147,7 @@
           <w:p>
             <w:pPr>
               <w:rPr>
-                <w:rFonts w:ascii="Times New Roman" w:eastAsia="標楷體" w:hAnsi="Times New Roman" w:cs="Times New Roman" w:hint="eastAsia"/>
+                <w:rFonts w:ascii="Times New Roman" w:eastAsia="標楷體" w:hAnsi="Times New Roman" w:cs="Times New Roman"/>
               </w:rPr>
             </w:pPr>
             <w:r>
@@ -13114,13 +13186,6 @@
         </w:tc>
       </w:tr>
     </w:tbl>
-    <w:p>
-      <w:pPr>
-        <w:rPr>
-          <w:rFonts w:ascii="Times New Roman" w:eastAsia="標楷體" w:hAnsi="Times New Roman" w:cs="Times New Roman"/>
-        </w:rPr>
-      </w:pPr>
-    </w:p>
     <w:p>
       <w:pPr>
         <w:rPr>

</xml_diff>

<commit_message>
doc: fix blurry `Design Class Model`
</commit_message>
<xml_diff>
--- a/document/hw4.docx
+++ b/document/hw4.docx
@@ -83,8 +83,6 @@
           <w:szCs w:val="52"/>
         </w:rPr>
       </w:pPr>
-      <w:proofErr w:type="spellStart"/>
-      <w:proofErr w:type="gramStart"/>
       <w:r>
         <w:rPr>
           <w:rFonts w:ascii="Times New Roman" w:eastAsia="標楷體" w:hAnsi="Times New Roman" w:cs="Times New Roman" w:hint="eastAsia"/>
@@ -95,8 +93,6 @@
         </w:rPr>
         <w:t>Re:Book</w:t>
       </w:r>
-      <w:proofErr w:type="spellEnd"/>
-      <w:proofErr w:type="gramEnd"/>
     </w:p>
     <w:p>
       <w:pPr>
@@ -201,23 +197,21 @@
           <w:szCs w:val="40"/>
         </w:rPr>
       </w:pPr>
-      <w:proofErr w:type="gramStart"/>
       <w:r>
         <w:rPr>
           <w:rFonts w:ascii="Times New Roman" w:eastAsia="標楷體" w:hAnsi="Times New Roman" w:cs="Times New Roman"/>
           <w:sz w:val="40"/>
           <w:szCs w:val="40"/>
         </w:rPr>
-        <w:t>資工碩</w:t>
-      </w:r>
-      <w:proofErr w:type="gramEnd"/>
+        <w:t>資工碩二</w:t>
+      </w:r>
       <w:r>
         <w:rPr>
           <w:rFonts w:ascii="Times New Roman" w:eastAsia="標楷體" w:hAnsi="Times New Roman" w:cs="Times New Roman"/>
           <w:sz w:val="40"/>
           <w:szCs w:val="40"/>
         </w:rPr>
-        <w:t>二</w:t>
+        <w:t xml:space="preserve"> 113598037 </w:t>
       </w:r>
       <w:r>
         <w:rPr>
@@ -225,54 +219,26 @@
           <w:sz w:val="40"/>
           <w:szCs w:val="40"/>
         </w:rPr>
-        <w:t xml:space="preserve"> 113598037 </w:t>
-      </w:r>
-      <w:r>
+        <w:t>陳宥錡</w:t>
+      </w:r>
+    </w:p>
+    <w:p>
+      <w:pPr>
+        <w:jc w:val="center"/>
         <w:rPr>
           <w:rFonts w:ascii="Times New Roman" w:eastAsia="標楷體" w:hAnsi="Times New Roman" w:cs="Times New Roman"/>
           <w:sz w:val="40"/>
           <w:szCs w:val="40"/>
         </w:rPr>
-        <w:t>陳</w:t>
-      </w:r>
-      <w:proofErr w:type="gramStart"/>
+      </w:pPr>
       <w:r>
         <w:rPr>
           <w:rFonts w:ascii="Times New Roman" w:eastAsia="標楷體" w:hAnsi="Times New Roman" w:cs="Times New Roman"/>
           <w:sz w:val="40"/>
           <w:szCs w:val="40"/>
         </w:rPr>
-        <w:t>宥錡</w:t>
-      </w:r>
-      <w:proofErr w:type="gramEnd"/>
-    </w:p>
-    <w:p>
-      <w:pPr>
-        <w:jc w:val="center"/>
-        <w:rPr>
-          <w:rFonts w:ascii="Times New Roman" w:eastAsia="標楷體" w:hAnsi="Times New Roman" w:cs="Times New Roman"/>
-          <w:sz w:val="40"/>
-          <w:szCs w:val="40"/>
-        </w:rPr>
-      </w:pPr>
-      <w:r>
-        <w:rPr>
-          <w:rFonts w:ascii="Times New Roman" w:eastAsia="標楷體" w:hAnsi="Times New Roman" w:cs="Times New Roman"/>
-          <w:sz w:val="40"/>
-          <w:szCs w:val="40"/>
-        </w:rPr>
-        <w:t>資工碩</w:t>
-      </w:r>
-      <w:proofErr w:type="gramStart"/>
-      <w:r>
-        <w:rPr>
-          <w:rFonts w:ascii="Times New Roman" w:eastAsia="標楷體" w:hAnsi="Times New Roman" w:cs="Times New Roman"/>
-          <w:sz w:val="40"/>
-          <w:szCs w:val="40"/>
-        </w:rPr>
-        <w:t>一</w:t>
-      </w:r>
-      <w:proofErr w:type="gramEnd"/>
+        <w:t>資工碩一</w:t>
+      </w:r>
       <w:r>
         <w:rPr>
           <w:rFonts w:ascii="Times New Roman" w:eastAsia="標楷體" w:hAnsi="Times New Roman" w:cs="Times New Roman"/>
@@ -697,80 +663,74 @@
           <w:p>
             <w:pPr>
               <w:rPr>
+                <w:rFonts w:ascii="Times New Roman" w:hAnsi="Times New Roman" w:cs="Times New Roman"/>
+              </w:rPr>
+            </w:pPr>
+            <w:r>
+              <w:rPr>
                 <w:rFonts w:ascii="Times New Roman" w:hAnsi="Times New Roman" w:cs="Times New Roman" w:hint="eastAsia"/>
               </w:rPr>
-            </w:pPr>
+              <w:t>5</w:t>
+            </w:r>
+          </w:p>
+        </w:tc>
+        <w:tc>
+          <w:tcPr>
+            <w:tcW w:w="5384" w:type="dxa"/>
+          </w:tcPr>
+          <w:p>
+            <w:pPr>
+              <w:rPr>
+                <w:rFonts w:ascii="Times New Roman" w:hAnsi="Times New Roman" w:cs="Times New Roman"/>
+              </w:rPr>
+            </w:pPr>
+            <w:r>
+              <w:rPr>
+                <w:rFonts w:ascii="Times New Roman" w:hAnsi="Times New Roman" w:cs="Times New Roman"/>
+              </w:rPr>
+              <w:t>Logical Architecture</w:t>
+            </w:r>
             <w:r>
               <w:rPr>
                 <w:rFonts w:ascii="Times New Roman" w:hAnsi="Times New Roman" w:cs="Times New Roman" w:hint="eastAsia"/>
               </w:rPr>
-              <w:t>5</w:t>
-            </w:r>
-          </w:p>
-        </w:tc>
-        <w:tc>
-          <w:tcPr>
-            <w:tcW w:w="5384" w:type="dxa"/>
-          </w:tcPr>
-          <w:p>
-            <w:pPr>
+              <w:t xml:space="preserve">, </w:t>
+            </w:r>
+            <w:r>
+              <w:rPr>
+                <w:rFonts w:ascii="Times New Roman" w:hAnsi="Times New Roman" w:cs="Times New Roman"/>
+              </w:rPr>
+              <w:t>Sequence Diagram</w:t>
+            </w:r>
+            <w:r>
               <w:rPr>
                 <w:rFonts w:ascii="Times New Roman" w:hAnsi="Times New Roman" w:cs="Times New Roman" w:hint="eastAsia"/>
               </w:rPr>
-            </w:pPr>
+              <w:t xml:space="preserve">, </w:t>
+            </w:r>
             <w:r>
               <w:rPr>
                 <w:rFonts w:ascii="Times New Roman" w:hAnsi="Times New Roman" w:cs="Times New Roman"/>
               </w:rPr>
-              <w:t>Logical Architecture</w:t>
-            </w:r>
-            <w:r>
-              <w:rPr>
-                <w:rFonts w:ascii="Times New Roman" w:hAnsi="Times New Roman" w:cs="Times New Roman" w:hint="eastAsia"/>
-              </w:rPr>
-              <w:t xml:space="preserve">, </w:t>
-            </w:r>
-            <w:r>
+              <w:t>Design Class Model</w:t>
+            </w:r>
+          </w:p>
+        </w:tc>
+        <w:tc>
+          <w:tcPr>
+            <w:tcW w:w="1922" w:type="dxa"/>
+          </w:tcPr>
+          <w:p>
+            <w:pPr>
               <w:rPr>
                 <w:rFonts w:ascii="Times New Roman" w:hAnsi="Times New Roman" w:cs="Times New Roman"/>
               </w:rPr>
-              <w:t>Sequence Diagram</w:t>
-            </w:r>
-            <w:r>
-              <w:rPr>
-                <w:rFonts w:ascii="Times New Roman" w:hAnsi="Times New Roman" w:cs="Times New Roman" w:hint="eastAsia"/>
-              </w:rPr>
-              <w:t xml:space="preserve">, </w:t>
-            </w:r>
-            <w:r>
-              <w:rPr>
-                <w:rFonts w:ascii="Times New Roman" w:hAnsi="Times New Roman" w:cs="Times New Roman"/>
-              </w:rPr>
-              <w:t>Design Class Model</w:t>
-            </w:r>
-          </w:p>
-        </w:tc>
-        <w:tc>
-          <w:tcPr>
-            <w:tcW w:w="1922" w:type="dxa"/>
-          </w:tcPr>
-          <w:p>
-            <w:pPr>
-              <w:rPr>
-                <w:rFonts w:ascii="Times New Roman" w:hAnsi="Times New Roman" w:cs="Times New Roman" w:hint="eastAsia"/>
-              </w:rPr>
-            </w:pPr>
-            <w:r>
-              <w:rPr>
-                <w:rFonts w:ascii="Times New Roman" w:eastAsia="標楷體" w:hAnsi="Times New Roman" w:cs="Times New Roman" w:hint="eastAsia"/>
-              </w:rPr>
-              <w:t>20</w:t>
-            </w:r>
-            <w:r>
-              <w:rPr>
-                <w:rFonts w:ascii="Times New Roman" w:eastAsia="標楷體" w:hAnsi="Times New Roman" w:cs="Times New Roman" w:hint="eastAsia"/>
-              </w:rPr>
-              <w:t>26/04/22</w:t>
+            </w:pPr>
+            <w:r>
+              <w:rPr>
+                <w:rFonts w:ascii="Times New Roman" w:eastAsia="標楷體" w:hAnsi="Times New Roman" w:cs="Times New Roman" w:hint="eastAsia"/>
+              </w:rPr>
+              <w:t>2026/04/22</w:t>
             </w:r>
           </w:p>
         </w:tc>
@@ -797,19 +757,11 @@
           <w:rFonts w:ascii="Times New Roman" w:eastAsia="標楷體" w:hAnsi="Times New Roman" w:cs="Times New Roman"/>
         </w:rPr>
       </w:pPr>
-      <w:proofErr w:type="spellStart"/>
-      <w:r>
-        <w:rPr>
-          <w:rFonts w:ascii="Times New Roman" w:eastAsia="標楷體" w:hAnsi="Times New Roman" w:cs="Times New Roman" w:hint="eastAsia"/>
-        </w:rPr>
-        <w:t>Re:Book</w:t>
-      </w:r>
-      <w:proofErr w:type="spellEnd"/>
-      <w:r>
-        <w:rPr>
-          <w:rFonts w:ascii="Times New Roman" w:eastAsia="標楷體" w:hAnsi="Times New Roman" w:cs="Times New Roman" w:hint="eastAsia"/>
-        </w:rPr>
-        <w:t xml:space="preserve"> </w:t>
+      <w:r>
+        <w:rPr>
+          <w:rFonts w:ascii="Times New Roman" w:eastAsia="標楷體" w:hAnsi="Times New Roman" w:cs="Times New Roman" w:hint="eastAsia"/>
+        </w:rPr>
+        <w:t xml:space="preserve">Re:Book </w:t>
       </w:r>
       <w:r>
         <w:rPr>
@@ -836,19 +788,11 @@
           <w:rFonts w:ascii="Times New Roman" w:eastAsia="標楷體" w:hAnsi="Times New Roman" w:cs="Times New Roman"/>
         </w:rPr>
       </w:pPr>
-      <w:proofErr w:type="spellStart"/>
-      <w:r>
-        <w:rPr>
-          <w:rFonts w:ascii="Times New Roman" w:eastAsia="標楷體" w:hAnsi="Times New Roman" w:cs="Times New Roman" w:hint="eastAsia"/>
-        </w:rPr>
-        <w:t>Re:Book</w:t>
-      </w:r>
-      <w:proofErr w:type="spellEnd"/>
-      <w:r>
-        <w:rPr>
-          <w:rFonts w:ascii="Times New Roman" w:eastAsia="標楷體" w:hAnsi="Times New Roman" w:cs="Times New Roman" w:hint="eastAsia"/>
-        </w:rPr>
-        <w:t xml:space="preserve"> </w:t>
+      <w:r>
+        <w:rPr>
+          <w:rFonts w:ascii="Times New Roman" w:eastAsia="標楷體" w:hAnsi="Times New Roman" w:cs="Times New Roman" w:hint="eastAsia"/>
+        </w:rPr>
+        <w:t xml:space="preserve">Re:Book </w:t>
       </w:r>
       <w:r>
         <w:rPr>
@@ -878,35 +822,7 @@
         <w:rPr>
           <w:rFonts w:ascii="Times New Roman" w:eastAsia="標楷體" w:hAnsi="Times New Roman" w:cs="Times New Roman" w:hint="eastAsia"/>
         </w:rPr>
-        <w:t>類。為體現對書本價值的尊重，賣家可設定期望售價，並上傳書</w:t>
-      </w:r>
-      <w:proofErr w:type="gramStart"/>
-      <w:r>
-        <w:rPr>
-          <w:rFonts w:ascii="Times New Roman" w:eastAsia="標楷體" w:hAnsi="Times New Roman" w:cs="Times New Roman" w:hint="eastAsia"/>
-        </w:rPr>
-        <w:t>況</w:t>
-      </w:r>
-      <w:proofErr w:type="gramEnd"/>
-      <w:r>
-        <w:rPr>
-          <w:rFonts w:ascii="Times New Roman" w:eastAsia="標楷體" w:hAnsi="Times New Roman" w:cs="Times New Roman" w:hint="eastAsia"/>
-        </w:rPr>
-        <w:t>照片或分享使用心得。潛在買家則可透過搜尋與篩選功能，快速找到所需書籍。平台同時</w:t>
-      </w:r>
-      <w:proofErr w:type="gramStart"/>
-      <w:r>
-        <w:rPr>
-          <w:rFonts w:ascii="Times New Roman" w:eastAsia="標楷體" w:hAnsi="Times New Roman" w:cs="Times New Roman" w:hint="eastAsia"/>
-        </w:rPr>
-        <w:t>提供私訊機制</w:t>
-      </w:r>
-      <w:proofErr w:type="gramEnd"/>
-      <w:r>
-        <w:rPr>
-          <w:rFonts w:ascii="Times New Roman" w:eastAsia="標楷體" w:hAnsi="Times New Roman" w:cs="Times New Roman" w:hint="eastAsia"/>
-        </w:rPr>
-        <w:t>，讓雙方協商最終價格與交付方式，確保知識的傳遞過程既順暢高效，也保有人與人之間的溫度。</w:t>
+        <w:t>類。為體現對書本價值的尊重，賣家可設定期望售價，並上傳書況照片或分享使用心得。潛在買家則可透過搜尋與篩選功能，快速找到所需書籍。平台同時提供私訊機制，讓雙方協商最終價格與交付方式，確保知識的傳遞過程既順暢高效，也保有人與人之間的溫度。</w:t>
       </w:r>
     </w:p>
     <w:p>
@@ -1134,14 +1050,12 @@
                 <w:rFonts w:ascii="Times New Roman" w:eastAsia="標楷體" w:hAnsi="Times New Roman" w:cs="Times New Roman"/>
               </w:rPr>
             </w:pPr>
-            <w:proofErr w:type="gramStart"/>
             <w:r>
               <w:rPr>
                 <w:rFonts w:ascii="Times New Roman" w:eastAsia="標楷體" w:hAnsi="Times New Roman" w:cs="Times New Roman" w:hint="eastAsia"/>
               </w:rPr>
               <w:t>發送私訊</w:t>
             </w:r>
-            <w:proofErr w:type="gramEnd"/>
           </w:p>
         </w:tc>
       </w:tr>
@@ -1447,16 +1361,12 @@
                 <w:rFonts w:ascii="Times New Roman" w:eastAsia="標楷體" w:hAnsi="Times New Roman" w:cs="Times New Roman"/>
               </w:rPr>
             </w:pPr>
-            <w:proofErr w:type="spellStart"/>
-            <w:proofErr w:type="gramStart"/>
             <w:r>
               <w:rPr>
                 <w:rFonts w:ascii="Times New Roman" w:eastAsia="標楷體" w:hAnsi="Times New Roman" w:cs="Times New Roman" w:hint="eastAsia"/>
               </w:rPr>
               <w:t>Re:Book</w:t>
             </w:r>
-            <w:proofErr w:type="spellEnd"/>
-            <w:proofErr w:type="gramEnd"/>
           </w:p>
         </w:tc>
       </w:tr>
@@ -1831,21 +1741,7 @@
               <w:rPr>
                 <w:rFonts w:ascii="Times New Roman" w:eastAsia="標楷體" w:hAnsi="Times New Roman" w:cs="Times New Roman" w:hint="eastAsia"/>
               </w:rPr>
-              <w:t>、書名、價格、書</w:t>
-            </w:r>
-            <w:proofErr w:type="gramStart"/>
-            <w:r>
-              <w:rPr>
-                <w:rFonts w:ascii="Times New Roman" w:eastAsia="標楷體" w:hAnsi="Times New Roman" w:cs="Times New Roman" w:hint="eastAsia"/>
-              </w:rPr>
-              <w:t>況</w:t>
-            </w:r>
-            <w:proofErr w:type="gramEnd"/>
-            <w:r>
-              <w:rPr>
-                <w:rFonts w:ascii="Times New Roman" w:eastAsia="標楷體" w:hAnsi="Times New Roman" w:cs="Times New Roman" w:hint="eastAsia"/>
-              </w:rPr>
-              <w:t>及</w:t>
+              <w:t>、書名、價格、書況及</w:t>
             </w:r>
             <w:r>
               <w:rPr>
@@ -1902,14 +1798,12 @@
               </w:rPr>
               <w:t>格式</w:t>
             </w:r>
-            <w:proofErr w:type="gramStart"/>
             <w:r>
               <w:rPr>
                 <w:rFonts w:ascii="Times New Roman" w:eastAsia="標楷體" w:hAnsi="Times New Roman" w:cs="Times New Roman" w:hint="eastAsia"/>
               </w:rPr>
               <w:t>與必填欄位</w:t>
             </w:r>
-            <w:proofErr w:type="gramEnd"/>
             <w:r>
               <w:rPr>
                 <w:rFonts w:ascii="Times New Roman" w:eastAsia="標楷體" w:hAnsi="Times New Roman" w:cs="Times New Roman" w:hint="eastAsia"/>
@@ -2598,16 +2492,12 @@
                 <w:rFonts w:ascii="Times New Roman" w:eastAsia="標楷體" w:hAnsi="Times New Roman" w:cs="Times New Roman"/>
               </w:rPr>
             </w:pPr>
-            <w:proofErr w:type="spellStart"/>
-            <w:proofErr w:type="gramStart"/>
             <w:r>
               <w:rPr>
                 <w:rFonts w:ascii="Times New Roman" w:eastAsia="標楷體" w:hAnsi="Times New Roman" w:cs="Times New Roman" w:hint="eastAsia"/>
               </w:rPr>
               <w:t>Re:Book</w:t>
             </w:r>
-            <w:proofErr w:type="spellEnd"/>
-            <w:proofErr w:type="gramEnd"/>
           </w:p>
         </w:tc>
       </w:tr>
@@ -2932,21 +2822,7 @@
               <w:rPr>
                 <w:rFonts w:ascii="Times New Roman" w:eastAsia="標楷體" w:hAnsi="Times New Roman" w:cs="Times New Roman" w:hint="eastAsia"/>
               </w:rPr>
-              <w:t>買家選擇篩選條件</w:t>
-            </w:r>
-            <w:proofErr w:type="gramStart"/>
-            <w:r>
-              <w:rPr>
-                <w:rFonts w:ascii="Times New Roman" w:eastAsia="標楷體" w:hAnsi="Times New Roman" w:cs="Times New Roman" w:hint="eastAsia"/>
-              </w:rPr>
-              <w:t>（</w:t>
-            </w:r>
-            <w:proofErr w:type="gramEnd"/>
-            <w:r>
-              <w:rPr>
-                <w:rFonts w:ascii="Times New Roman" w:eastAsia="標楷體" w:hAnsi="Times New Roman" w:cs="Times New Roman" w:hint="eastAsia"/>
-              </w:rPr>
-              <w:t>如：</w:t>
+              <w:t>買家選擇篩選條件（如：</w:t>
             </w:r>
             <w:r>
               <w:rPr>
@@ -2958,21 +2834,7 @@
               <w:rPr>
                 <w:rFonts w:ascii="Times New Roman" w:eastAsia="標楷體" w:hAnsi="Times New Roman" w:cs="Times New Roman" w:hint="eastAsia"/>
               </w:rPr>
-              <w:t>、價格範圍</w:t>
-            </w:r>
-            <w:proofErr w:type="gramStart"/>
-            <w:r>
-              <w:rPr>
-                <w:rFonts w:ascii="Times New Roman" w:eastAsia="標楷體" w:hAnsi="Times New Roman" w:cs="Times New Roman" w:hint="eastAsia"/>
-              </w:rPr>
-              <w:t>）</w:t>
-            </w:r>
-            <w:proofErr w:type="gramEnd"/>
-            <w:r>
-              <w:rPr>
-                <w:rFonts w:ascii="Times New Roman" w:eastAsia="標楷體" w:hAnsi="Times New Roman" w:cs="Times New Roman" w:hint="eastAsia"/>
-              </w:rPr>
-              <w:t>。</w:t>
+              <w:t>、價格範圍）。</w:t>
             </w:r>
           </w:p>
           <w:p>
@@ -3400,16 +3262,12 @@
                 <w:rFonts w:ascii="Times New Roman" w:eastAsia="標楷體" w:hAnsi="Times New Roman" w:cs="Times New Roman"/>
               </w:rPr>
             </w:pPr>
-            <w:proofErr w:type="spellStart"/>
-            <w:proofErr w:type="gramStart"/>
             <w:r>
               <w:rPr>
                 <w:rFonts w:ascii="Times New Roman" w:eastAsia="標楷體" w:hAnsi="Times New Roman" w:cs="Times New Roman" w:hint="eastAsia"/>
               </w:rPr>
               <w:t>Re:Book</w:t>
             </w:r>
-            <w:proofErr w:type="spellEnd"/>
-            <w:proofErr w:type="gramEnd"/>
           </w:p>
         </w:tc>
       </w:tr>
@@ -3710,35 +3568,7 @@
               <w:rPr>
                 <w:rFonts w:ascii="Times New Roman" w:eastAsia="標楷體" w:hAnsi="Times New Roman" w:cs="Times New Roman" w:hint="eastAsia"/>
               </w:rPr>
-              <w:t>系統顯示訂單資訊與線下交易選項</w:t>
-            </w:r>
-            <w:proofErr w:type="gramStart"/>
-            <w:r>
-              <w:rPr>
-                <w:rFonts w:ascii="Times New Roman" w:eastAsia="標楷體" w:hAnsi="Times New Roman" w:cs="Times New Roman" w:hint="eastAsia"/>
-              </w:rPr>
-              <w:t>（</w:t>
-            </w:r>
-            <w:proofErr w:type="gramEnd"/>
-            <w:r>
-              <w:rPr>
-                <w:rFonts w:ascii="Times New Roman" w:eastAsia="標楷體" w:hAnsi="Times New Roman" w:cs="Times New Roman" w:hint="eastAsia"/>
-              </w:rPr>
-              <w:t>如：面交付現、自行匯款</w:t>
-            </w:r>
-            <w:proofErr w:type="gramStart"/>
-            <w:r>
-              <w:rPr>
-                <w:rFonts w:ascii="Times New Roman" w:eastAsia="標楷體" w:hAnsi="Times New Roman" w:cs="Times New Roman" w:hint="eastAsia"/>
-              </w:rPr>
-              <w:t>）</w:t>
-            </w:r>
-            <w:proofErr w:type="gramEnd"/>
-            <w:r>
-              <w:rPr>
-                <w:rFonts w:ascii="Times New Roman" w:eastAsia="標楷體" w:hAnsi="Times New Roman" w:cs="Times New Roman" w:hint="eastAsia"/>
-              </w:rPr>
-              <w:t>。</w:t>
+              <w:t>系統顯示訂單資訊與線下交易選項（如：面交付現、自行匯款）。</w:t>
             </w:r>
           </w:p>
           <w:p>
@@ -4135,21 +3965,7 @@
               <w:rPr>
                 <w:rFonts w:ascii="Times New Roman" w:eastAsia="標楷體" w:hAnsi="Times New Roman" w:cs="Times New Roman"/>
               </w:rPr>
-              <w:t>是否需要設定自動取消機制？</w:t>
-            </w:r>
-            <w:proofErr w:type="gramStart"/>
-            <w:r>
-              <w:rPr>
-                <w:rFonts w:ascii="Times New Roman" w:eastAsia="標楷體" w:hAnsi="Times New Roman" w:cs="Times New Roman"/>
-              </w:rPr>
-              <w:t>（</w:t>
-            </w:r>
-            <w:proofErr w:type="gramEnd"/>
-            <w:r>
-              <w:rPr>
-                <w:rFonts w:ascii="Times New Roman" w:eastAsia="標楷體" w:hAnsi="Times New Roman" w:cs="Times New Roman"/>
-              </w:rPr>
-              <w:t>例如：訂單成立後</w:t>
+              <w:t>是否需要設定自動取消機制？（例如：訂單成立後</w:t>
             </w:r>
             <w:r>
               <w:rPr>
@@ -4161,21 +3977,7 @@
               <w:rPr>
                 <w:rFonts w:ascii="Times New Roman" w:eastAsia="標楷體" w:hAnsi="Times New Roman" w:cs="Times New Roman"/>
               </w:rPr>
-              <w:t>天內未點擊完成，系統自動取消並恢復書籍狀態</w:t>
-            </w:r>
-            <w:proofErr w:type="gramStart"/>
-            <w:r>
-              <w:rPr>
-                <w:rFonts w:ascii="Times New Roman" w:eastAsia="標楷體" w:hAnsi="Times New Roman" w:cs="Times New Roman"/>
-              </w:rPr>
-              <w:t>）</w:t>
-            </w:r>
-            <w:proofErr w:type="gramEnd"/>
-            <w:r>
-              <w:rPr>
-                <w:rFonts w:ascii="Times New Roman" w:eastAsia="標楷體" w:hAnsi="Times New Roman" w:cs="Times New Roman"/>
-              </w:rPr>
-              <w:t>。</w:t>
+              <w:t>天內未點擊完成，系統自動取消並恢復書籍狀態）。</w:t>
             </w:r>
           </w:p>
         </w:tc>
@@ -4300,16 +4102,12 @@
                 <w:rFonts w:ascii="Times New Roman" w:eastAsia="標楷體" w:hAnsi="Times New Roman" w:cs="Times New Roman"/>
               </w:rPr>
             </w:pPr>
-            <w:proofErr w:type="spellStart"/>
-            <w:proofErr w:type="gramStart"/>
             <w:r>
               <w:rPr>
                 <w:rFonts w:ascii="Times New Roman" w:eastAsia="標楷體" w:hAnsi="Times New Roman" w:cs="Times New Roman" w:hint="eastAsia"/>
               </w:rPr>
               <w:t>Re:Book</w:t>
             </w:r>
-            <w:proofErr w:type="spellEnd"/>
-            <w:proofErr w:type="gramEnd"/>
           </w:p>
         </w:tc>
       </w:tr>
@@ -4428,21 +4226,7 @@
               <w:rPr>
                 <w:rFonts w:ascii="Times New Roman" w:eastAsia="標楷體" w:hAnsi="Times New Roman" w:cs="Times New Roman" w:hint="eastAsia"/>
               </w:rPr>
-              <w:t>買家：希望直接聯繫賣家以詢問書</w:t>
-            </w:r>
-            <w:proofErr w:type="gramStart"/>
-            <w:r>
-              <w:rPr>
-                <w:rFonts w:ascii="Times New Roman" w:eastAsia="標楷體" w:hAnsi="Times New Roman" w:cs="Times New Roman" w:hint="eastAsia"/>
-              </w:rPr>
-              <w:t>況</w:t>
-            </w:r>
-            <w:proofErr w:type="gramEnd"/>
-            <w:r>
-              <w:rPr>
-                <w:rFonts w:ascii="Times New Roman" w:eastAsia="標楷體" w:hAnsi="Times New Roman" w:cs="Times New Roman" w:hint="eastAsia"/>
-              </w:rPr>
-              <w:t>細節或協商最終價格</w:t>
+              <w:t>買家：希望直接聯繫賣家以詢問書況細節或協商最終價格</w:t>
             </w:r>
           </w:p>
           <w:p>
@@ -4661,14 +4445,12 @@
               </w:rPr>
               <w:t>賣家</w:t>
             </w:r>
-            <w:proofErr w:type="gramStart"/>
             <w:r>
               <w:rPr>
                 <w:rFonts w:ascii="Times New Roman" w:eastAsia="標楷體" w:hAnsi="Times New Roman" w:cs="Times New Roman" w:hint="eastAsia"/>
               </w:rPr>
               <w:t>的私訊</w:t>
             </w:r>
-            <w:proofErr w:type="gramEnd"/>
             <w:r>
               <w:rPr>
                 <w:rFonts w:ascii="Times New Roman" w:eastAsia="標楷體" w:hAnsi="Times New Roman" w:cs="Times New Roman" w:hint="eastAsia"/>
@@ -4698,21 +4480,7 @@
               <w:rPr>
                 <w:rFonts w:ascii="Times New Roman" w:eastAsia="標楷體" w:hAnsi="Times New Roman" w:cs="Times New Roman" w:hint="eastAsia"/>
               </w:rPr>
-              <w:t>買家輸入諮詢內容</w:t>
-            </w:r>
-            <w:proofErr w:type="gramStart"/>
-            <w:r>
-              <w:rPr>
-                <w:rFonts w:ascii="Times New Roman" w:eastAsia="標楷體" w:hAnsi="Times New Roman" w:cs="Times New Roman" w:hint="eastAsia"/>
-              </w:rPr>
-              <w:t>（</w:t>
-            </w:r>
-            <w:proofErr w:type="gramEnd"/>
-            <w:r>
-              <w:rPr>
-                <w:rFonts w:ascii="Times New Roman" w:eastAsia="標楷體" w:hAnsi="Times New Roman" w:cs="Times New Roman" w:hint="eastAsia"/>
-              </w:rPr>
-              <w:t>如：詢問</w:t>
+              <w:t>買家輸入諮詢內容（如：詢問</w:t>
             </w:r>
             <w:r>
               <w:rPr>
@@ -4720,33 +4488,11 @@
               </w:rPr>
               <w:t>書</w:t>
             </w:r>
-            <w:proofErr w:type="gramStart"/>
-            <w:r>
-              <w:rPr>
-                <w:rFonts w:ascii="Times New Roman" w:eastAsia="標楷體" w:hAnsi="Times New Roman" w:cs="Times New Roman" w:hint="eastAsia"/>
-              </w:rPr>
-              <w:t>況</w:t>
-            </w:r>
-            <w:proofErr w:type="gramEnd"/>
-            <w:r>
-              <w:rPr>
-                <w:rFonts w:ascii="Times New Roman" w:eastAsia="標楷體" w:hAnsi="Times New Roman" w:cs="Times New Roman" w:hint="eastAsia"/>
-              </w:rPr>
-              <w:t>、議價或約定地點</w:t>
-            </w:r>
-            <w:proofErr w:type="gramStart"/>
-            <w:r>
-              <w:rPr>
-                <w:rFonts w:ascii="Times New Roman" w:eastAsia="標楷體" w:hAnsi="Times New Roman" w:cs="Times New Roman" w:hint="eastAsia"/>
-              </w:rPr>
-              <w:t>）</w:t>
-            </w:r>
-            <w:proofErr w:type="gramEnd"/>
-            <w:r>
-              <w:rPr>
-                <w:rFonts w:ascii="Times New Roman" w:eastAsia="標楷體" w:hAnsi="Times New Roman" w:cs="Times New Roman" w:hint="eastAsia"/>
-              </w:rPr>
-              <w:t>。</w:t>
+            <w:r>
+              <w:rPr>
+                <w:rFonts w:ascii="Times New Roman" w:eastAsia="標楷體" w:hAnsi="Times New Roman" w:cs="Times New Roman" w:hint="eastAsia"/>
+              </w:rPr>
+              <w:t>況、議價或約定地點）。</w:t>
             </w:r>
           </w:p>
           <w:p>
@@ -4971,21 +4717,7 @@
               <w:rPr>
                 <w:rFonts w:ascii="Times New Roman" w:eastAsia="標楷體" w:hAnsi="Times New Roman" w:cs="Times New Roman" w:hint="eastAsia"/>
               </w:rPr>
-              <w:t>支援文字訊息；未來可擴充支援圖片傳送（用於拍攝更詳細的書</w:t>
-            </w:r>
-            <w:proofErr w:type="gramStart"/>
-            <w:r>
-              <w:rPr>
-                <w:rFonts w:ascii="Times New Roman" w:eastAsia="標楷體" w:hAnsi="Times New Roman" w:cs="Times New Roman" w:hint="eastAsia"/>
-              </w:rPr>
-              <w:t>況</w:t>
-            </w:r>
-            <w:proofErr w:type="gramEnd"/>
-            <w:r>
-              <w:rPr>
-                <w:rFonts w:ascii="Times New Roman" w:eastAsia="標楷體" w:hAnsi="Times New Roman" w:cs="Times New Roman" w:hint="eastAsia"/>
-              </w:rPr>
-              <w:t>）。</w:t>
+              <w:t>支援文字訊息；未來可擴充支援圖片傳送（用於拍攝更詳細的書況）。</w:t>
             </w:r>
           </w:p>
         </w:tc>
@@ -5193,16 +4925,12 @@
                 <w:rFonts w:ascii="Times New Roman" w:eastAsia="標楷體" w:hAnsi="Times New Roman" w:cs="Times New Roman"/>
               </w:rPr>
             </w:pPr>
-            <w:proofErr w:type="spellStart"/>
-            <w:proofErr w:type="gramStart"/>
             <w:r>
               <w:rPr>
                 <w:rFonts w:ascii="Times New Roman" w:eastAsia="標楷體" w:hAnsi="Times New Roman" w:cs="Times New Roman" w:hint="eastAsia"/>
               </w:rPr>
               <w:t>Re:Book</w:t>
             </w:r>
-            <w:proofErr w:type="spellEnd"/>
-            <w:proofErr w:type="gramEnd"/>
           </w:p>
         </w:tc>
       </w:tr>
@@ -5494,14 +5222,7 @@
               <w:rPr>
                 <w:rFonts w:ascii="Times New Roman" w:eastAsia="標楷體" w:hAnsi="Times New Roman" w:cs="Times New Roman" w:hint="eastAsia"/>
               </w:rPr>
-              <w:t>被正確</w:t>
-            </w:r>
-            <w:proofErr w:type="gramStart"/>
-            <w:r>
-              <w:rPr>
-                <w:rFonts w:ascii="Times New Roman" w:eastAsia="標楷體" w:hAnsi="Times New Roman" w:cs="Times New Roman" w:hint="eastAsia"/>
-              </w:rPr>
-              <w:t>歸類至</w:t>
+              <w:t>被正確歸類至</w:t>
             </w:r>
             <w:r>
               <w:rPr>
@@ -5509,7 +5230,6 @@
               </w:rPr>
               <w:t>賣家</w:t>
             </w:r>
-            <w:proofErr w:type="gramEnd"/>
             <w:r>
               <w:rPr>
                 <w:rFonts w:ascii="Times New Roman" w:eastAsia="標楷體" w:hAnsi="Times New Roman" w:cs="Times New Roman" w:hint="eastAsia"/>
@@ -5526,21 +5246,7 @@
               <w:rPr>
                 <w:rFonts w:ascii="Times New Roman" w:eastAsia="標楷體" w:hAnsi="Times New Roman" w:cs="Times New Roman" w:hint="eastAsia"/>
               </w:rPr>
-              <w:t>分類中，且買家在賣家個人頁面能看到</w:t>
-            </w:r>
-            <w:proofErr w:type="gramStart"/>
-            <w:r>
-              <w:rPr>
-                <w:rFonts w:ascii="Times New Roman" w:eastAsia="標楷體" w:hAnsi="Times New Roman" w:cs="Times New Roman" w:hint="eastAsia"/>
-              </w:rPr>
-              <w:t>清楚的</w:t>
-            </w:r>
-            <w:proofErr w:type="gramEnd"/>
-            <w:r>
-              <w:rPr>
-                <w:rFonts w:ascii="Times New Roman" w:eastAsia="標楷體" w:hAnsi="Times New Roman" w:cs="Times New Roman" w:hint="eastAsia"/>
-              </w:rPr>
-              <w:t>分類結構。</w:t>
+              <w:t>分類中，且買家在賣家個人頁面能看到清楚的分類結構。</w:t>
             </w:r>
           </w:p>
         </w:tc>
@@ -6355,16 +6061,12 @@
                 <w:rFonts w:ascii="Times New Roman" w:eastAsia="標楷體" w:hAnsi="Times New Roman" w:cs="Times New Roman"/>
               </w:rPr>
             </w:pPr>
-            <w:proofErr w:type="spellStart"/>
-            <w:proofErr w:type="gramStart"/>
             <w:r>
               <w:rPr>
                 <w:rFonts w:ascii="Times New Roman" w:eastAsia="標楷體" w:hAnsi="Times New Roman" w:cs="Times New Roman"/>
               </w:rPr>
               <w:t>Re:Book</w:t>
             </w:r>
-            <w:proofErr w:type="spellEnd"/>
-            <w:proofErr w:type="gramEnd"/>
           </w:p>
         </w:tc>
       </w:tr>
@@ -6653,19 +6355,11 @@
               </w:rPr>
               <w:t>的</w:t>
             </w:r>
-            <w:proofErr w:type="gramStart"/>
-            <w:r>
-              <w:rPr>
-                <w:rFonts w:ascii="Times New Roman" w:eastAsia="標楷體" w:hAnsi="Times New Roman" w:cs="Times New Roman" w:hint="eastAsia"/>
-              </w:rPr>
-              <w:t>詳情頁點擊</w:t>
-            </w:r>
-            <w:proofErr w:type="gramEnd"/>
-            <w:r>
-              <w:rPr>
-                <w:rFonts w:ascii="Times New Roman" w:eastAsia="標楷體" w:hAnsi="Times New Roman" w:cs="Times New Roman" w:hint="eastAsia"/>
-              </w:rPr>
-              <w:t>「加入</w:t>
+            <w:r>
+              <w:rPr>
+                <w:rFonts w:ascii="Times New Roman" w:eastAsia="標楷體" w:hAnsi="Times New Roman" w:cs="Times New Roman" w:hint="eastAsia"/>
+              </w:rPr>
+              <w:t>詳情頁點擊「加入</w:t>
             </w:r>
             <w:r>
               <w:rPr>
@@ -6753,7 +6447,6 @@
               </w:rPr>
               <w:t>買家進入</w:t>
             </w:r>
-            <w:proofErr w:type="gramStart"/>
             <w:r>
               <w:rPr>
                 <w:rFonts w:ascii="Times New Roman" w:eastAsia="標楷體" w:hAnsi="Times New Roman" w:cs="Times New Roman" w:hint="eastAsia"/>
@@ -6764,14 +6457,7 @@
               <w:rPr>
                 <w:rFonts w:ascii="Times New Roman" w:eastAsia="標楷體" w:hAnsi="Times New Roman" w:cs="Times New Roman" w:hint="eastAsia"/>
               </w:rPr>
-              <w:t>頁面</w:t>
-            </w:r>
-            <w:proofErr w:type="gramEnd"/>
-            <w:r>
-              <w:rPr>
-                <w:rFonts w:ascii="Times New Roman" w:eastAsia="標楷體" w:hAnsi="Times New Roman" w:cs="Times New Roman" w:hint="eastAsia"/>
-              </w:rPr>
-              <w:t>，查看所有已</w:t>
+              <w:t>頁面，查看所有已</w:t>
             </w:r>
             <w:r>
               <w:rPr>
@@ -6816,14 +6502,12 @@
               </w:rPr>
               <w:t>買家可從</w:t>
             </w:r>
-            <w:proofErr w:type="gramStart"/>
             <w:r>
               <w:rPr>
                 <w:rFonts w:ascii="Times New Roman" w:eastAsia="標楷體" w:hAnsi="Times New Roman" w:cs="Times New Roman" w:hint="eastAsia"/>
               </w:rPr>
               <w:t>購物車頁面</w:t>
             </w:r>
-            <w:proofErr w:type="gramEnd"/>
             <w:r>
               <w:rPr>
                 <w:rFonts w:ascii="Times New Roman" w:eastAsia="標楷體" w:hAnsi="Times New Roman" w:cs="Times New Roman" w:hint="eastAsia"/>
@@ -7531,19 +7215,11 @@
                 <w:rFonts w:ascii="Times New Roman" w:eastAsia="標楷體" w:hAnsi="Times New Roman" w:cs="Times New Roman"/>
               </w:rPr>
             </w:pPr>
-            <w:proofErr w:type="gramStart"/>
-            <w:r>
-              <w:rPr>
-                <w:rFonts w:ascii="Times New Roman" w:eastAsia="標楷體" w:hAnsi="Times New Roman" w:cs="Times New Roman" w:hint="eastAsia"/>
-              </w:rPr>
-              <w:t>私訊傳遞</w:t>
-            </w:r>
-            <w:proofErr w:type="gramEnd"/>
-            <w:r>
-              <w:rPr>
-                <w:rFonts w:ascii="Times New Roman" w:eastAsia="標楷體" w:hAnsi="Times New Roman" w:cs="Times New Roman" w:hint="eastAsia"/>
-              </w:rPr>
-              <w:t>的延遲時間應小於</w:t>
+            <w:r>
+              <w:rPr>
+                <w:rFonts w:ascii="Times New Roman" w:eastAsia="標楷體" w:hAnsi="Times New Roman" w:cs="Times New Roman" w:hint="eastAsia"/>
+              </w:rPr>
+              <w:t>私訊傳遞的延遲時間應小於</w:t>
             </w:r>
             <w:r>
               <w:rPr>
@@ -8063,21 +7739,7 @@
               <w:rPr>
                 <w:rFonts w:ascii="Times New Roman" w:eastAsia="標楷體" w:hAnsi="Times New Roman" w:cs="Times New Roman"/>
               </w:rPr>
-              <w:t>，包含該書籍的價格、書</w:t>
-            </w:r>
-            <w:proofErr w:type="gramStart"/>
-            <w:r>
-              <w:rPr>
-                <w:rFonts w:ascii="Times New Roman" w:eastAsia="標楷體" w:hAnsi="Times New Roman" w:cs="Times New Roman"/>
-              </w:rPr>
-              <w:t>況</w:t>
-            </w:r>
-            <w:proofErr w:type="gramEnd"/>
-            <w:r>
-              <w:rPr>
-                <w:rFonts w:ascii="Times New Roman" w:eastAsia="標楷體" w:hAnsi="Times New Roman" w:cs="Times New Roman"/>
-              </w:rPr>
-              <w:t>、照片與所在地點等資訊。</w:t>
+              <w:t>，包含該書籍的價格、書況、照片與所在地點等資訊。</w:t>
             </w:r>
           </w:p>
         </w:tc>
@@ -8181,14 +7843,12 @@
                 <w:rFonts w:ascii="Times New Roman" w:eastAsia="標楷體" w:hAnsi="Times New Roman" w:cs="Times New Roman"/>
               </w:rPr>
             </w:pPr>
-            <w:proofErr w:type="gramStart"/>
             <w:r>
               <w:rPr>
                 <w:rFonts w:ascii="Times New Roman" w:eastAsia="標楷體" w:hAnsi="Times New Roman" w:cs="Times New Roman" w:hint="eastAsia"/>
               </w:rPr>
               <w:t>私訊</w:t>
             </w:r>
-            <w:proofErr w:type="gramEnd"/>
           </w:p>
         </w:tc>
         <w:tc>
@@ -8255,21 +7915,7 @@
               <w:rPr>
                 <w:rFonts w:ascii="Times New Roman" w:eastAsia="標楷體" w:hAnsi="Times New Roman" w:cs="Times New Roman" w:hint="eastAsia"/>
               </w:rPr>
-              <w:t>。讓買家在後續可以進行比價或</w:t>
-            </w:r>
-            <w:proofErr w:type="gramStart"/>
-            <w:r>
-              <w:rPr>
-                <w:rFonts w:ascii="Times New Roman" w:eastAsia="標楷體" w:hAnsi="Times New Roman" w:cs="Times New Roman" w:hint="eastAsia"/>
-              </w:rPr>
-              <w:t>發起私訊以</w:t>
-            </w:r>
-            <w:proofErr w:type="gramEnd"/>
-            <w:r>
-              <w:rPr>
-                <w:rFonts w:ascii="Times New Roman" w:eastAsia="標楷體" w:hAnsi="Times New Roman" w:cs="Times New Roman" w:hint="eastAsia"/>
-              </w:rPr>
-              <w:t>進行協商。</w:t>
+              <w:t>。讓買家在後續可以進行比價或發起私訊以進行協商。</w:t>
             </w:r>
           </w:p>
         </w:tc>
@@ -8688,14 +8334,12 @@
                 <w:rFonts w:ascii="Times New Roman" w:eastAsia="標楷體" w:hAnsi="Times New Roman" w:cs="Times New Roman"/>
               </w:rPr>
             </w:pPr>
-            <w:proofErr w:type="gramStart"/>
             <w:r>
               <w:rPr>
                 <w:rFonts w:ascii="Times New Roman" w:eastAsia="標楷體" w:hAnsi="Times New Roman" w:cs="Times New Roman" w:hint="eastAsia"/>
               </w:rPr>
               <w:t>必填欄位</w:t>
             </w:r>
-            <w:proofErr w:type="gramEnd"/>
           </w:p>
         </w:tc>
       </w:tr>
@@ -8732,16 +8376,8 @@
               <w:rPr>
                 <w:rFonts w:ascii="Times New Roman" w:eastAsia="標楷體" w:hAnsi="Times New Roman" w:cs="Times New Roman" w:hint="eastAsia"/>
               </w:rPr>
-              <w:t>書</w:t>
-            </w:r>
-            <w:proofErr w:type="gramStart"/>
-            <w:r>
-              <w:rPr>
-                <w:rFonts w:ascii="Times New Roman" w:eastAsia="標楷體" w:hAnsi="Times New Roman" w:cs="Times New Roman" w:hint="eastAsia"/>
-              </w:rPr>
-              <w:t>況</w:t>
-            </w:r>
-            <w:proofErr w:type="gramEnd"/>
+              <w:t>書況</w:t>
+            </w:r>
           </w:p>
         </w:tc>
         <w:tc>
@@ -8790,14 +8426,12 @@
                 <w:rFonts w:ascii="Times New Roman" w:eastAsia="標楷體" w:hAnsi="Times New Roman" w:cs="Times New Roman"/>
               </w:rPr>
             </w:pPr>
-            <w:proofErr w:type="gramStart"/>
             <w:r>
               <w:rPr>
                 <w:rFonts w:ascii="Times New Roman" w:eastAsia="標楷體" w:hAnsi="Times New Roman" w:cs="Times New Roman" w:hint="eastAsia"/>
               </w:rPr>
               <w:t>私訊</w:t>
             </w:r>
-            <w:proofErr w:type="gramEnd"/>
           </w:p>
         </w:tc>
       </w:tr>
@@ -9032,14 +8666,12 @@
                 <w:rFonts w:ascii="Times New Roman" w:eastAsia="標楷體" w:hAnsi="Times New Roman" w:cs="Times New Roman"/>
               </w:rPr>
             </w:pPr>
-            <w:proofErr w:type="gramStart"/>
             <w:r>
               <w:rPr>
                 <w:rFonts w:ascii="Times New Roman" w:eastAsia="標楷體" w:hAnsi="Times New Roman" w:cs="Times New Roman" w:hint="eastAsia"/>
               </w:rPr>
               <w:t>購物車頁面</w:t>
             </w:r>
-            <w:proofErr w:type="gramEnd"/>
           </w:p>
         </w:tc>
         <w:tc>
@@ -9180,21 +8812,7 @@
         <w:rPr>
           <w:rFonts w:ascii="Times New Roman" w:eastAsia="標楷體" w:hAnsi="Times New Roman" w:cs="Times New Roman" w:hint="eastAsia"/>
         </w:rPr>
-        <w:t>書籍頁面、個人賣場管理頁面、</w:t>
-      </w:r>
-      <w:proofErr w:type="gramStart"/>
-      <w:r>
-        <w:rPr>
-          <w:rFonts w:ascii="Times New Roman" w:eastAsia="標楷體" w:hAnsi="Times New Roman" w:cs="Times New Roman" w:hint="eastAsia"/>
-        </w:rPr>
-        <w:t>購物車頁面</w:t>
-      </w:r>
-      <w:proofErr w:type="gramEnd"/>
-      <w:r>
-        <w:rPr>
-          <w:rFonts w:ascii="Times New Roman" w:eastAsia="標楷體" w:hAnsi="Times New Roman" w:cs="Times New Roman" w:hint="eastAsia"/>
-        </w:rPr>
-        <w:t>：皆為前端</w:t>
+        <w:t>書籍頁面、個人賣場管理頁面、購物車頁面：皆為前端</w:t>
       </w:r>
       <w:r>
         <w:rPr>
@@ -9286,19 +8904,11 @@
           <w:rFonts w:ascii="Times New Roman" w:eastAsia="標楷體" w:hAnsi="Times New Roman" w:cs="Times New Roman"/>
         </w:rPr>
       </w:pPr>
-      <w:proofErr w:type="gramStart"/>
-      <w:r>
-        <w:rPr>
-          <w:rFonts w:ascii="Times New Roman" w:eastAsia="標楷體" w:hAnsi="Times New Roman" w:cs="Times New Roman" w:hint="eastAsia"/>
-        </w:rPr>
-        <w:t>必填欄位</w:t>
-      </w:r>
-      <w:proofErr w:type="gramEnd"/>
-      <w:r>
-        <w:rPr>
-          <w:rFonts w:ascii="Times New Roman" w:eastAsia="標楷體" w:hAnsi="Times New Roman" w:cs="Times New Roman" w:hint="eastAsia"/>
-        </w:rPr>
-        <w:t>：表單驗證規則，非實體物件。</w:t>
+      <w:r>
+        <w:rPr>
+          <w:rFonts w:ascii="Times New Roman" w:eastAsia="標楷體" w:hAnsi="Times New Roman" w:cs="Times New Roman" w:hint="eastAsia"/>
+        </w:rPr>
+        <w:t>必填欄位：表單驗證規則，非實體物件。</w:t>
       </w:r>
     </w:p>
     <w:p>
@@ -9359,21 +8969,7 @@
         <w:rPr>
           <w:rFonts w:ascii="Times New Roman" w:eastAsia="標楷體" w:hAnsi="Times New Roman" w:cs="Times New Roman" w:hint="eastAsia"/>
         </w:rPr>
-        <w:t>書籍狀態、書</w:t>
-      </w:r>
-      <w:proofErr w:type="gramStart"/>
-      <w:r>
-        <w:rPr>
-          <w:rFonts w:ascii="Times New Roman" w:eastAsia="標楷體" w:hAnsi="Times New Roman" w:cs="Times New Roman" w:hint="eastAsia"/>
-        </w:rPr>
-        <w:t>況</w:t>
-      </w:r>
-      <w:proofErr w:type="gramEnd"/>
-      <w:r>
-        <w:rPr>
-          <w:rFonts w:ascii="Times New Roman" w:eastAsia="標楷體" w:hAnsi="Times New Roman" w:cs="Times New Roman" w:hint="eastAsia"/>
-        </w:rPr>
-        <w:t>：應作為</w:t>
+        <w:t>書籍狀態、書況：應作為</w:t>
       </w:r>
       <w:r>
         <w:rPr>
@@ -9902,14 +9498,12 @@
                 <w:rFonts w:ascii="Times New Roman" w:eastAsia="標楷體" w:hAnsi="Times New Roman" w:cs="Times New Roman"/>
               </w:rPr>
             </w:pPr>
-            <w:proofErr w:type="gramStart"/>
             <w:r>
               <w:rPr>
                 <w:rFonts w:ascii="Times New Roman" w:eastAsia="標楷體" w:hAnsi="Times New Roman" w:cs="Times New Roman" w:hint="eastAsia"/>
               </w:rPr>
               <w:t>私訊</w:t>
             </w:r>
-            <w:proofErr w:type="gramEnd"/>
           </w:p>
         </w:tc>
         <w:tc>
@@ -9995,14 +9589,12 @@
         </w:rPr>
         <w:t>class</w:t>
       </w:r>
-      <w:proofErr w:type="gramStart"/>
       <w:r>
         <w:rPr>
           <w:rFonts w:ascii="Times New Roman" w:eastAsia="標楷體" w:hAnsi="Times New Roman" w:cs="Times New Roman" w:hint="eastAsia"/>
         </w:rPr>
         <w:t>—</w:t>
       </w:r>
-      <w:proofErr w:type="gramEnd"/>
       <w:r>
         <w:rPr>
           <w:rFonts w:ascii="Times New Roman" w:eastAsia="標楷體" w:hAnsi="Times New Roman" w:cs="Times New Roman" w:hint="eastAsia"/>
@@ -10212,21 +9804,7 @@
               <w:rPr>
                 <w:rFonts w:ascii="Times New Roman" w:eastAsia="標楷體" w:hAnsi="Times New Roman" w:cs="Times New Roman" w:hint="eastAsia"/>
               </w:rPr>
-              <w:t xml:space="preserve"> (</w:t>
-            </w:r>
-            <w:proofErr w:type="spellStart"/>
-            <w:r>
-              <w:rPr>
-                <w:rFonts w:ascii="Times New Roman" w:eastAsia="標楷體" w:hAnsi="Times New Roman" w:cs="Times New Roman" w:hint="eastAsia"/>
-              </w:rPr>
-              <w:t>BookInfo</w:t>
-            </w:r>
-            <w:proofErr w:type="spellEnd"/>
-            <w:r>
-              <w:rPr>
-                <w:rFonts w:ascii="Times New Roman" w:eastAsia="標楷體" w:hAnsi="Times New Roman" w:cs="Times New Roman" w:hint="eastAsia"/>
-              </w:rPr>
-              <w:t>)</w:t>
+              <w:t xml:space="preserve"> (BookInfo)</w:t>
             </w:r>
           </w:p>
         </w:tc>
@@ -10264,14 +9842,12 @@
                 <w:rFonts w:ascii="Times New Roman" w:eastAsia="標楷體" w:hAnsi="Times New Roman" w:cs="Times New Roman"/>
               </w:rPr>
             </w:pPr>
-            <w:proofErr w:type="gramStart"/>
             <w:r>
               <w:rPr>
                 <w:rFonts w:ascii="Times New Roman" w:eastAsia="標楷體" w:hAnsi="Times New Roman" w:cs="Times New Roman" w:hint="eastAsia"/>
               </w:rPr>
               <w:t>私訊</w:t>
             </w:r>
-            <w:proofErr w:type="gramEnd"/>
             <w:r>
               <w:rPr>
                 <w:rFonts w:ascii="Times New Roman" w:eastAsia="標楷體" w:hAnsi="Times New Roman" w:cs="Times New Roman" w:hint="eastAsia"/>
@@ -11571,48 +11147,8 @@
           <w:sz w:val="22"/>
           <w:szCs w:val="22"/>
         </w:rPr>
-        <w:t xml:space="preserve">7 Sequence </w:t>
-      </w:r>
-      <w:proofErr w:type="gramStart"/>
-      <w:r>
-        <w:rPr>
-          <w:rFonts w:ascii="Times New Roman" w:eastAsia="標楷體" w:hAnsi="Times New Roman" w:cs="Times New Roman" w:hint="eastAsia"/>
-          <w:b/>
-          <w:bCs/>
-          <w:i/>
-          <w:iCs/>
-          <w:sz w:val="22"/>
-          <w:szCs w:val="22"/>
-        </w:rPr>
-        <w:t>Diagram :</w:t>
-      </w:r>
-      <w:proofErr w:type="gramEnd"/>
-      <w:r>
-        <w:rPr>
-          <w:rFonts w:ascii="Times New Roman" w:eastAsia="標楷體" w:hAnsi="Times New Roman" w:cs="Times New Roman" w:hint="eastAsia"/>
-          <w:b/>
-          <w:bCs/>
-          <w:i/>
-          <w:iCs/>
-          <w:sz w:val="22"/>
-          <w:szCs w:val="22"/>
-        </w:rPr>
-        <w:t xml:space="preserve"> </w:t>
-      </w:r>
-      <w:proofErr w:type="spellStart"/>
-      <w:r>
-        <w:rPr>
-          <w:rFonts w:ascii="Times New Roman" w:eastAsia="標楷體" w:hAnsi="Times New Roman" w:cs="Times New Roman" w:hint="eastAsia"/>
-          <w:b/>
-          <w:bCs/>
-          <w:i/>
-          <w:iCs/>
-          <w:sz w:val="22"/>
-          <w:szCs w:val="22"/>
-        </w:rPr>
-        <w:t>checkOut</w:t>
-      </w:r>
-      <w:proofErr w:type="spellEnd"/>
+        <w:t>7 Sequence Diagram : checkOut</w:t>
+      </w:r>
     </w:p>
     <w:p>
       <w:r>
@@ -11706,48 +11242,8 @@
           <w:sz w:val="22"/>
           <w:szCs w:val="22"/>
         </w:rPr>
-        <w:t xml:space="preserve">8 Sequence </w:t>
-      </w:r>
-      <w:proofErr w:type="gramStart"/>
-      <w:r>
-        <w:rPr>
-          <w:rFonts w:ascii="Times New Roman" w:eastAsia="標楷體" w:hAnsi="Times New Roman" w:cs="Times New Roman" w:hint="eastAsia"/>
-          <w:b/>
-          <w:bCs/>
-          <w:i/>
-          <w:iCs/>
-          <w:sz w:val="22"/>
-          <w:szCs w:val="22"/>
-        </w:rPr>
-        <w:t>Diagram :</w:t>
-      </w:r>
-      <w:proofErr w:type="gramEnd"/>
-      <w:r>
-        <w:rPr>
-          <w:rFonts w:ascii="Times New Roman" w:eastAsia="標楷體" w:hAnsi="Times New Roman" w:cs="Times New Roman" w:hint="eastAsia"/>
-          <w:b/>
-          <w:bCs/>
-          <w:i/>
-          <w:iCs/>
-          <w:sz w:val="22"/>
-          <w:szCs w:val="22"/>
-        </w:rPr>
-        <w:t xml:space="preserve"> </w:t>
-      </w:r>
-      <w:proofErr w:type="spellStart"/>
-      <w:r>
-        <w:rPr>
-          <w:rFonts w:ascii="Times New Roman" w:eastAsia="標楷體" w:hAnsi="Times New Roman" w:cs="Times New Roman" w:hint="eastAsia"/>
-          <w:b/>
-          <w:bCs/>
-          <w:i/>
-          <w:iCs/>
-          <w:sz w:val="22"/>
-          <w:szCs w:val="22"/>
-        </w:rPr>
-        <w:t>addBook</w:t>
-      </w:r>
-      <w:proofErr w:type="spellEnd"/>
+        <w:t>8 Sequence Diagram : addBook</w:t>
+      </w:r>
     </w:p>
     <w:p>
       <w:pPr>
@@ -11844,48 +11340,8 @@
           <w:sz w:val="22"/>
           <w:szCs w:val="22"/>
         </w:rPr>
-        <w:t xml:space="preserve">9 Sequence </w:t>
-      </w:r>
-      <w:proofErr w:type="gramStart"/>
-      <w:r>
-        <w:rPr>
-          <w:rFonts w:ascii="Times New Roman" w:eastAsia="標楷體" w:hAnsi="Times New Roman" w:cs="Times New Roman" w:hint="eastAsia"/>
-          <w:b/>
-          <w:bCs/>
-          <w:i/>
-          <w:iCs/>
-          <w:sz w:val="22"/>
-          <w:szCs w:val="22"/>
-        </w:rPr>
-        <w:t>Diagram :</w:t>
-      </w:r>
-      <w:proofErr w:type="gramEnd"/>
-      <w:r>
-        <w:rPr>
-          <w:rFonts w:ascii="Times New Roman" w:eastAsia="標楷體" w:hAnsi="Times New Roman" w:cs="Times New Roman" w:hint="eastAsia"/>
-          <w:b/>
-          <w:bCs/>
-          <w:i/>
-          <w:iCs/>
-          <w:sz w:val="22"/>
-          <w:szCs w:val="22"/>
-        </w:rPr>
-        <w:t xml:space="preserve"> </w:t>
-      </w:r>
-      <w:proofErr w:type="spellStart"/>
-      <w:r>
-        <w:rPr>
-          <w:rFonts w:ascii="Times New Roman" w:eastAsia="標楷體" w:hAnsi="Times New Roman" w:cs="Times New Roman" w:hint="eastAsia"/>
-          <w:b/>
-          <w:bCs/>
-          <w:i/>
-          <w:iCs/>
-          <w:sz w:val="22"/>
-          <w:szCs w:val="22"/>
-        </w:rPr>
-        <w:t>viewBookList</w:t>
-      </w:r>
-      <w:proofErr w:type="spellEnd"/>
+        <w:t>9 Sequence Diagram : viewBookList</w:t>
+      </w:r>
     </w:p>
     <w:p>
       <w:r>
@@ -11980,48 +11436,8 @@
           <w:sz w:val="22"/>
           <w:szCs w:val="22"/>
         </w:rPr>
-        <w:t xml:space="preserve">10 Sequence </w:t>
-      </w:r>
-      <w:proofErr w:type="gramStart"/>
-      <w:r>
-        <w:rPr>
-          <w:rFonts w:ascii="Times New Roman" w:eastAsia="標楷體" w:hAnsi="Times New Roman" w:cs="Times New Roman" w:hint="eastAsia"/>
-          <w:b/>
-          <w:bCs/>
-          <w:i/>
-          <w:iCs/>
-          <w:sz w:val="22"/>
-          <w:szCs w:val="22"/>
-        </w:rPr>
-        <w:t>Diagram :</w:t>
-      </w:r>
-      <w:proofErr w:type="gramEnd"/>
-      <w:r>
-        <w:rPr>
-          <w:rFonts w:ascii="Times New Roman" w:eastAsia="標楷體" w:hAnsi="Times New Roman" w:cs="Times New Roman" w:hint="eastAsia"/>
-          <w:b/>
-          <w:bCs/>
-          <w:i/>
-          <w:iCs/>
-          <w:sz w:val="22"/>
-          <w:szCs w:val="22"/>
-        </w:rPr>
-        <w:t xml:space="preserve"> </w:t>
-      </w:r>
-      <w:proofErr w:type="spellStart"/>
-      <w:r>
-        <w:rPr>
-          <w:rFonts w:ascii="Times New Roman" w:eastAsia="標楷體" w:hAnsi="Times New Roman" w:cs="Times New Roman" w:hint="eastAsia"/>
-          <w:b/>
-          <w:bCs/>
-          <w:i/>
-          <w:iCs/>
-          <w:sz w:val="22"/>
-          <w:szCs w:val="22"/>
-        </w:rPr>
-        <w:t>updateBook</w:t>
-      </w:r>
-      <w:proofErr w:type="spellEnd"/>
+        <w:t>10 Sequence Diagram : updateBook</w:t>
+      </w:r>
     </w:p>
     <w:p>
       <w:r>
@@ -12115,48 +11531,8 @@
           <w:sz w:val="22"/>
           <w:szCs w:val="22"/>
         </w:rPr>
-        <w:t xml:space="preserve">11 Sequence </w:t>
-      </w:r>
-      <w:proofErr w:type="gramStart"/>
-      <w:r>
-        <w:rPr>
-          <w:rFonts w:ascii="Times New Roman" w:eastAsia="標楷體" w:hAnsi="Times New Roman" w:cs="Times New Roman" w:hint="eastAsia"/>
-          <w:b/>
-          <w:bCs/>
-          <w:i/>
-          <w:iCs/>
-          <w:sz w:val="22"/>
-          <w:szCs w:val="22"/>
-        </w:rPr>
-        <w:t>Diagram :</w:t>
-      </w:r>
-      <w:proofErr w:type="gramEnd"/>
-      <w:r>
-        <w:rPr>
-          <w:rFonts w:ascii="Times New Roman" w:eastAsia="標楷體" w:hAnsi="Times New Roman" w:cs="Times New Roman" w:hint="eastAsia"/>
-          <w:b/>
-          <w:bCs/>
-          <w:i/>
-          <w:iCs/>
-          <w:sz w:val="22"/>
-          <w:szCs w:val="22"/>
-        </w:rPr>
-        <w:t xml:space="preserve"> </w:t>
-      </w:r>
-      <w:proofErr w:type="spellStart"/>
-      <w:r>
-        <w:rPr>
-          <w:rFonts w:ascii="Times New Roman" w:eastAsia="標楷體" w:hAnsi="Times New Roman" w:cs="Times New Roman" w:hint="eastAsia"/>
-          <w:b/>
-          <w:bCs/>
-          <w:i/>
-          <w:iCs/>
-          <w:sz w:val="22"/>
-          <w:szCs w:val="22"/>
-        </w:rPr>
-        <w:t>deleteBook</w:t>
-      </w:r>
-      <w:proofErr w:type="spellEnd"/>
+        <w:t>11 Sequence Diagram : deleteBook</w:t>
+      </w:r>
     </w:p>
     <w:p>
       <w:pPr>
@@ -12176,10 +11552,10 @@
           <w:noProof/>
         </w:rPr>
         <w:drawing>
-          <wp:inline distT="0" distB="0" distL="0" distR="0" wp14:anchorId="6D6A638D" wp14:editId="46B25F1E">
-            <wp:extent cx="4724400" cy="5048250"/>
-            <wp:effectExtent l="0" t="0" r="0" b="0"/>
-            <wp:docPr id="6" name="圖片 6"/>
+          <wp:inline distT="0" distB="0" distL="0" distR="0" wp14:anchorId="656E22D6" wp14:editId="15DF153A">
+            <wp:extent cx="5274310" cy="5647055"/>
+            <wp:effectExtent l="0" t="0" r="2540" b="0"/>
+            <wp:docPr id="1" name="圖片 1"/>
             <wp:cNvGraphicFramePr>
               <a:graphicFrameLocks xmlns:a="http://schemas.openxmlformats.org/drawingml/2006/main" noChangeAspect="1"/>
             </wp:cNvGraphicFramePr>
@@ -12187,7 +11563,7 @@
               <a:graphicData uri="http://schemas.openxmlformats.org/drawingml/2006/picture">
                 <pic:pic xmlns:pic="http://schemas.openxmlformats.org/drawingml/2006/picture">
                   <pic:nvPicPr>
-                    <pic:cNvPr id="0" name="Picture 13"/>
+                    <pic:cNvPr id="0" name="Picture 1"/>
                     <pic:cNvPicPr>
                       <a:picLocks noChangeAspect="1" noChangeArrowheads="1"/>
                     </pic:cNvPicPr>
@@ -12208,7 +11584,7 @@
                   <pic:spPr bwMode="auto">
                     <a:xfrm>
                       <a:off x="0" y="0"/>
-                      <a:ext cx="4724400" cy="5048250"/>
+                      <a:ext cx="5274310" cy="5647055"/>
                     </a:xfrm>
                     <a:prstGeom prst="rect">
                       <a:avLst/>
@@ -15311,6 +14687,7 @@
   <w:style w:type="character" w:default="1" w:styleId="a0">
     <w:name w:val="Default Paragraph Font"/>
     <w:uiPriority w:val="1"/>
+    <w:semiHidden/>
     <w:unhideWhenUsed/>
   </w:style>
   <w:style w:type="table" w:default="1" w:styleId="a1">

</xml_diff>